<commit_message>
#1070 - docs: document sys-repl and feature/env
</commit_message>
<xml_diff>
--- a/doc/refcards/mu-ref.docx
+++ b/doc/refcards/mu-ref.docx
@@ -38,7 +38,7 @@
           <w:tab w:val="left" w:pos="4110" w:leader="none"/>
         </w:tabs>
         <w:suppressAutoHyphens w:val="true"/>
-        <w:overflowPunct w:val="true"/>
+        <w:overflowPunct w:val="false"/>
         <w:bidi w:val="0"/>
         <w:spacing w:before="0" w:after="0"/>
         <w:ind w:hanging="0" w:start="0" w:end="0"/>
@@ -349,7 +349,19 @@
           <w:sz w:val="16"/>
           <w:szCs w:val="16"/>
         </w:rPr>
-        <w:t>0.2.15</w:t>
+        <w:t>0.2.1</w:t>
+      </w:r>
+      <w:r>
+        <w:rPr>
+          <w:rFonts w:ascii="Georgia" w:hAnsi="Georgia"/>
+          <w:b/>
+          <w:bCs/>
+          <w:i/>
+          <w:iCs/>
+          <w:sz w:val="16"/>
+          <w:szCs w:val="16"/>
+        </w:rPr>
+        <w:t>7</w:t>
       </w:r>
     </w:p>
     <w:p>
@@ -5537,7 +5549,7 @@
         <w:pStyle w:val="Normal"/>
         <w:widowControl/>
         <w:suppressAutoHyphens w:val="true"/>
-        <w:overflowPunct w:val="true"/>
+        <w:overflowPunct w:val="false"/>
         <w:bidi w:val="0"/>
         <w:spacing w:before="0" w:after="0"/>
         <w:ind w:hanging="0" w:start="0" w:end="0"/>
@@ -14973,31 +14985,7 @@
           <w:sz w:val="14"/>
           <w:szCs w:val="14"/>
         </w:rPr>
-        <w:t>process</w:t>
-      </w:r>
-      <w:r>
-        <w:rPr>
-          <w:rFonts w:ascii="Georgia" w:hAnsi="Georgia"/>
-          <w:b/>
-          <w:bCs/>
-          <w:i/>
-          <w:iCs/>
-          <w:sz w:val="14"/>
-          <w:szCs w:val="14"/>
-        </w:rPr>
-        <w:t>-</w:t>
-      </w:r>
-      <w:r>
-        <w:rPr>
-          <w:rFonts w:ascii="Georgia" w:hAnsi="Georgia"/>
-          <w:b/>
-          <w:bCs/>
-          <w:i/>
-          <w:iCs/>
-          <w:sz w:val="14"/>
-          <w:szCs w:val="14"/>
-        </w:rPr>
-        <w:t>mem-virt</w:t>
+        <w:t>process-mem-virt</w:t>
       </w:r>
       <w:r>
         <w:rPr>
@@ -15259,53 +15247,57 @@
           <w:sz w:val="14"/>
           <w:szCs w:val="14"/>
         </w:rPr>
-        <w:t>ns-symbols</w:t>
-      </w:r>
-      <w:r>
-        <w:rPr>
-          <w:rFonts w:ascii="Georgia" w:hAnsi="Georgia"/>
-          <w:b w:val="false"/>
-          <w:bCs w:val="false"/>
-          <w:i w:val="false"/>
-          <w:iCs w:val="false"/>
-          <w:sz w:val="16"/>
-          <w:szCs w:val="16"/>
-        </w:rPr>
-        <w:t xml:space="preserve"> </w:t>
-      </w:r>
-      <w:r>
-        <w:rPr>
-          <w:rFonts w:ascii="Georgia" w:hAnsi="Georgia"/>
-          <w:b w:val="false"/>
-          <w:bCs w:val="false"/>
-          <w:i/>
-          <w:iCs/>
-          <w:sz w:val="16"/>
-          <w:szCs w:val="16"/>
-        </w:rPr>
-        <w:t>ns|</w:t>
-      </w:r>
-      <w:r>
-        <w:rPr>
-          <w:rFonts w:ascii="Andale Mono" w:hAnsi="Andale Mono"/>
-          <w:b w:val="false"/>
-          <w:bCs w:val="false"/>
-          <w:i w:val="false"/>
-          <w:iCs w:val="false"/>
-          <w:sz w:val="16"/>
-          <w:szCs w:val="16"/>
-        </w:rPr>
-        <w:t>:nil</w:t>
-      </w:r>
-    </w:p>
-    <w:p>
-      <w:pPr>
-        <w:pStyle w:val="Normal"/>
-        <w:rPr>
-          <w:sz w:val="16"/>
-          <w:szCs w:val="16"/>
-        </w:rPr>
-      </w:pPr>
+        <w:t>n</w:t>
+      </w:r>
+      <w:r>
+        <w:rPr>
+          <w:rFonts w:ascii="Georgia" w:hAnsi="Georgia"/>
+          <w:b/>
+          <w:bCs/>
+          <w:i/>
+          <w:iCs/>
+          <w:sz w:val="14"/>
+          <w:szCs w:val="14"/>
+        </w:rPr>
+        <w:t>a</w:t>
+      </w:r>
+      <w:r>
+        <w:rPr>
+          <w:rFonts w:ascii="Georgia" w:hAnsi="Georgia"/>
+          <w:b/>
+          <w:bCs/>
+          <w:i/>
+          <w:iCs/>
+          <w:sz w:val="14"/>
+          <w:szCs w:val="14"/>
+        </w:rPr>
+        <w:t>m</w:t>
+      </w:r>
+      <w:r>
+        <w:rPr>
+          <w:rFonts w:ascii="Georgia" w:hAnsi="Georgia"/>
+          <w:b/>
+          <w:bCs/>
+          <w:i/>
+          <w:iCs/>
+          <w:sz w:val="14"/>
+          <w:szCs w:val="14"/>
+        </w:rPr>
+        <w:t xml:space="preserve">espace  </w:t>
+      </w:r>
+      <w:r>
+        <w:rPr>
+          <w:rFonts w:ascii="Georgia" w:hAnsi="Georgia"/>
+          <w:b w:val="false"/>
+          <w:bCs w:val="false"/>
+          <w:i/>
+          <w:iCs/>
+          <w:sz w:val="14"/>
+          <w:szCs w:val="14"/>
+        </w:rPr>
+        <w:t>string</w:t>
+        <w:tab/>
+      </w:r>
       <w:r>
         <w:rPr>
           <w:rFonts w:eastAsia="Songti SC" w:cs="Arial Unicode MS" w:ascii="Georgia" w:hAnsi="Georgia"/>
@@ -15315,15 +15307,12 @@
           <w:iCs/>
           <w:color w:val="auto"/>
           <w:kern w:val="2"/>
-          <w:sz w:val="12"/>
-          <w:szCs w:val="12"/>
+          <w:sz w:val="16"/>
+          <w:szCs w:val="16"/>
           <w:u w:val="none"/>
           <w:lang w:val="en-US" w:eastAsia="zh-CN" w:bidi="hi-IN"/>
         </w:rPr>
-        <w:tab/>
-        <w:tab/>
-        <w:tab/>
-        <w:t xml:space="preserve"> </w:t>
+        <w:t>list</w:t>
         <w:tab/>
       </w:r>
       <w:r>
@@ -15335,20 +15324,107 @@
           <w:iCs/>
           <w:color w:val="auto"/>
           <w:kern w:val="2"/>
-          <w:sz w:val="16"/>
-          <w:szCs w:val="16"/>
+          <w:sz w:val="14"/>
+          <w:szCs w:val="14"/>
           <w:u w:val="none"/>
           <w:lang w:val="en-US" w:eastAsia="zh-CN" w:bidi="hi-IN"/>
         </w:rPr>
+        <w:t>symbol</w:t>
+      </w:r>
+      <w:r>
+        <w:rPr>
+          <w:rFonts w:eastAsia="Songti SC" w:cs="Arial Unicode MS" w:ascii="Georgia" w:hAnsi="Georgia"/>
+          <w:b w:val="false"/>
+          <w:bCs w:val="false"/>
+          <w:i/>
+          <w:iCs/>
+          <w:color w:val="auto"/>
+          <w:kern w:val="2"/>
+          <w:sz w:val="16"/>
+          <w:szCs w:val="16"/>
+          <w:u w:val="none"/>
+          <w:lang w:val="en-US" w:eastAsia="zh-CN" w:bidi="hi-IN"/>
+        </w:rPr>
+        <w:t xml:space="preserve"> </w:t>
+      </w:r>
+      <w:r>
+        <w:rPr>
+          <w:rFonts w:eastAsia="Songti SC" w:cs="Arial Unicode MS" w:ascii="Georgia" w:hAnsi="Georgia"/>
+          <w:b w:val="false"/>
+          <w:bCs w:val="false"/>
+          <w:i w:val="false"/>
+          <w:iCs w:val="false"/>
+          <w:color w:val="auto"/>
+          <w:kern w:val="2"/>
+          <w:sz w:val="16"/>
+          <w:szCs w:val="16"/>
+          <w:u w:val="none"/>
+          <w:lang w:val="en-US" w:eastAsia="zh-CN" w:bidi="hi-IN"/>
+        </w:rPr>
         <w:t>list</w:t>
-        <w:tab/>
-        <w:t xml:space="preserve">symbol </w:t>
+      </w:r>
+    </w:p>
+    <w:p>
+      <w:pPr>
+        <w:pStyle w:val="Normal"/>
+        <w:rPr>
+          <w:sz w:val="12"/>
+          <w:szCs w:val="12"/>
+        </w:rPr>
+      </w:pPr>
+      <w:r>
+        <w:rPr>
+          <w:sz w:val="12"/>
+          <w:szCs w:val="12"/>
+        </w:rPr>
+      </w:r>
+    </w:p>
+    <w:p>
+      <w:pPr>
+        <w:pStyle w:val="Normal"/>
+        <w:rPr/>
+      </w:pPr>
+      <w:r>
+        <w:rPr>
+          <w:rFonts w:ascii="Georgia" w:hAnsi="Georgia"/>
+          <w:b/>
+          <w:bCs/>
+          <w:i w:val="false"/>
+          <w:iCs w:val="false"/>
+          <w:sz w:val="14"/>
+          <w:szCs w:val="14"/>
+        </w:rPr>
+        <w:t xml:space="preserve"> </w:t>
+      </w:r>
+      <w:r>
+        <w:rPr>
+          <w:rFonts w:ascii="Georgia" w:hAnsi="Georgia"/>
+          <w:b/>
+          <w:bCs/>
+          <w:i w:val="false"/>
+          <w:iCs w:val="false"/>
+          <w:sz w:val="16"/>
+          <w:szCs w:val="16"/>
+        </w:rPr>
+        <w:t xml:space="preserve"> </w:t>
+      </w:r>
+      <w:r>
+        <w:rPr>
+          <w:rFonts w:ascii="Georgia" w:hAnsi="Georgia"/>
+          <w:b/>
+          <w:bCs/>
+          <w:i w:val="false"/>
+          <w:iCs w:val="false"/>
+          <w:sz w:val="16"/>
+          <w:szCs w:val="16"/>
+        </w:rPr>
+        <w:t>feature/env</w:t>
       </w:r>
       <w:r>
         <w:rPr>
           <w:rFonts w:eastAsia="Songti SC" w:cs="Arial Unicode MS" w:ascii="Georgia" w:hAnsi="Georgia"/>
-          <w:b w:val="false"/>
-          <w:bCs w:val="false"/>
+          <w:b/>
+          <w:bCs/>
           <w:i w:val="false"/>
           <w:iCs w:val="false"/>
           <w:color w:val="auto"/>
@@ -15358,22 +15434,73 @@
           <w:u w:val="none"/>
           <w:lang w:val="en-US" w:eastAsia="zh-CN" w:bidi="hi-IN"/>
         </w:rPr>
-        <w:t>list</w:t>
-      </w:r>
-    </w:p>
-    <w:p>
-      <w:pPr>
-        <w:pStyle w:val="Normal"/>
-        <w:rPr>
-          <w:sz w:val="12"/>
-          <w:szCs w:val="12"/>
-        </w:rPr>
-      </w:pPr>
-      <w:r>
-        <w:rPr>
-          <w:sz w:val="12"/>
-          <w:szCs w:val="12"/>
-        </w:rPr>
+        <w:tab/>
+      </w:r>
+      <w:r>
+        <w:rPr>
+          <w:rFonts w:eastAsia="Songti SC" w:cs="Arial Unicode MS" w:ascii="Georgia" w:hAnsi="Georgia"/>
+          <w:b/>
+          <w:bCs/>
+          <w:i/>
+          <w:iCs/>
+          <w:color w:val="auto"/>
+          <w:kern w:val="2"/>
+          <w:sz w:val="14"/>
+          <w:szCs w:val="14"/>
+          <w:u w:val="none"/>
+          <w:lang w:val="en-US" w:eastAsia="zh-CN" w:bidi="hi-IN"/>
+        </w:rPr>
+        <w:t>heap-info</w:t>
+      </w:r>
+      <w:r>
+        <w:rPr>
+          <w:rFonts w:eastAsia="Songti SC" w:cs="Arial Unicode MS" w:ascii="Georgia" w:hAnsi="Georgia"/>
+          <w:b/>
+          <w:bCs/>
+          <w:i w:val="false"/>
+          <w:iCs w:val="false"/>
+          <w:color w:val="auto"/>
+          <w:kern w:val="2"/>
+          <w:sz w:val="14"/>
+          <w:szCs w:val="14"/>
+          <w:u w:val="none"/>
+          <w:lang w:val="en-US" w:eastAsia="zh-CN" w:bidi="hi-IN"/>
+        </w:rPr>
+        <w:tab/>
+        <w:tab/>
+      </w:r>
+      <w:r>
+        <w:rPr>
+          <w:rFonts w:eastAsia="Songti SC" w:cs="Arial Unicode MS" w:ascii="Georgia" w:hAnsi="Georgia"/>
+          <w:b w:val="false"/>
+          <w:bCs w:val="false"/>
+          <w:i/>
+          <w:iCs/>
+          <w:color w:val="auto"/>
+          <w:kern w:val="2"/>
+          <w:sz w:val="14"/>
+          <w:szCs w:val="14"/>
+          <w:u w:val="none"/>
+          <w:lang w:val="en-US" w:eastAsia="zh-CN" w:bidi="hi-IN"/>
+        </w:rPr>
+        <w:t>()</w:t>
+        <w:tab/>
+      </w:r>
+      <w:r>
+        <w:rPr>
+          <w:rFonts w:eastAsia="Songti SC" w:cs="Arial Unicode MS" w:ascii="Georgia" w:hAnsi="Georgia"/>
+          <w:b w:val="false"/>
+          <w:bCs w:val="false"/>
+          <w:i w:val="false"/>
+          <w:iCs w:val="false"/>
+          <w:color w:val="auto"/>
+          <w:kern w:val="2"/>
+          <w:sz w:val="14"/>
+          <w:szCs w:val="14"/>
+          <w:u w:val="none"/>
+          <w:lang w:val="en-US" w:eastAsia="zh-CN" w:bidi="hi-IN"/>
+        </w:rPr>
+        <w:t>heap info to</w:t>
       </w:r>
     </w:p>
     <w:p>
@@ -15383,67 +15510,47 @@
       </w:pPr>
       <w:r>
         <w:rPr>
-          <w:rFonts w:ascii="Georgia" w:hAnsi="Georgia"/>
-          <w:b/>
-          <w:bCs/>
-          <w:i w:val="false"/>
-          <w:iCs w:val="false"/>
-          <w:sz w:val="14"/>
-          <w:szCs w:val="14"/>
-        </w:rPr>
-        <w:t xml:space="preserve"> </w:t>
-      </w:r>
-      <w:r>
-        <w:rPr>
-          <w:rFonts w:ascii="Georgia" w:hAnsi="Georgia"/>
-          <w:b/>
-          <w:bCs/>
-          <w:i w:val="false"/>
-          <w:iCs w:val="false"/>
-          <w:sz w:val="16"/>
-          <w:szCs w:val="16"/>
-        </w:rPr>
-        <w:t xml:space="preserve"> </w:t>
-      </w:r>
-      <w:r>
-        <w:rPr>
-          <w:rFonts w:ascii="Georgia" w:hAnsi="Georgia"/>
-          <w:b/>
-          <w:bCs/>
-          <w:i w:val="false"/>
-          <w:iCs w:val="false"/>
-          <w:sz w:val="16"/>
-          <w:szCs w:val="16"/>
-        </w:rPr>
-        <w:t>feature/en</w:t>
-      </w:r>
-      <w:r>
-        <w:rPr>
-          <w:rFonts w:ascii="Georgia" w:hAnsi="Georgia"/>
-          <w:b/>
-          <w:bCs/>
-          <w:i w:val="false"/>
-          <w:iCs w:val="false"/>
-          <w:sz w:val="16"/>
-          <w:szCs w:val="16"/>
-        </w:rPr>
-        <w:t>v</w:t>
-      </w:r>
-      <w:r>
-        <w:rPr>
           <w:rFonts w:eastAsia="Songti SC" w:cs="Arial Unicode MS" w:ascii="Georgia" w:hAnsi="Georgia"/>
-          <w:b/>
-          <w:bCs/>
+          <w:b w:val="false"/>
+          <w:bCs w:val="false"/>
           <w:i w:val="false"/>
           <w:iCs w:val="false"/>
           <w:color w:val="auto"/>
           <w:kern w:val="2"/>
-          <w:sz w:val="16"/>
-          <w:szCs w:val="16"/>
+          <w:sz w:val="14"/>
+          <w:szCs w:val="14"/>
           <w:u w:val="none"/>
           <w:lang w:val="en-US" w:eastAsia="zh-CN" w:bidi="hi-IN"/>
         </w:rPr>
         <w:tab/>
+        <w:tab/>
+        <w:tab/>
+        <w:tab/>
+        <w:tab/>
+        <w:t>stdout</w:t>
+      </w:r>
+    </w:p>
+    <w:p>
+      <w:pPr>
+        <w:pStyle w:val="Normal"/>
+        <w:rPr/>
+      </w:pPr>
+      <w:r>
+        <w:rPr>
+          <w:rFonts w:eastAsia="Songti SC" w:cs="Arial Unicode MS" w:ascii="Andale Mono" w:hAnsi="Andale Mono"/>
+          <w:b w:val="false"/>
+          <w:bCs w:val="false"/>
+          <w:i/>
+          <w:iCs/>
+          <w:color w:val="auto"/>
+          <w:kern w:val="2"/>
+          <w:sz w:val="14"/>
+          <w:szCs w:val="14"/>
+          <w:u w:val="none"/>
+          <w:lang w:val="en-US" w:eastAsia="zh-CN" w:bidi="hi-IN"/>
+        </w:rPr>
+        <w:tab/>
+        <w:tab/>
       </w:r>
       <w:r>
         <w:rPr>
@@ -15459,15 +15566,15 @@
           <w:u w:val="none"/>
           <w:lang w:val="en-US" w:eastAsia="zh-CN" w:bidi="hi-IN"/>
         </w:rPr>
-        <w:t>heap-info</w:t>
+        <w:t xml:space="preserve">heap-room </w:t>
       </w:r>
       <w:r>
         <w:rPr>
           <w:rFonts w:eastAsia="Songti SC" w:cs="Arial Unicode MS" w:ascii="Georgia" w:hAnsi="Georgia"/>
-          <w:b/>
-          <w:bCs/>
-          <w:i w:val="false"/>
-          <w:iCs w:val="false"/>
+          <w:b w:val="false"/>
+          <w:bCs w:val="false"/>
+          <w:i/>
+          <w:iCs/>
           <w:color w:val="auto"/>
           <w:kern w:val="2"/>
           <w:sz w:val="14"/>
@@ -15475,16 +15582,15 @@
           <w:u w:val="none"/>
           <w:lang w:val="en-US" w:eastAsia="zh-CN" w:bidi="hi-IN"/>
         </w:rPr>
-        <w:tab/>
-        <w:tab/>
+        <w:t>key</w:t>
       </w:r>
       <w:r>
         <w:rPr>
           <w:rFonts w:eastAsia="Songti SC" w:cs="Arial Unicode MS" w:ascii="Georgia" w:hAnsi="Georgia"/>
-          <w:b w:val="false"/>
-          <w:bCs w:val="false"/>
-          <w:i/>
-          <w:iCs/>
+          <w:b/>
+          <w:bCs/>
+          <w:i w:val="false"/>
+          <w:iCs w:val="false"/>
           <w:color w:val="auto"/>
           <w:kern w:val="2"/>
           <w:sz w:val="14"/>
@@ -15492,7 +15598,6 @@
           <w:u w:val="none"/>
           <w:lang w:val="en-US" w:eastAsia="zh-CN" w:bidi="hi-IN"/>
         </w:rPr>
-        <w:t>()</w:t>
         <w:tab/>
       </w:r>
       <w:r>
@@ -15500,8 +15605,8 @@
           <w:rFonts w:eastAsia="Songti SC" w:cs="Arial Unicode MS" w:ascii="Georgia" w:hAnsi="Georgia"/>
           <w:b w:val="false"/>
           <w:bCs w:val="false"/>
-          <w:i w:val="false"/>
-          <w:iCs w:val="false"/>
+          <w:i/>
+          <w:iCs/>
           <w:color w:val="auto"/>
           <w:kern w:val="2"/>
           <w:sz w:val="14"/>
@@ -15509,7 +15614,41 @@
           <w:u w:val="none"/>
           <w:lang w:val="en-US" w:eastAsia="zh-CN" w:bidi="hi-IN"/>
         </w:rPr>
-        <w:t>heap info to</w:t>
+        <w:t>vector</w:t>
+        <w:tab/>
+      </w:r>
+      <w:r>
+        <w:rPr>
+          <w:rFonts w:eastAsia="Songti SC" w:cs="Arial Unicode MS" w:ascii="Georgia" w:hAnsi="Georgia"/>
+          <w:b w:val="false"/>
+          <w:bCs w:val="false"/>
+          <w:i w:val="false"/>
+          <w:iCs w:val="false"/>
+          <w:color w:val="auto"/>
+          <w:kern w:val="2"/>
+          <w:sz w:val="14"/>
+          <w:szCs w:val="14"/>
+          <w:u w:val="none"/>
+          <w:lang w:val="en-US" w:eastAsia="zh-CN" w:bidi="hi-IN"/>
+        </w:rPr>
+        <w:t>allocations</w:t>
+      </w:r>
+      <w:r>
+        <w:rPr>
+          <w:rFonts w:eastAsia="Songti SC" w:cs="Arial Unicode MS" w:ascii="Andale Mono" w:hAnsi="Andale Mono"/>
+          <w:b w:val="false"/>
+          <w:bCs w:val="false"/>
+          <w:i/>
+          <w:iCs/>
+          <w:color w:val="auto"/>
+          <w:kern w:val="2"/>
+          <w:sz w:val="14"/>
+          <w:szCs w:val="14"/>
+          <w:u w:val="none"/>
+          <w:lang w:val="en-US" w:eastAsia="zh-CN" w:bidi="hi-IN"/>
+        </w:rPr>
+        <w:tab/>
+        <w:t xml:space="preserve"> </w:t>
       </w:r>
     </w:p>
     <w:p>
@@ -15519,11 +15658,66 @@
       </w:pPr>
       <w:r>
         <w:rPr>
+          <w:rFonts w:eastAsia="Songti SC" w:cs="Arial Unicode MS" w:ascii="Courier New" w:hAnsi="Courier New"/>
+          <w:b/>
+          <w:bCs/>
+          <w:i w:val="false"/>
+          <w:iCs w:val="false"/>
+          <w:color w:val="auto"/>
+          <w:kern w:val="2"/>
+          <w:sz w:val="14"/>
+          <w:szCs w:val="14"/>
+          <w:u w:val="none"/>
+          <w:lang w:val="en-US" w:eastAsia="zh-CN" w:bidi="hi-IN"/>
+        </w:rPr>
+        <w:tab/>
+        <w:tab/>
+      </w:r>
+      <w:r>
+        <w:rPr>
+          <w:rFonts w:eastAsia="Songti SC" w:cs="Arial Unicode MS" w:ascii="Courier New" w:hAnsi="Courier New"/>
+          <w:b/>
+          <w:bCs/>
+          <w:i/>
+          <w:iCs/>
+          <w:color w:val="auto"/>
+          <w:kern w:val="2"/>
+          <w:sz w:val="14"/>
+          <w:szCs w:val="14"/>
+          <w:u w:val="none"/>
+          <w:lang w:val="en-US" w:eastAsia="zh-CN" w:bidi="hi-IN"/>
+        </w:rPr>
+        <w:t xml:space="preserve">    </w:t>
+      </w:r>
+      <w:r>
+        <w:rPr>
+          <w:rFonts w:eastAsia="Songti SC" w:cs="Arial Unicode MS" w:ascii="Andale Mono" w:hAnsi="Andale Mono"/>
+          <w:b w:val="false"/>
+          <w:bCs w:val="false"/>
+          <w:i/>
+          <w:iCs/>
+          <w:color w:val="auto"/>
+          <w:kern w:val="2"/>
+          <w:sz w:val="14"/>
+          <w:szCs w:val="14"/>
+          <w:u w:val="none"/>
+          <w:lang w:val="en-US" w:eastAsia="zh-CN" w:bidi="hi-IN"/>
+        </w:rPr>
+        <w:t>#(:t size total free …)</w:t>
+      </w:r>
+    </w:p>
+    <w:p>
+      <w:pPr>
+        <w:pStyle w:val="Normal"/>
+        <w:rPr/>
+      </w:pPr>
+      <w:r>
+        <w:rPr>
           <w:rFonts w:eastAsia="Songti SC" w:cs="Arial Unicode MS" w:ascii="Georgia" w:hAnsi="Georgia"/>
-          <w:b w:val="false"/>
-          <w:bCs w:val="false"/>
-          <w:i w:val="false"/>
-          <w:iCs w:val="false"/>
+          <w:b/>
+          <w:bCs/>
+          <w:i/>
+          <w:iCs/>
           <w:color w:val="auto"/>
           <w:kern w:val="2"/>
           <w:sz w:val="14"/>
@@ -15531,12 +15725,107 @@
           <w:u w:val="none"/>
           <w:lang w:val="en-US" w:eastAsia="zh-CN" w:bidi="hi-IN"/>
         </w:rPr>
-        <w:tab/>
-        <w:tab/>
-        <w:tab/>
-        <w:tab/>
-        <w:tab/>
-        <w:t>stdout</w:t>
+        <w:t xml:space="preserve"> </w:t>
+      </w:r>
+      <w:r>
+        <w:rPr>
+          <w:rFonts w:eastAsia="Songti SC" w:cs="Arial Unicode MS" w:ascii="Georgia" w:hAnsi="Georgia"/>
+          <w:b/>
+          <w:bCs/>
+          <w:i/>
+          <w:iCs/>
+          <w:color w:val="auto"/>
+          <w:kern w:val="2"/>
+          <w:sz w:val="14"/>
+          <w:szCs w:val="14"/>
+          <w:u w:val="none"/>
+          <w:lang w:val="en-US" w:eastAsia="zh-CN" w:bidi="hi-IN"/>
+        </w:rPr>
+        <w:tab/>
+        <w:tab/>
+        <w:t>heap-size</w:t>
+      </w:r>
+      <w:r>
+        <w:rPr>
+          <w:rFonts w:eastAsia="Songti SC" w:cs="Arial Unicode MS" w:ascii="Georgia" w:hAnsi="Georgia"/>
+          <w:b/>
+          <w:bCs/>
+          <w:i w:val="false"/>
+          <w:iCs w:val="false"/>
+          <w:color w:val="auto"/>
+          <w:kern w:val="2"/>
+          <w:sz w:val="14"/>
+          <w:szCs w:val="14"/>
+          <w:u w:val="none"/>
+          <w:lang w:val="en-US" w:eastAsia="zh-CN" w:bidi="hi-IN"/>
+        </w:rPr>
+        <w:t xml:space="preserve"> </w:t>
+      </w:r>
+      <w:r>
+        <w:rPr>
+          <w:rFonts w:eastAsia="Songti SC" w:cs="Arial Unicode MS" w:ascii="Georgia" w:hAnsi="Georgia"/>
+          <w:b w:val="false"/>
+          <w:bCs w:val="false"/>
+          <w:i/>
+          <w:iCs/>
+          <w:color w:val="auto"/>
+          <w:kern w:val="2"/>
+          <w:sz w:val="14"/>
+          <w:szCs w:val="14"/>
+          <w:u w:val="none"/>
+          <w:lang w:val="en-US" w:eastAsia="zh-CN" w:bidi="hi-IN"/>
+        </w:rPr>
+        <w:t>key</w:t>
+      </w:r>
+      <w:r>
+        <w:rPr>
+          <w:rFonts w:eastAsia="Songti SC" w:cs="Arial Unicode MS" w:ascii="Georgia" w:hAnsi="Georgia"/>
+          <w:b/>
+          <w:bCs/>
+          <w:i w:val="false"/>
+          <w:iCs w:val="false"/>
+          <w:color w:val="auto"/>
+          <w:kern w:val="2"/>
+          <w:sz w:val="14"/>
+          <w:szCs w:val="14"/>
+          <w:u w:val="none"/>
+          <w:lang w:val="en-US" w:eastAsia="zh-CN" w:bidi="hi-IN"/>
+        </w:rPr>
+        <w:tab/>
+        <w:t xml:space="preserve"> </w:t>
+      </w:r>
+      <w:r>
+        <w:rPr>
+          <w:rFonts w:eastAsia="Songti SC" w:cs="Arial Unicode MS" w:ascii="Georgia" w:hAnsi="Georgia"/>
+          <w:b w:val="false"/>
+          <w:bCs w:val="false"/>
+          <w:i/>
+          <w:iCs/>
+          <w:color w:val="auto"/>
+          <w:kern w:val="2"/>
+          <w:sz w:val="14"/>
+          <w:szCs w:val="14"/>
+          <w:u w:val="none"/>
+          <w:lang w:val="en-US" w:eastAsia="zh-CN" w:bidi="hi-IN"/>
+        </w:rPr>
+        <w:t>fixnum</w:t>
+        <w:tab/>
+      </w:r>
+      <w:r>
+        <w:rPr>
+          <w:rFonts w:eastAsia="Songti SC" w:cs="Arial Unicode MS" w:ascii="Georgia" w:hAnsi="Georgia"/>
+          <w:b w:val="false"/>
+          <w:bCs w:val="false"/>
+          <w:i w:val="false"/>
+          <w:iCs w:val="false"/>
+          <w:color w:val="auto"/>
+          <w:kern w:val="2"/>
+          <w:sz w:val="14"/>
+          <w:szCs w:val="14"/>
+          <w:u w:val="none"/>
+          <w:lang w:val="en-US" w:eastAsia="zh-CN" w:bidi="hi-IN"/>
+        </w:rPr>
+        <w:t>type size</w:t>
       </w:r>
     </w:p>
     <w:p>
@@ -15575,15 +15864,15 @@
           <w:u w:val="none"/>
           <w:lang w:val="en-US" w:eastAsia="zh-CN" w:bidi="hi-IN"/>
         </w:rPr>
-        <w:t xml:space="preserve">heap-room </w:t>
+        <w:t>cache-room</w:t>
       </w:r>
       <w:r>
         <w:rPr>
           <w:rFonts w:eastAsia="Songti SC" w:cs="Arial Unicode MS" w:ascii="Georgia" w:hAnsi="Georgia"/>
-          <w:b w:val="false"/>
-          <w:bCs w:val="false"/>
-          <w:i/>
-          <w:iCs/>
+          <w:b/>
+          <w:bCs/>
+          <w:i w:val="false"/>
+          <w:iCs w:val="false"/>
           <w:color w:val="auto"/>
           <w:kern w:val="2"/>
           <w:sz w:val="14"/>
@@ -15591,852 +15880,554 @@
           <w:u w:val="none"/>
           <w:lang w:val="en-US" w:eastAsia="zh-CN" w:bidi="hi-IN"/>
         </w:rPr>
+        <w:tab/>
+      </w:r>
+      <w:r>
+        <w:rPr>
+          <w:rFonts w:eastAsia="Songti SC" w:cs="Arial Unicode MS" w:ascii="Georgia" w:hAnsi="Georgia"/>
+          <w:b w:val="false"/>
+          <w:bCs w:val="false"/>
+          <w:i/>
+          <w:iCs/>
+          <w:color w:val="auto"/>
+          <w:kern w:val="2"/>
+          <w:sz w:val="14"/>
+          <w:szCs w:val="14"/>
+          <w:u w:val="none"/>
+          <w:lang w:val="en-US" w:eastAsia="zh-CN" w:bidi="hi-IN"/>
+        </w:rPr>
+        <w:t>vector</w:t>
+        <w:tab/>
+      </w:r>
+      <w:r>
+        <w:rPr>
+          <w:rFonts w:eastAsia="Songti SC" w:cs="Arial Unicode MS" w:ascii="Georgia" w:hAnsi="Georgia"/>
+          <w:b w:val="false"/>
+          <w:bCs w:val="false"/>
+          <w:i w:val="false"/>
+          <w:iCs w:val="false"/>
+          <w:color w:val="auto"/>
+          <w:kern w:val="2"/>
+          <w:sz w:val="14"/>
+          <w:szCs w:val="14"/>
+          <w:u w:val="none"/>
+          <w:lang w:val="en-US" w:eastAsia="zh-CN" w:bidi="hi-IN"/>
+        </w:rPr>
+        <w:t>allocations</w:t>
+      </w:r>
+    </w:p>
+    <w:p>
+      <w:pPr>
+        <w:pStyle w:val="Normal"/>
+        <w:rPr/>
+      </w:pPr>
+      <w:r>
+        <w:rPr>
+          <w:rFonts w:eastAsia="Songti SC" w:cs="Arial Unicode MS" w:ascii="Courier New" w:hAnsi="Courier New"/>
+          <w:b/>
+          <w:bCs/>
+          <w:i w:val="false"/>
+          <w:iCs w:val="false"/>
+          <w:color w:val="auto"/>
+          <w:kern w:val="2"/>
+          <w:sz w:val="14"/>
+          <w:szCs w:val="14"/>
+          <w:u w:val="none"/>
+          <w:lang w:val="en-US" w:eastAsia="zh-CN" w:bidi="hi-IN"/>
+        </w:rPr>
+        <w:tab/>
+        <w:tab/>
+      </w:r>
+      <w:r>
+        <w:rPr>
+          <w:rFonts w:eastAsia="Songti SC" w:cs="Arial Unicode MS" w:ascii="Courier New" w:hAnsi="Courier New"/>
+          <w:b/>
+          <w:bCs/>
+          <w:i/>
+          <w:iCs/>
+          <w:color w:val="auto"/>
+          <w:kern w:val="2"/>
+          <w:sz w:val="14"/>
+          <w:szCs w:val="14"/>
+          <w:u w:val="none"/>
+          <w:lang w:val="en-US" w:eastAsia="zh-CN" w:bidi="hi-IN"/>
+        </w:rPr>
+        <w:t xml:space="preserve">    </w:t>
+      </w:r>
+      <w:r>
+        <w:rPr>
+          <w:rFonts w:eastAsia="Songti SC" w:cs="Arial Unicode MS" w:ascii="Andale Mono" w:hAnsi="Andale Mono"/>
+          <w:b w:val="false"/>
+          <w:bCs w:val="false"/>
+          <w:i/>
+          <w:iCs/>
+          <w:color w:val="auto"/>
+          <w:kern w:val="2"/>
+          <w:sz w:val="14"/>
+          <w:szCs w:val="14"/>
+          <w:u w:val="none"/>
+          <w:lang w:val="en-US" w:eastAsia="zh-CN" w:bidi="hi-IN"/>
+        </w:rPr>
+        <w:t>#(:t size total …)</w:t>
+      </w:r>
+    </w:p>
+    <w:p>
+      <w:pPr>
+        <w:pStyle w:val="Normal"/>
+        <w:rPr>
+          <w:sz w:val="12"/>
+          <w:szCs w:val="12"/>
+        </w:rPr>
+      </w:pPr>
+      <w:r>
+        <w:rPr>
+          <w:sz w:val="12"/>
+          <w:szCs w:val="12"/>
+        </w:rPr>
+      </w:r>
+    </w:p>
+    <w:p>
+      <w:pPr>
+        <w:pStyle w:val="Normal"/>
+        <w:rPr/>
+      </w:pPr>
+      <w:r>
+        <w:rPr>
+          <w:rFonts w:ascii="Georgia" w:hAnsi="Georgia"/>
+          <w:b w:val="false"/>
+          <w:bCs w:val="false"/>
+          <w:sz w:val="14"/>
+          <w:szCs w:val="14"/>
+        </w:rPr>
+        <w:t xml:space="preserve">   </w:t>
+      </w:r>
+      <w:r>
+        <w:rPr>
+          <w:rFonts w:ascii="Georgia" w:hAnsi="Georgia"/>
+          <w:b/>
+          <w:bCs/>
+          <w:i/>
+          <w:iCs/>
+          <w:sz w:val="16"/>
+          <w:szCs w:val="16"/>
+        </w:rPr>
+        <w:t>feature</w:t>
+      </w:r>
+      <w:r>
+        <w:rPr>
+          <w:rFonts w:ascii="Georgia" w:hAnsi="Georgia"/>
+          <w:b/>
+          <w:bCs/>
+          <w:sz w:val="16"/>
+          <w:szCs w:val="16"/>
+        </w:rPr>
+        <w:t>/system</w:t>
+      </w:r>
+      <w:r>
+        <w:rPr>
+          <w:rFonts w:ascii="Georgia" w:hAnsi="Georgia"/>
+          <w:b/>
+          <w:bCs/>
+          <w:sz w:val="14"/>
+          <w:szCs w:val="14"/>
+        </w:rPr>
+        <w:tab/>
+      </w:r>
+      <w:r>
+        <w:rPr>
+          <w:rFonts w:ascii="Georgia" w:hAnsi="Georgia"/>
+          <w:b/>
+          <w:bCs/>
+          <w:i/>
+          <w:iCs/>
+          <w:sz w:val="14"/>
+          <w:szCs w:val="14"/>
+        </w:rPr>
+        <w:t>uname</w:t>
+        <w:tab/>
+        <w:tab/>
+      </w:r>
+      <w:r>
+        <w:rPr>
+          <w:rFonts w:ascii="Andale Mono" w:hAnsi="Andale Mono"/>
+          <w:b w:val="false"/>
+          <w:bCs w:val="false"/>
+          <w:i w:val="false"/>
+          <w:iCs w:val="false"/>
+          <w:sz w:val="14"/>
+          <w:szCs w:val="14"/>
+        </w:rPr>
+        <w:t>:t</w:t>
+      </w:r>
+      <w:r>
+        <w:rPr>
+          <w:rFonts w:ascii="Georgia" w:hAnsi="Georgia"/>
+          <w:b/>
+          <w:bCs/>
+          <w:i/>
+          <w:iCs/>
+          <w:sz w:val="14"/>
+          <w:szCs w:val="14"/>
+        </w:rPr>
+        <w:tab/>
+      </w:r>
+      <w:r>
+        <w:rPr>
+          <w:rFonts w:ascii="Georgia" w:hAnsi="Georgia"/>
+          <w:b w:val="false"/>
+          <w:bCs w:val="false"/>
+          <w:i w:val="false"/>
+          <w:iCs w:val="false"/>
+          <w:sz w:val="14"/>
+          <w:szCs w:val="14"/>
+        </w:rPr>
+        <w:t>system info</w:t>
+      </w:r>
+    </w:p>
+    <w:p>
+      <w:pPr>
+        <w:pStyle w:val="Normal"/>
+        <w:rPr/>
+      </w:pPr>
+      <w:r>
+        <w:rPr>
+          <w:rFonts w:ascii="Georgia" w:hAnsi="Georgia"/>
+          <w:b/>
+          <w:bCs/>
+          <w:sz w:val="14"/>
+          <w:szCs w:val="14"/>
+        </w:rPr>
+        <w:t xml:space="preserve">   </w:t>
+      </w:r>
+      <w:r>
+        <w:rPr>
+          <w:rFonts w:ascii="Georgia" w:hAnsi="Georgia"/>
+          <w:b/>
+          <w:bCs/>
+          <w:sz w:val="14"/>
+          <w:szCs w:val="14"/>
+        </w:rPr>
+        <w:tab/>
+        <w:tab/>
+      </w:r>
+      <w:r>
+        <w:rPr>
+          <w:rFonts w:ascii="Georgia" w:hAnsi="Georgia"/>
+          <w:b/>
+          <w:bCs/>
+          <w:i/>
+          <w:iCs/>
+          <w:sz w:val="14"/>
+          <w:szCs w:val="14"/>
+        </w:rPr>
+        <w:t xml:space="preserve">shell </w:t>
+      </w:r>
+      <w:r>
+        <w:rPr>
+          <w:rFonts w:ascii="Georgia" w:hAnsi="Georgia"/>
+          <w:b w:val="false"/>
+          <w:bCs w:val="false"/>
+          <w:i/>
+          <w:iCs/>
+          <w:sz w:val="14"/>
+          <w:szCs w:val="14"/>
+        </w:rPr>
+        <w:t>string list</w:t>
+      </w:r>
+      <w:r>
+        <w:rPr>
+          <w:rFonts w:ascii="Georgia" w:hAnsi="Georgia"/>
+          <w:b w:val="false"/>
+          <w:bCs w:val="false"/>
+          <w:i w:val="false"/>
+          <w:iCs w:val="false"/>
+          <w:sz w:val="14"/>
+          <w:szCs w:val="14"/>
+        </w:rPr>
+        <w:tab/>
+      </w:r>
+      <w:r>
+        <w:rPr>
+          <w:rFonts w:ascii="Georgia" w:hAnsi="Georgia"/>
+          <w:b w:val="false"/>
+          <w:bCs w:val="false"/>
+          <w:i/>
+          <w:iCs/>
+          <w:sz w:val="14"/>
+          <w:szCs w:val="14"/>
+        </w:rPr>
+        <w:t>fixnum</w:t>
+        <w:tab/>
+      </w:r>
+      <w:r>
+        <w:rPr>
+          <w:rFonts w:ascii="Georgia" w:hAnsi="Georgia"/>
+          <w:b w:val="false"/>
+          <w:bCs w:val="false"/>
+          <w:i w:val="false"/>
+          <w:iCs w:val="false"/>
+          <w:sz w:val="14"/>
+          <w:szCs w:val="14"/>
+        </w:rPr>
+        <w:t>shell</w:t>
+      </w:r>
+      <w:r>
+        <w:rPr>
+          <w:rFonts w:ascii="Georgia" w:hAnsi="Georgia"/>
+          <w:b w:val="false"/>
+          <w:bCs w:val="false"/>
+          <w:i/>
+          <w:iCs/>
+          <w:sz w:val="14"/>
+          <w:szCs w:val="14"/>
+        </w:rPr>
+        <w:t xml:space="preserve"> </w:t>
+      </w:r>
+      <w:r>
+        <w:rPr>
+          <w:rFonts w:ascii="Georgia" w:hAnsi="Georgia"/>
+          <w:b w:val="false"/>
+          <w:bCs w:val="false"/>
+          <w:i w:val="false"/>
+          <w:iCs w:val="false"/>
+          <w:sz w:val="14"/>
+          <w:szCs w:val="14"/>
+        </w:rPr>
+        <w:t>command</w:t>
+      </w:r>
+    </w:p>
+    <w:p>
+      <w:pPr>
+        <w:pStyle w:val="Normal"/>
+        <w:rPr/>
+      </w:pPr>
+      <w:r>
+        <w:rPr>
+          <w:rFonts w:ascii="Georgia" w:hAnsi="Georgia"/>
+          <w:b/>
+          <w:bCs/>
+          <w:i/>
+          <w:iCs/>
+          <w:sz w:val="14"/>
+          <w:szCs w:val="14"/>
+        </w:rPr>
+        <w:tab/>
+        <w:tab/>
+        <w:t xml:space="preserve">exit </w:t>
+      </w:r>
+      <w:r>
+        <w:rPr>
+          <w:rFonts w:ascii="Georgia" w:hAnsi="Georgia"/>
+          <w:b w:val="false"/>
+          <w:bCs w:val="false"/>
+          <w:i/>
+          <w:iCs/>
+          <w:sz w:val="14"/>
+          <w:szCs w:val="14"/>
+        </w:rPr>
+        <w:t>fixnum</w:t>
+        <w:tab/>
+        <w:tab/>
+      </w:r>
+      <w:r>
+        <w:rPr>
+          <w:rFonts w:ascii="Georgia" w:hAnsi="Georgia"/>
+          <w:b w:val="false"/>
+          <w:bCs w:val="false"/>
+          <w:i w:val="false"/>
+          <w:iCs w:val="false"/>
+          <w:sz w:val="14"/>
+          <w:szCs w:val="14"/>
+        </w:rPr>
+        <w:t>doesn’t return</w:t>
+      </w:r>
+    </w:p>
+    <w:p>
+      <w:pPr>
+        <w:pStyle w:val="Normal"/>
+        <w:rPr/>
+      </w:pPr>
+      <w:r>
+        <w:rPr>
+          <w:rFonts w:ascii="Georgia" w:hAnsi="Georgia"/>
+          <w:b/>
+          <w:bCs/>
+          <w:sz w:val="14"/>
+          <w:szCs w:val="14"/>
+        </w:rPr>
+        <w:t xml:space="preserve">   </w:t>
+      </w:r>
+      <w:r>
+        <w:rPr>
+          <w:rFonts w:ascii="Georgia" w:hAnsi="Georgia"/>
+          <w:b/>
+          <w:bCs/>
+          <w:sz w:val="14"/>
+          <w:szCs w:val="14"/>
+        </w:rPr>
+        <w:tab/>
+        <w:tab/>
+      </w:r>
+      <w:r>
+        <w:rPr>
+          <w:rFonts w:ascii="Georgia" w:hAnsi="Georgia"/>
+          <w:b/>
+          <w:bCs/>
+          <w:i/>
+          <w:iCs/>
+          <w:sz w:val="14"/>
+          <w:szCs w:val="14"/>
+        </w:rPr>
+        <w:t>sysinfo</w:t>
+      </w:r>
+      <w:r>
+        <w:rPr>
+          <w:rFonts w:ascii="Georgia" w:hAnsi="Georgia"/>
+          <w:sz w:val="14"/>
+          <w:szCs w:val="14"/>
+        </w:rPr>
+        <w:t xml:space="preserve"> </w:t>
+        <w:tab/>
+        <w:tab/>
+      </w:r>
+      <w:r>
+        <w:rPr>
+          <w:rFonts w:ascii="Andale Mono" w:hAnsi="Andale Mono"/>
+          <w:sz w:val="14"/>
+          <w:szCs w:val="14"/>
+        </w:rPr>
+        <w:t>:t</w:t>
+      </w:r>
+      <w:r>
+        <w:rPr>
+          <w:rFonts w:ascii="Georgia" w:hAnsi="Georgia"/>
+          <w:sz w:val="14"/>
+          <w:szCs w:val="14"/>
+        </w:rPr>
+        <w:tab/>
+        <w:t>not on macOS</w:t>
+      </w:r>
+    </w:p>
+    <w:p>
+      <w:pPr>
+        <w:pStyle w:val="Normal"/>
+        <w:rPr>
+          <w:rFonts w:ascii="Georgia" w:hAnsi="Georgia"/>
+          <w:sz w:val="14"/>
+          <w:szCs w:val="14"/>
+        </w:rPr>
+      </w:pPr>
+      <w:r>
+        <w:rPr>
+          <w:rFonts w:ascii="Georgia" w:hAnsi="Georgia"/>
+          <w:sz w:val="14"/>
+          <w:szCs w:val="14"/>
+        </w:rPr>
+      </w:r>
+    </w:p>
+    <w:p>
+      <w:pPr>
+        <w:pStyle w:val="Normal"/>
+        <w:rPr>
+          <w:rFonts w:ascii="Georgia" w:hAnsi="Georgia"/>
+          <w:sz w:val="12"/>
+          <w:szCs w:val="12"/>
+        </w:rPr>
+      </w:pPr>
+      <w:r>
+        <w:rPr>
+          <w:rFonts w:ascii="Georgia" w:hAnsi="Georgia"/>
+          <w:b/>
+          <w:bCs/>
+          <w:i/>
+          <w:iCs/>
+          <w:sz w:val="14"/>
+          <w:szCs w:val="14"/>
+        </w:rPr>
+        <w:t xml:space="preserve">  </w:t>
+      </w:r>
+      <w:r>
+        <w:rPr>
+          <w:rFonts w:ascii="Georgia" w:hAnsi="Georgia"/>
+          <w:b/>
+          <w:bCs/>
+          <w:i/>
+          <w:iCs/>
+          <w:sz w:val="16"/>
+          <w:szCs w:val="16"/>
+        </w:rPr>
+        <w:t xml:space="preserve"> </w:t>
+      </w:r>
+      <w:r>
+        <w:rPr>
+          <w:rFonts w:ascii="Georgia" w:hAnsi="Georgia"/>
+          <w:b/>
+          <w:bCs/>
+          <w:i/>
+          <w:iCs/>
+          <w:sz w:val="16"/>
+          <w:szCs w:val="16"/>
+          <w:u w:val="none"/>
+        </w:rPr>
+        <w:t>feature</w:t>
+      </w:r>
+      <w:r>
+        <w:rPr>
+          <w:rFonts w:ascii="Georgia" w:hAnsi="Georgia"/>
+          <w:b/>
+          <w:bCs/>
+          <w:i/>
+          <w:iCs/>
+          <w:sz w:val="16"/>
+          <w:szCs w:val="16"/>
+        </w:rPr>
+        <w:t>/instrument</w:t>
+      </w:r>
+      <w:r>
+        <w:rPr>
+          <w:rFonts w:ascii="Georgia" w:hAnsi="Georgia"/>
+          <w:b/>
+          <w:bCs/>
+          <w:sz w:val="14"/>
+          <w:szCs w:val="14"/>
+        </w:rPr>
+        <w:tab/>
+      </w:r>
+    </w:p>
+    <w:p>
+      <w:pPr>
+        <w:pStyle w:val="Normal"/>
+        <w:rPr>
+          <w:rFonts w:ascii="Georgia" w:hAnsi="Georgia"/>
+          <w:sz w:val="12"/>
+          <w:szCs w:val="12"/>
+        </w:rPr>
+      </w:pPr>
+      <w:r>
+        <w:rPr>
+          <w:rFonts w:ascii="Georgia" w:hAnsi="Georgia"/>
+          <w:b/>
+          <w:bCs/>
+          <w:i/>
+          <w:iCs/>
+          <w:sz w:val="14"/>
+          <w:szCs w:val="14"/>
+        </w:rPr>
+        <w:tab/>
+        <w:tab/>
+        <w:t xml:space="preserve">instrument-control </w:t>
+      </w:r>
+      <w:r>
+        <w:rPr>
+          <w:rFonts w:ascii="Georgia" w:hAnsi="Georgia"/>
+          <w:b w:val="false"/>
+          <w:bCs w:val="false"/>
+          <w:i/>
+          <w:iCs/>
+          <w:sz w:val="14"/>
+          <w:szCs w:val="14"/>
+        </w:rPr>
         <w:t>key</w:t>
-      </w:r>
-      <w:r>
-        <w:rPr>
-          <w:rFonts w:eastAsia="Songti SC" w:cs="Arial Unicode MS" w:ascii="Georgia" w:hAnsi="Georgia"/>
-          <w:b/>
-          <w:bCs/>
-          <w:i w:val="false"/>
-          <w:iCs w:val="false"/>
-          <w:color w:val="auto"/>
-          <w:kern w:val="2"/>
-          <w:sz w:val="14"/>
-          <w:szCs w:val="14"/>
-          <w:u w:val="none"/>
-          <w:lang w:val="en-US" w:eastAsia="zh-CN" w:bidi="hi-IN"/>
-        </w:rPr>
-        <w:tab/>
-      </w:r>
-      <w:r>
-        <w:rPr>
-          <w:rFonts w:eastAsia="Songti SC" w:cs="Arial Unicode MS" w:ascii="Georgia" w:hAnsi="Georgia"/>
-          <w:b w:val="false"/>
-          <w:bCs w:val="false"/>
-          <w:i/>
-          <w:iCs/>
-          <w:color w:val="auto"/>
-          <w:kern w:val="2"/>
-          <w:sz w:val="14"/>
-          <w:szCs w:val="14"/>
-          <w:u w:val="none"/>
-          <w:lang w:val="en-US" w:eastAsia="zh-CN" w:bidi="hi-IN"/>
-        </w:rPr>
-        <w:t>vector</w:t>
-        <w:tab/>
-      </w:r>
-      <w:r>
-        <w:rPr>
-          <w:rFonts w:eastAsia="Songti SC" w:cs="Arial Unicode MS" w:ascii="Georgia" w:hAnsi="Georgia"/>
-          <w:b w:val="false"/>
-          <w:bCs w:val="false"/>
-          <w:i w:val="false"/>
-          <w:iCs w:val="false"/>
-          <w:color w:val="auto"/>
-          <w:kern w:val="2"/>
-          <w:sz w:val="14"/>
-          <w:szCs w:val="14"/>
-          <w:u w:val="none"/>
-          <w:lang w:val="en-US" w:eastAsia="zh-CN" w:bidi="hi-IN"/>
-        </w:rPr>
-        <w:t>allocations</w:t>
-      </w:r>
-      <w:r>
-        <w:rPr>
-          <w:rFonts w:eastAsia="Songti SC" w:cs="Arial Unicode MS" w:ascii="Andale Mono" w:hAnsi="Andale Mono"/>
-          <w:b w:val="false"/>
-          <w:bCs w:val="false"/>
-          <w:i/>
-          <w:iCs/>
-          <w:color w:val="auto"/>
-          <w:kern w:val="2"/>
-          <w:sz w:val="14"/>
-          <w:szCs w:val="14"/>
-          <w:u w:val="none"/>
-          <w:lang w:val="en-US" w:eastAsia="zh-CN" w:bidi="hi-IN"/>
-        </w:rPr>
-        <w:tab/>
-        <w:t xml:space="preserve"> </w:t>
-      </w:r>
-    </w:p>
-    <w:p>
-      <w:pPr>
-        <w:pStyle w:val="Normal"/>
-        <w:rPr/>
-      </w:pPr>
-      <w:r>
-        <w:rPr>
-          <w:rFonts w:eastAsia="Songti SC" w:cs="Arial Unicode MS" w:ascii="Courier New" w:hAnsi="Courier New"/>
-          <w:b/>
-          <w:bCs/>
-          <w:i w:val="false"/>
-          <w:iCs w:val="false"/>
-          <w:color w:val="auto"/>
-          <w:kern w:val="2"/>
-          <w:sz w:val="14"/>
-          <w:szCs w:val="14"/>
-          <w:u w:val="none"/>
-          <w:lang w:val="en-US" w:eastAsia="zh-CN" w:bidi="hi-IN"/>
-        </w:rPr>
-        <w:tab/>
-        <w:tab/>
-      </w:r>
-      <w:r>
-        <w:rPr>
-          <w:rFonts w:eastAsia="Songti SC" w:cs="Arial Unicode MS" w:ascii="Courier New" w:hAnsi="Courier New"/>
-          <w:b/>
-          <w:bCs/>
-          <w:i/>
-          <w:iCs/>
-          <w:color w:val="auto"/>
-          <w:kern w:val="2"/>
-          <w:sz w:val="14"/>
-          <w:szCs w:val="14"/>
-          <w:u w:val="none"/>
-          <w:lang w:val="en-US" w:eastAsia="zh-CN" w:bidi="hi-IN"/>
-        </w:rPr>
-        <w:t xml:space="preserve">    </w:t>
-      </w:r>
-      <w:r>
-        <w:rPr>
-          <w:rFonts w:eastAsia="Songti SC" w:cs="Arial Unicode MS" w:ascii="Andale Mono" w:hAnsi="Andale Mono"/>
-          <w:b w:val="false"/>
-          <w:bCs w:val="false"/>
-          <w:i/>
-          <w:iCs/>
-          <w:color w:val="auto"/>
-          <w:kern w:val="2"/>
-          <w:sz w:val="14"/>
-          <w:szCs w:val="14"/>
-          <w:u w:val="none"/>
-          <w:lang w:val="en-US" w:eastAsia="zh-CN" w:bidi="hi-IN"/>
-        </w:rPr>
-        <w:t>#(:t size total free …)</w:t>
-      </w:r>
-    </w:p>
-    <w:p>
-      <w:pPr>
-        <w:pStyle w:val="Normal"/>
-        <w:rPr/>
-      </w:pPr>
-      <w:r>
-        <w:rPr>
-          <w:rFonts w:eastAsia="Songti SC" w:cs="Arial Unicode MS" w:ascii="Georgia" w:hAnsi="Georgia"/>
-          <w:b/>
-          <w:bCs/>
-          <w:i/>
-          <w:iCs/>
-          <w:color w:val="auto"/>
-          <w:kern w:val="2"/>
-          <w:sz w:val="14"/>
-          <w:szCs w:val="14"/>
-          <w:u w:val="none"/>
-          <w:lang w:val="en-US" w:eastAsia="zh-CN" w:bidi="hi-IN"/>
-        </w:rPr>
-        <w:t xml:space="preserve"> </w:t>
-      </w:r>
-      <w:r>
-        <w:rPr>
-          <w:rFonts w:eastAsia="Songti SC" w:cs="Arial Unicode MS" w:ascii="Georgia" w:hAnsi="Georgia"/>
-          <w:b/>
-          <w:bCs/>
-          <w:i/>
-          <w:iCs/>
-          <w:color w:val="auto"/>
-          <w:kern w:val="2"/>
-          <w:sz w:val="14"/>
-          <w:szCs w:val="14"/>
-          <w:u w:val="none"/>
-          <w:lang w:val="en-US" w:eastAsia="zh-CN" w:bidi="hi-IN"/>
-        </w:rPr>
-        <w:tab/>
-        <w:tab/>
-        <w:t>heap-size</w:t>
-      </w:r>
-      <w:r>
-        <w:rPr>
-          <w:rFonts w:eastAsia="Songti SC" w:cs="Arial Unicode MS" w:ascii="Georgia" w:hAnsi="Georgia"/>
-          <w:b/>
-          <w:bCs/>
-          <w:i w:val="false"/>
-          <w:iCs w:val="false"/>
-          <w:color w:val="auto"/>
-          <w:kern w:val="2"/>
-          <w:sz w:val="14"/>
-          <w:szCs w:val="14"/>
-          <w:u w:val="none"/>
-          <w:lang w:val="en-US" w:eastAsia="zh-CN" w:bidi="hi-IN"/>
-        </w:rPr>
-        <w:t xml:space="preserve"> </w:t>
-      </w:r>
-      <w:r>
-        <w:rPr>
-          <w:rFonts w:eastAsia="Songti SC" w:cs="Arial Unicode MS" w:ascii="Georgia" w:hAnsi="Georgia"/>
-          <w:b w:val="false"/>
-          <w:bCs w:val="false"/>
-          <w:i/>
-          <w:iCs/>
-          <w:color w:val="auto"/>
-          <w:kern w:val="2"/>
-          <w:sz w:val="14"/>
-          <w:szCs w:val="14"/>
-          <w:u w:val="none"/>
-          <w:lang w:val="en-US" w:eastAsia="zh-CN" w:bidi="hi-IN"/>
-        </w:rPr>
-        <w:t>key</w:t>
-      </w:r>
-      <w:r>
-        <w:rPr>
-          <w:rFonts w:eastAsia="Songti SC" w:cs="Arial Unicode MS" w:ascii="Georgia" w:hAnsi="Georgia"/>
-          <w:b/>
-          <w:bCs/>
-          <w:i w:val="false"/>
-          <w:iCs w:val="false"/>
-          <w:color w:val="auto"/>
-          <w:kern w:val="2"/>
-          <w:sz w:val="14"/>
-          <w:szCs w:val="14"/>
-          <w:u w:val="none"/>
-          <w:lang w:val="en-US" w:eastAsia="zh-CN" w:bidi="hi-IN"/>
-        </w:rPr>
-        <w:tab/>
-        <w:t xml:space="preserve"> </w:t>
-      </w:r>
-      <w:r>
-        <w:rPr>
-          <w:rFonts w:eastAsia="Songti SC" w:cs="Arial Unicode MS" w:ascii="Georgia" w:hAnsi="Georgia"/>
-          <w:b w:val="false"/>
-          <w:bCs w:val="false"/>
-          <w:i/>
-          <w:iCs/>
-          <w:color w:val="auto"/>
-          <w:kern w:val="2"/>
-          <w:sz w:val="14"/>
-          <w:szCs w:val="14"/>
-          <w:u w:val="none"/>
-          <w:lang w:val="en-US" w:eastAsia="zh-CN" w:bidi="hi-IN"/>
-        </w:rPr>
-        <w:t>fixnum</w:t>
-        <w:tab/>
-      </w:r>
-      <w:r>
-        <w:rPr>
-          <w:rFonts w:eastAsia="Songti SC" w:cs="Arial Unicode MS" w:ascii="Georgia" w:hAnsi="Georgia"/>
-          <w:b w:val="false"/>
-          <w:bCs w:val="false"/>
-          <w:i w:val="false"/>
-          <w:iCs w:val="false"/>
-          <w:color w:val="auto"/>
-          <w:kern w:val="2"/>
-          <w:sz w:val="14"/>
-          <w:szCs w:val="14"/>
-          <w:u w:val="none"/>
-          <w:lang w:val="en-US" w:eastAsia="zh-CN" w:bidi="hi-IN"/>
-        </w:rPr>
-        <w:t>type size</w:t>
-      </w:r>
-    </w:p>
-    <w:p>
-      <w:pPr>
-        <w:pStyle w:val="Normal"/>
-        <w:rPr/>
-      </w:pPr>
-      <w:r>
-        <w:rPr>
-          <w:rFonts w:eastAsia="Songti SC" w:cs="Arial Unicode MS" w:ascii="Andale Mono" w:hAnsi="Andale Mono"/>
-          <w:b w:val="false"/>
-          <w:bCs w:val="false"/>
-          <w:i/>
-          <w:iCs/>
-          <w:color w:val="auto"/>
-          <w:kern w:val="2"/>
-          <w:sz w:val="14"/>
-          <w:szCs w:val="14"/>
-          <w:u w:val="none"/>
-          <w:lang w:val="en-US" w:eastAsia="zh-CN" w:bidi="hi-IN"/>
-        </w:rPr>
-        <w:tab/>
-        <w:tab/>
-      </w:r>
-      <w:r>
-        <w:rPr>
-          <w:rFonts w:eastAsia="Songti SC" w:cs="Arial Unicode MS" w:ascii="Georgia" w:hAnsi="Georgia"/>
-          <w:b/>
-          <w:bCs/>
-          <w:i/>
-          <w:iCs/>
-          <w:color w:val="auto"/>
-          <w:kern w:val="2"/>
-          <w:sz w:val="14"/>
-          <w:szCs w:val="14"/>
-          <w:u w:val="none"/>
-          <w:lang w:val="en-US" w:eastAsia="zh-CN" w:bidi="hi-IN"/>
-        </w:rPr>
-        <w:t>cache-room</w:t>
-      </w:r>
-      <w:r>
-        <w:rPr>
-          <w:rFonts w:eastAsia="Songti SC" w:cs="Arial Unicode MS" w:ascii="Georgia" w:hAnsi="Georgia"/>
-          <w:b/>
-          <w:bCs/>
-          <w:i w:val="false"/>
-          <w:iCs w:val="false"/>
-          <w:color w:val="auto"/>
-          <w:kern w:val="2"/>
-          <w:sz w:val="14"/>
-          <w:szCs w:val="14"/>
-          <w:u w:val="none"/>
-          <w:lang w:val="en-US" w:eastAsia="zh-CN" w:bidi="hi-IN"/>
-        </w:rPr>
-        <w:tab/>
-      </w:r>
-      <w:r>
-        <w:rPr>
-          <w:rFonts w:eastAsia="Songti SC" w:cs="Arial Unicode MS" w:ascii="Georgia" w:hAnsi="Georgia"/>
-          <w:b w:val="false"/>
-          <w:bCs w:val="false"/>
-          <w:i/>
-          <w:iCs/>
-          <w:color w:val="auto"/>
-          <w:kern w:val="2"/>
-          <w:sz w:val="14"/>
-          <w:szCs w:val="14"/>
-          <w:u w:val="none"/>
-          <w:lang w:val="en-US" w:eastAsia="zh-CN" w:bidi="hi-IN"/>
-        </w:rPr>
-        <w:t>vector</w:t>
-        <w:tab/>
-      </w:r>
-      <w:r>
-        <w:rPr>
-          <w:rFonts w:eastAsia="Songti SC" w:cs="Arial Unicode MS" w:ascii="Georgia" w:hAnsi="Georgia"/>
-          <w:b w:val="false"/>
-          <w:bCs w:val="false"/>
-          <w:i w:val="false"/>
-          <w:iCs w:val="false"/>
-          <w:color w:val="auto"/>
-          <w:kern w:val="2"/>
-          <w:sz w:val="14"/>
-          <w:szCs w:val="14"/>
-          <w:u w:val="none"/>
-          <w:lang w:val="en-US" w:eastAsia="zh-CN" w:bidi="hi-IN"/>
-        </w:rPr>
-        <w:t>allocations</w:t>
-      </w:r>
-    </w:p>
-    <w:p>
-      <w:pPr>
-        <w:pStyle w:val="Normal"/>
-        <w:rPr/>
-      </w:pPr>
-      <w:r>
-        <w:rPr>
-          <w:rFonts w:eastAsia="Songti SC" w:cs="Arial Unicode MS" w:ascii="Courier New" w:hAnsi="Courier New"/>
-          <w:b/>
-          <w:bCs/>
-          <w:i w:val="false"/>
-          <w:iCs w:val="false"/>
-          <w:color w:val="auto"/>
-          <w:kern w:val="2"/>
-          <w:sz w:val="14"/>
-          <w:szCs w:val="14"/>
-          <w:u w:val="none"/>
-          <w:lang w:val="en-US" w:eastAsia="zh-CN" w:bidi="hi-IN"/>
-        </w:rPr>
-        <w:tab/>
-        <w:tab/>
-      </w:r>
-      <w:r>
-        <w:rPr>
-          <w:rFonts w:eastAsia="Songti SC" w:cs="Arial Unicode MS" w:ascii="Courier New" w:hAnsi="Courier New"/>
-          <w:b/>
-          <w:bCs/>
-          <w:i/>
-          <w:iCs/>
-          <w:color w:val="auto"/>
-          <w:kern w:val="2"/>
-          <w:sz w:val="14"/>
-          <w:szCs w:val="14"/>
-          <w:u w:val="none"/>
-          <w:lang w:val="en-US" w:eastAsia="zh-CN" w:bidi="hi-IN"/>
-        </w:rPr>
-        <w:t xml:space="preserve">    </w:t>
-      </w:r>
-      <w:r>
-        <w:rPr>
-          <w:rFonts w:eastAsia="Songti SC" w:cs="Arial Unicode MS" w:ascii="Andale Mono" w:hAnsi="Andale Mono"/>
-          <w:b w:val="false"/>
-          <w:bCs w:val="false"/>
-          <w:i/>
-          <w:iCs/>
-          <w:color w:val="auto"/>
-          <w:kern w:val="2"/>
-          <w:sz w:val="14"/>
-          <w:szCs w:val="14"/>
-          <w:u w:val="none"/>
-          <w:lang w:val="en-US" w:eastAsia="zh-CN" w:bidi="hi-IN"/>
-        </w:rPr>
-        <w:t>#(:t size total …)</w:t>
-      </w:r>
-    </w:p>
-    <w:p>
-      <w:pPr>
-        <w:pStyle w:val="Normal"/>
-        <w:rPr>
-          <w:sz w:val="12"/>
-          <w:szCs w:val="12"/>
-        </w:rPr>
-      </w:pPr>
-      <w:r>
-        <w:rPr>
-          <w:sz w:val="12"/>
-          <w:szCs w:val="12"/>
-        </w:rPr>
-      </w:r>
-    </w:p>
-    <w:p>
-      <w:pPr>
-        <w:pStyle w:val="Normal"/>
-        <w:rPr/>
-      </w:pPr>
-      <w:r>
-        <w:rPr>
-          <w:rFonts w:ascii="Georgia" w:hAnsi="Georgia"/>
-          <w:b w:val="false"/>
-          <w:bCs w:val="false"/>
-          <w:sz w:val="14"/>
-          <w:szCs w:val="14"/>
-        </w:rPr>
-        <w:t xml:space="preserve">   </w:t>
-      </w:r>
-      <w:r>
-        <w:rPr>
-          <w:rFonts w:ascii="Georgia" w:hAnsi="Georgia"/>
-          <w:b/>
-          <w:bCs/>
-          <w:i/>
-          <w:iCs/>
-          <w:sz w:val="16"/>
-          <w:szCs w:val="16"/>
-        </w:rPr>
-        <w:t>feature</w:t>
-      </w:r>
-      <w:r>
-        <w:rPr>
-          <w:rFonts w:ascii="Georgia" w:hAnsi="Georgia"/>
-          <w:b/>
-          <w:bCs/>
-          <w:sz w:val="16"/>
-          <w:szCs w:val="16"/>
-        </w:rPr>
-        <w:t>/system</w:t>
-      </w:r>
-      <w:r>
-        <w:rPr>
-          <w:rFonts w:ascii="Georgia" w:hAnsi="Georgia"/>
-          <w:b/>
-          <w:bCs/>
-          <w:sz w:val="14"/>
-          <w:szCs w:val="14"/>
-        </w:rPr>
-        <w:tab/>
-      </w:r>
-      <w:r>
-        <w:rPr>
-          <w:rFonts w:ascii="Georgia" w:hAnsi="Georgia"/>
-          <w:b/>
-          <w:bCs/>
-          <w:i/>
-          <w:iCs/>
-          <w:sz w:val="14"/>
-          <w:szCs w:val="14"/>
-        </w:rPr>
-        <w:t>uname</w:t>
-        <w:tab/>
-        <w:tab/>
-      </w:r>
-      <w:r>
-        <w:rPr>
-          <w:rFonts w:ascii="Andale Mono" w:hAnsi="Andale Mono"/>
-          <w:b w:val="false"/>
-          <w:bCs w:val="false"/>
-          <w:i w:val="false"/>
-          <w:iCs w:val="false"/>
-          <w:sz w:val="14"/>
-          <w:szCs w:val="14"/>
-        </w:rPr>
-        <w:t>:t</w:t>
-      </w:r>
-      <w:r>
-        <w:rPr>
-          <w:rFonts w:ascii="Georgia" w:hAnsi="Georgia"/>
-          <w:b/>
-          <w:bCs/>
-          <w:i/>
-          <w:iCs/>
-          <w:sz w:val="14"/>
-          <w:szCs w:val="14"/>
-        </w:rPr>
-        <w:tab/>
-      </w:r>
-      <w:r>
-        <w:rPr>
-          <w:rFonts w:ascii="Georgia" w:hAnsi="Georgia"/>
-          <w:b w:val="false"/>
-          <w:bCs w:val="false"/>
-          <w:i w:val="false"/>
-          <w:iCs w:val="false"/>
-          <w:sz w:val="14"/>
-          <w:szCs w:val="14"/>
-        </w:rPr>
-        <w:t>system info</w:t>
-      </w:r>
-    </w:p>
-    <w:p>
-      <w:pPr>
-        <w:pStyle w:val="Normal"/>
-        <w:rPr/>
-      </w:pPr>
-      <w:r>
-        <w:rPr>
-          <w:rFonts w:ascii="Georgia" w:hAnsi="Georgia"/>
-          <w:b/>
-          <w:bCs/>
-          <w:sz w:val="14"/>
-          <w:szCs w:val="14"/>
-        </w:rPr>
-        <w:t xml:space="preserve">   </w:t>
-      </w:r>
-      <w:r>
-        <w:rPr>
-          <w:rFonts w:ascii="Georgia" w:hAnsi="Georgia"/>
-          <w:b/>
-          <w:bCs/>
-          <w:sz w:val="14"/>
-          <w:szCs w:val="14"/>
-        </w:rPr>
-        <w:tab/>
-        <w:tab/>
-      </w:r>
-      <w:r>
-        <w:rPr>
-          <w:rFonts w:ascii="Georgia" w:hAnsi="Georgia"/>
-          <w:b/>
-          <w:bCs/>
-          <w:i/>
-          <w:iCs/>
-          <w:sz w:val="14"/>
-          <w:szCs w:val="14"/>
-        </w:rPr>
-        <w:t xml:space="preserve">shell </w:t>
-      </w:r>
-      <w:r>
-        <w:rPr>
-          <w:rFonts w:ascii="Georgia" w:hAnsi="Georgia"/>
-          <w:b w:val="false"/>
-          <w:bCs w:val="false"/>
-          <w:i/>
-          <w:iCs/>
-          <w:sz w:val="14"/>
-          <w:szCs w:val="14"/>
-        </w:rPr>
-        <w:t>string list</w:t>
-      </w:r>
-      <w:r>
-        <w:rPr>
-          <w:rFonts w:ascii="Georgia" w:hAnsi="Georgia"/>
-          <w:b w:val="false"/>
-          <w:bCs w:val="false"/>
-          <w:i w:val="false"/>
-          <w:iCs w:val="false"/>
-          <w:sz w:val="14"/>
-          <w:szCs w:val="14"/>
-        </w:rPr>
-        <w:tab/>
-      </w:r>
-      <w:r>
-        <w:rPr>
-          <w:rFonts w:ascii="Georgia" w:hAnsi="Georgia"/>
-          <w:b w:val="false"/>
-          <w:bCs w:val="false"/>
-          <w:i/>
-          <w:iCs/>
-          <w:sz w:val="14"/>
-          <w:szCs w:val="14"/>
-        </w:rPr>
-        <w:t>fixnum</w:t>
-        <w:tab/>
-      </w:r>
-      <w:r>
-        <w:rPr>
-          <w:rFonts w:ascii="Georgia" w:hAnsi="Georgia"/>
-          <w:b w:val="false"/>
-          <w:bCs w:val="false"/>
-          <w:i w:val="false"/>
-          <w:iCs w:val="false"/>
-          <w:sz w:val="14"/>
-          <w:szCs w:val="14"/>
-        </w:rPr>
-        <w:t>shell</w:t>
-      </w:r>
-      <w:r>
-        <w:rPr>
-          <w:rFonts w:ascii="Georgia" w:hAnsi="Georgia"/>
-          <w:b w:val="false"/>
-          <w:bCs w:val="false"/>
-          <w:i/>
-          <w:iCs/>
-          <w:sz w:val="14"/>
-          <w:szCs w:val="14"/>
-        </w:rPr>
-        <w:t xml:space="preserve"> </w:t>
-      </w:r>
-      <w:r>
-        <w:rPr>
-          <w:rFonts w:ascii="Georgia" w:hAnsi="Georgia"/>
-          <w:b w:val="false"/>
-          <w:bCs w:val="false"/>
-          <w:i w:val="false"/>
-          <w:iCs w:val="false"/>
-          <w:sz w:val="14"/>
-          <w:szCs w:val="14"/>
-        </w:rPr>
-        <w:t>command</w:t>
-      </w:r>
-    </w:p>
-    <w:p>
-      <w:pPr>
-        <w:pStyle w:val="Normal"/>
-        <w:rPr/>
-      </w:pPr>
-      <w:r>
-        <w:rPr>
-          <w:rFonts w:ascii="Georgia" w:hAnsi="Georgia"/>
-          <w:b/>
-          <w:bCs/>
-          <w:i/>
-          <w:iCs/>
-          <w:sz w:val="14"/>
-          <w:szCs w:val="14"/>
-        </w:rPr>
-        <w:tab/>
-        <w:tab/>
-        <w:t xml:space="preserve">exit </w:t>
-      </w:r>
-      <w:r>
-        <w:rPr>
-          <w:rFonts w:ascii="Georgia" w:hAnsi="Georgia"/>
-          <w:b w:val="false"/>
-          <w:bCs w:val="false"/>
-          <w:i/>
-          <w:iCs/>
-          <w:sz w:val="14"/>
-          <w:szCs w:val="14"/>
-        </w:rPr>
-        <w:t>fixnum</w:t>
-        <w:tab/>
-        <w:tab/>
-      </w:r>
-      <w:r>
-        <w:rPr>
-          <w:rFonts w:ascii="Georgia" w:hAnsi="Georgia"/>
-          <w:b w:val="false"/>
-          <w:bCs w:val="false"/>
-          <w:i w:val="false"/>
-          <w:iCs w:val="false"/>
-          <w:sz w:val="14"/>
-          <w:szCs w:val="14"/>
-        </w:rPr>
-        <w:t>doesn’t return</w:t>
-      </w:r>
-    </w:p>
-    <w:p>
-      <w:pPr>
-        <w:pStyle w:val="Normal"/>
-        <w:rPr/>
-      </w:pPr>
-      <w:r>
-        <w:rPr>
-          <w:rFonts w:ascii="Georgia" w:hAnsi="Georgia"/>
-          <w:b/>
-          <w:bCs/>
-          <w:sz w:val="14"/>
-          <w:szCs w:val="14"/>
-        </w:rPr>
-        <w:t xml:space="preserve">   </w:t>
-      </w:r>
-      <w:r>
-        <w:rPr>
-          <w:rFonts w:ascii="Georgia" w:hAnsi="Georgia"/>
-          <w:b/>
-          <w:bCs/>
-          <w:sz w:val="14"/>
-          <w:szCs w:val="14"/>
-        </w:rPr>
-        <w:tab/>
-        <w:tab/>
-      </w:r>
-      <w:r>
-        <w:rPr>
-          <w:rFonts w:ascii="Georgia" w:hAnsi="Georgia"/>
-          <w:b/>
-          <w:bCs/>
-          <w:i/>
-          <w:iCs/>
-          <w:sz w:val="14"/>
-          <w:szCs w:val="14"/>
-        </w:rPr>
-        <w:t>sysinfo</w:t>
-      </w:r>
-      <w:r>
-        <w:rPr>
-          <w:rFonts w:ascii="Georgia" w:hAnsi="Georgia"/>
-          <w:sz w:val="14"/>
-          <w:szCs w:val="14"/>
-        </w:rPr>
-        <w:t xml:space="preserve"> </w:t>
-        <w:tab/>
-        <w:tab/>
-      </w:r>
-      <w:r>
-        <w:rPr>
-          <w:rFonts w:ascii="Andale Mono" w:hAnsi="Andale Mono"/>
-          <w:sz w:val="14"/>
-          <w:szCs w:val="14"/>
-        </w:rPr>
-        <w:t>:t</w:t>
-      </w:r>
-      <w:r>
-        <w:rPr>
-          <w:rFonts w:ascii="Georgia" w:hAnsi="Georgia"/>
-          <w:sz w:val="14"/>
-          <w:szCs w:val="14"/>
-        </w:rPr>
-        <w:tab/>
-        <w:t>not on macOS</w:t>
-      </w:r>
-    </w:p>
-    <w:p>
-      <w:pPr>
-        <w:pStyle w:val="Normal"/>
-        <w:rPr>
-          <w:rFonts w:ascii="Georgia" w:hAnsi="Georgia"/>
-          <w:sz w:val="14"/>
-          <w:szCs w:val="14"/>
-        </w:rPr>
-      </w:pPr>
-      <w:r>
-        <w:rPr>
-          <w:rFonts w:ascii="Georgia" w:hAnsi="Georgia"/>
-          <w:sz w:val="14"/>
-          <w:szCs w:val="14"/>
-        </w:rPr>
-      </w:r>
-    </w:p>
-    <w:p>
-      <w:pPr>
-        <w:pStyle w:val="Normal"/>
-        <w:rPr>
-          <w:rFonts w:ascii="Georgia" w:hAnsi="Georgia"/>
-          <w:sz w:val="12"/>
-          <w:szCs w:val="12"/>
-        </w:rPr>
-      </w:pPr>
-      <w:r>
-        <w:rPr>
-          <w:rFonts w:ascii="Georgia" w:hAnsi="Georgia"/>
-          <w:b/>
-          <w:bCs/>
-          <w:i/>
-          <w:iCs/>
-          <w:sz w:val="14"/>
-          <w:szCs w:val="14"/>
-        </w:rPr>
-        <w:t xml:space="preserve">  </w:t>
-      </w:r>
-      <w:r>
-        <w:rPr>
-          <w:rFonts w:ascii="Georgia" w:hAnsi="Georgia"/>
-          <w:b/>
-          <w:bCs/>
-          <w:i/>
-          <w:iCs/>
-          <w:sz w:val="16"/>
-          <w:szCs w:val="16"/>
-        </w:rPr>
-        <w:t xml:space="preserve"> </w:t>
-      </w:r>
-      <w:r>
-        <w:rPr>
-          <w:rFonts w:ascii="Georgia" w:hAnsi="Georgia"/>
-          <w:b/>
-          <w:bCs/>
-          <w:i/>
-          <w:iCs/>
-          <w:sz w:val="16"/>
-          <w:szCs w:val="16"/>
-          <w:u w:val="none"/>
-        </w:rPr>
-        <w:t>feature</w:t>
-      </w:r>
-      <w:r>
-        <w:rPr>
-          <w:rFonts w:ascii="Georgia" w:hAnsi="Georgia"/>
-          <w:b/>
-          <w:bCs/>
-          <w:i/>
-          <w:iCs/>
-          <w:sz w:val="16"/>
-          <w:szCs w:val="16"/>
-        </w:rPr>
-        <w:t>/instrument</w:t>
-      </w:r>
-      <w:r>
-        <w:rPr>
-          <w:rFonts w:ascii="Georgia" w:hAnsi="Georgia"/>
-          <w:b/>
-          <w:bCs/>
-          <w:sz w:val="14"/>
-          <w:szCs w:val="14"/>
-        </w:rPr>
-        <w:tab/>
-      </w:r>
-    </w:p>
-    <w:p>
-      <w:pPr>
-        <w:pStyle w:val="Normal"/>
-        <w:rPr>
-          <w:rFonts w:ascii="Georgia" w:hAnsi="Georgia"/>
-          <w:sz w:val="12"/>
-          <w:szCs w:val="12"/>
-        </w:rPr>
-      </w:pPr>
-      <w:r>
-        <w:rPr>
-          <w:rFonts w:ascii="Georgia" w:hAnsi="Georgia"/>
-          <w:b/>
-          <w:bCs/>
-          <w:i/>
-          <w:iCs/>
-          <w:sz w:val="14"/>
-          <w:szCs w:val="14"/>
-        </w:rPr>
-        <w:tab/>
-        <w:tab/>
-        <w:t xml:space="preserve">instrument-control </w:t>
-      </w:r>
-      <w:r>
-        <w:rPr>
-          <w:rFonts w:ascii="Georgia" w:hAnsi="Georgia"/>
-          <w:b w:val="false"/>
-          <w:bCs w:val="false"/>
-          <w:i/>
-          <w:iCs/>
-          <w:sz w:val="14"/>
-          <w:szCs w:val="14"/>
-        </w:rPr>
-        <w:t>key</w:t>
         <w:tab/>
       </w:r>
       <w:r>
@@ -16489,6 +16480,27 @@
         <w:tab/>
         <w:t>key | vec</w:t>
         <w:tab/>
+      </w:r>
+    </w:p>
+    <w:p>
+      <w:pPr>
+        <w:pStyle w:val="Normal"/>
+        <w:rPr>
+          <w:rFonts w:ascii="Georgia" w:hAnsi="Georgia"/>
+          <w:sz w:val="12"/>
+          <w:szCs w:val="12"/>
+        </w:rPr>
+      </w:pPr>
+      <w:r>
+        <w:rPr>
+          <w:rFonts w:ascii="Georgia" w:hAnsi="Georgia"/>
+          <w:b w:val="false"/>
+          <w:bCs w:val="false"/>
+          <w:i/>
+          <w:iCs/>
+          <w:sz w:val="12"/>
+          <w:szCs w:val="12"/>
+        </w:rPr>
       </w:r>
     </w:p>
     <w:p>
@@ -18600,19 +18612,7 @@
           <w:sz w:val="14"/>
           <w:szCs w:val="14"/>
         </w:rPr>
-        <w:t xml:space="preserve"> </w:t>
-      </w:r>
-      <w:r>
-        <w:rPr>
-          <w:rFonts w:ascii="Georgia" w:hAnsi="Georgia"/>
-          <w:b w:val="false"/>
-          <w:bCs w:val="false"/>
-          <w:i w:val="false"/>
-          <w:iCs w:val="false"/>
-          <w:sz w:val="14"/>
-          <w:szCs w:val="14"/>
-        </w:rPr>
-        <w:t>C</w:t>
+        <w:t xml:space="preserve"> C</w:t>
       </w:r>
       <w:r>
         <w:rPr>
@@ -19590,43 +19590,7 @@
           <w:sz w:val="14"/>
           <w:szCs w:val="14"/>
         </w:rPr>
-        <w:t xml:space="preserve">// </w:t>
-      </w:r>
-      <w:r>
-        <w:rPr>
-          <w:rFonts w:ascii="Andale Mono" w:hAnsi="Andale Mono"/>
-          <w:b w:val="false"/>
-          <w:bCs w:val="false"/>
-          <w:i w:val="false"/>
-          <w:iCs w:val="false"/>
-          <w:sz w:val="14"/>
-          <w:szCs w:val="14"/>
-        </w:rPr>
-        <w:t>b</w:t>
-      </w:r>
-      <w:r>
-        <w:rPr>
-          <w:rFonts w:ascii="Andale Mono" w:hAnsi="Andale Mono"/>
-          <w:b w:val="false"/>
-          <w:bCs w:val="false"/>
-          <w:i w:val="false"/>
-          <w:iCs w:val="false"/>
-          <w:sz w:val="14"/>
-          <w:szCs w:val="14"/>
-        </w:rPr>
-        <w:t>o</w:t>
-      </w:r>
-      <w:r>
-        <w:rPr>
-          <w:rFonts w:ascii="Andale Mono" w:hAnsi="Andale Mono"/>
-          <w:b w:val="false"/>
-          <w:bCs w:val="false"/>
-          <w:i w:val="false"/>
-          <w:iCs w:val="false"/>
-          <w:sz w:val="14"/>
-          <w:szCs w:val="14"/>
-        </w:rPr>
-        <w:t>ol</w:t>
+        <w:t>// bool</w:t>
       </w:r>
       <w:r>
         <w:rPr>
@@ -20269,11 +20233,7 @@
       </w:pPr>
       <w:r>
         <w:rPr>
-          <w:rFonts w:ascii="Andale Mono" w:hAnsi="Andale Mono"/>
-          <w:b w:val="false"/>
-          <w:bCs w:val="false"/>
-          <w:i w:val="false"/>
-          <w:iCs w:val="false"/>
+          <w:rFonts w:ascii="Georgia" w:hAnsi="Georgia"/>
           <w:sz w:val="14"/>
           <w:szCs w:val="14"/>
         </w:rPr>
@@ -23225,7 +23185,7 @@
     <w:pPr>
       <w:widowControl/>
       <w:suppressAutoHyphens w:val="true"/>
-      <w:overflowPunct w:val="true"/>
+      <w:overflowPunct w:val="false"/>
       <w:bidi w:val="0"/>
       <w:spacing w:before="0" w:after="0"/>
       <w:jc w:val="start"/>
@@ -23391,8 +23351,8 @@
     </w:pPr>
     <w:rPr/>
   </w:style>
-  <w:style w:type="paragraph" w:styleId="FrameContentsuser">
-    <w:name w:val="Frame Contents (user)"/>
+  <w:style w:type="paragraph" w:styleId="FrameContents">
+    <w:name w:val="Frame Contents"/>
     <w:basedOn w:val="Normal"/>
     <w:qFormat/>
     <w:pPr/>

</xml_diff>

<commit_message>
#1075 - doc: better namespace documentation
</commit_message>
<xml_diff>
--- a/doc/refcards/mu-ref.docx
+++ b/doc/refcards/mu-ref.docx
@@ -38,7 +38,7 @@
           <w:tab w:val="left" w:pos="4110" w:leader="none"/>
         </w:tabs>
         <w:suppressAutoHyphens w:val="true"/>
-        <w:overflowPunct w:val="false"/>
+        <w:overflowPunct w:val="true"/>
         <w:bidi w:val="0"/>
         <w:spacing w:before="0" w:after="0"/>
         <w:ind w:hanging="0" w:start="0" w:end="0"/>
@@ -349,19 +349,7 @@
           <w:sz w:val="16"/>
           <w:szCs w:val="16"/>
         </w:rPr>
-        <w:t>0.2.1</w:t>
-      </w:r>
-      <w:r>
-        <w:rPr>
-          <w:rFonts w:ascii="Georgia" w:hAnsi="Georgia"/>
-          <w:b/>
-          <w:bCs/>
-          <w:i/>
-          <w:iCs/>
-          <w:sz w:val="16"/>
-          <w:szCs w:val="16"/>
-        </w:rPr>
-        <w:t>7</w:t>
+        <w:t>0.2.17</w:t>
       </w:r>
     </w:p>
     <w:p>
@@ -5549,7 +5537,7 @@
         <w:pStyle w:val="Normal"/>
         <w:widowControl/>
         <w:suppressAutoHyphens w:val="true"/>
-        <w:overflowPunct w:val="false"/>
+        <w:overflowPunct w:val="true"/>
         <w:bidi w:val="0"/>
         <w:spacing w:before="0" w:after="0"/>
         <w:ind w:hanging="0" w:start="0" w:end="0"/>
@@ -9898,7 +9886,29 @@
           <w:sz w:val="16"/>
           <w:szCs w:val="16"/>
         </w:rPr>
-        <w:t>runtime namespaces:  mu (static)</w:t>
+        <w:t xml:space="preserve">           </w:t>
+      </w:r>
+      <w:r>
+        <w:rPr>
+          <w:rFonts w:ascii="Georgia" w:hAnsi="Georgia"/>
+          <w:b/>
+          <w:bCs/>
+          <w:i/>
+          <w:iCs/>
+          <w:sz w:val="16"/>
+          <w:szCs w:val="16"/>
+        </w:rPr>
+        <w:t>mu</w:t>
+      </w:r>
+      <w:r>
+        <w:rPr>
+          <w:rFonts w:ascii="Georgia" w:hAnsi="Georgia"/>
+          <w:i/>
+          <w:iCs/>
+          <w:sz w:val="16"/>
+          <w:szCs w:val="16"/>
+        </w:rPr>
+        <w:t xml:space="preserve"> (static)</w:t>
       </w:r>
       <w:r>
         <w:rPr>
@@ -9913,12 +9923,64 @@
       <w:r>
         <w:rPr>
           <w:rFonts w:ascii="Georgia" w:hAnsi="Georgia"/>
+          <w:b/>
+          <w:bCs/>
           <w:i/>
           <w:iCs/>
           <w:sz w:val="16"/>
           <w:szCs w:val="16"/>
         </w:rPr>
         <w:t>keyword</w:t>
+      </w:r>
+      <w:r>
+        <w:rPr>
+          <w:rFonts w:ascii="Georgia" w:hAnsi="Georgia"/>
+          <w:i/>
+          <w:iCs/>
+          <w:sz w:val="16"/>
+          <w:szCs w:val="16"/>
+        </w:rPr>
+        <w:t xml:space="preserve">  #s(:ns #(:t </w:t>
+      </w:r>
+      <w:r>
+        <w:rPr>
+          <w:rFonts w:ascii="Georgia" w:hAnsi="Georgia"/>
+          <w:i/>
+          <w:iCs/>
+          <w:sz w:val="16"/>
+          <w:szCs w:val="16"/>
+        </w:rPr>
+        <w:t>s</w:t>
+      </w:r>
+      <w:r>
+        <w:rPr>
+          <w:rFonts w:ascii="Georgia" w:hAnsi="Georgia"/>
+          <w:i/>
+          <w:iCs/>
+          <w:sz w:val="16"/>
+          <w:szCs w:val="16"/>
+        </w:rPr>
+        <w:t>t</w:t>
+      </w:r>
+      <w:r>
+        <w:rPr>
+          <w:rFonts w:ascii="Georgia" w:hAnsi="Georgia"/>
+          <w:i/>
+          <w:iCs/>
+          <w:sz w:val="16"/>
+          <w:szCs w:val="16"/>
+        </w:rPr>
+        <w:t>r</w:t>
+      </w:r>
+      <w:r>
+        <w:rPr>
+          <w:rFonts w:ascii="Georgia" w:hAnsi="Georgia"/>
+          <w:i/>
+          <w:iCs/>
+          <w:sz w:val="16"/>
+          <w:szCs w:val="16"/>
+        </w:rPr>
+        <w:t>))</w:t>
       </w:r>
     </w:p>
     <w:p>
@@ -15247,43 +15309,7 @@
           <w:sz w:val="14"/>
           <w:szCs w:val="14"/>
         </w:rPr>
-        <w:t>n</w:t>
-      </w:r>
-      <w:r>
-        <w:rPr>
-          <w:rFonts w:ascii="Georgia" w:hAnsi="Georgia"/>
-          <w:b/>
-          <w:bCs/>
-          <w:i/>
-          <w:iCs/>
-          <w:sz w:val="14"/>
-          <w:szCs w:val="14"/>
-        </w:rPr>
-        <w:t>a</w:t>
-      </w:r>
-      <w:r>
-        <w:rPr>
-          <w:rFonts w:ascii="Georgia" w:hAnsi="Georgia"/>
-          <w:b/>
-          <w:bCs/>
-          <w:i/>
-          <w:iCs/>
-          <w:sz w:val="14"/>
-          <w:szCs w:val="14"/>
-        </w:rPr>
-        <w:t>m</w:t>
-      </w:r>
-      <w:r>
-        <w:rPr>
-          <w:rFonts w:ascii="Georgia" w:hAnsi="Georgia"/>
-          <w:b/>
-          <w:bCs/>
-          <w:i/>
-          <w:iCs/>
-          <w:sz w:val="14"/>
-          <w:szCs w:val="14"/>
-        </w:rPr>
-        <w:t xml:space="preserve">espace  </w:t>
+        <w:t xml:space="preserve">namespace  </w:t>
       </w:r>
       <w:r>
         <w:rPr>
@@ -16494,10 +16520,6 @@
       <w:r>
         <w:rPr>
           <w:rFonts w:ascii="Georgia" w:hAnsi="Georgia"/>
-          <w:b w:val="false"/>
-          <w:bCs w:val="false"/>
-          <w:i/>
-          <w:iCs/>
           <w:sz w:val="12"/>
           <w:szCs w:val="12"/>
         </w:rPr>
@@ -23185,7 +23207,7 @@
     <w:pPr>
       <w:widowControl/>
       <w:suppressAutoHyphens w:val="true"/>
-      <w:overflowPunct w:val="false"/>
+      <w:overflowPunct w:val="true"/>
       <w:bidi w:val="0"/>
       <w:spacing w:before="0" w:after="0"/>
       <w:jc w:val="start"/>
@@ -23351,8 +23373,8 @@
     </w:pPr>
     <w:rPr/>
   </w:style>
-  <w:style w:type="paragraph" w:styleId="FrameContents">
-    <w:name w:val="Frame Contents"/>
+  <w:style w:type="paragraph" w:styleId="FrameContentsuser">
+    <w:name w:val="Frame Contents (user)"/>
     <w:basedOn w:val="Normal"/>
     <w:qFormat/>
     <w:pPr/>

</xml_diff>

<commit_message>
project: rename to mu
</commit_message>
<xml_diff>
--- a/doc/refcards/mu-ref.docx
+++ b/doc/refcards/mu-ref.docx
@@ -62,7 +62,7 @@
           <w:tab w:val="left" w:pos="4110" w:leader="none"/>
         </w:tabs>
         <w:suppressAutoHyphens w:val="true"/>
-        <w:overflowPunct w:val="false"/>
+        <w:overflowPunct w:val="true"/>
         <w:bidi w:val="0"/>
         <w:spacing w:before="0" w:after="0"/>
         <w:ind w:hanging="0" w:left="0" w:right="0"/>
@@ -345,7 +345,19 @@
           <w:sz w:val="16"/>
           <w:szCs w:val="16"/>
         </w:rPr>
-        <w:t>0.2.20</w:t>
+        <w:t>0.2.2</w:t>
+      </w:r>
+      <w:r>
+        <w:rPr>
+          <w:rFonts w:ascii="Georgia" w:hAnsi="Georgia"/>
+          <w:b/>
+          <w:bCs/>
+          <w:i/>
+          <w:iCs/>
+          <w:sz w:val="16"/>
+          <w:szCs w:val="16"/>
+        </w:rPr>
+        <w:t>1</w:t>
       </w:r>
     </w:p>
     <w:p>
@@ -554,31 +566,7 @@
           <w:sz w:val="16"/>
           <w:szCs w:val="16"/>
         </w:rPr>
-        <w:t xml:space="preserve">are false, </w:t>
-      </w:r>
-      <w:r>
-        <w:rPr>
-          <w:rFonts w:ascii="Georgia" w:hAnsi="Georgia"/>
-          <w:b w:val="false"/>
-          <w:bCs w:val="false"/>
-          <w:i w:val="false"/>
-          <w:iCs w:val="false"/>
-          <w:sz w:val="16"/>
-          <w:szCs w:val="16"/>
-        </w:rPr>
-        <w:t>else</w:t>
-      </w:r>
-      <w:r>
-        <w:rPr>
-          <w:rFonts w:ascii="Georgia" w:hAnsi="Georgia"/>
-          <w:b w:val="false"/>
-          <w:bCs w:val="false"/>
-          <w:i w:val="false"/>
-          <w:iCs w:val="false"/>
-          <w:sz w:val="16"/>
-          <w:szCs w:val="16"/>
-        </w:rPr>
-        <w:t xml:space="preserve"> true</w:t>
+        <w:t>are false, else true</w:t>
       </w:r>
     </w:p>
     <w:p>
@@ -636,17 +624,6 @@
           <w:szCs w:val="16"/>
         </w:rPr>
         <w:t>keyword</w:t>
-      </w:r>
-      <w:r>
-        <w:rPr>
-          <w:rFonts w:ascii="Georgia" w:hAnsi="Georgia"/>
-          <w:b w:val="false"/>
-          <w:bCs w:val="false"/>
-          <w:i/>
-          <w:iCs/>
-          <w:sz w:val="16"/>
-          <w:szCs w:val="16"/>
-        </w:rPr>
         <w:tab/>
         <w:tab/>
       </w:r>
@@ -2129,7 +2106,7 @@
         <w:pStyle w:val="Normal"/>
         <w:widowControl/>
         <w:suppressAutoHyphens w:val="true"/>
-        <w:overflowPunct w:val="false"/>
+        <w:overflowPunct w:val="true"/>
         <w:bidi w:val="0"/>
         <w:spacing w:before="0" w:after="0"/>
         <w:ind w:hanging="0" w:left="0" w:right="0"/>
@@ -3568,11 +3545,6 @@
       </w:pPr>
       <w:r>
         <w:rPr>
-          <w:rFonts w:ascii="Georgia" w:hAnsi="Georgia"/>
-          <w:b w:val="false"/>
-          <w:bCs w:val="false"/>
-          <w:i w:val="false"/>
-          <w:iCs w:val="false"/>
           <w:sz w:val="16"/>
           <w:szCs w:val="16"/>
         </w:rPr>
@@ -3589,11 +3561,6 @@
       </w:pPr>
       <w:r>
         <w:rPr>
-          <w:rFonts w:ascii="Georgia" w:hAnsi="Georgia"/>
-          <w:b w:val="false"/>
-          <w:bCs w:val="false"/>
-          <w:i w:val="false"/>
-          <w:iCs w:val="false"/>
           <w:sz w:val="16"/>
           <w:szCs w:val="16"/>
         </w:rPr>
@@ -5600,7 +5567,7 @@
         <w:pStyle w:val="Normal"/>
         <w:widowControl/>
         <w:suppressAutoHyphens w:val="true"/>
-        <w:overflowPunct w:val="false"/>
+        <w:overflowPunct w:val="true"/>
         <w:bidi w:val="0"/>
         <w:spacing w:before="0" w:after="0"/>
         <w:ind w:hanging="0" w:left="0" w:right="0"/>
@@ -9560,11 +9527,6 @@
       </w:pPr>
       <w:r>
         <w:rPr>
-          <w:rFonts w:ascii="Georgia" w:hAnsi="Georgia"/>
-          <w:b w:val="false"/>
-          <w:bCs w:val="false"/>
-          <w:i w:val="false"/>
-          <w:iCs w:val="false"/>
           <w:sz w:val="16"/>
           <w:szCs w:val="16"/>
         </w:rPr>
@@ -13969,6 +13931,7 @@
         <w:t>keyword</w:t>
         <w:tab/>
         <w:tab/>
+        <w:t xml:space="preserve"> </w:t>
       </w:r>
     </w:p>
     <w:p>
@@ -16693,20 +16656,38 @@
         </w:rPr>
         <w:t>connect</w:t>
       </w:r>
-    </w:p>
-    <w:p>
-      <w:pPr>
-        <w:pStyle w:val="Normal"/>
-        <w:rPr>
-          <w:rFonts w:ascii="Georgia" w:hAnsi="Georgia"/>
-          <w:b w:val="false"/>
-          <w:bCs w:val="false"/>
-          <w:sz w:val="14"/>
-          <w:szCs w:val="14"/>
-        </w:rPr>
-      </w:pPr>
-      <w:r>
-        <w:rPr/>
+      <w:r>
+        <w:rPr>
+          <w:rFonts w:ascii="Georgia" w:hAnsi="Georgia"/>
+          <w:b w:val="false"/>
+          <w:bCs w:val="false"/>
+          <w:i w:val="false"/>
+          <w:iCs w:val="false"/>
+          <w:sz w:val="14"/>
+          <w:szCs w:val="14"/>
+        </w:rPr>
+        <w:t>...</w:t>
+      </w:r>
+    </w:p>
+    <w:p>
+      <w:pPr>
+        <w:pStyle w:val="Normal"/>
+        <w:rPr>
+          <w:rFonts w:ascii="Georgia" w:hAnsi="Georgia"/>
+          <w:b w:val="false"/>
+          <w:bCs w:val="false"/>
+          <w:sz w:val="14"/>
+          <w:szCs w:val="14"/>
+        </w:rPr>
+      </w:pPr>
+      <w:r>
+        <w:rPr>
+          <w:rFonts w:ascii="Georgia" w:hAnsi="Georgia"/>
+          <w:b w:val="false"/>
+          <w:bCs w:val="false"/>
+          <w:sz w:val="14"/>
+          <w:szCs w:val="14"/>
+        </w:rPr>
       </w:r>
     </w:p>
     <w:p>
@@ -17272,11 +17253,11 @@
       </w:r>
       <w:r>
         <w:rPr>
-          <w:rFonts w:ascii="Andale Mono" w:hAnsi="Andale Mono"/>
-          <w:b w:val="false"/>
-          <w:bCs w:val="false"/>
-          <w:i/>
-          <w:iCs/>
+          <w:rFonts w:ascii="Georgia" w:hAnsi="Georgia"/>
+          <w:b/>
+          <w:bCs/>
+          <w:i w:val="false"/>
+          <w:iCs w:val="false"/>
           <w:sz w:val="12"/>
           <w:szCs w:val="12"/>
         </w:rPr>
@@ -17287,17 +17268,20 @@
       <w:pPr>
         <w:pStyle w:val="Normal"/>
         <w:rPr>
-          <w:b w:val="false"/>
-          <w:bCs w:val="false"/>
-        </w:rPr>
-      </w:pPr>
-      <w:r>
-        <w:rPr>
-          <w:rFonts w:ascii="Andale Mono" w:hAnsi="Andale Mono"/>
-          <w:b w:val="false"/>
-          <w:bCs w:val="false"/>
-          <w:i/>
-          <w:iCs/>
+          <w:rFonts w:ascii="Georgia" w:hAnsi="Georgia"/>
+          <w:b/>
+          <w:bCs/>
+          <w:i w:val="false"/>
+          <w:iCs w:val="false"/>
+        </w:rPr>
+      </w:pPr>
+      <w:r>
+        <w:rPr>
+          <w:rFonts w:ascii="Georgia" w:hAnsi="Georgia"/>
+          <w:b/>
+          <w:bCs/>
+          <w:i w:val="false"/>
+          <w:iCs w:val="false"/>
           <w:sz w:val="12"/>
           <w:szCs w:val="12"/>
         </w:rPr>
@@ -17305,11 +17289,11 @@
       </w:r>
       <w:r>
         <w:rPr>
-          <w:rFonts w:ascii="Andale Mono" w:hAnsi="Andale Mono"/>
-          <w:b w:val="false"/>
-          <w:bCs w:val="false"/>
-          <w:i/>
-          <w:iCs/>
+          <w:rFonts w:ascii="Georgia" w:hAnsi="Georgia"/>
+          <w:b/>
+          <w:bCs/>
+          <w:i w:val="false"/>
+          <w:iCs w:val="false"/>
           <w:sz w:val="12"/>
           <w:szCs w:val="12"/>
         </w:rPr>
@@ -17323,38 +17307,37 @@
       </w:pPr>
       <w:r>
         <w:rPr>
-          <w:rFonts w:ascii="Andale Mono" w:hAnsi="Andale Mono"/>
-          <w:b w:val="false"/>
-          <w:bCs w:val="false"/>
-          <w:i/>
-          <w:iCs/>
+          <w:rFonts w:ascii="Georgia" w:hAnsi="Georgia"/>
+          <w:b/>
+          <w:bCs/>
+          <w:i w:val="false"/>
+          <w:iCs w:val="false"/>
           <w:sz w:val="12"/>
           <w:szCs w:val="12"/>
         </w:rPr>
-        <w:t xml:space="preserve">   </w:t>
-      </w:r>
-      <w:r>
-        <w:rPr>
-          <w:rFonts w:ascii="Andale Mono" w:hAnsi="Andale Mono"/>
-          <w:b w:val="false"/>
-          <w:bCs w:val="false"/>
-          <w:i/>
-          <w:iCs/>
+        <w:t xml:space="preserve">           </w:t>
+      </w:r>
+      <w:r>
+        <w:rPr>
+          <w:rFonts w:ascii="Georgia" w:hAnsi="Georgia"/>
+          <w:b/>
+          <w:bCs/>
+          <w:i w:val="false"/>
+          <w:iCs w:val="false"/>
           <w:sz w:val="12"/>
           <w:szCs w:val="12"/>
         </w:rPr>
-        <w:tab/>
         <w:t>git =“</w:t>
       </w:r>
       <w:hyperlink r:id="rId2">
         <w:r>
           <w:rPr>
             <w:rStyle w:val="Hyperlink"/>
-            <w:rFonts w:ascii="Andale Mono" w:hAnsi="Andale Mono"/>
-            <w:b w:val="false"/>
-            <w:bCs w:val="false"/>
-            <w:i/>
-            <w:iCs/>
+            <w:rFonts w:ascii="Georgia" w:hAnsi="Georgia"/>
+            <w:b/>
+            <w:bCs/>
+            <w:i w:val="false"/>
+            <w:iCs w:val="false"/>
             <w:sz w:val="12"/>
             <w:szCs w:val="12"/>
           </w:rPr>
@@ -17364,11 +17347,11 @@
       <w:r>
         <w:rPr>
           <w:rStyle w:val="Hyperlink"/>
-          <w:rFonts w:ascii="Andale Mono" w:hAnsi="Andale Mono"/>
-          <w:b w:val="false"/>
-          <w:bCs w:val="false"/>
-          <w:i/>
-          <w:iCs/>
+          <w:rFonts w:ascii="Georgia" w:hAnsi="Georgia"/>
+          <w:b/>
+          <w:bCs/>
+          <w:i w:val="false"/>
+          <w:iCs w:val="false"/>
           <w:sz w:val="12"/>
           <w:szCs w:val="12"/>
         </w:rPr>
@@ -17379,33 +17362,35 @@
       <w:pPr>
         <w:pStyle w:val="Normal"/>
         <w:rPr>
-          <w:b w:val="false"/>
-          <w:bCs w:val="false"/>
-        </w:rPr>
-      </w:pPr>
-      <w:r>
-        <w:rPr>
-          <w:rFonts w:ascii="Andale Mono" w:hAnsi="Andale Mono"/>
-          <w:b w:val="false"/>
-          <w:bCs w:val="false"/>
-          <w:i/>
-          <w:iCs/>
+          <w:rFonts w:ascii="Georgia" w:hAnsi="Georgia"/>
+          <w:b/>
+          <w:bCs/>
+          <w:i w:val="false"/>
+          <w:iCs w:val="false"/>
+        </w:rPr>
+      </w:pPr>
+      <w:r>
+        <w:rPr>
+          <w:rFonts w:ascii="Georgia" w:hAnsi="Georgia"/>
+          <w:b/>
+          <w:bCs/>
+          <w:i w:val="false"/>
+          <w:iCs w:val="false"/>
           <w:sz w:val="12"/>
           <w:szCs w:val="12"/>
         </w:rPr>
-        <w:t xml:space="preserve">   </w:t>
-      </w:r>
-      <w:r>
-        <w:rPr>
-          <w:rFonts w:ascii="Andale Mono" w:hAnsi="Andale Mono"/>
-          <w:b w:val="false"/>
-          <w:bCs w:val="false"/>
-          <w:i/>
-          <w:iCs/>
+        <w:t xml:space="preserve">           </w:t>
+      </w:r>
+      <w:r>
+        <w:rPr>
+          <w:rFonts w:ascii="Georgia" w:hAnsi="Georgia"/>
+          <w:b/>
+          <w:bCs/>
+          <w:i w:val="false"/>
+          <w:iCs w:val="false"/>
           <w:sz w:val="12"/>
           <w:szCs w:val="12"/>
         </w:rPr>
-        <w:tab/>
         <w:t>branch = “main”</w:t>
       </w:r>
     </w:p>
@@ -17413,17 +17398,20 @@
       <w:pPr>
         <w:pStyle w:val="Normal"/>
         <w:rPr>
-          <w:b w:val="false"/>
-          <w:bCs w:val="false"/>
-        </w:rPr>
-      </w:pPr>
-      <w:r>
-        <w:rPr>
-          <w:rFonts w:ascii="Andale Mono" w:hAnsi="Andale Mono"/>
-          <w:b w:val="false"/>
-          <w:bCs w:val="false"/>
-          <w:i/>
-          <w:iCs/>
+          <w:rFonts w:ascii="Georgia" w:hAnsi="Georgia"/>
+          <w:b/>
+          <w:bCs/>
+          <w:i w:val="false"/>
+          <w:iCs w:val="false"/>
+        </w:rPr>
+      </w:pPr>
+      <w:r>
+        <w:rPr>
+          <w:rFonts w:ascii="Georgia" w:hAnsi="Georgia"/>
+          <w:b/>
+          <w:bCs/>
+          <w:i w:val="false"/>
+          <w:iCs w:val="false"/>
           <w:sz w:val="12"/>
           <w:szCs w:val="12"/>
         </w:rPr>
@@ -17431,11 +17419,11 @@
       </w:r>
       <w:r>
         <w:rPr>
-          <w:rFonts w:ascii="Andale Mono" w:hAnsi="Andale Mono"/>
-          <w:b w:val="false"/>
-          <w:bCs w:val="false"/>
-          <w:i/>
-          <w:iCs/>
+          <w:rFonts w:ascii="Georgia" w:hAnsi="Georgia"/>
+          <w:b/>
+          <w:bCs/>
+          <w:i w:val="false"/>
+          <w:iCs w:val="false"/>
           <w:sz w:val="12"/>
           <w:szCs w:val="12"/>
         </w:rPr>
@@ -17457,11 +17445,11 @@
       </w:pPr>
       <w:r>
         <w:rPr>
-          <w:rFonts w:ascii="Georgia" w:hAnsi="Georgia"/>
-          <w:b w:val="false"/>
-          <w:bCs w:val="false"/>
-          <w:i/>
-          <w:iCs/>
+          <w:rFonts w:ascii="Andale Mono MT Std" w:hAnsi="Andale Mono MT Std"/>
+          <w:b w:val="false"/>
+          <w:bCs w:val="false"/>
+          <w:i w:val="false"/>
+          <w:iCs w:val="false"/>
           <w:sz w:val="12"/>
           <w:szCs w:val="12"/>
         </w:rPr>
@@ -17482,7 +17470,7 @@
       </w:pPr>
       <w:r>
         <w:rPr>
-          <w:rFonts w:ascii="Andale Mono" w:hAnsi="Andale Mono"/>
+          <w:rFonts w:ascii="Andale Mono MT Std" w:hAnsi="Andale Mono MT Std"/>
           <w:b w:val="false"/>
           <w:bCs w:val="false"/>
           <w:i w:val="false"/>
@@ -17494,7 +17482,7 @@
       </w:r>
       <w:r>
         <w:rPr>
-          <w:rFonts w:ascii="Andale Mono" w:hAnsi="Andale Mono"/>
+          <w:rFonts w:ascii="Andale Mono MT Std" w:hAnsi="Andale Mono MT Std"/>
           <w:b w:val="false"/>
           <w:bCs w:val="false"/>
           <w:i w:val="false"/>
@@ -17520,7 +17508,7 @@
       </w:pPr>
       <w:r>
         <w:rPr>
-          <w:rFonts w:ascii="Andale Mono" w:hAnsi="Andale Mono"/>
+          <w:rFonts w:ascii="Andale Mono MT Std" w:hAnsi="Andale Mono MT Std"/>
           <w:b w:val="false"/>
           <w:bCs w:val="false"/>
           <w:i w:val="false"/>
@@ -17532,7 +17520,7 @@
       </w:r>
       <w:r>
         <w:rPr>
-          <w:rFonts w:ascii="Andale Mono" w:hAnsi="Andale Mono"/>
+          <w:rFonts w:ascii="Andale Mono MT Std" w:hAnsi="Andale Mono MT Std"/>
           <w:b w:val="false"/>
           <w:bCs w:val="false"/>
           <w:i w:val="false"/>
@@ -17547,7 +17535,7 @@
       <w:pPr>
         <w:pStyle w:val="Normal"/>
         <w:rPr>
-          <w:rFonts w:ascii="Georgia" w:hAnsi="Georgia"/>
+          <w:rFonts w:ascii="Andale Mono MT Std" w:hAnsi="Andale Mono MT Std"/>
           <w:b w:val="false"/>
           <w:bCs w:val="false"/>
           <w:sz w:val="12"/>
@@ -17556,7 +17544,7 @@
       </w:pPr>
       <w:r>
         <w:rPr>
-          <w:rFonts w:ascii="Georgia" w:hAnsi="Georgia"/>
+          <w:rFonts w:ascii="Andale Mono MT Std" w:hAnsi="Andale Mono MT Std"/>
           <w:b w:val="false"/>
           <w:bCs w:val="false"/>
           <w:sz w:val="12"/>
@@ -17568,13 +17556,12 @@
       <w:pPr>
         <w:pStyle w:val="Normal"/>
         <w:rPr>
-          <w:b w:val="false"/>
-          <w:bCs w:val="false"/>
-        </w:rPr>
-      </w:pPr>
-      <w:r>
-        <w:rPr>
-          <w:rFonts w:ascii="Andale Mono" w:hAnsi="Andale Mono"/>
+          <w:rFonts w:ascii="Andale Mono MT Std" w:hAnsi="Andale Mono MT Std"/>
+        </w:rPr>
+      </w:pPr>
+      <w:r>
+        <w:rPr>
+          <w:rFonts w:ascii="Andale Mono MT Std" w:hAnsi="Andale Mono MT Std"/>
           <w:b w:val="false"/>
           <w:bCs w:val="false"/>
           <w:i w:val="false"/>
@@ -17586,7 +17573,7 @@
       </w:r>
       <w:r>
         <w:rPr>
-          <w:rFonts w:ascii="Andale Mono" w:hAnsi="Andale Mono"/>
+          <w:rFonts w:ascii="Andale Mono MT Std" w:hAnsi="Andale Mono MT Std"/>
           <w:b w:val="false"/>
           <w:bCs w:val="false"/>
           <w:i w:val="false"/>
@@ -17603,13 +17590,12 @@
         <w:bidi w:val="0"/>
         <w:ind w:hanging="0" w:left="0"/>
         <w:rPr>
-          <w:b w:val="false"/>
-          <w:bCs w:val="false"/>
-        </w:rPr>
-      </w:pPr>
-      <w:r>
-        <w:rPr>
-          <w:rFonts w:ascii="Andale Mono" w:hAnsi="Andale Mono"/>
+          <w:rFonts w:ascii="Andale Mono MT Std" w:hAnsi="Andale Mono MT Std"/>
+        </w:rPr>
+      </w:pPr>
+      <w:r>
+        <w:rPr>
+          <w:rFonts w:ascii="Andale Mono MT Std" w:hAnsi="Andale Mono MT Std"/>
           <w:b w:val="false"/>
           <w:bCs w:val="false"/>
           <w:i w:val="false"/>
@@ -17617,11 +17603,11 @@
           <w:sz w:val="12"/>
           <w:szCs w:val="12"/>
         </w:rPr>
-        <w:t xml:space="preserve">         </w:t>
-      </w:r>
-      <w:r>
-        <w:rPr>
-          <w:rFonts w:ascii="Andale Mono" w:hAnsi="Andale Mono"/>
+        <w:t xml:space="preserve">     </w:t>
+      </w:r>
+      <w:r>
+        <w:rPr>
+          <w:rFonts w:ascii="Andale Mono MT Std" w:hAnsi="Andale Mono MT Std"/>
           <w:b w:val="false"/>
           <w:bCs w:val="false"/>
           <w:i w:val="false"/>
@@ -17638,7 +17624,12 @@
         <w:bidi w:val="0"/>
         <w:ind w:hanging="0" w:left="0"/>
         <w:rPr>
-          <w:rFonts w:ascii="Andale Mono" w:hAnsi="Andale Mono"/>
+          <w:rFonts w:ascii="Andale Mono MT Std" w:hAnsi="Andale Mono MT Std"/>
+        </w:rPr>
+      </w:pPr>
+      <w:r>
+        <w:rPr>
+          <w:rFonts w:ascii="Andale Mono MT Std" w:hAnsi="Andale Mono MT Std"/>
           <w:b w:val="false"/>
           <w:bCs w:val="false"/>
           <w:i w:val="false"/>
@@ -17646,10 +17637,11 @@
           <w:sz w:val="12"/>
           <w:szCs w:val="12"/>
         </w:rPr>
-      </w:pPr>
-      <w:r>
-        <w:rPr>
-          <w:rFonts w:ascii="Andale Mono" w:hAnsi="Andale Mono"/>
+        <w:t xml:space="preserve">     </w:t>
+      </w:r>
+      <w:r>
+        <w:rPr>
+          <w:rFonts w:ascii="Andale Mono MT Std" w:hAnsi="Andale Mono MT Std"/>
           <w:b w:val="false"/>
           <w:bCs w:val="false"/>
           <w:i w:val="false"/>
@@ -17657,11 +17649,21 @@
           <w:sz w:val="12"/>
           <w:szCs w:val="12"/>
         </w:rPr>
-        <w:t xml:space="preserve">         </w:t>
-      </w:r>
-      <w:r>
-        <w:rPr>
-          <w:rFonts w:ascii="Andale Mono" w:hAnsi="Andale Mono"/>
+        <w:t>fn config(_: Option&lt;String&gt;) → Config</w:t>
+      </w:r>
+    </w:p>
+    <w:p>
+      <w:pPr>
+        <w:pStyle w:val="Normal"/>
+        <w:bidi w:val="0"/>
+        <w:ind w:hanging="0" w:left="0"/>
+        <w:rPr>
+          <w:rFonts w:ascii="Andale Mono MT Std" w:hAnsi="Andale Mono MT Std"/>
+        </w:rPr>
+      </w:pPr>
+      <w:r>
+        <w:rPr>
+          <w:rFonts w:ascii="Andale Mono MT Std" w:hAnsi="Andale Mono MT Std"/>
           <w:b w:val="false"/>
           <w:bCs w:val="false"/>
           <w:i w:val="false"/>
@@ -17669,7 +17671,19 @@
           <w:sz w:val="12"/>
           <w:szCs w:val="12"/>
         </w:rPr>
-        <w:t>fn config(_: Option&lt;String&gt;) → Config</w:t>
+        <w:t xml:space="preserve">     </w:t>
+      </w:r>
+      <w:r>
+        <w:rPr>
+          <w:rFonts w:ascii="Andale Mono MT Std" w:hAnsi="Andale Mono MT Std"/>
+          <w:b w:val="false"/>
+          <w:bCs w:val="false"/>
+          <w:i w:val="false"/>
+          <w:iCs w:val="false"/>
+          <w:sz w:val="12"/>
+          <w:szCs w:val="12"/>
+        </w:rPr>
+        <w:t>fn env(_: &amp;Config) → Env</w:t>
       </w:r>
     </w:p>
     <w:p>
@@ -17678,7 +17692,12 @@
         <w:bidi w:val="0"/>
         <w:ind w:hanging="0" w:left="0"/>
         <w:rPr>
-          <w:rFonts w:ascii="Andale Mono" w:hAnsi="Andale Mono"/>
+          <w:rFonts w:ascii="Andale Mono MT Std" w:hAnsi="Andale Mono MT Std"/>
+        </w:rPr>
+      </w:pPr>
+      <w:r>
+        <w:rPr>
+          <w:rFonts w:ascii="Andale Mono MT Std" w:hAnsi="Andale Mono MT Std"/>
           <w:b w:val="false"/>
           <w:bCs w:val="false"/>
           <w:i w:val="false"/>
@@ -17686,10 +17705,11 @@
           <w:sz w:val="12"/>
           <w:szCs w:val="12"/>
         </w:rPr>
-      </w:pPr>
-      <w:r>
-        <w:rPr>
-          <w:rFonts w:ascii="Andale Mono" w:hAnsi="Andale Mono"/>
+        <w:t xml:space="preserve">     </w:t>
+      </w:r>
+      <w:r>
+        <w:rPr>
+          <w:rFonts w:ascii="Andale Mono MT Std" w:hAnsi="Andale Mono MT Std"/>
           <w:b w:val="false"/>
           <w:bCs w:val="false"/>
           <w:i w:val="false"/>
@@ -17697,11 +17717,21 @@
           <w:sz w:val="12"/>
           <w:szCs w:val="12"/>
         </w:rPr>
-        <w:t xml:space="preserve">         </w:t>
-      </w:r>
-      <w:r>
-        <w:rPr>
-          <w:rFonts w:ascii="Andale Mono" w:hAnsi="Andale Mono"/>
+        <w:t>fn eq(_: Tag, _: Tag) → bool;</w:t>
+      </w:r>
+    </w:p>
+    <w:p>
+      <w:pPr>
+        <w:pStyle w:val="Normal"/>
+        <w:bidi w:val="0"/>
+        <w:ind w:hanging="0" w:left="0"/>
+        <w:rPr>
+          <w:rFonts w:ascii="Andale Mono MT Std" w:hAnsi="Andale Mono MT Std"/>
+        </w:rPr>
+      </w:pPr>
+      <w:r>
+        <w:rPr>
+          <w:rFonts w:ascii="Andale Mono MT Std" w:hAnsi="Andale Mono MT Std"/>
           <w:b w:val="false"/>
           <w:bCs w:val="false"/>
           <w:i w:val="false"/>
@@ -17709,7 +17739,19 @@
           <w:sz w:val="12"/>
           <w:szCs w:val="12"/>
         </w:rPr>
-        <w:t>fn env(_: &amp;Config) → Env</w:t>
+        <w:t xml:space="preserve">     </w:t>
+      </w:r>
+      <w:r>
+        <w:rPr>
+          <w:rFonts w:ascii="Andale Mono MT Std" w:hAnsi="Andale Mono MT Std"/>
+          <w:b w:val="false"/>
+          <w:bCs w:val="false"/>
+          <w:i w:val="false"/>
+          <w:iCs w:val="false"/>
+          <w:sz w:val="12"/>
+          <w:szCs w:val="12"/>
+        </w:rPr>
+        <w:t xml:space="preserve">fn err_out() → Tag  </w:t>
       </w:r>
     </w:p>
     <w:p>
@@ -17718,7 +17760,12 @@
         <w:bidi w:val="0"/>
         <w:ind w:hanging="0" w:left="0"/>
         <w:rPr>
-          <w:rFonts w:ascii="Andale Mono" w:hAnsi="Andale Mono"/>
+          <w:rFonts w:ascii="Andale Mono MT Std" w:hAnsi="Andale Mono MT Std"/>
+        </w:rPr>
+      </w:pPr>
+      <w:r>
+        <w:rPr>
+          <w:rFonts w:ascii="Andale Mono MT Std" w:hAnsi="Andale Mono MT Std"/>
           <w:b w:val="false"/>
           <w:bCs w:val="false"/>
           <w:i w:val="false"/>
@@ -17726,10 +17773,11 @@
           <w:sz w:val="12"/>
           <w:szCs w:val="12"/>
         </w:rPr>
-      </w:pPr>
-      <w:r>
-        <w:rPr>
-          <w:rFonts w:ascii="Andale Mono" w:hAnsi="Andale Mono"/>
+        <w:t xml:space="preserve">     </w:t>
+      </w:r>
+      <w:r>
+        <w:rPr>
+          <w:rFonts w:ascii="Andale Mono MT Std" w:hAnsi="Andale Mono MT Std"/>
           <w:b w:val="false"/>
           <w:bCs w:val="false"/>
           <w:i w:val="false"/>
@@ -17737,11 +17785,21 @@
           <w:sz w:val="12"/>
           <w:szCs w:val="12"/>
         </w:rPr>
-        <w:t xml:space="preserve">         </w:t>
-      </w:r>
-      <w:r>
-        <w:rPr>
-          <w:rFonts w:ascii="Andale Mono" w:hAnsi="Andale Mono"/>
+        <w:t>fn eval_str(_: &amp;Env, _: &amp;str) → Result&lt;Tag&gt;</w:t>
+      </w:r>
+    </w:p>
+    <w:p>
+      <w:pPr>
+        <w:pStyle w:val="Normal"/>
+        <w:bidi w:val="0"/>
+        <w:ind w:hanging="0" w:left="0"/>
+        <w:rPr>
+          <w:rFonts w:ascii="Andale Mono MT Std" w:hAnsi="Andale Mono MT Std"/>
+        </w:rPr>
+      </w:pPr>
+      <w:r>
+        <w:rPr>
+          <w:rFonts w:ascii="Andale Mono MT Std" w:hAnsi="Andale Mono MT Std"/>
           <w:b w:val="false"/>
           <w:bCs w:val="false"/>
           <w:i w:val="false"/>
@@ -17749,7 +17807,19 @@
           <w:sz w:val="12"/>
           <w:szCs w:val="12"/>
         </w:rPr>
-        <w:t>fn eq(_: Tag, _: Tag) → bool;</w:t>
+        <w:t xml:space="preserve">     </w:t>
+      </w:r>
+      <w:r>
+        <w:rPr>
+          <w:rFonts w:ascii="Andale Mono MT Std" w:hAnsi="Andale Mono MT Std"/>
+          <w:b w:val="false"/>
+          <w:bCs w:val="false"/>
+          <w:i w:val="false"/>
+          <w:iCs w:val="false"/>
+          <w:sz w:val="12"/>
+          <w:szCs w:val="12"/>
+        </w:rPr>
+        <w:t>fn eval(_: &amp;Env, _: Tag) → Result&lt;Tag&gt;</w:t>
       </w:r>
     </w:p>
     <w:p>
@@ -17757,11 +17827,13 @@
         <w:pStyle w:val="Normal"/>
         <w:bidi w:val="0"/>
         <w:ind w:hanging="0" w:left="0"/>
-        <w:rPr/>
-      </w:pPr>
-      <w:r>
-        <w:rPr>
-          <w:rFonts w:ascii="Andale Mono" w:hAnsi="Andale Mono"/>
+        <w:rPr>
+          <w:rFonts w:ascii="Andale Mono MT Std" w:hAnsi="Andale Mono MT Std"/>
+        </w:rPr>
+      </w:pPr>
+      <w:r>
+        <w:rPr>
+          <w:rFonts w:ascii="Andale Mono MT Std" w:hAnsi="Andale Mono MT Std"/>
           <w:b w:val="false"/>
           <w:bCs w:val="false"/>
           <w:i w:val="false"/>
@@ -17769,11 +17841,11 @@
           <w:sz w:val="12"/>
           <w:szCs w:val="12"/>
         </w:rPr>
-        <w:t xml:space="preserve">         </w:t>
-      </w:r>
-      <w:r>
-        <w:rPr>
-          <w:rFonts w:ascii="Andale Mono" w:hAnsi="Andale Mono"/>
+        <w:t xml:space="preserve">     </w:t>
+      </w:r>
+      <w:r>
+        <w:rPr>
+          <w:rFonts w:ascii="Andale Mono MT Std" w:hAnsi="Andale Mono MT Std"/>
           <w:b w:val="false"/>
           <w:bCs w:val="false"/>
           <w:i w:val="false"/>
@@ -17781,7 +17853,7 @@
           <w:sz w:val="12"/>
           <w:szCs w:val="12"/>
         </w:rPr>
-        <w:t xml:space="preserve">fn err_out() → Tag  </w:t>
+        <w:t xml:space="preserve">fn exception_string(_: &amp;Env, _: Exception) → String  </w:t>
       </w:r>
     </w:p>
     <w:p>
@@ -17790,7 +17862,12 @@
         <w:bidi w:val="0"/>
         <w:ind w:hanging="0" w:left="0"/>
         <w:rPr>
-          <w:rFonts w:ascii="Andale Mono" w:hAnsi="Andale Mono"/>
+          <w:rFonts w:ascii="Andale Mono MT Std" w:hAnsi="Andale Mono MT Std"/>
+        </w:rPr>
+      </w:pPr>
+      <w:r>
+        <w:rPr>
+          <w:rFonts w:ascii="Andale Mono MT Std" w:hAnsi="Andale Mono MT Std"/>
           <w:b w:val="false"/>
           <w:bCs w:val="false"/>
           <w:i w:val="false"/>
@@ -17798,10 +17875,11 @@
           <w:sz w:val="12"/>
           <w:szCs w:val="12"/>
         </w:rPr>
-      </w:pPr>
-      <w:r>
-        <w:rPr>
-          <w:rFonts w:ascii="Andale Mono" w:hAnsi="Andale Mono"/>
+        <w:t xml:space="preserve">     </w:t>
+      </w:r>
+      <w:r>
+        <w:rPr>
+          <w:rFonts w:ascii="Andale Mono MT Std" w:hAnsi="Andale Mono MT Std"/>
           <w:b w:val="false"/>
           <w:bCs w:val="false"/>
           <w:i w:val="false"/>
@@ -17809,11 +17887,21 @@
           <w:sz w:val="12"/>
           <w:szCs w:val="12"/>
         </w:rPr>
-        <w:t xml:space="preserve">         </w:t>
-      </w:r>
-      <w:r>
-        <w:rPr>
-          <w:rFonts w:ascii="Andale Mono" w:hAnsi="Andale Mono"/>
+        <w:t>fn load(_: &amp;Env, _: &amp;str) → Result&lt;bool&gt;</w:t>
+      </w:r>
+    </w:p>
+    <w:p>
+      <w:pPr>
+        <w:pStyle w:val="Normal"/>
+        <w:bidi w:val="0"/>
+        <w:ind w:hanging="0" w:left="0"/>
+        <w:rPr>
+          <w:rFonts w:ascii="Andale Mono MT Std" w:hAnsi="Andale Mono MT Std"/>
+        </w:rPr>
+      </w:pPr>
+      <w:r>
+        <w:rPr>
+          <w:rFonts w:ascii="Andale Mono MT Std" w:hAnsi="Andale Mono MT Std"/>
           <w:b w:val="false"/>
           <w:bCs w:val="false"/>
           <w:i w:val="false"/>
@@ -17821,7 +17909,19 @@
           <w:sz w:val="12"/>
           <w:szCs w:val="12"/>
         </w:rPr>
-        <w:t>fn eval_str(_: &amp;Env, _: &amp;str) → Result&lt;Tag&gt;</w:t>
+        <w:t xml:space="preserve">     </w:t>
+      </w:r>
+      <w:r>
+        <w:rPr>
+          <w:rFonts w:ascii="Andale Mono MT Std" w:hAnsi="Andale Mono MT Std"/>
+          <w:b w:val="false"/>
+          <w:bCs w:val="false"/>
+          <w:i w:val="false"/>
+          <w:iCs w:val="false"/>
+          <w:sz w:val="12"/>
+          <w:szCs w:val="12"/>
+        </w:rPr>
+        <w:t>fn env(_: &amp;Config) → Env</w:t>
       </w:r>
     </w:p>
     <w:p>
@@ -17830,7 +17930,12 @@
         <w:bidi w:val="0"/>
         <w:ind w:hanging="0" w:left="0"/>
         <w:rPr>
-          <w:rFonts w:ascii="Andale Mono" w:hAnsi="Andale Mono"/>
+          <w:rFonts w:ascii="Andale Mono MT Std" w:hAnsi="Andale Mono MT Std"/>
+        </w:rPr>
+      </w:pPr>
+      <w:r>
+        <w:rPr>
+          <w:rFonts w:ascii="Andale Mono MT Std" w:hAnsi="Andale Mono MT Std"/>
           <w:b w:val="false"/>
           <w:bCs w:val="false"/>
           <w:i w:val="false"/>
@@ -17838,10 +17943,11 @@
           <w:sz w:val="12"/>
           <w:szCs w:val="12"/>
         </w:rPr>
-      </w:pPr>
-      <w:r>
-        <w:rPr>
-          <w:rFonts w:ascii="Andale Mono" w:hAnsi="Andale Mono"/>
+        <w:t xml:space="preserve">     </w:t>
+      </w:r>
+      <w:r>
+        <w:rPr>
+          <w:rFonts w:ascii="Andale Mono MT Std" w:hAnsi="Andale Mono MT Std"/>
           <w:b w:val="false"/>
           <w:bCs w:val="false"/>
           <w:i w:val="false"/>
@@ -17849,11 +17955,21 @@
           <w:sz w:val="12"/>
           <w:szCs w:val="12"/>
         </w:rPr>
-        <w:t xml:space="preserve">         </w:t>
-      </w:r>
-      <w:r>
-        <w:rPr>
-          <w:rFonts w:ascii="Andale Mono" w:hAnsi="Andale Mono"/>
+        <w:t>fn nil() → Tag</w:t>
+      </w:r>
+    </w:p>
+    <w:p>
+      <w:pPr>
+        <w:pStyle w:val="Normal"/>
+        <w:bidi w:val="0"/>
+        <w:ind w:hanging="0" w:left="0"/>
+        <w:rPr>
+          <w:rFonts w:ascii="Andale Mono MT Std" w:hAnsi="Andale Mono MT Std"/>
+        </w:rPr>
+      </w:pPr>
+      <w:r>
+        <w:rPr>
+          <w:rFonts w:ascii="Andale Mono MT Std" w:hAnsi="Andale Mono MT Std"/>
           <w:b w:val="false"/>
           <w:bCs w:val="false"/>
           <w:i w:val="false"/>
@@ -17861,7 +17977,19 @@
           <w:sz w:val="12"/>
           <w:szCs w:val="12"/>
         </w:rPr>
-        <w:t>fn eval(_: &amp;Env, _: Tag) → Result&lt;Tag&gt;</w:t>
+        <w:t xml:space="preserve">     </w:t>
+      </w:r>
+      <w:r>
+        <w:rPr>
+          <w:rFonts w:ascii="Andale Mono MT Std" w:hAnsi="Andale Mono MT Std"/>
+          <w:b w:val="false"/>
+          <w:bCs w:val="false"/>
+          <w:i w:val="false"/>
+          <w:iCs w:val="false"/>
+          <w:sz w:val="12"/>
+          <w:szCs w:val="12"/>
+        </w:rPr>
+        <w:t>fn read_str(_: &amp;Env, _: &amp;str) → Result&lt;Tag&gt;</w:t>
       </w:r>
     </w:p>
     <w:p>
@@ -17869,11 +17997,13 @@
         <w:pStyle w:val="Normal"/>
         <w:bidi w:val="0"/>
         <w:ind w:hanging="0" w:left="0"/>
-        <w:rPr/>
-      </w:pPr>
-      <w:r>
-        <w:rPr>
-          <w:rFonts w:ascii="Andale Mono" w:hAnsi="Andale Mono"/>
+        <w:rPr>
+          <w:rFonts w:ascii="Andale Mono MT Std" w:hAnsi="Andale Mono MT Std"/>
+        </w:rPr>
+      </w:pPr>
+      <w:r>
+        <w:rPr>
+          <w:rFonts w:ascii="Andale Mono MT Std" w:hAnsi="Andale Mono MT Std"/>
           <w:b w:val="false"/>
           <w:bCs w:val="false"/>
           <w:i w:val="false"/>
@@ -17881,11 +18011,11 @@
           <w:sz w:val="12"/>
           <w:szCs w:val="12"/>
         </w:rPr>
-        <w:t xml:space="preserve">         </w:t>
-      </w:r>
-      <w:r>
-        <w:rPr>
-          <w:rFonts w:ascii="Andale Mono" w:hAnsi="Andale Mono"/>
+        <w:t xml:space="preserve">     </w:t>
+      </w:r>
+      <w:r>
+        <w:rPr>
+          <w:rFonts w:ascii="Andale Mono MT Std" w:hAnsi="Andale Mono MT Std"/>
           <w:b w:val="false"/>
           <w:bCs w:val="false"/>
           <w:i w:val="false"/>
@@ -17893,7 +18023,7 @@
           <w:sz w:val="12"/>
           <w:szCs w:val="12"/>
         </w:rPr>
-        <w:t xml:space="preserve">fn exception_string(_: &amp;Env, _: Exception) → String  </w:t>
+        <w:t>fn read(_: &amp;Env, _: Tag, _: bool, _: Tag) → Result&lt;Tag&gt;</w:t>
       </w:r>
     </w:p>
     <w:p>
@@ -17901,11 +18031,13 @@
         <w:pStyle w:val="Normal"/>
         <w:bidi w:val="0"/>
         <w:ind w:hanging="0" w:left="0"/>
-        <w:rPr/>
-      </w:pPr>
-      <w:r>
-        <w:rPr>
-          <w:rFonts w:ascii="Andale Mono" w:hAnsi="Andale Mono"/>
+        <w:rPr>
+          <w:rFonts w:ascii="Andale Mono MT Std" w:hAnsi="Andale Mono MT Std"/>
+        </w:rPr>
+      </w:pPr>
+      <w:r>
+        <w:rPr>
+          <w:rFonts w:ascii="Andale Mono MT Std" w:hAnsi="Andale Mono MT Std"/>
           <w:b w:val="false"/>
           <w:bCs w:val="false"/>
           <w:i w:val="false"/>
@@ -17913,11 +18045,11 @@
           <w:sz w:val="12"/>
           <w:szCs w:val="12"/>
         </w:rPr>
-        <w:t xml:space="preserve">         </w:t>
-      </w:r>
-      <w:r>
-        <w:rPr>
-          <w:rFonts w:ascii="Andale Mono" w:hAnsi="Andale Mono"/>
+        <w:t xml:space="preserve">     </w:t>
+      </w:r>
+      <w:r>
+        <w:rPr>
+          <w:rFonts w:ascii="Andale Mono MT Std" w:hAnsi="Andale Mono MT Std"/>
           <w:b w:val="false"/>
           <w:bCs w:val="false"/>
           <w:i w:val="false"/>
@@ -17925,7 +18057,7 @@
           <w:sz w:val="12"/>
           <w:szCs w:val="12"/>
         </w:rPr>
-        <w:t>fn load(_: &amp;Env, _: &amp;str) → Result&lt;bool&gt;</w:t>
+        <w:t>fn std_in() → Tag</w:t>
       </w:r>
     </w:p>
     <w:p>
@@ -17933,11 +18065,13 @@
         <w:pStyle w:val="Normal"/>
         <w:bidi w:val="0"/>
         <w:ind w:hanging="0" w:left="0"/>
-        <w:rPr/>
-      </w:pPr>
-      <w:r>
-        <w:rPr>
-          <w:rFonts w:ascii="Andale Mono" w:hAnsi="Andale Mono"/>
+        <w:rPr>
+          <w:rFonts w:ascii="Andale Mono MT Std" w:hAnsi="Andale Mono MT Std"/>
+        </w:rPr>
+      </w:pPr>
+      <w:r>
+        <w:rPr>
+          <w:rFonts w:ascii="Andale Mono MT Std" w:hAnsi="Andale Mono MT Std"/>
           <w:b w:val="false"/>
           <w:bCs w:val="false"/>
           <w:i w:val="false"/>
@@ -17945,11 +18079,11 @@
           <w:sz w:val="12"/>
           <w:szCs w:val="12"/>
         </w:rPr>
-        <w:t xml:space="preserve">         </w:t>
-      </w:r>
-      <w:r>
-        <w:rPr>
-          <w:rFonts w:ascii="Andale Mono" w:hAnsi="Andale Mono"/>
+        <w:t xml:space="preserve">     </w:t>
+      </w:r>
+      <w:r>
+        <w:rPr>
+          <w:rFonts w:ascii="Andale Mono MT Std" w:hAnsi="Andale Mono MT Std"/>
           <w:b w:val="false"/>
           <w:bCs w:val="false"/>
           <w:i w:val="false"/>
@@ -17957,7 +18091,7 @@
           <w:sz w:val="12"/>
           <w:szCs w:val="12"/>
         </w:rPr>
-        <w:t>fn env(_: &amp;Config) → Env</w:t>
+        <w:t>fn std_out() → Tag</w:t>
       </w:r>
     </w:p>
     <w:p>
@@ -17965,11 +18099,13 @@
         <w:pStyle w:val="Normal"/>
         <w:bidi w:val="0"/>
         <w:ind w:hanging="0" w:left="0"/>
-        <w:rPr/>
-      </w:pPr>
-      <w:r>
-        <w:rPr>
-          <w:rFonts w:ascii="Andale Mono" w:hAnsi="Andale Mono"/>
+        <w:rPr>
+          <w:rFonts w:ascii="Andale Mono MT Std" w:hAnsi="Andale Mono MT Std"/>
+        </w:rPr>
+      </w:pPr>
+      <w:r>
+        <w:rPr>
+          <w:rFonts w:ascii="Andale Mono MT Std" w:hAnsi="Andale Mono MT Std"/>
           <w:b w:val="false"/>
           <w:bCs w:val="false"/>
           <w:i w:val="false"/>
@@ -17977,11 +18113,11 @@
           <w:sz w:val="12"/>
           <w:szCs w:val="12"/>
         </w:rPr>
-        <w:t xml:space="preserve">         </w:t>
-      </w:r>
-      <w:r>
-        <w:rPr>
-          <w:rFonts w:ascii="Andale Mono" w:hAnsi="Andale Mono"/>
+        <w:t xml:space="preserve">     </w:t>
+      </w:r>
+      <w:r>
+        <w:rPr>
+          <w:rFonts w:ascii="Andale Mono MT Std" w:hAnsi="Andale Mono MT Std"/>
           <w:b w:val="false"/>
           <w:bCs w:val="false"/>
           <w:i w:val="false"/>
@@ -17989,7 +18125,7 @@
           <w:sz w:val="12"/>
           <w:szCs w:val="12"/>
         </w:rPr>
-        <w:t>fn nil() → Tag</w:t>
+        <w:t>fn version() → &amp;str</w:t>
       </w:r>
     </w:p>
     <w:p>
@@ -17997,11 +18133,13 @@
         <w:pStyle w:val="Normal"/>
         <w:bidi w:val="0"/>
         <w:ind w:hanging="0" w:left="0"/>
-        <w:rPr/>
-      </w:pPr>
-      <w:r>
-        <w:rPr>
-          <w:rFonts w:ascii="Andale Mono" w:hAnsi="Andale Mono"/>
+        <w:rPr>
+          <w:rFonts w:ascii="Andale Mono MT Std" w:hAnsi="Andale Mono MT Std"/>
+        </w:rPr>
+      </w:pPr>
+      <w:r>
+        <w:rPr>
+          <w:rFonts w:ascii="Andale Mono MT Std" w:hAnsi="Andale Mono MT Std"/>
           <w:b w:val="false"/>
           <w:bCs w:val="false"/>
           <w:i w:val="false"/>
@@ -18009,11 +18147,11 @@
           <w:sz w:val="12"/>
           <w:szCs w:val="12"/>
         </w:rPr>
-        <w:t xml:space="preserve">         </w:t>
-      </w:r>
-      <w:r>
-        <w:rPr>
-          <w:rFonts w:ascii="Andale Mono" w:hAnsi="Andale Mono"/>
+        <w:t xml:space="preserve">     </w:t>
+      </w:r>
+      <w:r>
+        <w:rPr>
+          <w:rFonts w:ascii="Andale Mono MT Std" w:hAnsi="Andale Mono MT Std"/>
           <w:b w:val="false"/>
           <w:bCs w:val="false"/>
           <w:i w:val="false"/>
@@ -18021,7 +18159,7 @@
           <w:sz w:val="12"/>
           <w:szCs w:val="12"/>
         </w:rPr>
-        <w:t>fn read_str(_: &amp;Env, _: &amp;str) → Result&lt;Tag&gt;</w:t>
+        <w:t>fn write_str(_: &amp;Env, _: &amp;str, _: Tag) → Result&lt;()&gt;</w:t>
       </w:r>
     </w:p>
     <w:p>
@@ -18029,11 +18167,13 @@
         <w:pStyle w:val="Normal"/>
         <w:bidi w:val="0"/>
         <w:ind w:hanging="0" w:left="0"/>
-        <w:rPr/>
-      </w:pPr>
-      <w:r>
-        <w:rPr>
-          <w:rFonts w:ascii="Andale Mono" w:hAnsi="Andale Mono"/>
+        <w:rPr>
+          <w:rFonts w:ascii="Andale Mono MT Std" w:hAnsi="Andale Mono MT Std"/>
+        </w:rPr>
+      </w:pPr>
+      <w:r>
+        <w:rPr>
+          <w:rFonts w:ascii="Andale Mono MT Std" w:hAnsi="Andale Mono MT Std"/>
           <w:b w:val="false"/>
           <w:bCs w:val="false"/>
           <w:i w:val="false"/>
@@ -18041,11 +18181,11 @@
           <w:sz w:val="12"/>
           <w:szCs w:val="12"/>
         </w:rPr>
-        <w:t xml:space="preserve">         </w:t>
-      </w:r>
-      <w:r>
-        <w:rPr>
-          <w:rFonts w:ascii="Andale Mono" w:hAnsi="Andale Mono"/>
+        <w:t xml:space="preserve">     </w:t>
+      </w:r>
+      <w:r>
+        <w:rPr>
+          <w:rFonts w:ascii="Andale Mono MT Std" w:hAnsi="Andale Mono MT Std"/>
           <w:b w:val="false"/>
           <w:bCs w:val="false"/>
           <w:i w:val="false"/>
@@ -18053,7 +18193,7 @@
           <w:sz w:val="12"/>
           <w:szCs w:val="12"/>
         </w:rPr>
-        <w:t>fn read(_: &amp;Env, _: Tag, _: bool, _: Tag) → Result&lt;Tag&gt;</w:t>
+        <w:t>fn write_to_string(_: &amp;Env, _: Tag, _: bool) → String</w:t>
       </w:r>
     </w:p>
     <w:p>
@@ -18061,11 +18201,13 @@
         <w:pStyle w:val="Normal"/>
         <w:bidi w:val="0"/>
         <w:ind w:hanging="0" w:left="0"/>
-        <w:rPr/>
-      </w:pPr>
-      <w:r>
-        <w:rPr>
-          <w:rFonts w:ascii="Andale Mono" w:hAnsi="Andale Mono"/>
+        <w:rPr>
+          <w:rFonts w:ascii="Andale Mono MT Std" w:hAnsi="Andale Mono MT Std"/>
+        </w:rPr>
+      </w:pPr>
+      <w:r>
+        <w:rPr>
+          <w:rFonts w:ascii="Andale Mono MT Std" w:hAnsi="Andale Mono MT Std"/>
           <w:b w:val="false"/>
           <w:bCs w:val="false"/>
           <w:i w:val="false"/>
@@ -18073,11 +18215,11 @@
           <w:sz w:val="12"/>
           <w:szCs w:val="12"/>
         </w:rPr>
-        <w:t xml:space="preserve">  </w:t>
-      </w:r>
-      <w:r>
-        <w:rPr>
-          <w:rFonts w:ascii="Andale Mono" w:hAnsi="Andale Mono"/>
+        <w:t xml:space="preserve">     </w:t>
+      </w:r>
+      <w:r>
+        <w:rPr>
+          <w:rFonts w:ascii="Andale Mono MT Std" w:hAnsi="Andale Mono MT Std"/>
           <w:b w:val="false"/>
           <w:bCs w:val="false"/>
           <w:i w:val="false"/>
@@ -18085,218 +18227,6 @@
           <w:sz w:val="12"/>
           <w:szCs w:val="12"/>
         </w:rPr>
-        <w:t xml:space="preserve">       </w:t>
-      </w:r>
-      <w:r>
-        <w:rPr>
-          <w:rFonts w:ascii="Andale Mono" w:hAnsi="Andale Mono"/>
-          <w:b w:val="false"/>
-          <w:bCs w:val="false"/>
-          <w:i w:val="false"/>
-          <w:iCs w:val="false"/>
-          <w:sz w:val="12"/>
-          <w:szCs w:val="12"/>
-        </w:rPr>
-        <w:t>fn std_in() → Tag</w:t>
-      </w:r>
-    </w:p>
-    <w:p>
-      <w:pPr>
-        <w:pStyle w:val="Normal"/>
-        <w:bidi w:val="0"/>
-        <w:ind w:hanging="0" w:left="0"/>
-        <w:rPr/>
-      </w:pPr>
-      <w:r>
-        <w:rPr>
-          <w:rFonts w:ascii="Andale Mono" w:hAnsi="Andale Mono"/>
-          <w:b w:val="false"/>
-          <w:bCs w:val="false"/>
-          <w:i w:val="false"/>
-          <w:iCs w:val="false"/>
-          <w:sz w:val="12"/>
-          <w:szCs w:val="12"/>
-        </w:rPr>
-        <w:t xml:space="preserve">   </w:t>
-      </w:r>
-      <w:r>
-        <w:rPr>
-          <w:rFonts w:ascii="Andale Mono" w:hAnsi="Andale Mono"/>
-          <w:b w:val="false"/>
-          <w:bCs w:val="false"/>
-          <w:i w:val="false"/>
-          <w:iCs w:val="false"/>
-          <w:sz w:val="12"/>
-          <w:szCs w:val="12"/>
-        </w:rPr>
-        <w:t xml:space="preserve">      </w:t>
-      </w:r>
-      <w:r>
-        <w:rPr>
-          <w:rFonts w:ascii="Andale Mono" w:hAnsi="Andale Mono"/>
-          <w:b w:val="false"/>
-          <w:bCs w:val="false"/>
-          <w:i w:val="false"/>
-          <w:iCs w:val="false"/>
-          <w:sz w:val="12"/>
-          <w:szCs w:val="12"/>
-        </w:rPr>
-        <w:t>fn std_out() → Tag</w:t>
-      </w:r>
-    </w:p>
-    <w:p>
-      <w:pPr>
-        <w:pStyle w:val="Normal"/>
-        <w:bidi w:val="0"/>
-        <w:ind w:hanging="0" w:left="0"/>
-        <w:rPr/>
-      </w:pPr>
-      <w:r>
-        <w:rPr>
-          <w:rFonts w:ascii="Andale Mono" w:hAnsi="Andale Mono"/>
-          <w:b w:val="false"/>
-          <w:bCs w:val="false"/>
-          <w:i w:val="false"/>
-          <w:iCs w:val="false"/>
-          <w:sz w:val="12"/>
-          <w:szCs w:val="12"/>
-        </w:rPr>
-        <w:t xml:space="preserve">   </w:t>
-      </w:r>
-      <w:r>
-        <w:rPr>
-          <w:rFonts w:ascii="Andale Mono" w:hAnsi="Andale Mono"/>
-          <w:b w:val="false"/>
-          <w:bCs w:val="false"/>
-          <w:i w:val="false"/>
-          <w:iCs w:val="false"/>
-          <w:sz w:val="12"/>
-          <w:szCs w:val="12"/>
-        </w:rPr>
-        <w:t xml:space="preserve">      </w:t>
-      </w:r>
-      <w:r>
-        <w:rPr>
-          <w:rFonts w:ascii="Andale Mono" w:hAnsi="Andale Mono"/>
-          <w:b w:val="false"/>
-          <w:bCs w:val="false"/>
-          <w:i w:val="false"/>
-          <w:iCs w:val="false"/>
-          <w:sz w:val="12"/>
-          <w:szCs w:val="12"/>
-        </w:rPr>
-        <w:t>fn version() → &amp;str</w:t>
-      </w:r>
-    </w:p>
-    <w:p>
-      <w:pPr>
-        <w:pStyle w:val="Normal"/>
-        <w:bidi w:val="0"/>
-        <w:ind w:hanging="0" w:left="0"/>
-        <w:rPr>
-          <w:rFonts w:ascii="Andale Mono" w:hAnsi="Andale Mono"/>
-          <w:b w:val="false"/>
-          <w:bCs w:val="false"/>
-          <w:i w:val="false"/>
-          <w:iCs w:val="false"/>
-          <w:sz w:val="12"/>
-          <w:szCs w:val="12"/>
-        </w:rPr>
-      </w:pPr>
-      <w:r>
-        <w:rPr>
-          <w:rFonts w:ascii="Andale Mono" w:hAnsi="Andale Mono"/>
-          <w:b w:val="false"/>
-          <w:bCs w:val="false"/>
-          <w:i w:val="false"/>
-          <w:iCs w:val="false"/>
-          <w:sz w:val="12"/>
-          <w:szCs w:val="12"/>
-        </w:rPr>
-        <w:t xml:space="preserve">         </w:t>
-      </w:r>
-      <w:r>
-        <w:rPr>
-          <w:rFonts w:ascii="Andale Mono" w:hAnsi="Andale Mono"/>
-          <w:b w:val="false"/>
-          <w:bCs w:val="false"/>
-          <w:i w:val="false"/>
-          <w:iCs w:val="false"/>
-          <w:sz w:val="12"/>
-          <w:szCs w:val="12"/>
-        </w:rPr>
-        <w:t>fn write_str(_: &amp;Env, _: &amp;str, _: Tag) → Result&lt;()&gt;</w:t>
-      </w:r>
-    </w:p>
-    <w:p>
-      <w:pPr>
-        <w:pStyle w:val="Normal"/>
-        <w:bidi w:val="0"/>
-        <w:ind w:hanging="0" w:left="0"/>
-        <w:rPr>
-          <w:rFonts w:ascii="Andale Mono" w:hAnsi="Andale Mono"/>
-          <w:b w:val="false"/>
-          <w:bCs w:val="false"/>
-          <w:i w:val="false"/>
-          <w:iCs w:val="false"/>
-          <w:sz w:val="12"/>
-          <w:szCs w:val="12"/>
-        </w:rPr>
-      </w:pPr>
-      <w:r>
-        <w:rPr>
-          <w:rFonts w:ascii="Andale Mono" w:hAnsi="Andale Mono"/>
-          <w:b w:val="false"/>
-          <w:bCs w:val="false"/>
-          <w:i w:val="false"/>
-          <w:iCs w:val="false"/>
-          <w:sz w:val="12"/>
-          <w:szCs w:val="12"/>
-        </w:rPr>
-        <w:t xml:space="preserve">         </w:t>
-      </w:r>
-      <w:r>
-        <w:rPr>
-          <w:rFonts w:ascii="Andale Mono" w:hAnsi="Andale Mono"/>
-          <w:b w:val="false"/>
-          <w:bCs w:val="false"/>
-          <w:i w:val="false"/>
-          <w:iCs w:val="false"/>
-          <w:sz w:val="12"/>
-          <w:szCs w:val="12"/>
-        </w:rPr>
-        <w:t>fn write_to_string(_: &amp;Env, _: Tag, _: bool) → String</w:t>
-      </w:r>
-    </w:p>
-    <w:p>
-      <w:pPr>
-        <w:pStyle w:val="Normal"/>
-        <w:bidi w:val="0"/>
-        <w:ind w:hanging="0" w:left="0"/>
-        <w:rPr/>
-      </w:pPr>
-      <w:r>
-        <w:rPr>
-          <w:rFonts w:ascii="Andale Mono" w:hAnsi="Andale Mono"/>
-          <w:b w:val="false"/>
-          <w:bCs w:val="false"/>
-          <w:i w:val="false"/>
-          <w:iCs w:val="false"/>
-          <w:sz w:val="12"/>
-          <w:szCs w:val="12"/>
-        </w:rPr>
-        <w:t xml:space="preserve">         </w:t>
-      </w:r>
-      <w:r>
-        <w:rPr>
-          <w:rFonts w:ascii="Andale Mono" w:hAnsi="Andale Mono"/>
-          <w:b w:val="false"/>
-          <w:bCs w:val="false"/>
-          <w:i w:val="false"/>
-          <w:iCs w:val="false"/>
-          <w:sz w:val="12"/>
-          <w:szCs w:val="12"/>
-        </w:rPr>
         <w:t>fn write(_: &amp;Env, _: Tag, _: bool, _: Tag) → Result&lt;()&gt;</w:t>
       </w:r>
     </w:p>
@@ -18304,16 +18234,12 @@
       <w:pPr>
         <w:pStyle w:val="Normal"/>
         <w:rPr>
-          <w:rFonts w:ascii="Andale Mono" w:hAnsi="Andale Mono"/>
-          <w:b w:val="false"/>
-          <w:bCs w:val="false"/>
-          <w:sz w:val="12"/>
-          <w:szCs w:val="12"/>
-        </w:rPr>
-      </w:pPr>
-      <w:r>
-        <w:rPr>
-          <w:rFonts w:ascii="Georgia" w:hAnsi="Georgia"/>
+          <w:rFonts w:ascii="Andale Mono MT Std" w:hAnsi="Andale Mono MT Std"/>
+        </w:rPr>
+      </w:pPr>
+      <w:r>
+        <w:rPr>
+          <w:rFonts w:ascii="Andale Mono MT Std" w:hAnsi="Andale Mono MT Std"/>
           <w:b/>
           <w:bCs/>
           <w:sz w:val="16"/>
@@ -18323,7 +18249,7 @@
       </w:r>
       <w:r>
         <w:rPr>
-          <w:rFonts w:ascii="Andale Mono" w:hAnsi="Andale Mono"/>
+          <w:rFonts w:ascii="Andale Mono MT Std" w:hAnsi="Andale Mono MT Std"/>
           <w:b w:val="false"/>
           <w:bCs w:val="false"/>
           <w:sz w:val="12"/>
@@ -20038,11 +19964,177 @@
           <w:sz w:val="14"/>
           <w:szCs w:val="14"/>
         </w:rPr>
+        <w:t xml:space="preserve">bool </w:t>
+      </w:r>
+      <w:r>
+        <w:rPr>
+          <w:rFonts w:ascii="Georgia" w:hAnsi="Georgia"/>
+          <w:b/>
+          <w:bCs/>
+          <w:i w:val="false"/>
+          <w:iCs w:val="false"/>
+          <w:sz w:val="14"/>
+          <w:szCs w:val="14"/>
+        </w:rPr>
+        <w:t>→</w:t>
+      </w:r>
+      <w:r>
+        <w:rPr>
+          <w:rFonts w:ascii="Georgia" w:hAnsi="Georgia"/>
+          <w:b w:val="false"/>
+          <w:bCs w:val="false"/>
+          <w:i w:val="false"/>
+          <w:iCs w:val="false"/>
+          <w:sz w:val="14"/>
+          <w:szCs w:val="14"/>
+        </w:rPr>
+        <w:t xml:space="preserve"> </w:t>
+      </w:r>
+      <w:r>
+        <w:rPr>
+          <w:rFonts w:ascii="Andale Mono" w:hAnsi="Andale Mono"/>
+          <w:b w:val="false"/>
+          <w:bCs w:val="false"/>
+          <w:i w:val="false"/>
+          <w:iCs w:val="false"/>
+          <w:sz w:val="14"/>
+          <w:szCs w:val="14"/>
+        </w:rPr>
+        <w:t>String</w:t>
+      </w:r>
+    </w:p>
+    <w:p>
+      <w:pPr>
+        <w:pStyle w:val="Normal"/>
+        <w:ind w:hanging="0" w:left="709"/>
+        <w:rPr>
+          <w:rFonts w:ascii="Georgia" w:hAnsi="Georgia"/>
+          <w:sz w:val="14"/>
+          <w:szCs w:val="14"/>
+        </w:rPr>
+      </w:pPr>
+      <w:r>
+        <w:rPr>
+          <w:rFonts w:ascii="Andale Mono" w:hAnsi="Andale Mono"/>
+          <w:b w:val="false"/>
+          <w:bCs w:val="false"/>
+          <w:i w:val="false"/>
+          <w:iCs w:val="false"/>
+          <w:sz w:val="14"/>
+          <w:szCs w:val="14"/>
+        </w:rPr>
+        <w:t>// bool – print escaped</w:t>
+      </w:r>
+    </w:p>
+    <w:p>
+      <w:pPr>
+        <w:pStyle w:val="Normal"/>
+        <w:ind w:hanging="0" w:left="709"/>
+        <w:rPr>
+          <w:rFonts w:ascii="Georgia" w:hAnsi="Georgia"/>
+          <w:sz w:val="14"/>
+          <w:szCs w:val="14"/>
+        </w:rPr>
+      </w:pPr>
+      <w:r>
+        <w:rPr>
+          <w:rFonts w:ascii="Georgia" w:hAnsi="Georgia"/>
+          <w:b/>
+          <w:bCs/>
+          <w:i/>
+          <w:iCs/>
+          <w:sz w:val="14"/>
+          <w:szCs w:val="14"/>
+        </w:rPr>
+        <w:t xml:space="preserve">write </w:t>
+      </w:r>
+      <w:r>
+        <w:rPr>
+          <w:rFonts w:ascii="Andale Mono" w:hAnsi="Andale Mono"/>
+          <w:b w:val="false"/>
+          <w:bCs w:val="false"/>
+          <w:i w:val="false"/>
+          <w:iCs w:val="false"/>
+          <w:sz w:val="14"/>
+          <w:szCs w:val="14"/>
+        </w:rPr>
+        <w:t xml:space="preserve">&amp;Env </w:t>
+      </w:r>
+      <w:r>
+        <w:rPr>
+          <w:rFonts w:ascii="Georgia" w:hAnsi="Georgia"/>
+          <w:b w:val="false"/>
+          <w:bCs w:val="false"/>
+          <w:i/>
+          <w:iCs/>
+          <w:sz w:val="14"/>
+          <w:szCs w:val="14"/>
+        </w:rPr>
+        <w:t xml:space="preserve">T </w:t>
+      </w:r>
+      <w:r>
+        <w:rPr>
+          <w:rFonts w:ascii="Georgia" w:hAnsi="Georgia"/>
+          <w:b w:val="false"/>
+          <w:bCs w:val="false"/>
+          <w:i w:val="false"/>
+          <w:iCs w:val="false"/>
+          <w:sz w:val="14"/>
+          <w:szCs w:val="14"/>
+        </w:rPr>
+        <w:t xml:space="preserve"> </w:t>
+      </w:r>
+      <w:r>
+        <w:rPr>
+          <w:rFonts w:ascii="Andale Mono" w:hAnsi="Andale Mono"/>
+          <w:b w:val="false"/>
+          <w:bCs w:val="false"/>
+          <w:i w:val="false"/>
+          <w:iCs w:val="false"/>
+          <w:sz w:val="14"/>
+          <w:szCs w:val="14"/>
+        </w:rPr>
         <w:t>bool</w:t>
       </w:r>
       <w:r>
         <w:rPr>
           <w:rFonts w:ascii="Georgia" w:hAnsi="Georgia"/>
+          <w:b w:val="false"/>
+          <w:bCs w:val="false"/>
+          <w:i w:val="false"/>
+          <w:iCs w:val="false"/>
+          <w:sz w:val="14"/>
+          <w:szCs w:val="14"/>
+        </w:rPr>
+        <w:t xml:space="preserve"> </w:t>
+      </w:r>
+      <w:r>
+        <w:rPr>
+          <w:rFonts w:ascii="Georgia" w:hAnsi="Georgia"/>
+          <w:b/>
+          <w:bCs/>
+          <w:i/>
+          <w:iCs/>
+          <w:sz w:val="14"/>
+          <w:szCs w:val="14"/>
+        </w:rPr>
+        <w:t>stream</w:t>
+      </w:r>
+      <w:r>
+        <w:rPr>
+          <w:rFonts w:ascii="Georgia" w:hAnsi="Georgia"/>
+          <w:b w:val="false"/>
+          <w:bCs w:val="false"/>
+          <w:i w:val="false"/>
+          <w:iCs w:val="false"/>
+          <w:sz w:val="14"/>
+          <w:szCs w:val="14"/>
+        </w:rPr>
+        <w:t xml:space="preserve"> </w:t>
+      </w:r>
+      <w:r>
+        <w:rPr>
+          <w:rFonts w:ascii="Georgia" w:hAnsi="Georgia"/>
           <w:b/>
           <w:bCs/>
           <w:i w:val="false"/>
@@ -20074,7 +20166,7 @@
           <w:sz w:val="14"/>
           <w:szCs w:val="14"/>
         </w:rPr>
-        <w:t>String</w:t>
+        <w:t>Result&lt;()&gt;</w:t>
       </w:r>
     </w:p>
     <w:p>
@@ -20097,7 +20189,7 @@
           <w:sz w:val="14"/>
           <w:szCs w:val="14"/>
         </w:rPr>
-        <w:t>// bool – print escaped</w:t>
+        <w:t>// bool – print escape</w:t>
       </w:r>
     </w:p>
     <w:p>
@@ -20113,134 +20205,13 @@
       <w:r>
         <w:rPr>
           <w:rFonts w:ascii="Georgia" w:hAnsi="Georgia"/>
-          <w:b/>
-          <w:bCs/>
-          <w:i/>
-          <w:iCs/>
-          <w:sz w:val="14"/>
-          <w:szCs w:val="14"/>
-        </w:rPr>
-        <w:t xml:space="preserve">write </w:t>
-      </w:r>
-      <w:r>
-        <w:rPr>
-          <w:rFonts w:ascii="Andale Mono" w:hAnsi="Andale Mono"/>
-          <w:b w:val="false"/>
-          <w:bCs w:val="false"/>
-          <w:i w:val="false"/>
-          <w:iCs w:val="false"/>
-          <w:sz w:val="14"/>
-          <w:szCs w:val="14"/>
-        </w:rPr>
-        <w:t xml:space="preserve">&amp;Env </w:t>
-      </w:r>
-      <w:r>
-        <w:rPr>
-          <w:rFonts w:ascii="Georgia" w:hAnsi="Georgia"/>
-          <w:b w:val="false"/>
-          <w:bCs w:val="false"/>
-          <w:i/>
-          <w:iCs/>
-          <w:sz w:val="14"/>
-          <w:szCs w:val="14"/>
-        </w:rPr>
-        <w:t xml:space="preserve">T </w:t>
-      </w:r>
-      <w:r>
-        <w:rPr>
-          <w:rFonts w:ascii="Georgia" w:hAnsi="Georgia"/>
-          <w:b w:val="false"/>
-          <w:bCs w:val="false"/>
-          <w:i w:val="false"/>
-          <w:iCs w:val="false"/>
-          <w:sz w:val="14"/>
-          <w:szCs w:val="14"/>
-        </w:rPr>
-        <w:t xml:space="preserve"> </w:t>
-      </w:r>
-      <w:r>
-        <w:rPr>
-          <w:rFonts w:ascii="Andale Mono" w:hAnsi="Andale Mono"/>
-          <w:b w:val="false"/>
-          <w:bCs w:val="false"/>
-          <w:i w:val="false"/>
-          <w:iCs w:val="false"/>
-          <w:sz w:val="14"/>
-          <w:szCs w:val="14"/>
-        </w:rPr>
-        <w:t>bool</w:t>
-      </w:r>
-      <w:r>
-        <w:rPr>
-          <w:rFonts w:ascii="Georgia" w:hAnsi="Georgia"/>
-          <w:b w:val="false"/>
-          <w:bCs w:val="false"/>
-          <w:i w:val="false"/>
-          <w:iCs w:val="false"/>
-          <w:sz w:val="14"/>
-          <w:szCs w:val="14"/>
-        </w:rPr>
-        <w:t xml:space="preserve"> </w:t>
-      </w:r>
-      <w:r>
-        <w:rPr>
-          <w:rFonts w:ascii="Georgia" w:hAnsi="Georgia"/>
-          <w:b/>
-          <w:bCs/>
-          <w:i/>
-          <w:iCs/>
-          <w:sz w:val="14"/>
-          <w:szCs w:val="14"/>
-        </w:rPr>
-        <w:t>stream</w:t>
-      </w:r>
-      <w:r>
-        <w:rPr>
-          <w:rFonts w:ascii="Georgia" w:hAnsi="Georgia"/>
-          <w:b w:val="false"/>
-          <w:bCs w:val="false"/>
-          <w:i w:val="false"/>
-          <w:iCs w:val="false"/>
-          <w:sz w:val="14"/>
-          <w:szCs w:val="14"/>
-        </w:rPr>
-        <w:t xml:space="preserve"> </w:t>
-      </w:r>
-      <w:r>
-        <w:rPr>
-          <w:rFonts w:ascii="Georgia" w:hAnsi="Georgia"/>
-          <w:b/>
-          <w:bCs/>
-          <w:i w:val="false"/>
-          <w:iCs w:val="false"/>
-          <w:sz w:val="14"/>
-          <w:szCs w:val="14"/>
-        </w:rPr>
-        <w:t>→</w:t>
-      </w:r>
-      <w:r>
-        <w:rPr>
-          <w:rFonts w:ascii="Georgia" w:hAnsi="Georgia"/>
-          <w:b w:val="false"/>
-          <w:bCs w:val="false"/>
-          <w:i w:val="false"/>
-          <w:iCs w:val="false"/>
-          <w:sz w:val="14"/>
-          <w:szCs w:val="14"/>
-        </w:rPr>
-        <w:t xml:space="preserve"> </w:t>
-      </w:r>
-      <w:r>
-        <w:rPr>
-          <w:rFonts w:ascii="Andale Mono" w:hAnsi="Andale Mono"/>
-          <w:b w:val="false"/>
-          <w:bCs w:val="false"/>
-          <w:i w:val="false"/>
-          <w:iCs w:val="false"/>
-          <w:sz w:val="14"/>
-          <w:szCs w:val="14"/>
-        </w:rPr>
-        <w:t>Result&lt;()&gt;</w:t>
+          <w:b w:val="false"/>
+          <w:bCs w:val="false"/>
+          <w:i w:val="false"/>
+          <w:iCs w:val="false"/>
+          <w:sz w:val="14"/>
+          <w:szCs w:val="14"/>
+        </w:rPr>
       </w:r>
     </w:p>
     <w:p>
@@ -20255,15 +20226,58 @@
       </w:pPr>
       <w:r>
         <w:rPr>
-          <w:rFonts w:ascii="Andale Mono" w:hAnsi="Andale Mono"/>
-          <w:b w:val="false"/>
-          <w:bCs w:val="false"/>
-          <w:i w:val="false"/>
-          <w:iCs w:val="false"/>
-          <w:sz w:val="14"/>
-          <w:szCs w:val="14"/>
-        </w:rPr>
-        <w:t>// bool – print escape</w:t>
+          <w:rFonts w:ascii="Georgia" w:hAnsi="Georgia"/>
+          <w:b w:val="false"/>
+          <w:bCs w:val="false"/>
+          <w:i w:val="false"/>
+          <w:iCs w:val="false"/>
+          <w:sz w:val="14"/>
+          <w:szCs w:val="14"/>
+        </w:rPr>
+      </w:r>
+    </w:p>
+    <w:p>
+      <w:pPr>
+        <w:pStyle w:val="Normal"/>
+        <w:ind w:hanging="0" w:left="709"/>
+        <w:rPr>
+          <w:rFonts w:ascii="Georgia" w:hAnsi="Georgia"/>
+          <w:sz w:val="14"/>
+          <w:szCs w:val="14"/>
+        </w:rPr>
+      </w:pPr>
+      <w:r>
+        <w:rPr>
+          <w:rFonts w:ascii="Georgia" w:hAnsi="Georgia"/>
+          <w:b w:val="false"/>
+          <w:bCs w:val="false"/>
+          <w:i w:val="false"/>
+          <w:iCs w:val="false"/>
+          <w:sz w:val="14"/>
+          <w:szCs w:val="14"/>
+        </w:rPr>
+      </w:r>
+    </w:p>
+    <w:p>
+      <w:pPr>
+        <w:pStyle w:val="Normal"/>
+        <w:ind w:hanging="0" w:left="709"/>
+        <w:rPr>
+          <w:rFonts w:ascii="Georgia" w:hAnsi="Georgia"/>
+          <w:sz w:val="14"/>
+          <w:szCs w:val="14"/>
+        </w:rPr>
+      </w:pPr>
+      <w:r>
+        <w:rPr>
+          <w:rFonts w:ascii="Georgia" w:hAnsi="Georgia"/>
+          <w:b w:val="false"/>
+          <w:bCs w:val="false"/>
+          <w:i w:val="false"/>
+          <w:iCs w:val="false"/>
+          <w:sz w:val="14"/>
+          <w:szCs w:val="14"/>
+        </w:rPr>
       </w:r>
     </w:p>
     <w:p>
@@ -20394,8 +20408,8 @@
       <w:r>
         <w:rPr>
           <w:rFonts w:ascii="Andale Mono MT Std" w:hAnsi="Andale Mono MT Std"/>
-          <w:b w:val="false"/>
-          <w:bCs w:val="false"/>
+          <w:b/>
+          <w:bCs/>
           <w:i w:val="false"/>
           <w:iCs w:val="false"/>
           <w:caps w:val="false"/>
@@ -20418,18 +20432,15 @@
         <w:spacing w:before="57" w:after="57"/>
         <w:ind w:hanging="0" w:left="0"/>
         <w:rPr>
+          <w:b/>
+          <w:bCs/>
+        </w:rPr>
+      </w:pPr>
+      <w:r>
+        <w:rPr>
           <w:rFonts w:ascii="Andale Mono MT Std" w:hAnsi="Andale Mono MT Std"/>
-          <w:b w:val="false"/>
-          <w:bCs w:val="false"/>
-          <w:sz w:val="14"/>
-          <w:szCs w:val="14"/>
-        </w:rPr>
-      </w:pPr>
-      <w:r>
-        <w:rPr>
-          <w:rFonts w:ascii="Andale Mono MT Std" w:hAnsi="Andale Mono MT Std"/>
-          <w:b w:val="false"/>
-          <w:bCs w:val="false"/>
+          <w:b/>
+          <w:bCs/>
           <w:i w:val="false"/>
           <w:iCs w:val="false"/>
           <w:caps w:val="false"/>
@@ -20444,8 +20455,8 @@
       <w:r>
         <w:rPr>
           <w:rFonts w:ascii="Andale Mono MT Std" w:hAnsi="Andale Mono MT Std"/>
-          <w:b w:val="false"/>
-          <w:bCs w:val="false"/>
+          <w:b/>
+          <w:bCs/>
           <w:i w:val="false"/>
           <w:iCs w:val="false"/>
           <w:caps w:val="false"/>
@@ -20468,18 +20479,15 @@
         <w:spacing w:before="57" w:after="57"/>
         <w:ind w:hanging="0" w:left="0"/>
         <w:rPr>
+          <w:b/>
+          <w:bCs/>
+        </w:rPr>
+      </w:pPr>
+      <w:r>
+        <w:rPr>
           <w:rFonts w:ascii="Andale Mono MT Std" w:hAnsi="Andale Mono MT Std"/>
-          <w:b w:val="false"/>
-          <w:bCs w:val="false"/>
-          <w:sz w:val="14"/>
-          <w:szCs w:val="14"/>
-        </w:rPr>
-      </w:pPr>
-      <w:r>
-        <w:rPr>
-          <w:rFonts w:ascii="Andale Mono MT Std" w:hAnsi="Andale Mono MT Std"/>
-          <w:b w:val="false"/>
-          <w:bCs w:val="false"/>
+          <w:b/>
+          <w:bCs/>
           <w:i w:val="false"/>
           <w:iCs w:val="false"/>
           <w:caps w:val="false"/>
@@ -20494,8 +20502,8 @@
       <w:r>
         <w:rPr>
           <w:rFonts w:ascii="Andale Mono MT Std" w:hAnsi="Andale Mono MT Std"/>
-          <w:b w:val="false"/>
-          <w:bCs w:val="false"/>
+          <w:b/>
+          <w:bCs/>
           <w:i/>
           <w:iCs/>
           <w:caps w:val="false"/>
@@ -20510,8 +20518,8 @@
       <w:r>
         <w:rPr>
           <w:rFonts w:ascii="Andale Mono MT Std" w:hAnsi="Andale Mono MT Std"/>
-          <w:b w:val="false"/>
-          <w:bCs w:val="false"/>
+          <w:b/>
+          <w:bCs/>
           <w:i w:val="false"/>
           <w:iCs w:val="false"/>
           <w:caps w:val="false"/>
@@ -20533,18 +20541,15 @@
         <w:spacing w:before="57" w:after="57"/>
         <w:ind w:hanging="0" w:left="0"/>
         <w:rPr>
+          <w:b/>
+          <w:bCs/>
+        </w:rPr>
+      </w:pPr>
+      <w:r>
+        <w:rPr>
           <w:rFonts w:ascii="Andale Mono MT Std" w:hAnsi="Andale Mono MT Std"/>
-          <w:b w:val="false"/>
-          <w:bCs w:val="false"/>
-          <w:sz w:val="14"/>
-          <w:szCs w:val="14"/>
-        </w:rPr>
-      </w:pPr>
-      <w:r>
-        <w:rPr>
-          <w:rFonts w:ascii="Andale Mono MT Std" w:hAnsi="Andale Mono MT Std"/>
-          <w:b w:val="false"/>
-          <w:bCs w:val="false"/>
+          <w:b/>
+          <w:bCs/>
           <w:i w:val="false"/>
           <w:iCs w:val="false"/>
           <w:caps w:val="false"/>
@@ -20559,8 +20564,8 @@
       <w:r>
         <w:rPr>
           <w:rFonts w:ascii="Andale Mono MT Std" w:hAnsi="Andale Mono MT Std"/>
-          <w:b w:val="false"/>
-          <w:bCs w:val="false"/>
+          <w:b/>
+          <w:bCs/>
           <w:i w:val="false"/>
           <w:iCs w:val="false"/>
           <w:caps w:val="false"/>
@@ -20575,8 +20580,8 @@
       <w:r>
         <w:rPr>
           <w:rFonts w:ascii="Andale Mono MT Std" w:hAnsi="Andale Mono MT Std"/>
-          <w:b w:val="false"/>
-          <w:bCs w:val="false"/>
+          <w:b/>
+          <w:bCs/>
           <w:i/>
           <w:iCs/>
           <w:caps w:val="false"/>
@@ -20591,8 +20596,8 @@
       <w:r>
         <w:rPr>
           <w:rFonts w:ascii="Andale Mono MT Std" w:hAnsi="Andale Mono MT Std"/>
-          <w:b w:val="false"/>
-          <w:bCs w:val="false"/>
+          <w:b/>
+          <w:bCs/>
           <w:i w:val="false"/>
           <w:iCs w:val="false"/>
           <w:caps w:val="false"/>
@@ -20614,18 +20619,15 @@
         <w:spacing w:before="57" w:after="57"/>
         <w:ind w:hanging="0" w:left="0"/>
         <w:rPr>
+          <w:b/>
+          <w:bCs/>
+        </w:rPr>
+      </w:pPr>
+      <w:r>
+        <w:rPr>
           <w:rFonts w:ascii="Andale Mono MT Std" w:hAnsi="Andale Mono MT Std"/>
-          <w:b w:val="false"/>
-          <w:bCs w:val="false"/>
-          <w:sz w:val="14"/>
-          <w:szCs w:val="14"/>
-        </w:rPr>
-      </w:pPr>
-      <w:r>
-        <w:rPr>
-          <w:rFonts w:ascii="Andale Mono MT Std" w:hAnsi="Andale Mono MT Std"/>
-          <w:b w:val="false"/>
-          <w:bCs w:val="false"/>
+          <w:b/>
+          <w:bCs/>
           <w:i w:val="false"/>
           <w:iCs w:val="false"/>
           <w:caps w:val="false"/>
@@ -20640,8 +20642,8 @@
       <w:r>
         <w:rPr>
           <w:rFonts w:ascii="Andale Mono MT Std" w:hAnsi="Andale Mono MT Std"/>
-          <w:b w:val="false"/>
-          <w:bCs w:val="false"/>
+          <w:b/>
+          <w:bCs/>
           <w:i w:val="false"/>
           <w:iCs w:val="false"/>
           <w:caps w:val="false"/>
@@ -20656,8 +20658,8 @@
       <w:r>
         <w:rPr>
           <w:rFonts w:ascii="Andale Mono MT Std" w:hAnsi="Andale Mono MT Std"/>
-          <w:b w:val="false"/>
-          <w:bCs w:val="false"/>
+          <w:b/>
+          <w:bCs/>
           <w:i/>
           <w:iCs/>
           <w:caps w:val="false"/>
@@ -20672,8 +20674,8 @@
       <w:r>
         <w:rPr>
           <w:rFonts w:ascii="Andale Mono MT Std" w:hAnsi="Andale Mono MT Std"/>
-          <w:b w:val="false"/>
-          <w:bCs w:val="false"/>
+          <w:b/>
+          <w:bCs/>
           <w:i w:val="false"/>
           <w:iCs w:val="false"/>
           <w:caps w:val="false"/>
@@ -20700,18 +20702,15 @@
         <w:spacing w:before="57" w:after="57"/>
         <w:ind w:hanging="0" w:left="0"/>
         <w:rPr>
+          <w:b/>
+          <w:bCs/>
+        </w:rPr>
+      </w:pPr>
+      <w:r>
+        <w:rPr>
           <w:rFonts w:ascii="Andale Mono MT Std" w:hAnsi="Andale Mono MT Std"/>
-          <w:b w:val="false"/>
-          <w:bCs w:val="false"/>
-          <w:sz w:val="14"/>
-          <w:szCs w:val="14"/>
-        </w:rPr>
-      </w:pPr>
-      <w:r>
-        <w:rPr>
-          <w:rFonts w:ascii="Andale Mono MT Std" w:hAnsi="Andale Mono MT Std"/>
-          <w:b w:val="false"/>
-          <w:bCs w:val="false"/>
+          <w:b/>
+          <w:bCs/>
           <w:i w:val="false"/>
           <w:iCs w:val="false"/>
           <w:caps w:val="false"/>
@@ -20726,8 +20725,8 @@
       <w:r>
         <w:rPr>
           <w:rFonts w:ascii="Andale Mono MT Std" w:hAnsi="Andale Mono MT Std"/>
-          <w:b w:val="false"/>
-          <w:bCs w:val="false"/>
+          <w:b/>
+          <w:bCs/>
           <w:i w:val="false"/>
           <w:iCs w:val="false"/>
           <w:caps w:val="false"/>
@@ -20742,8 +20741,8 @@
       <w:r>
         <w:rPr>
           <w:rFonts w:ascii="Andale Mono MT Std" w:hAnsi="Andale Mono MT Std"/>
-          <w:b w:val="false"/>
-          <w:bCs w:val="false"/>
+          <w:b/>
+          <w:bCs/>
           <w:i/>
           <w:iCs/>
           <w:caps w:val="false"/>
@@ -20758,8 +20757,8 @@
       <w:r>
         <w:rPr>
           <w:rFonts w:ascii="Andale Mono MT Std" w:hAnsi="Andale Mono MT Std"/>
-          <w:b w:val="false"/>
-          <w:bCs w:val="false"/>
+          <w:b/>
+          <w:bCs/>
           <w:i w:val="false"/>
           <w:iCs w:val="false"/>
           <w:caps w:val="false"/>
@@ -20781,18 +20780,15 @@
         <w:spacing w:before="57" w:after="57"/>
         <w:ind w:hanging="0" w:left="0"/>
         <w:rPr>
+          <w:b/>
+          <w:bCs/>
+        </w:rPr>
+      </w:pPr>
+      <w:r>
+        <w:rPr>
           <w:rFonts w:ascii="Andale Mono MT Std" w:hAnsi="Andale Mono MT Std"/>
-          <w:b w:val="false"/>
-          <w:bCs w:val="false"/>
-          <w:sz w:val="14"/>
-          <w:szCs w:val="14"/>
-        </w:rPr>
-      </w:pPr>
-      <w:r>
-        <w:rPr>
-          <w:rFonts w:ascii="Andale Mono MT Std" w:hAnsi="Andale Mono MT Std"/>
-          <w:b w:val="false"/>
-          <w:bCs w:val="false"/>
+          <w:b/>
+          <w:bCs/>
           <w:i w:val="false"/>
           <w:iCs w:val="false"/>
           <w:caps w:val="false"/>
@@ -20807,8 +20803,8 @@
       <w:r>
         <w:rPr>
           <w:rFonts w:ascii="Andale Mono MT Std" w:hAnsi="Andale Mono MT Std"/>
-          <w:b w:val="false"/>
-          <w:bCs w:val="false"/>
+          <w:b/>
+          <w:bCs/>
           <w:i w:val="false"/>
           <w:iCs w:val="false"/>
           <w:caps w:val="false"/>
@@ -20823,8 +20819,8 @@
       <w:r>
         <w:rPr>
           <w:rFonts w:ascii="Andale Mono MT Std" w:hAnsi="Andale Mono MT Std"/>
-          <w:b w:val="false"/>
-          <w:bCs w:val="false"/>
+          <w:b/>
+          <w:bCs/>
           <w:i/>
           <w:iCs/>
           <w:caps w:val="false"/>
@@ -20839,8 +20835,8 @@
       <w:r>
         <w:rPr>
           <w:rFonts w:ascii="Andale Mono MT Std" w:hAnsi="Andale Mono MT Std"/>
-          <w:b w:val="false"/>
-          <w:bCs w:val="false"/>
+          <w:b/>
+          <w:bCs/>
           <w:i w:val="false"/>
           <w:iCs w:val="false"/>
           <w:caps w:val="false"/>
@@ -20862,18 +20858,15 @@
         <w:spacing w:before="57" w:after="57"/>
         <w:ind w:hanging="0" w:left="0"/>
         <w:rPr>
+          <w:b/>
+          <w:bCs/>
+        </w:rPr>
+      </w:pPr>
+      <w:r>
+        <w:rPr>
           <w:rFonts w:ascii="Andale Mono MT Std" w:hAnsi="Andale Mono MT Std"/>
-          <w:b w:val="false"/>
-          <w:bCs w:val="false"/>
-          <w:sz w:val="14"/>
-          <w:szCs w:val="14"/>
-        </w:rPr>
-      </w:pPr>
-      <w:r>
-        <w:rPr>
-          <w:rFonts w:ascii="Andale Mono MT Std" w:hAnsi="Andale Mono MT Std"/>
-          <w:b w:val="false"/>
-          <w:bCs w:val="false"/>
+          <w:b/>
+          <w:bCs/>
           <w:i w:val="false"/>
           <w:iCs w:val="false"/>
           <w:caps w:val="false"/>
@@ -20888,8 +20881,8 @@
       <w:r>
         <w:rPr>
           <w:rFonts w:ascii="Andale Mono MT Std" w:hAnsi="Andale Mono MT Std"/>
-          <w:b w:val="false"/>
-          <w:bCs w:val="false"/>
+          <w:b/>
+          <w:bCs/>
           <w:i w:val="false"/>
           <w:iCs w:val="false"/>
           <w:caps w:val="false"/>
@@ -20908,8 +20901,8 @@
       <w:r>
         <w:rPr>
           <w:rFonts w:ascii="Andale Mono MT Std" w:hAnsi="Andale Mono MT Std"/>
-          <w:b w:val="false"/>
-          <w:bCs w:val="false"/>
+          <w:b/>
+          <w:bCs/>
           <w:i/>
           <w:iCs/>
           <w:caps w:val="false"/>
@@ -20928,18 +20921,15 @@
         <w:spacing w:before="57" w:after="57"/>
         <w:ind w:hanging="0" w:left="0"/>
         <w:rPr>
+          <w:b/>
+          <w:bCs/>
+        </w:rPr>
+      </w:pPr>
+      <w:r>
+        <w:rPr>
           <w:rFonts w:ascii="Andale Mono MT Std" w:hAnsi="Andale Mono MT Std"/>
-          <w:b w:val="false"/>
-          <w:bCs w:val="false"/>
-          <w:sz w:val="14"/>
-          <w:szCs w:val="14"/>
-        </w:rPr>
-      </w:pPr>
-      <w:r>
-        <w:rPr>
-          <w:rFonts w:ascii="Andale Mono MT Std" w:hAnsi="Andale Mono MT Std"/>
-          <w:b w:val="false"/>
-          <w:bCs w:val="false"/>
+          <w:b/>
+          <w:bCs/>
           <w:i w:val="false"/>
           <w:iCs w:val="false"/>
           <w:caps w:val="false"/>
@@ -20954,8 +20944,8 @@
       <w:r>
         <w:rPr>
           <w:rFonts w:ascii="Andale Mono MT Std" w:hAnsi="Andale Mono MT Std"/>
-          <w:b w:val="false"/>
-          <w:bCs w:val="false"/>
+          <w:b/>
+          <w:bCs/>
           <w:i w:val="false"/>
           <w:iCs w:val="false"/>
           <w:caps w:val="false"/>
@@ -20973,8 +20963,8 @@
       <w:r>
         <w:rPr>
           <w:rFonts w:ascii="Andale Mono MT Std" w:hAnsi="Andale Mono MT Std"/>
-          <w:b w:val="false"/>
-          <w:bCs w:val="false"/>
+          <w:b/>
+          <w:bCs/>
           <w:i/>
           <w:iCs/>
           <w:caps w:val="false"/>
@@ -20989,8 +20979,8 @@
       <w:r>
         <w:rPr>
           <w:rFonts w:ascii="Andale Mono MT Std" w:hAnsi="Andale Mono MT Std"/>
-          <w:b w:val="false"/>
-          <w:bCs w:val="false"/>
+          <w:b/>
+          <w:bCs/>
           <w:i w:val="false"/>
           <w:iCs w:val="false"/>
           <w:caps w:val="false"/>
@@ -21009,18 +20999,15 @@
         <w:spacing w:before="57" w:after="57"/>
         <w:ind w:hanging="0" w:left="0"/>
         <w:rPr>
+          <w:b/>
+          <w:bCs/>
+        </w:rPr>
+      </w:pPr>
+      <w:r>
+        <w:rPr>
           <w:rFonts w:ascii="Andale Mono MT Std" w:hAnsi="Andale Mono MT Std"/>
-          <w:b w:val="false"/>
-          <w:bCs w:val="false"/>
-          <w:sz w:val="14"/>
-          <w:szCs w:val="14"/>
-        </w:rPr>
-      </w:pPr>
-      <w:r>
-        <w:rPr>
-          <w:rFonts w:ascii="Andale Mono MT Std" w:hAnsi="Andale Mono MT Std"/>
-          <w:b w:val="false"/>
-          <w:bCs w:val="false"/>
+          <w:b/>
+          <w:bCs/>
           <w:i w:val="false"/>
           <w:iCs w:val="false"/>
           <w:caps w:val="false"/>
@@ -21035,8 +21022,8 @@
       <w:r>
         <w:rPr>
           <w:rFonts w:ascii="Andale Mono MT Std" w:hAnsi="Andale Mono MT Std"/>
-          <w:b w:val="false"/>
-          <w:bCs w:val="false"/>
+          <w:b/>
+          <w:bCs/>
           <w:i w:val="false"/>
           <w:iCs w:val="false"/>
           <w:caps w:val="false"/>
@@ -21055,8 +21042,8 @@
       <w:r>
         <w:rPr>
           <w:rFonts w:ascii="Andale Mono MT Std" w:hAnsi="Andale Mono MT Std"/>
-          <w:b w:val="false"/>
-          <w:bCs w:val="false"/>
+          <w:b/>
+          <w:bCs/>
           <w:i/>
           <w:iCs/>
           <w:caps w:val="false"/>
@@ -21075,18 +21062,15 @@
         <w:spacing w:before="57" w:after="57"/>
         <w:ind w:hanging="0" w:left="0"/>
         <w:rPr>
+          <w:b/>
+          <w:bCs/>
+        </w:rPr>
+      </w:pPr>
+      <w:r>
+        <w:rPr>
           <w:rFonts w:ascii="Andale Mono MT Std" w:hAnsi="Andale Mono MT Std"/>
-          <w:b w:val="false"/>
-          <w:bCs w:val="false"/>
-          <w:sz w:val="14"/>
-          <w:szCs w:val="14"/>
-        </w:rPr>
-      </w:pPr>
-      <w:r>
-        <w:rPr>
-          <w:rFonts w:ascii="Andale Mono MT Std" w:hAnsi="Andale Mono MT Std"/>
-          <w:b w:val="false"/>
-          <w:bCs w:val="false"/>
+          <w:b/>
+          <w:bCs/>
           <w:i w:val="false"/>
           <w:iCs w:val="false"/>
           <w:caps w:val="false"/>
@@ -21101,8 +21085,8 @@
       <w:r>
         <w:rPr>
           <w:rFonts w:ascii="Andale Mono MT Std" w:hAnsi="Andale Mono MT Std"/>
-          <w:b w:val="false"/>
-          <w:bCs w:val="false"/>
+          <w:b/>
+          <w:bCs/>
           <w:i w:val="false"/>
           <w:iCs w:val="false"/>
           <w:caps w:val="false"/>
@@ -21119,8 +21103,8 @@
       <w:r>
         <w:rPr>
           <w:rFonts w:ascii="Andale Mono MT Std" w:hAnsi="Andale Mono MT Std"/>
-          <w:b w:val="false"/>
-          <w:bCs w:val="false"/>
+          <w:b/>
+          <w:bCs/>
           <w:i/>
           <w:iCs/>
           <w:caps w:val="false"/>
@@ -21135,8 +21119,8 @@
       <w:r>
         <w:rPr>
           <w:rFonts w:ascii="Andale Mono MT Std" w:hAnsi="Andale Mono MT Std"/>
-          <w:b w:val="false"/>
-          <w:bCs w:val="false"/>
+          <w:b/>
+          <w:bCs/>
           <w:i w:val="false"/>
           <w:iCs w:val="false"/>
           <w:caps w:val="false"/>
@@ -21155,18 +21139,15 @@
         <w:spacing w:before="57" w:after="57"/>
         <w:ind w:hanging="0" w:left="0"/>
         <w:rPr>
+          <w:b/>
+          <w:bCs/>
+        </w:rPr>
+      </w:pPr>
+      <w:r>
+        <w:rPr>
           <w:rFonts w:ascii="Andale Mono MT Std" w:hAnsi="Andale Mono MT Std"/>
-          <w:b w:val="false"/>
-          <w:bCs w:val="false"/>
-          <w:sz w:val="14"/>
-          <w:szCs w:val="14"/>
-        </w:rPr>
-      </w:pPr>
-      <w:r>
-        <w:rPr>
-          <w:rFonts w:ascii="Andale Mono MT Std" w:hAnsi="Andale Mono MT Std"/>
-          <w:b w:val="false"/>
-          <w:bCs w:val="false"/>
+          <w:b/>
+          <w:bCs/>
           <w:i/>
           <w:iCs/>
           <w:caps w:val="false"/>
@@ -21181,8 +21162,8 @@
       <w:r>
         <w:rPr>
           <w:rFonts w:ascii="Andale Mono MT Std" w:hAnsi="Andale Mono MT Std"/>
-          <w:b w:val="false"/>
-          <w:bCs w:val="false"/>
+          <w:b/>
+          <w:bCs/>
           <w:i/>
           <w:iCs/>
           <w:caps w:val="false"/>
@@ -21200,8 +21181,8 @@
       <w:r>
         <w:rPr>
           <w:rFonts w:ascii="Andale Mono MT Std" w:hAnsi="Andale Mono MT Std"/>
-          <w:b w:val="false"/>
-          <w:bCs w:val="false"/>
+          <w:b/>
+          <w:bCs/>
           <w:i w:val="false"/>
           <w:iCs w:val="false"/>
           <w:caps w:val="false"/>
@@ -21220,21 +21201,33 @@
         <w:spacing w:before="57" w:after="57"/>
         <w:ind w:hanging="0" w:left="0"/>
         <w:rPr>
-          <w:i/>
-          <w:iCs/>
+          <w:b/>
+          <w:bCs/>
+        </w:rPr>
+      </w:pPr>
+      <w:r>
+        <w:rPr>
+          <w:rFonts w:ascii="Andale Mono MT Std" w:hAnsi="Andale Mono MT Std"/>
+          <w:b/>
+          <w:bCs/>
+          <w:i w:val="false"/>
+          <w:iCs w:val="false"/>
           <w:caps w:val="false"/>
           <w:smallCaps w:val="false"/>
           <w:color w:val="auto"/>
           <w:spacing w:val="0"/>
-        </w:rPr>
-      </w:pPr>
+          <w:sz w:val="14"/>
+          <w:szCs w:val="14"/>
+        </w:rPr>
+        <w:t xml:space="preserve"> </w:t>
+      </w:r>
       <w:r>
         <w:rPr>
           <w:rFonts w:ascii="Andale Mono MT Std" w:hAnsi="Andale Mono MT Std"/>
-          <w:b w:val="false"/>
-          <w:bCs w:val="false"/>
-          <w:i w:val="false"/>
-          <w:iCs w:val="false"/>
+          <w:b/>
+          <w:bCs/>
+          <w:i/>
+          <w:iCs/>
           <w:caps w:val="false"/>
           <w:smallCaps w:val="false"/>
           <w:color w:val="auto"/>
@@ -21242,15 +21235,18 @@
           <w:sz w:val="14"/>
           <w:szCs w:val="14"/>
         </w:rPr>
-        <w:t xml:space="preserve"> </w:t>
+        <w:t>ns:name</w:t>
+        <w:tab/>
+        <w:tab/>
+        <w:tab/>
       </w:r>
       <w:r>
         <w:rPr>
           <w:rFonts w:ascii="Andale Mono MT Std" w:hAnsi="Andale Mono MT Std"/>
-          <w:b w:val="false"/>
-          <w:bCs w:val="false"/>
-          <w:i/>
-          <w:iCs/>
+          <w:b/>
+          <w:bCs/>
+          <w:i w:val="false"/>
+          <w:iCs w:val="false"/>
           <w:caps w:val="false"/>
           <w:smallCaps w:val="false"/>
           <w:color w:val="auto"/>
@@ -21258,18 +21254,15 @@
           <w:sz w:val="14"/>
           <w:szCs w:val="14"/>
         </w:rPr>
-        <w:t>ns:name</w:t>
-        <w:tab/>
-        <w:tab/>
-        <w:tab/>
+        <w:t>qualified</w:t>
       </w:r>
       <w:r>
         <w:rPr>
           <w:rFonts w:ascii="Andale Mono MT Std" w:hAnsi="Andale Mono MT Std"/>
-          <w:b w:val="false"/>
-          <w:bCs w:val="false"/>
-          <w:i w:val="false"/>
-          <w:iCs w:val="false"/>
+          <w:b/>
+          <w:bCs/>
+          <w:i/>
+          <w:iCs/>
           <w:caps w:val="false"/>
           <w:smallCaps w:val="false"/>
           <w:color w:val="auto"/>
@@ -21277,15 +21270,15 @@
           <w:sz w:val="14"/>
           <w:szCs w:val="14"/>
         </w:rPr>
-        <w:t>qualified</w:t>
+        <w:t xml:space="preserve"> symbol, </w:t>
       </w:r>
       <w:r>
         <w:rPr>
           <w:rFonts w:ascii="Andale Mono MT Std" w:hAnsi="Andale Mono MT Std"/>
-          <w:b w:val="false"/>
-          <w:bCs w:val="false"/>
-          <w:i/>
-          <w:iCs/>
+          <w:b/>
+          <w:bCs/>
+          <w:i w:val="false"/>
+          <w:iCs w:val="false"/>
           <w:caps w:val="false"/>
           <w:smallCaps w:val="false"/>
           <w:color w:val="auto"/>
@@ -21293,15 +21286,26 @@
           <w:sz w:val="14"/>
           <w:szCs w:val="14"/>
         </w:rPr>
-        <w:t xml:space="preserve"> symbol, </w:t>
-      </w:r>
+        <w:t>where</w:t>
+      </w:r>
+    </w:p>
+    <w:p>
+      <w:pPr>
+        <w:pStyle w:val="Normal"/>
+        <w:spacing w:before="57" w:after="57"/>
+        <w:ind w:hanging="0" w:left="0"/>
+        <w:rPr>
+          <w:b/>
+          <w:bCs/>
+        </w:rPr>
+      </w:pPr>
       <w:r>
         <w:rPr>
           <w:rFonts w:ascii="Andale Mono MT Std" w:hAnsi="Andale Mono MT Std"/>
-          <w:b w:val="false"/>
-          <w:bCs w:val="false"/>
-          <w:i w:val="false"/>
-          <w:iCs w:val="false"/>
+          <w:b/>
+          <w:bCs/>
+          <w:i/>
+          <w:iCs/>
           <w:caps w:val="false"/>
           <w:smallCaps w:val="false"/>
           <w:color w:val="auto"/>
@@ -21309,7 +21313,74 @@
           <w:sz w:val="14"/>
           <w:szCs w:val="14"/>
         </w:rPr>
-        <w:t>where</w:t>
+        <w:tab/>
+        <w:tab/>
+        <w:tab/>
+        <w:t xml:space="preserve">ns </w:t>
+      </w:r>
+      <w:r>
+        <w:rPr>
+          <w:rFonts w:ascii="Andale Mono MT Std" w:hAnsi="Andale Mono MT Std"/>
+          <w:b/>
+          <w:bCs/>
+          <w:i w:val="false"/>
+          <w:iCs w:val="false"/>
+          <w:caps w:val="false"/>
+          <w:smallCaps w:val="false"/>
+          <w:color w:val="auto"/>
+          <w:spacing w:val="0"/>
+          <w:sz w:val="14"/>
+          <w:szCs w:val="14"/>
+        </w:rPr>
+        <w:t xml:space="preserve">and </w:t>
+      </w:r>
+      <w:r>
+        <w:rPr>
+          <w:rFonts w:ascii="Andale Mono MT Std" w:hAnsi="Andale Mono MT Std"/>
+          <w:b/>
+          <w:bCs/>
+          <w:i/>
+          <w:iCs/>
+          <w:caps w:val="false"/>
+          <w:smallCaps w:val="false"/>
+          <w:color w:val="auto"/>
+          <w:spacing w:val="0"/>
+          <w:sz w:val="14"/>
+          <w:szCs w:val="14"/>
+        </w:rPr>
+        <w:t xml:space="preserve">name </w:t>
+      </w:r>
+      <w:r>
+        <w:rPr>
+          <w:rFonts w:ascii="Andale Mono MT Std" w:hAnsi="Andale Mono MT Std"/>
+          <w:b/>
+          <w:bCs/>
+          <w:i w:val="false"/>
+          <w:iCs w:val="false"/>
+          <w:caps w:val="false"/>
+          <w:smallCaps w:val="false"/>
+          <w:color w:val="auto"/>
+          <w:spacing w:val="0"/>
+          <w:sz w:val="14"/>
+          <w:szCs w:val="14"/>
+        </w:rPr>
+        <w:t xml:space="preserve">are </w:t>
+      </w:r>
+      <w:r>
+        <w:rPr>
+          <w:rFonts w:ascii="Andale Mono MT Std" w:hAnsi="Andale Mono MT Std"/>
+          <w:b/>
+          <w:bCs/>
+          <w:i/>
+          <w:iCs/>
+          <w:caps w:val="false"/>
+          <w:smallCaps w:val="false"/>
+          <w:color w:val="auto"/>
+          <w:spacing w:val="0"/>
+          <w:sz w:val="14"/>
+          <w:szCs w:val="14"/>
+        </w:rPr>
+        <w:t>symbol</w:t>
       </w:r>
     </w:p>
     <w:p>
@@ -21318,18 +21389,15 @@
         <w:spacing w:before="57" w:after="57"/>
         <w:ind w:hanging="0" w:left="0"/>
         <w:rPr>
+          <w:b/>
+          <w:bCs/>
+        </w:rPr>
+      </w:pPr>
+      <w:r>
+        <w:rPr>
           <w:rFonts w:ascii="Andale Mono MT Std" w:hAnsi="Andale Mono MT Std"/>
-          <w:b w:val="false"/>
-          <w:bCs w:val="false"/>
-          <w:sz w:val="14"/>
-          <w:szCs w:val="14"/>
-        </w:rPr>
-      </w:pPr>
-      <w:r>
-        <w:rPr>
-          <w:rFonts w:ascii="Andale Mono MT Std" w:hAnsi="Andale Mono MT Std"/>
-          <w:b w:val="false"/>
-          <w:bCs w:val="false"/>
+          <w:b/>
+          <w:bCs/>
           <w:i/>
           <w:iCs/>
           <w:caps w:val="false"/>
@@ -21342,12 +21410,24 @@
         <w:tab/>
         <w:tab/>
         <w:tab/>
-      </w:r>
+        <w:t>constituents</w:t>
+      </w:r>
+    </w:p>
+    <w:p>
+      <w:pPr>
+        <w:pStyle w:val="Normal"/>
+        <w:spacing w:before="57" w:after="57"/>
+        <w:ind w:hanging="0" w:left="0"/>
+        <w:rPr>
+          <w:b/>
+          <w:bCs/>
+        </w:rPr>
+      </w:pPr>
       <w:r>
         <w:rPr>
           <w:rFonts w:ascii="Andale Mono MT Std" w:hAnsi="Andale Mono MT Std"/>
-          <w:b w:val="false"/>
-          <w:bCs w:val="false"/>
+          <w:b/>
+          <w:bCs/>
           <w:i/>
           <w:iCs/>
           <w:caps w:val="false"/>
@@ -21357,15 +21437,15 @@
           <w:sz w:val="14"/>
           <w:szCs w:val="14"/>
         </w:rPr>
-        <w:t xml:space="preserve">ns </w:t>
+        <w:t xml:space="preserve"> </w:t>
       </w:r>
       <w:r>
         <w:rPr>
           <w:rFonts w:ascii="Andale Mono MT Std" w:hAnsi="Andale Mono MT Std"/>
-          <w:b w:val="false"/>
-          <w:bCs w:val="false"/>
-          <w:i w:val="false"/>
-          <w:iCs w:val="false"/>
+          <w:b/>
+          <w:bCs/>
+          <w:i/>
+          <w:iCs/>
           <w:caps w:val="false"/>
           <w:smallCaps w:val="false"/>
           <w:color w:val="auto"/>
@@ -21373,15 +21453,18 @@
           <w:sz w:val="14"/>
           <w:szCs w:val="14"/>
         </w:rPr>
-        <w:t xml:space="preserve">and </w:t>
+        <w:t>name</w:t>
+        <w:tab/>
+        <w:tab/>
+        <w:tab/>
       </w:r>
       <w:r>
         <w:rPr>
           <w:rFonts w:ascii="Andale Mono MT Std" w:hAnsi="Andale Mono MT Std"/>
-          <w:b w:val="false"/>
-          <w:bCs w:val="false"/>
-          <w:i/>
-          <w:iCs/>
+          <w:b/>
+          <w:bCs/>
+          <w:i w:val="false"/>
+          <w:iCs w:val="false"/>
           <w:caps w:val="false"/>
           <w:smallCaps w:val="false"/>
           <w:color w:val="auto"/>
@@ -21389,15 +21472,15 @@
           <w:sz w:val="14"/>
           <w:szCs w:val="14"/>
         </w:rPr>
-        <w:t xml:space="preserve">name </w:t>
+        <w:t>lexical</w:t>
       </w:r>
       <w:r>
         <w:rPr>
           <w:rFonts w:ascii="Andale Mono MT Std" w:hAnsi="Andale Mono MT Std"/>
-          <w:b w:val="false"/>
-          <w:bCs w:val="false"/>
-          <w:i w:val="false"/>
-          <w:iCs w:val="false"/>
+          <w:b/>
+          <w:bCs/>
+          <w:i/>
+          <w:iCs/>
           <w:caps w:val="false"/>
           <w:smallCaps w:val="false"/>
           <w:color w:val="auto"/>
@@ -21405,15 +21488,26 @@
           <w:sz w:val="14"/>
           <w:szCs w:val="14"/>
         </w:rPr>
-        <w:t xml:space="preserve">are </w:t>
-      </w:r>
+        <w:t xml:space="preserve"> symbol</w:t>
+      </w:r>
+    </w:p>
+    <w:p>
+      <w:pPr>
+        <w:pStyle w:val="Normal"/>
+        <w:spacing w:before="57" w:after="57"/>
+        <w:ind w:hanging="0" w:left="0"/>
+        <w:rPr>
+          <w:b/>
+          <w:bCs/>
+        </w:rPr>
+      </w:pPr>
       <w:r>
         <w:rPr>
           <w:rFonts w:ascii="Andale Mono MT Std" w:hAnsi="Andale Mono MT Std"/>
-          <w:b w:val="false"/>
-          <w:bCs w:val="false"/>
-          <w:i/>
-          <w:iCs/>
+          <w:b/>
+          <w:bCs/>
+          <w:i w:val="false"/>
+          <w:iCs w:val="false"/>
           <w:caps w:val="false"/>
           <w:smallCaps w:val="false"/>
           <w:color w:val="auto"/>
@@ -21421,7 +21515,27 @@
           <w:sz w:val="14"/>
           <w:szCs w:val="14"/>
         </w:rPr>
-        <w:t>symbol</w:t>
+        <w:t xml:space="preserve"> </w:t>
+      </w:r>
+      <w:r>
+        <w:rPr>
+          <w:rFonts w:ascii="Andale Mono MT Std" w:hAnsi="Andale Mono MT Std"/>
+          <w:b/>
+          <w:bCs/>
+          <w:i w:val="false"/>
+          <w:iCs w:val="false"/>
+          <w:caps w:val="false"/>
+          <w:smallCaps w:val="false"/>
+          <w:color w:val="auto"/>
+          <w:spacing w:val="0"/>
+          <w:sz w:val="14"/>
+          <w:szCs w:val="14"/>
+        </w:rPr>
+        <w:t>#*</w:t>
+        <w:tab/>
+        <w:tab/>
+        <w:tab/>
+        <w:t>bit vector</w:t>
       </w:r>
     </w:p>
     <w:p>
@@ -21430,11 +21544,17 @@
         <w:spacing w:before="57" w:after="57"/>
         <w:ind w:hanging="0" w:left="0"/>
         <w:rPr>
+          <w:b/>
+          <w:bCs/>
+        </w:rPr>
+      </w:pPr>
+      <w:r>
+        <w:rPr>
           <w:rFonts w:ascii="Andale Mono MT Std" w:hAnsi="Andale Mono MT Std"/>
-          <w:b w:val="false"/>
-          <w:bCs w:val="false"/>
-          <w:i/>
-          <w:iCs/>
+          <w:b/>
+          <w:bCs/>
+          <w:i w:val="false"/>
+          <w:iCs w:val="false"/>
           <w:caps w:val="false"/>
           <w:smallCaps w:val="false"/>
           <w:color w:val="auto"/>
@@ -21442,14 +21562,15 @@
           <w:sz w:val="14"/>
           <w:szCs w:val="14"/>
         </w:rPr>
-      </w:pPr>
+        <w:t xml:space="preserve"> </w:t>
+      </w:r>
       <w:r>
         <w:rPr>
           <w:rFonts w:ascii="Andale Mono MT Std" w:hAnsi="Andale Mono MT Std"/>
-          <w:b w:val="false"/>
-          <w:bCs w:val="false"/>
-          <w:i/>
-          <w:iCs/>
+          <w:b/>
+          <w:bCs/>
+          <w:i w:val="false"/>
+          <w:iCs w:val="false"/>
           <w:caps w:val="false"/>
           <w:smallCaps w:val="false"/>
           <w:color w:val="auto"/>
@@ -21457,10 +21578,27 @@
           <w:sz w:val="14"/>
           <w:szCs w:val="14"/>
         </w:rPr>
-        <w:tab/>
-        <w:tab/>
-        <w:tab/>
-        <w:t>constituents</w:t>
+        <w:t>#x</w:t>
+        <w:tab/>
+        <w:tab/>
+        <w:tab/>
+        <w:t xml:space="preserve">hexadecimal </w:t>
+      </w:r>
+      <w:r>
+        <w:rPr>
+          <w:rFonts w:ascii="Andale Mono MT Std" w:hAnsi="Andale Mono MT Std"/>
+          <w:b/>
+          <w:bCs/>
+          <w:i/>
+          <w:iCs/>
+          <w:caps w:val="false"/>
+          <w:smallCaps w:val="false"/>
+          <w:color w:val="auto"/>
+          <w:spacing w:val="0"/>
+          <w:sz w:val="14"/>
+          <w:szCs w:val="14"/>
+        </w:rPr>
+        <w:t>fixnum</w:t>
       </w:r>
     </w:p>
     <w:p>
@@ -21469,20 +21607,17 @@
         <w:spacing w:before="57" w:after="57"/>
         <w:ind w:hanging="0" w:left="0"/>
         <w:rPr>
+          <w:b/>
+          <w:bCs/>
+        </w:rPr>
+      </w:pPr>
+      <w:r>
+        <w:rPr>
           <w:rFonts w:ascii="Andale Mono MT Std" w:hAnsi="Andale Mono MT Std"/>
-          <w:b w:val="false"/>
-          <w:bCs w:val="false"/>
-          <w:sz w:val="14"/>
-          <w:szCs w:val="14"/>
-        </w:rPr>
-      </w:pPr>
-      <w:r>
-        <w:rPr>
-          <w:rFonts w:ascii="Andale Mono MT Std" w:hAnsi="Andale Mono MT Std"/>
-          <w:b w:val="false"/>
-          <w:bCs w:val="false"/>
-          <w:i/>
-          <w:iCs/>
+          <w:b/>
+          <w:bCs/>
+          <w:i w:val="false"/>
+          <w:iCs w:val="false"/>
           <w:caps w:val="false"/>
           <w:smallCaps w:val="false"/>
           <w:color w:val="auto"/>
@@ -21495,10 +21630,10 @@
       <w:r>
         <w:rPr>
           <w:rFonts w:ascii="Andale Mono MT Std" w:hAnsi="Andale Mono MT Std"/>
-          <w:b w:val="false"/>
-          <w:bCs w:val="false"/>
-          <w:i/>
-          <w:iCs/>
+          <w:b/>
+          <w:bCs/>
+          <w:i w:val="false"/>
+          <w:iCs w:val="false"/>
           <w:caps w:val="false"/>
           <w:smallCaps w:val="false"/>
           <w:color w:val="auto"/>
@@ -21506,16 +21641,28 @@
           <w:sz w:val="14"/>
           <w:szCs w:val="14"/>
         </w:rPr>
-        <w:t>name</w:t>
-        <w:tab/>
-        <w:tab/>
-        <w:tab/>
-      </w:r>
+        <w:t>#.</w:t>
+        <w:tab/>
+        <w:tab/>
+        <w:tab/>
+        <w:t>read-time eval</w:t>
+      </w:r>
+    </w:p>
+    <w:p>
+      <w:pPr>
+        <w:pStyle w:val="Normal"/>
+        <w:spacing w:before="57" w:after="57"/>
+        <w:ind w:hanging="0" w:left="0"/>
+        <w:rPr>
+          <w:b/>
+          <w:bCs/>
+        </w:rPr>
+      </w:pPr>
       <w:r>
         <w:rPr>
           <w:rFonts w:ascii="Andale Mono MT Std" w:hAnsi="Andale Mono MT Std"/>
-          <w:b w:val="false"/>
-          <w:bCs w:val="false"/>
+          <w:b/>
+          <w:bCs/>
           <w:i w:val="false"/>
           <w:iCs w:val="false"/>
           <w:caps w:val="false"/>
@@ -21525,15 +21672,15 @@
           <w:sz w:val="14"/>
           <w:szCs w:val="14"/>
         </w:rPr>
-        <w:t>lexical</w:t>
+        <w:t xml:space="preserve"> </w:t>
       </w:r>
       <w:r>
         <w:rPr>
           <w:rFonts w:ascii="Andale Mono MT Std" w:hAnsi="Andale Mono MT Std"/>
-          <w:b w:val="false"/>
-          <w:bCs w:val="false"/>
-          <w:i/>
-          <w:iCs/>
+          <w:b/>
+          <w:bCs/>
+          <w:i w:val="false"/>
+          <w:iCs w:val="false"/>
           <w:caps w:val="false"/>
           <w:smallCaps w:val="false"/>
           <w:color w:val="auto"/>
@@ -21541,7 +21688,26 @@
           <w:sz w:val="14"/>
           <w:szCs w:val="14"/>
         </w:rPr>
-        <w:t xml:space="preserve"> symbol</w:t>
+        <w:t>#\</w:t>
+        <w:tab/>
+        <w:tab/>
+        <w:tab/>
+      </w:r>
+      <w:r>
+        <w:rPr>
+          <w:rFonts w:ascii="Andale Mono MT Std" w:hAnsi="Andale Mono MT Std"/>
+          <w:b/>
+          <w:bCs/>
+          <w:i/>
+          <w:iCs/>
+          <w:caps w:val="false"/>
+          <w:smallCaps w:val="false"/>
+          <w:color w:val="auto"/>
+          <w:spacing w:val="0"/>
+          <w:sz w:val="14"/>
+          <w:szCs w:val="14"/>
+        </w:rPr>
+        <w:t>char</w:t>
       </w:r>
     </w:p>
     <w:p>
@@ -21550,18 +21716,15 @@
         <w:spacing w:before="57" w:after="57"/>
         <w:ind w:hanging="0" w:left="0"/>
         <w:rPr>
+          <w:b/>
+          <w:bCs/>
+        </w:rPr>
+      </w:pPr>
+      <w:r>
+        <w:rPr>
           <w:rFonts w:ascii="Andale Mono MT Std" w:hAnsi="Andale Mono MT Std"/>
-          <w:b w:val="false"/>
-          <w:bCs w:val="false"/>
-          <w:sz w:val="14"/>
-          <w:szCs w:val="14"/>
-        </w:rPr>
-      </w:pPr>
-      <w:r>
-        <w:rPr>
-          <w:rFonts w:ascii="Andale Mono MT Std" w:hAnsi="Andale Mono MT Std"/>
-          <w:b w:val="false"/>
-          <w:bCs w:val="false"/>
+          <w:b/>
+          <w:bCs/>
           <w:i w:val="false"/>
           <w:iCs w:val="false"/>
           <w:caps w:val="false"/>
@@ -21576,8 +21739,8 @@
       <w:r>
         <w:rPr>
           <w:rFonts w:ascii="Andale Mono MT Std" w:hAnsi="Andale Mono MT Std"/>
-          <w:b w:val="false"/>
-          <w:bCs w:val="false"/>
+          <w:b/>
+          <w:bCs/>
           <w:i w:val="false"/>
           <w:iCs w:val="false"/>
           <w:caps w:val="false"/>
@@ -21587,11 +21750,25 @@
           <w:sz w:val="14"/>
           <w:szCs w:val="14"/>
         </w:rPr>
-        <w:t>#*</w:t>
-        <w:tab/>
-        <w:tab/>
-        <w:tab/>
-        <w:t>bit vector</w:t>
+        <w:t>#(:type …)</w:t>
+        <w:tab/>
+        <w:tab/>
+      </w:r>
+      <w:r>
+        <w:rPr>
+          <w:rFonts w:ascii="Andale Mono MT Std" w:hAnsi="Andale Mono MT Std"/>
+          <w:b/>
+          <w:bCs/>
+          <w:i/>
+          <w:iCs/>
+          <w:caps w:val="false"/>
+          <w:smallCaps w:val="false"/>
+          <w:color w:val="auto"/>
+          <w:spacing w:val="0"/>
+          <w:sz w:val="14"/>
+          <w:szCs w:val="14"/>
+        </w:rPr>
+        <w:t>vector</w:t>
       </w:r>
     </w:p>
     <w:p>
@@ -21600,18 +21777,15 @@
         <w:spacing w:before="57" w:after="57"/>
         <w:ind w:hanging="0" w:left="0"/>
         <w:rPr>
+          <w:b/>
+          <w:bCs/>
+        </w:rPr>
+      </w:pPr>
+      <w:r>
+        <w:rPr>
           <w:rFonts w:ascii="Andale Mono MT Std" w:hAnsi="Andale Mono MT Std"/>
-          <w:b w:val="false"/>
-          <w:bCs w:val="false"/>
-          <w:sz w:val="14"/>
-          <w:szCs w:val="14"/>
-        </w:rPr>
-      </w:pPr>
-      <w:r>
-        <w:rPr>
-          <w:rFonts w:ascii="Andale Mono MT Std" w:hAnsi="Andale Mono MT Std"/>
-          <w:b w:val="false"/>
-          <w:bCs w:val="false"/>
+          <w:b/>
+          <w:bCs/>
           <w:i w:val="false"/>
           <w:iCs w:val="false"/>
           <w:caps w:val="false"/>
@@ -21626,8 +21800,8 @@
       <w:r>
         <w:rPr>
           <w:rFonts w:ascii="Andale Mono MT Std" w:hAnsi="Andale Mono MT Std"/>
-          <w:b w:val="false"/>
-          <w:bCs w:val="false"/>
+          <w:b/>
+          <w:bCs/>
           <w:i w:val="false"/>
           <w:iCs w:val="false"/>
           <w:caps w:val="false"/>
@@ -21637,17 +21811,15 @@
           <w:sz w:val="14"/>
           <w:szCs w:val="14"/>
         </w:rPr>
-        <w:t>#x</w:t>
-        <w:tab/>
-        <w:tab/>
-        <w:tab/>
-        <w:t xml:space="preserve">hexadecimal </w:t>
+        <w:t>#s(:type …)</w:t>
+        <w:tab/>
+        <w:tab/>
       </w:r>
       <w:r>
         <w:rPr>
           <w:rFonts w:ascii="Andale Mono MT Std" w:hAnsi="Andale Mono MT Std"/>
-          <w:b w:val="false"/>
-          <w:bCs w:val="false"/>
+          <w:b/>
+          <w:bCs/>
           <w:i/>
           <w:iCs/>
           <w:caps w:val="false"/>
@@ -21657,7 +21829,7 @@
           <w:sz w:val="14"/>
           <w:szCs w:val="14"/>
         </w:rPr>
-        <w:t>fixnum</w:t>
+        <w:t>struct</w:t>
       </w:r>
     </w:p>
     <w:p>
@@ -21666,18 +21838,15 @@
         <w:spacing w:before="57" w:after="57"/>
         <w:ind w:hanging="0" w:left="0"/>
         <w:rPr>
+          <w:b/>
+          <w:bCs/>
+        </w:rPr>
+      </w:pPr>
+      <w:r>
+        <w:rPr>
           <w:rFonts w:ascii="Andale Mono MT Std" w:hAnsi="Andale Mono MT Std"/>
-          <w:b w:val="false"/>
-          <w:bCs w:val="false"/>
-          <w:sz w:val="14"/>
-          <w:szCs w:val="14"/>
-        </w:rPr>
-      </w:pPr>
-      <w:r>
-        <w:rPr>
-          <w:rFonts w:ascii="Andale Mono MT Std" w:hAnsi="Andale Mono MT Std"/>
-          <w:b w:val="false"/>
-          <w:bCs w:val="false"/>
+          <w:b/>
+          <w:bCs/>
           <w:i w:val="false"/>
           <w:iCs w:val="false"/>
           <w:caps w:val="false"/>
@@ -21692,8 +21861,8 @@
       <w:r>
         <w:rPr>
           <w:rFonts w:ascii="Andale Mono MT Std" w:hAnsi="Andale Mono MT Std"/>
-          <w:b w:val="false"/>
-          <w:bCs w:val="false"/>
+          <w:b/>
+          <w:bCs/>
           <w:i w:val="false"/>
           <w:iCs w:val="false"/>
           <w:caps w:val="false"/>
@@ -21703,11 +21872,73 @@
           <w:sz w:val="14"/>
           <w:szCs w:val="14"/>
         </w:rPr>
-        <w:t>#.</w:t>
-        <w:tab/>
-        <w:tab/>
-        <w:tab/>
-        <w:t>read-time eval</w:t>
+        <w:t>#:…</w:t>
+        <w:tab/>
+      </w:r>
+      <w:r>
+        <w:rPr>
+          <w:rFonts w:ascii="Andale Mono MT Std" w:hAnsi="Andale Mono MT Std"/>
+          <w:b/>
+          <w:bCs/>
+          <w:i w:val="false"/>
+          <w:iCs/>
+          <w:caps w:val="false"/>
+          <w:smallCaps w:val="false"/>
+          <w:color w:val="auto"/>
+          <w:spacing w:val="0"/>
+          <w:sz w:val="14"/>
+          <w:szCs w:val="14"/>
+        </w:rPr>
+        <w:tab/>
+        <w:tab/>
+      </w:r>
+      <w:r>
+        <w:rPr>
+          <w:rFonts w:ascii="Andale Mono MT Std" w:hAnsi="Andale Mono MT Std"/>
+          <w:b/>
+          <w:bCs/>
+          <w:i w:val="false"/>
+          <w:iCs w:val="false"/>
+          <w:caps w:val="false"/>
+          <w:smallCaps w:val="false"/>
+          <w:color w:val="auto"/>
+          <w:spacing w:val="0"/>
+          <w:sz w:val="14"/>
+          <w:szCs w:val="14"/>
+        </w:rPr>
+        <w:t>uninterned</w:t>
+      </w:r>
+      <w:r>
+        <w:rPr>
+          <w:rFonts w:ascii="Andale Mono MT Std" w:hAnsi="Andale Mono MT Std"/>
+          <w:b/>
+          <w:bCs/>
+          <w:i w:val="false"/>
+          <w:iCs/>
+          <w:caps w:val="false"/>
+          <w:smallCaps w:val="false"/>
+          <w:color w:val="auto"/>
+          <w:spacing w:val="0"/>
+          <w:sz w:val="14"/>
+          <w:szCs w:val="14"/>
+        </w:rPr>
+        <w:t xml:space="preserve"> </w:t>
+      </w:r>
+      <w:r>
+        <w:rPr>
+          <w:rFonts w:ascii="Andale Mono MT Std" w:hAnsi="Andale Mono MT Std"/>
+          <w:b/>
+          <w:bCs/>
+          <w:i/>
+          <w:iCs/>
+          <w:caps w:val="false"/>
+          <w:smallCaps w:val="false"/>
+          <w:color w:val="auto"/>
+          <w:spacing w:val="0"/>
+          <w:sz w:val="14"/>
+          <w:szCs w:val="14"/>
+        </w:rPr>
+        <w:t>symbol</w:t>
       </w:r>
     </w:p>
     <w:p>
@@ -21716,18 +21947,15 @@
         <w:spacing w:before="57" w:after="57"/>
         <w:ind w:hanging="0" w:left="0"/>
         <w:rPr>
+          <w:b/>
+          <w:bCs/>
+        </w:rPr>
+      </w:pPr>
+      <w:r>
+        <w:rPr>
           <w:rFonts w:ascii="Andale Mono MT Std" w:hAnsi="Andale Mono MT Std"/>
-          <w:b w:val="false"/>
-          <w:bCs w:val="false"/>
-          <w:sz w:val="14"/>
-          <w:szCs w:val="14"/>
-        </w:rPr>
-      </w:pPr>
-      <w:r>
-        <w:rPr>
-          <w:rFonts w:ascii="Andale Mono MT Std" w:hAnsi="Andale Mono MT Std"/>
-          <w:b w:val="false"/>
-          <w:bCs w:val="false"/>
+          <w:b/>
+          <w:bCs/>
           <w:i w:val="false"/>
           <w:iCs w:val="false"/>
           <w:caps w:val="false"/>
@@ -21737,13 +21965,13 @@
           <w:sz w:val="14"/>
           <w:szCs w:val="14"/>
         </w:rPr>
-        <w:t xml:space="preserve"> </w:t>
+        <w:t xml:space="preserve"> “</w:t>
       </w:r>
       <w:r>
         <w:rPr>
           <w:rFonts w:ascii="Andale Mono MT Std" w:hAnsi="Andale Mono MT Std"/>
-          <w:b w:val="false"/>
-          <w:bCs w:val="false"/>
+          <w:b/>
+          <w:bCs/>
           <w:i w:val="false"/>
           <w:iCs w:val="false"/>
           <w:caps w:val="false"/>
@@ -21753,18 +21981,30 @@
           <w:sz w:val="14"/>
           <w:szCs w:val="14"/>
         </w:rPr>
-        <w:t>#\</w:t>
-        <w:tab/>
-        <w:tab/>
-        <w:tab/>
-      </w:r>
+        <w:t>`,;</w:t>
+        <w:tab/>
+        <w:tab/>
+        <w:tab/>
+        <w:t>terminating macro char</w:t>
+      </w:r>
+    </w:p>
+    <w:p>
+      <w:pPr>
+        <w:pStyle w:val="Normal"/>
+        <w:spacing w:before="57" w:after="57"/>
+        <w:ind w:hanging="0" w:left="0"/>
+        <w:rPr>
+          <w:b/>
+          <w:bCs/>
+        </w:rPr>
+      </w:pPr>
       <w:r>
         <w:rPr>
           <w:rFonts w:ascii="Andale Mono MT Std" w:hAnsi="Andale Mono MT Std"/>
-          <w:b w:val="false"/>
-          <w:bCs w:val="false"/>
-          <w:i/>
-          <w:iCs/>
+          <w:b/>
+          <w:bCs/>
+          <w:i w:val="false"/>
+          <w:iCs w:val="false"/>
           <w:caps w:val="false"/>
           <w:smallCaps w:val="false"/>
           <w:color w:val="auto"/>
@@ -21772,7 +22012,27 @@
           <w:sz w:val="14"/>
           <w:szCs w:val="14"/>
         </w:rPr>
-        <w:t>char</w:t>
+        <w:t xml:space="preserve"> </w:t>
+      </w:r>
+      <w:r>
+        <w:rPr>
+          <w:rFonts w:ascii="Andale Mono MT Std" w:hAnsi="Andale Mono MT Std"/>
+          <w:b/>
+          <w:bCs/>
+          <w:i w:val="false"/>
+          <w:iCs w:val="false"/>
+          <w:caps w:val="false"/>
+          <w:smallCaps w:val="false"/>
+          <w:color w:val="auto"/>
+          <w:spacing w:val="0"/>
+          <w:sz w:val="14"/>
+          <w:szCs w:val="14"/>
+        </w:rPr>
+        <w:t>#</w:t>
+        <w:tab/>
+        <w:tab/>
+        <w:tab/>
+        <w:t>non-terminating macro char</w:t>
       </w:r>
     </w:p>
     <w:p>
@@ -21782,354 +22042,8 @@
         <w:ind w:hanging="0" w:left="0"/>
         <w:rPr>
           <w:rFonts w:ascii="Andale Mono MT Std" w:hAnsi="Andale Mono MT Std"/>
-          <w:b w:val="false"/>
-          <w:bCs w:val="false"/>
-          <w:sz w:val="14"/>
-          <w:szCs w:val="14"/>
-        </w:rPr>
-      </w:pPr>
-      <w:r>
-        <w:rPr>
-          <w:rFonts w:ascii="Andale Mono MT Std" w:hAnsi="Andale Mono MT Std"/>
-          <w:b w:val="false"/>
-          <w:bCs w:val="false"/>
-          <w:i w:val="false"/>
-          <w:iCs w:val="false"/>
-          <w:caps w:val="false"/>
-          <w:smallCaps w:val="false"/>
-          <w:color w:val="auto"/>
-          <w:spacing w:val="0"/>
-          <w:sz w:val="14"/>
-          <w:szCs w:val="14"/>
-        </w:rPr>
-        <w:t xml:space="preserve"> </w:t>
-      </w:r>
-      <w:r>
-        <w:rPr>
-          <w:rFonts w:ascii="Andale Mono MT Std" w:hAnsi="Andale Mono MT Std"/>
-          <w:b w:val="false"/>
-          <w:bCs w:val="false"/>
-          <w:i w:val="false"/>
-          <w:iCs w:val="false"/>
-          <w:caps w:val="false"/>
-          <w:smallCaps w:val="false"/>
-          <w:color w:val="auto"/>
-          <w:spacing w:val="0"/>
-          <w:sz w:val="14"/>
-          <w:szCs w:val="14"/>
-        </w:rPr>
-        <w:t>#(:type …)</w:t>
-        <w:tab/>
-        <w:tab/>
-      </w:r>
-      <w:r>
-        <w:rPr>
-          <w:rFonts w:ascii="Andale Mono MT Std" w:hAnsi="Andale Mono MT Std"/>
-          <w:b w:val="false"/>
-          <w:bCs w:val="false"/>
-          <w:i/>
-          <w:iCs/>
-          <w:caps w:val="false"/>
-          <w:smallCaps w:val="false"/>
-          <w:color w:val="auto"/>
-          <w:spacing w:val="0"/>
-          <w:sz w:val="14"/>
-          <w:szCs w:val="14"/>
-        </w:rPr>
-        <w:t>vector</w:t>
-      </w:r>
-    </w:p>
-    <w:p>
-      <w:pPr>
-        <w:pStyle w:val="Normal"/>
-        <w:spacing w:before="57" w:after="57"/>
-        <w:ind w:hanging="0" w:left="0"/>
-        <w:rPr>
-          <w:rFonts w:ascii="Andale Mono MT Std" w:hAnsi="Andale Mono MT Std"/>
-          <w:b w:val="false"/>
-          <w:bCs w:val="false"/>
-          <w:sz w:val="14"/>
-          <w:szCs w:val="14"/>
-        </w:rPr>
-      </w:pPr>
-      <w:r>
-        <w:rPr>
-          <w:rFonts w:ascii="Andale Mono MT Std" w:hAnsi="Andale Mono MT Std"/>
-          <w:b w:val="false"/>
-          <w:bCs w:val="false"/>
-          <w:i w:val="false"/>
-          <w:iCs w:val="false"/>
-          <w:caps w:val="false"/>
-          <w:smallCaps w:val="false"/>
-          <w:color w:val="auto"/>
-          <w:spacing w:val="0"/>
-          <w:sz w:val="14"/>
-          <w:szCs w:val="14"/>
-        </w:rPr>
-        <w:t xml:space="preserve"> </w:t>
-      </w:r>
-      <w:r>
-        <w:rPr>
-          <w:rFonts w:ascii="Andale Mono MT Std" w:hAnsi="Andale Mono MT Std"/>
-          <w:b w:val="false"/>
-          <w:bCs w:val="false"/>
-          <w:i w:val="false"/>
-          <w:iCs w:val="false"/>
-          <w:caps w:val="false"/>
-          <w:smallCaps w:val="false"/>
-          <w:color w:val="auto"/>
-          <w:spacing w:val="0"/>
-          <w:sz w:val="14"/>
-          <w:szCs w:val="14"/>
-        </w:rPr>
-        <w:t>#s(:type …)</w:t>
-        <w:tab/>
-        <w:tab/>
-      </w:r>
-      <w:r>
-        <w:rPr>
-          <w:rFonts w:ascii="Andale Mono MT Std" w:hAnsi="Andale Mono MT Std"/>
-          <w:b w:val="false"/>
-          <w:bCs w:val="false"/>
-          <w:i/>
-          <w:iCs/>
-          <w:caps w:val="false"/>
-          <w:smallCaps w:val="false"/>
-          <w:color w:val="auto"/>
-          <w:spacing w:val="0"/>
-          <w:sz w:val="14"/>
-          <w:szCs w:val="14"/>
-        </w:rPr>
-        <w:t>struct</w:t>
-      </w:r>
-    </w:p>
-    <w:p>
-      <w:pPr>
-        <w:pStyle w:val="Normal"/>
-        <w:spacing w:before="57" w:after="57"/>
-        <w:ind w:hanging="0" w:left="0"/>
-        <w:rPr>
-          <w:rFonts w:ascii="Andale Mono MT Std" w:hAnsi="Andale Mono MT Std"/>
-          <w:b w:val="false"/>
-          <w:bCs w:val="false"/>
-          <w:sz w:val="14"/>
-          <w:szCs w:val="14"/>
-        </w:rPr>
-      </w:pPr>
-      <w:r>
-        <w:rPr>
-          <w:rFonts w:ascii="Andale Mono MT Std" w:hAnsi="Andale Mono MT Std"/>
-          <w:b w:val="false"/>
-          <w:bCs w:val="false"/>
-          <w:i w:val="false"/>
-          <w:iCs w:val="false"/>
-          <w:caps w:val="false"/>
-          <w:smallCaps w:val="false"/>
-          <w:color w:val="auto"/>
-          <w:spacing w:val="0"/>
-          <w:sz w:val="14"/>
-          <w:szCs w:val="14"/>
-        </w:rPr>
-        <w:t xml:space="preserve"> </w:t>
-      </w:r>
-      <w:r>
-        <w:rPr>
-          <w:rFonts w:ascii="Andale Mono MT Std" w:hAnsi="Andale Mono MT Std"/>
-          <w:b w:val="false"/>
-          <w:bCs w:val="false"/>
-          <w:i w:val="false"/>
-          <w:iCs w:val="false"/>
-          <w:caps w:val="false"/>
-          <w:smallCaps w:val="false"/>
-          <w:color w:val="auto"/>
-          <w:spacing w:val="0"/>
-          <w:sz w:val="14"/>
-          <w:szCs w:val="14"/>
-        </w:rPr>
-        <w:t>#:…</w:t>
-        <w:tab/>
-      </w:r>
-      <w:r>
-        <w:rPr>
-          <w:rFonts w:ascii="Andale Mono MT Std" w:hAnsi="Andale Mono MT Std"/>
-          <w:b w:val="false"/>
-          <w:bCs w:val="false"/>
-          <w:i w:val="false"/>
-          <w:iCs/>
-          <w:caps w:val="false"/>
-          <w:smallCaps w:val="false"/>
-          <w:color w:val="auto"/>
-          <w:spacing w:val="0"/>
-          <w:sz w:val="14"/>
-          <w:szCs w:val="14"/>
-        </w:rPr>
-        <w:tab/>
-        <w:tab/>
-      </w:r>
-      <w:r>
-        <w:rPr>
-          <w:rFonts w:ascii="Andale Mono MT Std" w:hAnsi="Andale Mono MT Std"/>
-          <w:b w:val="false"/>
-          <w:bCs w:val="false"/>
-          <w:i w:val="false"/>
-          <w:iCs w:val="false"/>
-          <w:caps w:val="false"/>
-          <w:smallCaps w:val="false"/>
-          <w:color w:val="auto"/>
-          <w:spacing w:val="0"/>
-          <w:sz w:val="14"/>
-          <w:szCs w:val="14"/>
-        </w:rPr>
-        <w:t>uninterned</w:t>
-      </w:r>
-      <w:r>
-        <w:rPr>
-          <w:rFonts w:ascii="Andale Mono MT Std" w:hAnsi="Andale Mono MT Std"/>
-          <w:b w:val="false"/>
-          <w:bCs w:val="false"/>
-          <w:i w:val="false"/>
-          <w:iCs/>
-          <w:caps w:val="false"/>
-          <w:smallCaps w:val="false"/>
-          <w:color w:val="auto"/>
-          <w:spacing w:val="0"/>
-          <w:sz w:val="14"/>
-          <w:szCs w:val="14"/>
-        </w:rPr>
-        <w:t xml:space="preserve"> </w:t>
-      </w:r>
-      <w:r>
-        <w:rPr>
-          <w:rFonts w:ascii="Andale Mono MT Std" w:hAnsi="Andale Mono MT Std"/>
-          <w:b w:val="false"/>
-          <w:bCs w:val="false"/>
-          <w:i/>
-          <w:iCs/>
-          <w:caps w:val="false"/>
-          <w:smallCaps w:val="false"/>
-          <w:color w:val="auto"/>
-          <w:spacing w:val="0"/>
-          <w:sz w:val="14"/>
-          <w:szCs w:val="14"/>
-        </w:rPr>
-        <w:t>symbol</w:t>
-      </w:r>
-    </w:p>
-    <w:p>
-      <w:pPr>
-        <w:pStyle w:val="Normal"/>
-        <w:spacing w:before="57" w:after="57"/>
-        <w:ind w:hanging="0" w:left="0"/>
-        <w:rPr>
-          <w:rFonts w:ascii="Andale Mono MT Std" w:hAnsi="Andale Mono MT Std"/>
-          <w:b w:val="false"/>
-          <w:bCs w:val="false"/>
-          <w:sz w:val="14"/>
-          <w:szCs w:val="14"/>
-        </w:rPr>
-      </w:pPr>
-      <w:r>
-        <w:rPr>
-          <w:rFonts w:ascii="Andale Mono MT Std" w:hAnsi="Andale Mono MT Std"/>
-          <w:b w:val="false"/>
-          <w:bCs w:val="false"/>
-          <w:i w:val="false"/>
-          <w:iCs w:val="false"/>
-          <w:caps w:val="false"/>
-          <w:smallCaps w:val="false"/>
-          <w:color w:val="auto"/>
-          <w:spacing w:val="0"/>
-          <w:sz w:val="14"/>
-          <w:szCs w:val="14"/>
-        </w:rPr>
-        <w:t xml:space="preserve"> “</w:t>
-      </w:r>
-      <w:r>
-        <w:rPr>
-          <w:rFonts w:ascii="Andale Mono MT Std" w:hAnsi="Andale Mono MT Std"/>
-          <w:b w:val="false"/>
-          <w:bCs w:val="false"/>
-          <w:i w:val="false"/>
-          <w:iCs w:val="false"/>
-          <w:caps w:val="false"/>
-          <w:smallCaps w:val="false"/>
-          <w:color w:val="auto"/>
-          <w:spacing w:val="0"/>
-          <w:sz w:val="14"/>
-          <w:szCs w:val="14"/>
-        </w:rPr>
-        <w:t>`,;</w:t>
-        <w:tab/>
-        <w:tab/>
-        <w:tab/>
-        <w:t>terminating macro char</w:t>
-      </w:r>
-    </w:p>
-    <w:p>
-      <w:pPr>
-        <w:pStyle w:val="Normal"/>
-        <w:spacing w:before="57" w:after="57"/>
-        <w:ind w:hanging="0" w:left="0"/>
-        <w:rPr>
-          <w:rFonts w:ascii="Andale Mono MT Std" w:hAnsi="Andale Mono MT Std"/>
-          <w:b w:val="false"/>
-          <w:bCs w:val="false"/>
-          <w:i w:val="false"/>
-          <w:iCs w:val="false"/>
-          <w:caps w:val="false"/>
-          <w:smallCaps w:val="false"/>
-          <w:color w:val="auto"/>
-          <w:spacing w:val="0"/>
-          <w:sz w:val="14"/>
-          <w:szCs w:val="14"/>
-        </w:rPr>
-      </w:pPr>
-      <w:r>
-        <w:rPr>
-          <w:rFonts w:ascii="Andale Mono MT Std" w:hAnsi="Andale Mono MT Std"/>
-          <w:b w:val="false"/>
-          <w:bCs w:val="false"/>
-          <w:i w:val="false"/>
-          <w:iCs w:val="false"/>
-          <w:caps w:val="false"/>
-          <w:smallCaps w:val="false"/>
-          <w:color w:val="auto"/>
-          <w:spacing w:val="0"/>
-          <w:sz w:val="14"/>
-          <w:szCs w:val="14"/>
-        </w:rPr>
-        <w:t xml:space="preserve"> </w:t>
-      </w:r>
-      <w:r>
-        <w:rPr>
-          <w:rFonts w:ascii="Andale Mono MT Std" w:hAnsi="Andale Mono MT Std"/>
-          <w:b w:val="false"/>
-          <w:bCs w:val="false"/>
-          <w:i w:val="false"/>
-          <w:iCs w:val="false"/>
-          <w:caps w:val="false"/>
-          <w:smallCaps w:val="false"/>
-          <w:color w:val="auto"/>
-          <w:spacing w:val="0"/>
-          <w:sz w:val="14"/>
-          <w:szCs w:val="14"/>
-        </w:rPr>
-        <w:t>#</w:t>
-        <w:tab/>
-        <w:tab/>
-        <w:tab/>
-        <w:t>non-terminating macro char</w:t>
-      </w:r>
-    </w:p>
-    <w:p>
-      <w:pPr>
-        <w:pStyle w:val="Normal"/>
-        <w:spacing w:before="57" w:after="57"/>
-        <w:ind w:hanging="0" w:left="0"/>
-        <w:rPr>
-          <w:rFonts w:ascii="Andale Mono MT Std" w:hAnsi="Andale Mono MT Std"/>
-          <w:b w:val="false"/>
-          <w:bCs w:val="false"/>
+          <w:b/>
+          <w:bCs/>
           <w:i w:val="false"/>
           <w:iCs w:val="false"/>
           <w:caps w:val="false"/>
@@ -22143,8 +22057,8 @@
       <w:r>
         <w:rPr>
           <w:rFonts w:ascii="Andale Mono MT Std" w:hAnsi="Andale Mono MT Std"/>
-          <w:b w:val="false"/>
-          <w:bCs w:val="false"/>
+          <w:b/>
+          <w:bCs/>
           <w:i w:val="false"/>
           <w:iCs w:val="false"/>
           <w:caps w:val="false"/>
@@ -22162,18 +22076,15 @@
         <w:spacing w:before="57" w:after="57"/>
         <w:ind w:hanging="0" w:left="0"/>
         <w:rPr>
+          <w:b/>
+          <w:bCs/>
+        </w:rPr>
+      </w:pPr>
+      <w:r>
+        <w:rPr>
           <w:rFonts w:ascii="Andale Mono MT Std" w:hAnsi="Andale Mono MT Std"/>
-          <w:b w:val="false"/>
-          <w:bCs w:val="false"/>
-          <w:sz w:val="14"/>
-          <w:szCs w:val="14"/>
-        </w:rPr>
-      </w:pPr>
-      <w:r>
-        <w:rPr>
-          <w:rFonts w:ascii="Andale Mono MT Std" w:hAnsi="Andale Mono MT Std"/>
-          <w:b w:val="false"/>
-          <w:bCs w:val="false"/>
+          <w:b/>
+          <w:bCs/>
           <w:i w:val="false"/>
           <w:iCs w:val="false"/>
           <w:caps w:val="false"/>
@@ -22188,8 +22099,8 @@
       <w:r>
         <w:rPr>
           <w:rFonts w:ascii="Andale Mono MT Std" w:hAnsi="Andale Mono MT Std"/>
-          <w:b w:val="false"/>
-          <w:bCs w:val="false"/>
+          <w:b/>
+          <w:bCs/>
           <w:i w:val="false"/>
           <w:iCs w:val="false"/>
           <w:caps w:val="false"/>
@@ -22206,8 +22117,8 @@
       <w:r>
         <w:rPr>
           <w:rFonts w:ascii="Andale Mono MT Std" w:hAnsi="Andale Mono MT Std"/>
-          <w:b w:val="false"/>
-          <w:bCs w:val="false"/>
+          <w:b/>
+          <w:bCs/>
           <w:i/>
           <w:iCs/>
           <w:caps w:val="false"/>
@@ -22226,18 +22137,15 @@
         <w:spacing w:before="57" w:after="57"/>
         <w:ind w:hanging="0" w:left="0"/>
         <w:rPr>
+          <w:b/>
+          <w:bCs/>
+        </w:rPr>
+      </w:pPr>
+      <w:r>
+        <w:rPr>
           <w:rFonts w:ascii="Andale Mono MT Std" w:hAnsi="Andale Mono MT Std"/>
-          <w:b w:val="false"/>
-          <w:bCs w:val="false"/>
-          <w:sz w:val="14"/>
-          <w:szCs w:val="14"/>
-        </w:rPr>
-      </w:pPr>
-      <w:r>
-        <w:rPr>
-          <w:rFonts w:ascii="Andale Mono MT Std" w:hAnsi="Andale Mono MT Std"/>
-          <w:b w:val="false"/>
-          <w:bCs w:val="false"/>
+          <w:b/>
+          <w:bCs/>
           <w:i w:val="false"/>
           <w:iCs w:val="false"/>
           <w:caps w:val="false"/>
@@ -22252,8 +22160,8 @@
       <w:r>
         <w:rPr>
           <w:rFonts w:ascii="Andale Mono MT Std" w:hAnsi="Andale Mono MT Std"/>
-          <w:b w:val="false"/>
-          <w:bCs w:val="false"/>
+          <w:b/>
+          <w:bCs/>
           <w:i w:val="false"/>
           <w:iCs w:val="false"/>
           <w:caps w:val="false"/>
@@ -22272,18 +22180,15 @@
         <w:spacing w:before="57" w:after="57"/>
         <w:ind w:hanging="0" w:left="0"/>
         <w:rPr>
+          <w:b/>
+          <w:bCs/>
+        </w:rPr>
+      </w:pPr>
+      <w:r>
+        <w:rPr>
           <w:rFonts w:ascii="Andale Mono MT Std" w:hAnsi="Andale Mono MT Std"/>
-          <w:b w:val="false"/>
-          <w:bCs w:val="false"/>
-          <w:sz w:val="14"/>
-          <w:szCs w:val="14"/>
-        </w:rPr>
-      </w:pPr>
-      <w:r>
-        <w:rPr>
-          <w:rFonts w:ascii="Andale Mono MT Std" w:hAnsi="Andale Mono MT Std"/>
-          <w:b w:val="false"/>
-          <w:bCs w:val="false"/>
+          <w:b/>
+          <w:bCs/>
           <w:i w:val="false"/>
           <w:iCs w:val="false"/>
           <w:caps w:val="false"/>
@@ -22298,8 +22203,8 @@
       <w:r>
         <w:rPr>
           <w:rFonts w:ascii="Andale Mono MT Std" w:hAnsi="Andale Mono MT Std"/>
-          <w:b w:val="false"/>
-          <w:bCs w:val="false"/>
+          <w:b/>
+          <w:bCs/>
           <w:i w:val="false"/>
           <w:iCs w:val="false"/>
           <w:caps w:val="false"/>
@@ -22318,18 +22223,15 @@
         <w:spacing w:before="57" w:after="57"/>
         <w:ind w:hanging="0" w:left="0"/>
         <w:rPr>
+          <w:b/>
+          <w:bCs/>
+        </w:rPr>
+      </w:pPr>
+      <w:r>
+        <w:rPr>
           <w:rFonts w:ascii="Andale Mono MT Std" w:hAnsi="Andale Mono MT Std"/>
-          <w:b w:val="false"/>
-          <w:bCs w:val="false"/>
-          <w:sz w:val="14"/>
-          <w:szCs w:val="14"/>
-        </w:rPr>
-      </w:pPr>
-      <w:r>
-        <w:rPr>
-          <w:rFonts w:ascii="Andale Mono MT Std" w:hAnsi="Andale Mono MT Std"/>
-          <w:b w:val="false"/>
-          <w:bCs w:val="false"/>
+          <w:b/>
+          <w:bCs/>
           <w:i w:val="false"/>
           <w:iCs w:val="false"/>
           <w:caps w:val="false"/>
@@ -22344,8 +22246,8 @@
       <w:r>
         <w:rPr>
           <w:rFonts w:ascii="Andale Mono MT Std" w:hAnsi="Andale Mono MT Std"/>
-          <w:b w:val="false"/>
-          <w:bCs w:val="false"/>
+          <w:b/>
+          <w:bCs/>
           <w:i w:val="false"/>
           <w:iCs w:val="false"/>
           <w:caps w:val="false"/>
@@ -22357,6 +22259,22 @@
         </w:rPr>
         <w:t>A..Za..z</w:t>
       </w:r>
+      <w:r>
+        <w:rPr>
+          <w:rFonts w:ascii="Andale Mono MT Std" w:hAnsi="Andale Mono MT Std"/>
+          <w:b/>
+          <w:bCs/>
+          <w:i w:val="false"/>
+          <w:iCs w:val="false"/>
+          <w:caps w:val="false"/>
+          <w:smallCaps w:val="false"/>
+          <w:color w:val="auto"/>
+          <w:spacing w:val="0"/>
+          <w:sz w:val="14"/>
+          <w:szCs w:val="14"/>
+        </w:rPr>
+        <w:t>0..9</w:t>
+      </w:r>
     </w:p>
     <w:p>
       <w:pPr>
@@ -22365,8 +22283,8 @@
         <w:ind w:hanging="0" w:left="0"/>
         <w:rPr>
           <w:rFonts w:ascii="Andale Mono MT Std" w:hAnsi="Andale Mono MT Std"/>
-          <w:b w:val="false"/>
-          <w:bCs w:val="false"/>
+          <w:b/>
+          <w:bCs/>
           <w:i w:val="false"/>
           <w:iCs w:val="false"/>
           <w:caps w:val="false"/>
@@ -22380,8 +22298,8 @@
       <w:r>
         <w:rPr>
           <w:rFonts w:ascii="Andale Mono MT Std" w:hAnsi="Andale Mono MT Std"/>
-          <w:b w:val="false"/>
-          <w:bCs w:val="false"/>
+          <w:b/>
+          <w:bCs/>
           <w:i w:val="false"/>
           <w:iCs w:val="false"/>
           <w:caps w:val="false"/>
@@ -22391,13 +22309,24 @@
           <w:sz w:val="14"/>
           <w:szCs w:val="14"/>
         </w:rPr>
-        <w:t xml:space="preserve"> </w:t>
-      </w:r>
+        <w:tab/>
+      </w:r>
+    </w:p>
+    <w:p>
+      <w:pPr>
+        <w:pStyle w:val="Normal"/>
+        <w:spacing w:before="57" w:after="57"/>
+        <w:ind w:hanging="0" w:left="0"/>
+        <w:rPr>
+          <w:b/>
+          <w:bCs/>
+        </w:rPr>
+      </w:pPr>
       <w:r>
         <w:rPr>
           <w:rFonts w:ascii="Andale Mono MT Std" w:hAnsi="Andale Mono MT Std"/>
-          <w:b w:val="false"/>
-          <w:bCs w:val="false"/>
+          <w:b/>
+          <w:bCs/>
           <w:i w:val="false"/>
           <w:iCs w:val="false"/>
           <w:caps w:val="false"/>
@@ -22407,7 +22336,27 @@
           <w:sz w:val="14"/>
           <w:szCs w:val="14"/>
         </w:rPr>
-        <w:t>0..9</w:t>
+        <w:t xml:space="preserve"> </w:t>
+      </w:r>
+      <w:r>
+        <w:rPr>
+          <w:rFonts w:ascii="Andale Mono MT Std" w:hAnsi="Andale Mono MT Std"/>
+          <w:b/>
+          <w:bCs/>
+          <w:i w:val="false"/>
+          <w:iCs w:val="false"/>
+          <w:caps w:val="false"/>
+          <w:smallCaps w:val="false"/>
+          <w:color w:val="auto"/>
+          <w:spacing w:val="0"/>
+          <w:sz w:val="14"/>
+          <w:szCs w:val="14"/>
+        </w:rPr>
+        <w:t>0x09 #\tab</w:t>
+        <w:tab/>
+        <w:tab/>
+        <w:t>character designators</w:t>
+        <w:tab/>
       </w:r>
     </w:p>
     <w:p>
@@ -22416,9 +22365,15 @@
         <w:spacing w:before="57" w:after="57"/>
         <w:ind w:hanging="0" w:left="0"/>
         <w:rPr>
+          <w:b/>
+          <w:bCs/>
+        </w:rPr>
+      </w:pPr>
+      <w:r>
+        <w:rPr>
           <w:rFonts w:ascii="Andale Mono MT Std" w:hAnsi="Andale Mono MT Std"/>
-          <w:b w:val="false"/>
-          <w:bCs w:val="false"/>
+          <w:b/>
+          <w:bCs/>
           <w:i w:val="false"/>
           <w:iCs w:val="false"/>
           <w:caps w:val="false"/>
@@ -22428,12 +22383,13 @@
           <w:sz w:val="14"/>
           <w:szCs w:val="14"/>
         </w:rPr>
-      </w:pPr>
+        <w:t xml:space="preserve"> </w:t>
+      </w:r>
       <w:r>
         <w:rPr>
           <w:rFonts w:ascii="Andale Mono MT Std" w:hAnsi="Andale Mono MT Std"/>
-          <w:b w:val="false"/>
-          <w:bCs w:val="false"/>
+          <w:b/>
+          <w:bCs/>
           <w:i w:val="false"/>
           <w:iCs w:val="false"/>
           <w:caps w:val="false"/>
@@ -22443,8 +22399,7 @@
           <w:sz w:val="14"/>
           <w:szCs w:val="14"/>
         </w:rPr>
-        <w:tab/>
-        <w:tab/>
+        <w:t xml:space="preserve">0x0a #\linefeed </w:t>
       </w:r>
     </w:p>
     <w:p>
@@ -22453,18 +22408,15 @@
         <w:spacing w:before="57" w:after="57"/>
         <w:ind w:hanging="0" w:left="0"/>
         <w:rPr>
+          <w:b/>
+          <w:bCs/>
+        </w:rPr>
+      </w:pPr>
+      <w:r>
+        <w:rPr>
           <w:rFonts w:ascii="Andale Mono MT Std" w:hAnsi="Andale Mono MT Std"/>
-          <w:b w:val="false"/>
-          <w:bCs w:val="false"/>
-          <w:sz w:val="14"/>
-          <w:szCs w:val="14"/>
-        </w:rPr>
-      </w:pPr>
-      <w:r>
-        <w:rPr>
-          <w:rFonts w:ascii="Andale Mono MT Std" w:hAnsi="Andale Mono MT Std"/>
-          <w:b w:val="false"/>
-          <w:bCs w:val="false"/>
+          <w:b/>
+          <w:bCs/>
           <w:i w:val="false"/>
           <w:iCs w:val="false"/>
           <w:caps w:val="false"/>
@@ -22479,8 +22431,8 @@
       <w:r>
         <w:rPr>
           <w:rFonts w:ascii="Andale Mono MT Std" w:hAnsi="Andale Mono MT Std"/>
-          <w:b w:val="false"/>
-          <w:bCs w:val="false"/>
+          <w:b/>
+          <w:bCs/>
           <w:i w:val="false"/>
           <w:iCs w:val="false"/>
           <w:caps w:val="false"/>
@@ -22490,15 +22442,24 @@
           <w:sz w:val="14"/>
           <w:szCs w:val="14"/>
         </w:rPr>
-        <w:t>0x09 #\tab</w:t>
-        <w:tab/>
-        <w:tab/>
-      </w:r>
+        <w:t xml:space="preserve">0x0c #\page                </w:t>
+      </w:r>
+    </w:p>
+    <w:p>
+      <w:pPr>
+        <w:pStyle w:val="Normal"/>
+        <w:spacing w:before="57" w:after="57"/>
+        <w:ind w:hanging="0" w:left="0"/>
+        <w:rPr>
+          <w:b/>
+          <w:bCs/>
+        </w:rPr>
+      </w:pPr>
       <w:r>
         <w:rPr>
           <w:rFonts w:ascii="Andale Mono MT Std" w:hAnsi="Andale Mono MT Std"/>
-          <w:b w:val="false"/>
-          <w:bCs w:val="false"/>
+          <w:b/>
+          <w:bCs/>
           <w:i w:val="false"/>
           <w:iCs w:val="false"/>
           <w:caps w:val="false"/>
@@ -22508,8 +22469,23 @@
           <w:sz w:val="14"/>
           <w:szCs w:val="14"/>
         </w:rPr>
-        <w:t>character designators</w:t>
-        <w:tab/>
+        <w:t xml:space="preserve"> </w:t>
+      </w:r>
+      <w:r>
+        <w:rPr>
+          <w:rFonts w:ascii="Andale Mono MT Std" w:hAnsi="Andale Mono MT Std"/>
+          <w:b/>
+          <w:bCs/>
+          <w:i w:val="false"/>
+          <w:iCs w:val="false"/>
+          <w:caps w:val="false"/>
+          <w:smallCaps w:val="false"/>
+          <w:color w:val="auto"/>
+          <w:spacing w:val="0"/>
+          <w:sz w:val="14"/>
+          <w:szCs w:val="14"/>
+        </w:rPr>
+        <w:t xml:space="preserve">0x0d #\return            </w:t>
       </w:r>
     </w:p>
     <w:p>
@@ -22518,18 +22494,15 @@
         <w:spacing w:before="57" w:after="57"/>
         <w:ind w:hanging="0" w:left="0"/>
         <w:rPr>
+          <w:b/>
+          <w:bCs/>
+        </w:rPr>
+      </w:pPr>
+      <w:r>
+        <w:rPr>
           <w:rFonts w:ascii="Andale Mono MT Std" w:hAnsi="Andale Mono MT Std"/>
-          <w:b w:val="false"/>
-          <w:bCs w:val="false"/>
-          <w:sz w:val="14"/>
-          <w:szCs w:val="14"/>
-        </w:rPr>
-      </w:pPr>
-      <w:r>
-        <w:rPr>
-          <w:rFonts w:ascii="Andale Mono MT Std" w:hAnsi="Andale Mono MT Std"/>
-          <w:b w:val="false"/>
-          <w:bCs w:val="false"/>
+          <w:b/>
+          <w:bCs/>
           <w:i w:val="false"/>
           <w:iCs w:val="false"/>
           <w:caps w:val="false"/>
@@ -22544,146 +22517,8 @@
       <w:r>
         <w:rPr>
           <w:rFonts w:ascii="Andale Mono MT Std" w:hAnsi="Andale Mono MT Std"/>
-          <w:b w:val="false"/>
-          <w:bCs w:val="false"/>
-          <w:i w:val="false"/>
-          <w:iCs w:val="false"/>
-          <w:caps w:val="false"/>
-          <w:smallCaps w:val="false"/>
-          <w:color w:val="auto"/>
-          <w:spacing w:val="0"/>
-          <w:sz w:val="14"/>
-          <w:szCs w:val="14"/>
-        </w:rPr>
-        <w:t xml:space="preserve">0x0a #\linefeed </w:t>
-      </w:r>
-    </w:p>
-    <w:p>
-      <w:pPr>
-        <w:pStyle w:val="Normal"/>
-        <w:spacing w:before="57" w:after="57"/>
-        <w:ind w:hanging="0" w:left="0"/>
-        <w:rPr>
-          <w:rFonts w:ascii="Andale Mono MT Std" w:hAnsi="Andale Mono MT Std"/>
-          <w:b w:val="false"/>
-          <w:bCs w:val="false"/>
-          <w:sz w:val="14"/>
-          <w:szCs w:val="14"/>
-        </w:rPr>
-      </w:pPr>
-      <w:r>
-        <w:rPr>
-          <w:rFonts w:ascii="Andale Mono MT Std" w:hAnsi="Andale Mono MT Std"/>
-          <w:b w:val="false"/>
-          <w:bCs w:val="false"/>
-          <w:i w:val="false"/>
-          <w:iCs w:val="false"/>
-          <w:caps w:val="false"/>
-          <w:smallCaps w:val="false"/>
-          <w:color w:val="auto"/>
-          <w:spacing w:val="0"/>
-          <w:sz w:val="14"/>
-          <w:szCs w:val="14"/>
-        </w:rPr>
-        <w:t xml:space="preserve"> </w:t>
-      </w:r>
-      <w:r>
-        <w:rPr>
-          <w:rFonts w:ascii="Andale Mono MT Std" w:hAnsi="Andale Mono MT Std"/>
-          <w:b w:val="false"/>
-          <w:bCs w:val="false"/>
-          <w:i w:val="false"/>
-          <w:iCs w:val="false"/>
-          <w:caps w:val="false"/>
-          <w:smallCaps w:val="false"/>
-          <w:color w:val="auto"/>
-          <w:spacing w:val="0"/>
-          <w:sz w:val="14"/>
-          <w:szCs w:val="14"/>
-        </w:rPr>
-        <w:t xml:space="preserve">0x0c #\page                </w:t>
-      </w:r>
-    </w:p>
-    <w:p>
-      <w:pPr>
-        <w:pStyle w:val="Normal"/>
-        <w:spacing w:before="57" w:after="57"/>
-        <w:ind w:hanging="0" w:left="0"/>
-        <w:rPr>
-          <w:rFonts w:ascii="Andale Mono MT Std" w:hAnsi="Andale Mono MT Std"/>
-          <w:b w:val="false"/>
-          <w:bCs w:val="false"/>
-          <w:sz w:val="14"/>
-          <w:szCs w:val="14"/>
-        </w:rPr>
-      </w:pPr>
-      <w:r>
-        <w:rPr>
-          <w:rFonts w:ascii="Andale Mono MT Std" w:hAnsi="Andale Mono MT Std"/>
-          <w:b w:val="false"/>
-          <w:bCs w:val="false"/>
-          <w:i w:val="false"/>
-          <w:iCs w:val="false"/>
-          <w:caps w:val="false"/>
-          <w:smallCaps w:val="false"/>
-          <w:color w:val="auto"/>
-          <w:spacing w:val="0"/>
-          <w:sz w:val="14"/>
-          <w:szCs w:val="14"/>
-        </w:rPr>
-        <w:t xml:space="preserve"> </w:t>
-      </w:r>
-      <w:r>
-        <w:rPr>
-          <w:rFonts w:ascii="Andale Mono MT Std" w:hAnsi="Andale Mono MT Std"/>
-          <w:b w:val="false"/>
-          <w:bCs w:val="false"/>
-          <w:i w:val="false"/>
-          <w:iCs w:val="false"/>
-          <w:caps w:val="false"/>
-          <w:smallCaps w:val="false"/>
-          <w:color w:val="auto"/>
-          <w:spacing w:val="0"/>
-          <w:sz w:val="14"/>
-          <w:szCs w:val="14"/>
-        </w:rPr>
-        <w:t xml:space="preserve">0x0d #\return            </w:t>
-      </w:r>
-    </w:p>
-    <w:p>
-      <w:pPr>
-        <w:pStyle w:val="Normal"/>
-        <w:spacing w:before="57" w:after="57"/>
-        <w:ind w:hanging="0" w:left="0"/>
-        <w:rPr>
-          <w:rFonts w:ascii="Andale Mono MT Std" w:hAnsi="Andale Mono MT Std"/>
-          <w:b w:val="false"/>
-          <w:bCs w:val="false"/>
-          <w:sz w:val="14"/>
-          <w:szCs w:val="14"/>
-        </w:rPr>
-      </w:pPr>
-      <w:r>
-        <w:rPr>
-          <w:rFonts w:ascii="Andale Mono MT Std" w:hAnsi="Andale Mono MT Std"/>
-          <w:b w:val="false"/>
-          <w:bCs w:val="false"/>
-          <w:i w:val="false"/>
-          <w:iCs w:val="false"/>
-          <w:caps w:val="false"/>
-          <w:smallCaps w:val="false"/>
-          <w:color w:val="auto"/>
-          <w:spacing w:val="0"/>
-          <w:sz w:val="14"/>
-          <w:szCs w:val="14"/>
-        </w:rPr>
-        <w:t xml:space="preserve"> </w:t>
-      </w:r>
-      <w:r>
-        <w:rPr>
-          <w:rFonts w:ascii="Andale Mono MT Std" w:hAnsi="Andale Mono MT Std"/>
-          <w:b w:val="false"/>
-          <w:bCs w:val="false"/>
+          <w:b/>
+          <w:bCs/>
           <w:i w:val="false"/>
           <w:iCs w:val="false"/>
           <w:caps w:val="false"/>
@@ -22990,7 +22825,7 @@
     <w:pPr>
       <w:widowControl/>
       <w:suppressAutoHyphens w:val="true"/>
-      <w:overflowPunct w:val="false"/>
+      <w:overflowPunct w:val="true"/>
       <w:bidi w:val="0"/>
       <w:spacing w:before="0" w:after="0"/>
       <w:jc w:val="left"/>
@@ -23156,8 +22991,8 @@
     </w:pPr>
     <w:rPr/>
   </w:style>
-  <w:style w:type="paragraph" w:styleId="FrameContentsuser">
-    <w:name w:val="Frame Contents (user)"/>
+  <w:style w:type="paragraph" w:styleId="FrameContents">
+    <w:name w:val="Frame Contents"/>
     <w:basedOn w:val="Normal"/>
     <w:qFormat/>
     <w:pPr/>

</xml_diff>

<commit_message>
#1117 - runtime: add ffi feature
</commit_message>
<xml_diff>
--- a/doc/refcards/mu-ref.docx
+++ b/doc/refcards/mu-ref.docx
@@ -345,19 +345,7 @@
           <w:sz w:val="16"/>
           <w:szCs w:val="16"/>
         </w:rPr>
-        <w:t>0.2.2</w:t>
-      </w:r>
-      <w:r>
-        <w:rPr>
-          <w:rFonts w:ascii="Georgia" w:hAnsi="Georgia"/>
-          <w:b/>
-          <w:bCs/>
-          <w:i/>
-          <w:iCs/>
-          <w:sz w:val="16"/>
-          <w:szCs w:val="16"/>
-        </w:rPr>
-        <w:t>1</w:t>
+        <w:t>0.2.22</w:t>
       </w:r>
     </w:p>
     <w:p>
@@ -3736,6 +3724,132 @@
           <w:sz w:val="16"/>
           <w:szCs w:val="16"/>
         </w:rPr>
+        <w:t xml:space="preserve">  </w:t>
+      </w:r>
+      <w:r>
+        <w:rPr>
+          <w:rFonts w:ascii="Georgia" w:hAnsi="Georgia"/>
+          <w:b/>
+          <w:bCs/>
+          <w:i/>
+          <w:iCs/>
+          <w:sz w:val="16"/>
+          <w:szCs w:val="16"/>
+        </w:rPr>
+        <w:t xml:space="preserve"> </w:t>
+      </w:r>
+      <w:r>
+        <w:rPr>
+          <w:rFonts w:ascii="Andale Mono" w:hAnsi="Andale Mono"/>
+          <w:b w:val="false"/>
+          <w:bCs w:val="false"/>
+          <w:i/>
+          <w:iCs/>
+          <w:sz w:val="16"/>
+          <w:szCs w:val="16"/>
+        </w:rPr>
+        <w:t>:lambda</w:t>
+      </w:r>
+      <w:r>
+        <w:rPr>
+          <w:rFonts w:ascii="Georgia" w:hAnsi="Georgia"/>
+          <w:b w:val="false"/>
+          <w:bCs w:val="false"/>
+          <w:i w:val="false"/>
+          <w:iCs/>
+          <w:sz w:val="16"/>
+          <w:szCs w:val="16"/>
+        </w:rPr>
+        <w:t xml:space="preserve"> </w:t>
+      </w:r>
+      <w:r>
+        <w:rPr>
+          <w:rFonts w:ascii="Georgia" w:hAnsi="Georgia"/>
+          <w:b w:val="false"/>
+          <w:bCs w:val="false"/>
+          <w:i/>
+          <w:iCs/>
+          <w:sz w:val="16"/>
+          <w:szCs w:val="16"/>
+        </w:rPr>
+        <w:t>list</w:t>
+      </w:r>
+      <w:r>
+        <w:rPr>
+          <w:rFonts w:ascii="Georgia" w:hAnsi="Georgia"/>
+          <w:b w:val="false"/>
+          <w:bCs w:val="false"/>
+          <w:i w:val="false"/>
+          <w:iCs/>
+          <w:sz w:val="16"/>
+          <w:szCs w:val="16"/>
+        </w:rPr>
+        <w:t xml:space="preserve"> . </w:t>
+      </w:r>
+      <w:r>
+        <w:rPr>
+          <w:rFonts w:ascii="Georgia" w:hAnsi="Georgia"/>
+          <w:b w:val="false"/>
+          <w:bCs w:val="false"/>
+          <w:i/>
+          <w:iCs/>
+          <w:sz w:val="16"/>
+          <w:szCs w:val="16"/>
+        </w:rPr>
+        <w:t>list’</w:t>
+        <w:tab/>
+        <w:tab/>
+      </w:r>
+      <w:r>
+        <w:rPr>
+          <w:rFonts w:ascii="Georgia" w:hAnsi="Georgia"/>
+          <w:i/>
+          <w:iCs/>
+          <w:sz w:val="16"/>
+          <w:szCs w:val="16"/>
+        </w:rPr>
+        <w:t>function</w:t>
+        <w:tab/>
+      </w:r>
+      <w:r>
+        <w:rPr>
+          <w:rFonts w:ascii="Georgia" w:hAnsi="Georgia"/>
+          <w:i w:val="false"/>
+          <w:iCs w:val="false"/>
+          <w:sz w:val="16"/>
+          <w:szCs w:val="16"/>
+        </w:rPr>
+        <w:t xml:space="preserve">anonymous </w:t>
+      </w:r>
+      <w:r>
+        <w:rPr>
+          <w:rFonts w:ascii="Georgia" w:hAnsi="Georgia"/>
+          <w:i/>
+          <w:iCs/>
+          <w:sz w:val="16"/>
+          <w:szCs w:val="16"/>
+        </w:rPr>
+        <w:t>fn</w:t>
+      </w:r>
+    </w:p>
+    <w:p>
+      <w:pPr>
+        <w:pStyle w:val="Normal"/>
+        <w:rPr>
+          <w:sz w:val="16"/>
+          <w:szCs w:val="16"/>
+        </w:rPr>
+      </w:pPr>
+      <w:r>
+        <w:rPr>
+          <w:rFonts w:ascii="Georgia" w:hAnsi="Georgia"/>
+          <w:b/>
+          <w:bCs/>
+          <w:i/>
+          <w:iCs/>
+          <w:sz w:val="16"/>
+          <w:szCs w:val="16"/>
+        </w:rPr>
         <w:t xml:space="preserve">   </w:t>
       </w:r>
       <w:r>
@@ -3743,20 +3857,19 @@
           <w:rFonts w:ascii="Andale Mono" w:hAnsi="Andale Mono"/>
           <w:b w:val="false"/>
           <w:bCs w:val="false"/>
-          <w:i w:val="false"/>
-          <w:iCs w:val="false"/>
-          <w:sz w:val="16"/>
-          <w:szCs w:val="16"/>
-        </w:rPr>
-        <w:t>:lambda</w:t>
-      </w:r>
-      <w:r>
-        <w:rPr>
-          <w:rFonts w:ascii="Georgia" w:hAnsi="Georgia"/>
-          <w:b w:val="false"/>
-          <w:bCs w:val="false"/>
-          <w:i w:val="false"/>
-          <w:iCs/>
+          <w:i/>
+          <w:iCs/>
+          <w:sz w:val="16"/>
+          <w:szCs w:val="16"/>
+        </w:rPr>
+        <w:t>:alambda</w:t>
+      </w:r>
+      <w:r>
+        <w:rPr>
+          <w:rFonts w:ascii="Georgia" w:hAnsi="Georgia"/>
+          <w:b w:val="false"/>
+          <w:bCs w:val="false"/>
+          <w:i w:val="false"/>
           <w:sz w:val="16"/>
           <w:szCs w:val="16"/>
         </w:rPr>
@@ -3780,23 +3893,33 @@
           <w:b w:val="false"/>
           <w:bCs w:val="false"/>
           <w:i w:val="false"/>
-          <w:iCs/>
-          <w:sz w:val="16"/>
-          <w:szCs w:val="16"/>
-        </w:rPr>
-        <w:t xml:space="preserve"> . </w:t>
-      </w:r>
-      <w:r>
-        <w:rPr>
-          <w:rFonts w:ascii="Georgia" w:hAnsi="Georgia"/>
-          <w:b w:val="false"/>
-          <w:bCs w:val="false"/>
-          <w:i/>
-          <w:iCs/>
-          <w:sz w:val="16"/>
-          <w:szCs w:val="16"/>
-        </w:rPr>
-        <w:t>list’</w:t>
+          <w:sz w:val="16"/>
+          <w:szCs w:val="16"/>
+        </w:rPr>
+        <w:t xml:space="preserve"> .</w:t>
+      </w:r>
+      <w:r>
+        <w:rPr>
+          <w:rFonts w:ascii="Georgia" w:hAnsi="Georgia"/>
+          <w:b w:val="false"/>
+          <w:bCs w:val="false"/>
+          <w:i/>
+          <w:iCs/>
+          <w:sz w:val="16"/>
+          <w:szCs w:val="16"/>
+        </w:rPr>
+        <w:t xml:space="preserve"> list’</w:t>
+      </w:r>
+      <w:r>
+        <w:rPr>
+          <w:rFonts w:ascii="Georgia" w:hAnsi="Georgia"/>
+          <w:b w:val="false"/>
+          <w:bCs w:val="false"/>
+          <w:i w:val="false"/>
+          <w:iCs w:val="false"/>
+          <w:sz w:val="16"/>
+          <w:szCs w:val="16"/>
+        </w:rPr>
         <w:tab/>
       </w:r>
       <w:r>
@@ -3808,6 +3931,13 @@
           <w:szCs w:val="16"/>
         </w:rPr>
         <w:t>function</w:t>
+      </w:r>
+      <w:r>
+        <w:rPr>
+          <w:rFonts w:ascii="Georgia" w:hAnsi="Georgia"/>
+          <w:sz w:val="16"/>
+          <w:szCs w:val="16"/>
+        </w:rPr>
         <w:tab/>
       </w:r>
       <w:r>
@@ -3856,29 +3986,40 @@
           <w:rFonts w:ascii="Andale Mono" w:hAnsi="Andale Mono"/>
           <w:b w:val="false"/>
           <w:bCs w:val="false"/>
-          <w:i w:val="false"/>
-          <w:iCs w:val="false"/>
-          <w:sz w:val="16"/>
-          <w:szCs w:val="16"/>
-        </w:rPr>
-        <w:t>:alambda</w:t>
-      </w:r>
-      <w:r>
-        <w:rPr>
-          <w:rFonts w:ascii="Georgia" w:hAnsi="Georgia"/>
-          <w:b w:val="false"/>
-          <w:bCs w:val="false"/>
-          <w:i w:val="false"/>
-          <w:sz w:val="16"/>
-          <w:szCs w:val="16"/>
-        </w:rPr>
-        <w:t xml:space="preserve"> </w:t>
-      </w:r>
-      <w:r>
-        <w:rPr>
-          <w:rFonts w:ascii="Georgia" w:hAnsi="Georgia"/>
-          <w:b w:val="false"/>
-          <w:bCs w:val="false"/>
+          <w:i/>
+          <w:iCs/>
+          <w:sz w:val="16"/>
+          <w:szCs w:val="16"/>
+        </w:rPr>
+        <w:t>:quote</w:t>
+      </w:r>
+      <w:r>
+        <w:rPr>
+          <w:rFonts w:ascii="Georgia" w:hAnsi="Georgia"/>
+          <w:b w:val="false"/>
+          <w:i/>
+          <w:iCs/>
+          <w:sz w:val="16"/>
+          <w:szCs w:val="16"/>
+        </w:rPr>
+        <w:t xml:space="preserve"> T</w:t>
+      </w:r>
+      <w:r>
+        <w:rPr>
+          <w:rFonts w:ascii="Georgia" w:hAnsi="Georgia"/>
+          <w:b w:val="false"/>
+          <w:i w:val="false"/>
+          <w:iCs w:val="false"/>
+          <w:sz w:val="16"/>
+          <w:szCs w:val="16"/>
+        </w:rPr>
+        <w:tab/>
+        <w:tab/>
+      </w:r>
+      <w:r>
+        <w:rPr>
+          <w:rFonts w:ascii="Georgia" w:hAnsi="Georgia"/>
+          <w:b w:val="false"/>
           <w:i/>
           <w:iCs/>
           <w:sz w:val="16"/>
@@ -3890,87 +4031,61 @@
         <w:rPr>
           <w:rFonts w:ascii="Georgia" w:hAnsi="Georgia"/>
           <w:b w:val="false"/>
-          <w:bCs w:val="false"/>
-          <w:i w:val="false"/>
-          <w:sz w:val="16"/>
-          <w:szCs w:val="16"/>
-        </w:rPr>
-        <w:t xml:space="preserve"> .</w:t>
-      </w:r>
-      <w:r>
-        <w:rPr>
-          <w:rFonts w:ascii="Georgia" w:hAnsi="Georgia"/>
-          <w:b w:val="false"/>
-          <w:bCs w:val="false"/>
-          <w:i/>
-          <w:iCs/>
-          <w:sz w:val="16"/>
-          <w:szCs w:val="16"/>
-        </w:rPr>
-        <w:t xml:space="preserve"> list’</w:t>
-      </w:r>
-      <w:r>
-        <w:rPr>
-          <w:rFonts w:ascii="Georgia" w:hAnsi="Georgia"/>
-          <w:b w:val="false"/>
-          <w:bCs w:val="false"/>
-          <w:i w:val="false"/>
-          <w:iCs w:val="false"/>
-          <w:sz w:val="16"/>
-          <w:szCs w:val="16"/>
-        </w:rPr>
-        <w:tab/>
-      </w:r>
-      <w:r>
-        <w:rPr>
-          <w:rFonts w:ascii="Georgia" w:hAnsi="Georgia"/>
-          <w:i/>
-          <w:iCs/>
-          <w:sz w:val="16"/>
-          <w:szCs w:val="16"/>
-        </w:rPr>
-        <w:t>function</w:t>
-      </w:r>
-      <w:r>
-        <w:rPr>
-          <w:rFonts w:ascii="Georgia" w:hAnsi="Georgia"/>
-          <w:sz w:val="16"/>
-          <w:szCs w:val="16"/>
-        </w:rPr>
-        <w:tab/>
-      </w:r>
-      <w:r>
-        <w:rPr>
-          <w:rFonts w:ascii="Georgia" w:hAnsi="Georgia"/>
-          <w:i w:val="false"/>
-          <w:iCs w:val="false"/>
-          <w:sz w:val="16"/>
-          <w:szCs w:val="16"/>
-        </w:rPr>
-        <w:t xml:space="preserve">anonymous </w:t>
-      </w:r>
-      <w:r>
-        <w:rPr>
-          <w:rFonts w:ascii="Georgia" w:hAnsi="Georgia"/>
-          <w:i/>
-          <w:iCs/>
-          <w:sz w:val="16"/>
-          <w:szCs w:val="16"/>
-        </w:rPr>
-        <w:t>fn</w:t>
-      </w:r>
-    </w:p>
-    <w:p>
-      <w:pPr>
-        <w:pStyle w:val="Normal"/>
-        <w:rPr>
-          <w:sz w:val="16"/>
-          <w:szCs w:val="16"/>
-        </w:rPr>
-      </w:pPr>
-      <w:r>
-        <w:rPr>
-          <w:rFonts w:ascii="Georgia" w:hAnsi="Georgia"/>
+          <w:i w:val="false"/>
+          <w:iCs w:val="false"/>
+          <w:sz w:val="16"/>
+          <w:szCs w:val="16"/>
+        </w:rPr>
+        <w:tab/>
+      </w:r>
+      <w:r>
+        <w:rPr>
+          <w:rFonts w:ascii="Georgia" w:hAnsi="Georgia"/>
+          <w:i w:val="false"/>
+          <w:iCs w:val="false"/>
+          <w:sz w:val="16"/>
+          <w:szCs w:val="16"/>
+        </w:rPr>
+        <w:t>quoted</w:t>
+      </w:r>
+      <w:r>
+        <w:rPr>
+          <w:rFonts w:ascii="Georgia" w:hAnsi="Georgia"/>
+          <w:b w:val="false"/>
+          <w:i w:val="false"/>
+          <w:iCs w:val="false"/>
+          <w:sz w:val="16"/>
+          <w:szCs w:val="16"/>
+        </w:rPr>
+        <w:t xml:space="preserve"> </w:t>
+      </w:r>
+      <w:r>
+        <w:rPr>
+          <w:rFonts w:ascii="Georgia" w:hAnsi="Georgia"/>
+          <w:i w:val="false"/>
+          <w:iCs w:val="false"/>
+          <w:sz w:val="16"/>
+          <w:szCs w:val="16"/>
+        </w:rPr>
+        <w:t>form</w:t>
+      </w:r>
+    </w:p>
+    <w:p>
+      <w:pPr>
+        <w:pStyle w:val="Normal"/>
+        <w:rPr>
+          <w:rFonts w:ascii="Georgia" w:hAnsi="Georgia"/>
+          <w:b/>
+          <w:bCs/>
+          <w:i/>
+          <w:iCs/>
+          <w:sz w:val="16"/>
+          <w:szCs w:val="16"/>
+        </w:rPr>
+      </w:pPr>
+      <w:r>
+        <w:rPr>
+          <w:rFonts w:ascii="Andale Mono" w:hAnsi="Andale Mono"/>
           <w:b/>
           <w:bCs/>
           <w:i/>
@@ -3983,166 +4098,44 @@
       <w:r>
         <w:rPr>
           <w:rFonts w:ascii="Andale Mono" w:hAnsi="Andale Mono"/>
-          <w:b w:val="false"/>
-          <w:bCs w:val="false"/>
-          <w:i w:val="false"/>
-          <w:iCs w:val="false"/>
-          <w:sz w:val="16"/>
-          <w:szCs w:val="16"/>
-        </w:rPr>
-        <w:t>:quote</w:t>
-      </w:r>
-      <w:r>
-        <w:rPr>
-          <w:rFonts w:ascii="Georgia" w:hAnsi="Georgia"/>
-          <w:b w:val="false"/>
-          <w:i w:val="false"/>
-          <w:iCs/>
-          <w:sz w:val="16"/>
-          <w:szCs w:val="16"/>
-        </w:rPr>
-        <w:t xml:space="preserve"> </w:t>
-      </w:r>
-      <w:r>
-        <w:rPr>
-          <w:rFonts w:ascii="Georgia" w:hAnsi="Georgia"/>
-          <w:b w:val="false"/>
-          <w:i/>
-          <w:iCs/>
-          <w:sz w:val="16"/>
-          <w:szCs w:val="16"/>
-        </w:rPr>
+          <w:i/>
+          <w:iCs/>
+          <w:sz w:val="16"/>
+          <w:szCs w:val="16"/>
+        </w:rPr>
+        <w:t>:if</w:t>
+      </w:r>
+      <w:r>
+        <w:rPr>
+          <w:b/>
+          <w:bCs/>
+          <w:i/>
+          <w:iCs/>
+          <w:sz w:val="16"/>
+          <w:szCs w:val="16"/>
+        </w:rPr>
+        <w:t xml:space="preserve"> </w:t>
+      </w:r>
+      <w:r>
+        <w:rPr>
+          <w:i/>
+          <w:iCs/>
+          <w:sz w:val="16"/>
+          <w:szCs w:val="16"/>
+        </w:rPr>
+        <w:t>T T’ T’’</w:t>
+      </w:r>
+      <w:r>
+        <w:rPr>
+          <w:bCs/>
+          <w:i/>
+          <w:iCs/>
+          <w:sz w:val="16"/>
+          <w:szCs w:val="16"/>
+        </w:rPr>
+        <w:tab/>
+        <w:tab/>
         <w:t>T</w:t>
-      </w:r>
-      <w:r>
-        <w:rPr>
-          <w:rFonts w:ascii="Georgia" w:hAnsi="Georgia"/>
-          <w:b w:val="false"/>
-          <w:i w:val="false"/>
-          <w:iCs w:val="false"/>
-          <w:sz w:val="16"/>
-          <w:szCs w:val="16"/>
-        </w:rPr>
-        <w:tab/>
-        <w:tab/>
-      </w:r>
-      <w:r>
-        <w:rPr>
-          <w:rFonts w:ascii="Georgia" w:hAnsi="Georgia"/>
-          <w:b w:val="false"/>
-          <w:i/>
-          <w:iCs/>
-          <w:sz w:val="16"/>
-          <w:szCs w:val="16"/>
-        </w:rPr>
-        <w:t>list</w:t>
-      </w:r>
-      <w:r>
-        <w:rPr>
-          <w:rFonts w:ascii="Georgia" w:hAnsi="Georgia"/>
-          <w:b w:val="false"/>
-          <w:i w:val="false"/>
-          <w:iCs w:val="false"/>
-          <w:sz w:val="16"/>
-          <w:szCs w:val="16"/>
-        </w:rPr>
-        <w:tab/>
-      </w:r>
-      <w:r>
-        <w:rPr>
-          <w:rFonts w:ascii="Georgia" w:hAnsi="Georgia"/>
-          <w:i w:val="false"/>
-          <w:iCs w:val="false"/>
-          <w:sz w:val="16"/>
-          <w:szCs w:val="16"/>
-        </w:rPr>
-        <w:t>quoted</w:t>
-      </w:r>
-      <w:r>
-        <w:rPr>
-          <w:rFonts w:ascii="Georgia" w:hAnsi="Georgia"/>
-          <w:b w:val="false"/>
-          <w:i w:val="false"/>
-          <w:iCs w:val="false"/>
-          <w:sz w:val="16"/>
-          <w:szCs w:val="16"/>
-        </w:rPr>
-        <w:t xml:space="preserve"> </w:t>
-      </w:r>
-      <w:r>
-        <w:rPr>
-          <w:rFonts w:ascii="Georgia" w:hAnsi="Georgia"/>
-          <w:i w:val="false"/>
-          <w:iCs w:val="false"/>
-          <w:sz w:val="16"/>
-          <w:szCs w:val="16"/>
-        </w:rPr>
-        <w:t>form</w:t>
-      </w:r>
-    </w:p>
-    <w:p>
-      <w:pPr>
-        <w:pStyle w:val="Normal"/>
-        <w:rPr>
-          <w:rFonts w:ascii="Georgia" w:hAnsi="Georgia"/>
-          <w:b/>
-          <w:bCs/>
-          <w:i/>
-          <w:iCs/>
-          <w:sz w:val="16"/>
-          <w:szCs w:val="16"/>
-        </w:rPr>
-      </w:pPr>
-      <w:r>
-        <w:rPr>
-          <w:b/>
-          <w:bCs/>
-          <w:i/>
-          <w:iCs/>
-          <w:sz w:val="16"/>
-          <w:szCs w:val="16"/>
-        </w:rPr>
-        <w:t xml:space="preserve">   </w:t>
-      </w:r>
-      <w:r>
-        <w:rPr>
-          <w:rFonts w:ascii="Andale Mono" w:hAnsi="Andale Mono"/>
-          <w:sz w:val="16"/>
-          <w:szCs w:val="16"/>
-        </w:rPr>
-        <w:t>:if</w:t>
-      </w:r>
-      <w:r>
-        <w:rPr>
-          <w:b/>
-          <w:bCs/>
-          <w:i/>
-          <w:iCs/>
-          <w:sz w:val="16"/>
-          <w:szCs w:val="16"/>
-        </w:rPr>
-        <w:t xml:space="preserve"> </w:t>
-      </w:r>
-      <w:r>
-        <w:rPr>
-          <w:i/>
-          <w:iCs/>
-          <w:sz w:val="16"/>
-          <w:szCs w:val="16"/>
-        </w:rPr>
-        <w:t>T T’ T’’</w:t>
-      </w:r>
-      <w:r>
-        <w:rPr>
-          <w:bCs/>
-          <w:i/>
-          <w:iCs/>
-          <w:sz w:val="16"/>
-          <w:szCs w:val="16"/>
-        </w:rPr>
-        <w:tab/>
-        <w:tab/>
-        <w:t>T</w:t>
         <w:tab/>
       </w:r>
       <w:r>
@@ -4155,6 +4148,29 @@
           <w:szCs w:val="16"/>
         </w:rPr>
         <w:t>conditional</w:t>
+      </w:r>
+    </w:p>
+    <w:p>
+      <w:pPr>
+        <w:pStyle w:val="Normal"/>
+        <w:rPr>
+          <w:rFonts w:ascii="Georgia" w:hAnsi="Georgia"/>
+          <w:bCs/>
+          <w:i w:val="false"/>
+          <w:iCs w:val="false"/>
+          <w:sz w:val="12"/>
+          <w:szCs w:val="12"/>
+        </w:rPr>
+      </w:pPr>
+      <w:r>
+        <w:rPr>
+          <w:rFonts w:ascii="Georgia" w:hAnsi="Georgia"/>
+          <w:bCs/>
+          <w:i w:val="false"/>
+          <w:iCs w:val="false"/>
+          <w:sz w:val="12"/>
+          <w:szCs w:val="12"/>
+        </w:rPr>
       </w:r>
     </w:p>
     <w:p>
@@ -8773,23 +8789,6 @@
     <w:p>
       <w:pPr>
         <w:pStyle w:val="Normal"/>
-        <w:rPr>
-          <w:rFonts w:ascii="Georgia" w:hAnsi="Georgia"/>
-          <w:sz w:val="12"/>
-          <w:szCs w:val="12"/>
-        </w:rPr>
-      </w:pPr>
-      <w:r>
-        <w:rPr>
-          <w:rFonts w:ascii="Georgia" w:hAnsi="Georgia"/>
-          <w:sz w:val="12"/>
-          <w:szCs w:val="12"/>
-        </w:rPr>
-      </w:r>
-    </w:p>
-    <w:p>
-      <w:pPr>
-        <w:pStyle w:val="Normal"/>
         <w:rPr/>
       </w:pPr>
       <w:r>
@@ -13930,32 +13929,6 @@
         </w:rPr>
         <w:t>keyword</w:t>
         <w:tab/>
-        <w:tab/>
-        <w:t xml:space="preserve"> </w:t>
-      </w:r>
-    </w:p>
-    <w:p>
-      <w:pPr>
-        <w:pStyle w:val="Normal"/>
-        <w:rPr/>
-      </w:pPr>
-      <w:r>
-        <w:rPr>
-          <w:rFonts w:eastAsia="Songti SC" w:cs="Arial Unicode MS" w:ascii="Georgia" w:hAnsi="Georgia"/>
-          <w:b w:val="false"/>
-          <w:bCs w:val="false"/>
-          <w:i/>
-          <w:iCs/>
-          <w:color w:val="auto"/>
-          <w:kern w:val="2"/>
-          <w:sz w:val="16"/>
-          <w:szCs w:val="16"/>
-          <w:u w:val="none"/>
-          <w:lang w:val="en-US" w:eastAsia="zh-CN" w:bidi="hi-IN"/>
-        </w:rPr>
-        <w:tab/>
-        <w:tab/>
-        <w:tab/>
       </w:r>
       <w:r>
         <w:rPr>
@@ -16666,12 +16639,244 @@
           <w:sz w:val="14"/>
           <w:szCs w:val="14"/>
         </w:rPr>
-        <w:t>...</w:t>
-      </w:r>
-    </w:p>
-    <w:p>
-      <w:pPr>
-        <w:pStyle w:val="Normal"/>
+        <w:t>…</w:t>
+      </w:r>
+    </w:p>
+    <w:p>
+      <w:pPr>
+        <w:pStyle w:val="Normal"/>
+        <w:rPr>
+          <w:rFonts w:ascii="Georgia" w:hAnsi="Georgia"/>
+          <w:b w:val="false"/>
+          <w:bCs w:val="false"/>
+          <w:i w:val="false"/>
+          <w:iCs w:val="false"/>
+          <w:sz w:val="12"/>
+          <w:szCs w:val="12"/>
+        </w:rPr>
+      </w:pPr>
+      <w:r>
+        <w:rPr>
+          <w:rFonts w:ascii="Georgia" w:hAnsi="Georgia"/>
+          <w:b w:val="false"/>
+          <w:bCs w:val="false"/>
+          <w:i w:val="false"/>
+          <w:iCs w:val="false"/>
+          <w:sz w:val="12"/>
+          <w:szCs w:val="12"/>
+        </w:rPr>
+      </w:r>
+    </w:p>
+    <w:p>
+      <w:pPr>
+        <w:pStyle w:val="Normal"/>
+        <w:rPr>
+          <w:rFonts w:ascii="Georgia" w:hAnsi="Georgia"/>
+          <w:sz w:val="12"/>
+          <w:szCs w:val="12"/>
+        </w:rPr>
+      </w:pPr>
+      <w:r>
+        <w:rPr>
+          <w:rFonts w:ascii="Georgia" w:hAnsi="Georgia"/>
+          <w:b/>
+          <w:bCs/>
+          <w:i w:val="false"/>
+          <w:iCs w:val="false"/>
+          <w:sz w:val="14"/>
+          <w:szCs w:val="14"/>
+        </w:rPr>
+        <w:t xml:space="preserve"> </w:t>
+      </w:r>
+      <w:r>
+        <w:rPr>
+          <w:rFonts w:ascii="Georgia" w:hAnsi="Georgia"/>
+          <w:b/>
+          <w:bCs/>
+          <w:i w:val="false"/>
+          <w:iCs w:val="false"/>
+          <w:sz w:val="16"/>
+          <w:szCs w:val="16"/>
+        </w:rPr>
+        <w:t xml:space="preserve"> </w:t>
+      </w:r>
+      <w:r>
+        <w:rPr>
+          <w:rFonts w:ascii="Georgia" w:hAnsi="Georgia"/>
+          <w:b/>
+          <w:bCs/>
+          <w:i w:val="false"/>
+          <w:iCs w:val="false"/>
+          <w:sz w:val="16"/>
+          <w:szCs w:val="16"/>
+        </w:rPr>
+        <w:t>feature/ffi</w:t>
+        <w:tab/>
+      </w:r>
+      <w:r>
+        <w:rPr>
+          <w:rFonts w:ascii="Georgia" w:hAnsi="Georgia"/>
+          <w:b/>
+          <w:bCs/>
+          <w:i w:val="false"/>
+          <w:iCs w:val="false"/>
+          <w:sz w:val="14"/>
+          <w:szCs w:val="14"/>
+        </w:rPr>
+        <w:t>info</w:t>
+      </w:r>
+    </w:p>
+    <w:p>
+      <w:pPr>
+        <w:pStyle w:val="Normal"/>
+        <w:rPr>
+          <w:rFonts w:ascii="Georgia" w:hAnsi="Georgia"/>
+          <w:b w:val="false"/>
+          <w:bCs w:val="false"/>
+          <w:sz w:val="14"/>
+          <w:szCs w:val="14"/>
+        </w:rPr>
+      </w:pPr>
+      <w:r>
+        <w:rPr>
+          <w:rFonts w:ascii="Georgia" w:hAnsi="Georgia"/>
+          <w:b w:val="false"/>
+          <w:bCs w:val="false"/>
+          <w:sz w:val="14"/>
+          <w:szCs w:val="14"/>
+        </w:rPr>
+      </w:r>
+    </w:p>
+    <w:p>
+      <w:pPr>
+        <w:pStyle w:val="Normal"/>
+        <w:rPr>
+          <w:rFonts w:ascii="Georgia" w:hAnsi="Georgia"/>
+          <w:b w:val="false"/>
+          <w:bCs w:val="false"/>
+          <w:sz w:val="14"/>
+          <w:szCs w:val="14"/>
+        </w:rPr>
+      </w:pPr>
+      <w:r>
+        <w:rPr>
+          <w:rFonts w:ascii="Georgia" w:hAnsi="Georgia"/>
+          <w:b w:val="false"/>
+          <w:bCs w:val="false"/>
+          <w:sz w:val="14"/>
+          <w:szCs w:val="14"/>
+        </w:rPr>
+      </w:r>
+    </w:p>
+    <w:p>
+      <w:pPr>
+        <w:pStyle w:val="Normal"/>
+        <w:rPr>
+          <w:rFonts w:ascii="Georgia" w:hAnsi="Georgia"/>
+          <w:b w:val="false"/>
+          <w:bCs w:val="false"/>
+          <w:sz w:val="14"/>
+          <w:szCs w:val="14"/>
+        </w:rPr>
+      </w:pPr>
+      <w:r>
+        <w:rPr>
+          <w:rFonts w:ascii="Georgia" w:hAnsi="Georgia"/>
+          <w:b w:val="false"/>
+          <w:bCs w:val="false"/>
+          <w:sz w:val="14"/>
+          <w:szCs w:val="14"/>
+        </w:rPr>
+      </w:r>
+    </w:p>
+    <w:p>
+      <w:pPr>
+        <w:pStyle w:val="Normal"/>
+        <w:rPr>
+          <w:rFonts w:ascii="Georgia" w:hAnsi="Georgia"/>
+          <w:b w:val="false"/>
+          <w:bCs w:val="false"/>
+          <w:sz w:val="14"/>
+          <w:szCs w:val="14"/>
+        </w:rPr>
+      </w:pPr>
+      <w:r>
+        <w:rPr>
+          <w:rFonts w:ascii="Georgia" w:hAnsi="Georgia"/>
+          <w:b w:val="false"/>
+          <w:bCs w:val="false"/>
+          <w:sz w:val="14"/>
+          <w:szCs w:val="14"/>
+        </w:rPr>
+      </w:r>
+    </w:p>
+    <w:p>
+      <w:pPr>
+        <w:pStyle w:val="Normal"/>
+        <w:rPr>
+          <w:rFonts w:ascii="Georgia" w:hAnsi="Georgia"/>
+          <w:b w:val="false"/>
+          <w:bCs w:val="false"/>
+          <w:sz w:val="14"/>
+          <w:szCs w:val="14"/>
+        </w:rPr>
+      </w:pPr>
+      <w:r>
+        <w:rPr>
+          <w:rFonts w:ascii="Georgia" w:hAnsi="Georgia"/>
+          <w:b w:val="false"/>
+          <w:bCs w:val="false"/>
+          <w:sz w:val="14"/>
+          <w:szCs w:val="14"/>
+        </w:rPr>
+      </w:r>
+    </w:p>
+    <w:p>
+      <w:pPr>
+        <w:pStyle w:val="Normal"/>
+        <w:rPr>
+          <w:rFonts w:ascii="Georgia" w:hAnsi="Georgia"/>
+          <w:b w:val="false"/>
+          <w:bCs w:val="false"/>
+          <w:sz w:val="14"/>
+          <w:szCs w:val="14"/>
+        </w:rPr>
+      </w:pPr>
+      <w:r>
+        <w:rPr>
+          <w:rFonts w:ascii="Georgia" w:hAnsi="Georgia"/>
+          <w:b w:val="false"/>
+          <w:bCs w:val="false"/>
+          <w:sz w:val="14"/>
+          <w:szCs w:val="14"/>
+        </w:rPr>
+      </w:r>
+    </w:p>
+    <w:p>
+      <w:pPr>
+        <w:pStyle w:val="Normal"/>
+        <w:rPr>
+          <w:rFonts w:ascii="Georgia" w:hAnsi="Georgia"/>
+          <w:b w:val="false"/>
+          <w:bCs w:val="false"/>
+          <w:sz w:val="14"/>
+          <w:szCs w:val="14"/>
+        </w:rPr>
+      </w:pPr>
+      <w:r>
+        <w:rPr>
+          <w:rFonts w:ascii="Georgia" w:hAnsi="Georgia"/>
+          <w:b w:val="false"/>
+          <w:bCs w:val="false"/>
+          <w:sz w:val="14"/>
+          <w:szCs w:val="14"/>
+        </w:rPr>
+      </w:r>
+    </w:p>
+    <w:p>
+      <w:pPr>
+        <w:pStyle w:val="Normal"/>
+        <w:ind w:hanging="0" w:left="2836"/>
         <w:rPr>
           <w:rFonts w:ascii="Georgia" w:hAnsi="Georgia"/>
           <w:b w:val="false"/>
@@ -16991,6 +17196,21 @@
           <w:szCs w:val="12"/>
         </w:rPr>
         <w:t>}</w:t>
+      </w:r>
+    </w:p>
+    <w:p>
+      <w:pPr>
+        <w:pStyle w:val="Normal"/>
+        <w:rPr>
+          <w:sz w:val="12"/>
+          <w:szCs w:val="12"/>
+        </w:rPr>
+      </w:pPr>
+      <w:r>
+        <w:rPr>
+          <w:sz w:val="12"/>
+          <w:szCs w:val="12"/>
+        </w:rPr>
       </w:r>
     </w:p>
     <w:p>
@@ -17445,11 +17665,11 @@
       </w:pPr>
       <w:r>
         <w:rPr>
-          <w:rFonts w:ascii="Andale Mono MT Std" w:hAnsi="Andale Mono MT Std"/>
-          <w:b w:val="false"/>
-          <w:bCs w:val="false"/>
-          <w:i w:val="false"/>
-          <w:iCs w:val="false"/>
+          <w:rFonts w:ascii="Georgia" w:hAnsi="Georgia"/>
+          <w:b w:val="false"/>
+          <w:bCs w:val="false"/>
+          <w:i/>
+          <w:iCs/>
           <w:sz w:val="12"/>
           <w:szCs w:val="12"/>
         </w:rPr>
@@ -18298,43 +18518,21 @@
           <w:sz w:val="16"/>
           <w:szCs w:val="16"/>
         </w:rPr>
-        <w:t xml:space="preserve">        </w:t>
-      </w:r>
-      <w:r>
-        <w:rPr>
-          <w:rFonts w:ascii="Georgia" w:hAnsi="Georgia"/>
-          <w:b w:val="false"/>
-          <w:bCs w:val="false"/>
-          <w:sz w:val="16"/>
-          <w:szCs w:val="16"/>
-        </w:rPr>
-        <w:t>API</w:t>
-      </w:r>
-      <w:r>
-        <w:rPr>
-          <w:rFonts w:ascii="Georgia" w:hAnsi="Georgia"/>
-          <w:b w:val="false"/>
-          <w:bCs w:val="false"/>
+        <w:t xml:space="preserve">    </w:t>
+      </w:r>
+    </w:p>
+    <w:p>
+      <w:pPr>
+        <w:pStyle w:val="Normal"/>
+        <w:rPr>
+          <w:rFonts w:ascii="Georgia" w:hAnsi="Georgia"/>
+          <w:b/>
+          <w:bCs/>
           <w:sz w:val="12"/>
           <w:szCs w:val="12"/>
         </w:rPr>
-        <w:t xml:space="preserve"> </w:t>
-      </w:r>
-      <w:r>
-        <w:rPr>
-          <w:rFonts w:ascii="Georgia" w:hAnsi="Georgia"/>
-          <w:b w:val="false"/>
-          <w:bCs w:val="false"/>
-          <w:sz w:val="16"/>
-          <w:szCs w:val="16"/>
-        </w:rPr>
-        <w:t>reference:</w:t>
-      </w:r>
-    </w:p>
-    <w:p>
-      <w:pPr>
-        <w:pStyle w:val="Normal"/>
-        <w:ind w:hanging="0" w:left="709"/>
+      </w:pPr>
+      <w:r>
         <w:rPr>
           <w:rFonts w:ascii="Georgia" w:hAnsi="Georgia"/>
           <w:b/>
@@ -18342,285 +18540,300 @@
           <w:sz w:val="12"/>
           <w:szCs w:val="12"/>
         </w:rPr>
-      </w:pPr>
-      <w:r>
-        <w:rPr>
-          <w:rFonts w:ascii="Georgia" w:hAnsi="Georgia"/>
-          <w:b/>
-          <w:bCs/>
-          <w:i/>
-          <w:iCs/>
-          <w:sz w:val="14"/>
-          <w:szCs w:val="14"/>
-        </w:rPr>
-        <w:t>compile</w:t>
-      </w:r>
-      <w:r>
-        <w:rPr>
-          <w:rFonts w:ascii="Georgia" w:hAnsi="Georgia"/>
-          <w:b/>
-          <w:bCs/>
-          <w:sz w:val="14"/>
-          <w:szCs w:val="14"/>
-        </w:rPr>
-        <w:t xml:space="preserve"> </w:t>
-      </w:r>
-      <w:r>
-        <w:rPr>
-          <w:rFonts w:ascii="Andale Mono" w:hAnsi="Andale Mono"/>
-          <w:b w:val="false"/>
-          <w:bCs w:val="false"/>
-          <w:sz w:val="14"/>
-          <w:szCs w:val="14"/>
-        </w:rPr>
-        <w:t>&amp;Env</w:t>
-      </w:r>
-      <w:r>
-        <w:rPr>
-          <w:rFonts w:ascii="Georgia" w:hAnsi="Georgia"/>
-          <w:b/>
-          <w:bCs/>
-          <w:sz w:val="14"/>
-          <w:szCs w:val="14"/>
-        </w:rPr>
-        <w:t xml:space="preserve"> </w:t>
-      </w:r>
-      <w:r>
-        <w:rPr>
-          <w:rFonts w:ascii="Georgia" w:hAnsi="Georgia"/>
-          <w:b/>
-          <w:bCs/>
-          <w:i/>
-          <w:iCs/>
-          <w:sz w:val="14"/>
-          <w:szCs w:val="14"/>
-        </w:rPr>
-        <w:t xml:space="preserve">T </w:t>
-      </w:r>
-      <w:r>
-        <w:rPr>
-          <w:rFonts w:ascii="Georgia" w:hAnsi="Georgia"/>
-          <w:b w:val="false"/>
-          <w:bCs w:val="false"/>
-          <w:i/>
-          <w:iCs/>
-          <w:sz w:val="14"/>
-          <w:szCs w:val="14"/>
-        </w:rPr>
-        <w:t xml:space="preserve"> </w:t>
-      </w:r>
-      <w:r>
-        <w:rPr>
-          <w:rFonts w:ascii="Georgia" w:hAnsi="Georgia"/>
-          <w:b w:val="false"/>
-          <w:bCs w:val="false"/>
-          <w:i w:val="false"/>
-          <w:iCs w:val="false"/>
-          <w:sz w:val="14"/>
-          <w:szCs w:val="14"/>
-        </w:rPr>
-        <w:t>→</w:t>
-      </w:r>
-      <w:r>
-        <w:rPr>
-          <w:rFonts w:ascii="Georgia" w:hAnsi="Georgia"/>
-          <w:b/>
-          <w:bCs/>
-          <w:sz w:val="14"/>
-          <w:szCs w:val="14"/>
-        </w:rPr>
-        <w:t xml:space="preserve"> </w:t>
-      </w:r>
-      <w:r>
-        <w:rPr>
-          <w:rFonts w:ascii="Andale Mono" w:hAnsi="Andale Mono"/>
-          <w:b w:val="false"/>
-          <w:bCs w:val="false"/>
-          <w:sz w:val="14"/>
-          <w:szCs w:val="14"/>
-        </w:rPr>
-        <w:t>Result&lt;Tag&gt;</w:t>
-      </w:r>
-    </w:p>
-    <w:p>
-      <w:pPr>
-        <w:pStyle w:val="Normal"/>
-        <w:ind w:hanging="0" w:left="709"/>
-        <w:rPr>
-          <w:rFonts w:ascii="Georgia" w:hAnsi="Georgia"/>
-          <w:sz w:val="14"/>
-          <w:szCs w:val="14"/>
-        </w:rPr>
-      </w:pPr>
-      <w:r>
-        <w:rPr>
-          <w:rFonts w:ascii="Georgia" w:hAnsi="Georgia"/>
-          <w:b/>
-          <w:bCs/>
-          <w:i/>
-          <w:iCs/>
-          <w:sz w:val="14"/>
-          <w:szCs w:val="14"/>
-        </w:rPr>
-        <w:t>config</w:t>
-      </w:r>
-      <w:r>
-        <w:rPr>
-          <w:rFonts w:ascii="Andale Mono" w:hAnsi="Andale Mono"/>
-          <w:b/>
-          <w:bCs/>
-          <w:i/>
-          <w:iCs/>
-          <w:sz w:val="14"/>
-          <w:szCs w:val="14"/>
-        </w:rPr>
-        <w:t xml:space="preserve"> </w:t>
-      </w:r>
-      <w:r>
-        <w:rPr>
-          <w:rFonts w:ascii="Andale Mono" w:hAnsi="Andale Mono"/>
-          <w:b w:val="false"/>
-          <w:bCs w:val="false"/>
-          <w:i w:val="false"/>
-          <w:iCs w:val="false"/>
-          <w:sz w:val="14"/>
-          <w:szCs w:val="14"/>
-        </w:rPr>
-        <w:t>Option&lt;String&gt;</w:t>
-      </w:r>
-      <w:r>
-        <w:rPr>
-          <w:rFonts w:ascii="Georgia" w:hAnsi="Georgia"/>
-          <w:b w:val="false"/>
-          <w:bCs w:val="false"/>
-          <w:i w:val="false"/>
-          <w:iCs w:val="false"/>
-          <w:sz w:val="14"/>
-          <w:szCs w:val="14"/>
-        </w:rPr>
-        <w:t xml:space="preserve"> </w:t>
-      </w:r>
-      <w:r>
-        <w:rPr>
-          <w:rFonts w:ascii="Georgia" w:hAnsi="Georgia"/>
-          <w:b/>
-          <w:bCs/>
-          <w:i w:val="false"/>
-          <w:iCs w:val="false"/>
-          <w:sz w:val="14"/>
-          <w:szCs w:val="14"/>
-        </w:rPr>
-        <w:t>→</w:t>
-      </w:r>
-      <w:r>
-        <w:rPr>
-          <w:rFonts w:ascii="Georgia" w:hAnsi="Georgia"/>
-          <w:b w:val="false"/>
-          <w:bCs w:val="false"/>
-          <w:i w:val="false"/>
-          <w:iCs w:val="false"/>
-          <w:sz w:val="14"/>
-          <w:szCs w:val="14"/>
-        </w:rPr>
-        <w:t xml:space="preserve"> C</w:t>
-      </w:r>
-      <w:r>
-        <w:rPr>
-          <w:rFonts w:ascii="Andale Mono" w:hAnsi="Andale Mono"/>
-          <w:b w:val="false"/>
-          <w:bCs w:val="false"/>
-          <w:i w:val="false"/>
-          <w:iCs w:val="false"/>
-          <w:sz w:val="14"/>
-          <w:szCs w:val="14"/>
-        </w:rPr>
-        <w:t>onfig</w:t>
-      </w:r>
-    </w:p>
-    <w:p>
-      <w:pPr>
-        <w:pStyle w:val="Normal"/>
-        <w:tabs>
-          <w:tab w:val="clear" w:pos="709"/>
-          <w:tab w:val="left" w:pos="556" w:leader="none"/>
-        </w:tabs>
-        <w:rPr>
-          <w:b w:val="false"/>
-          <w:bCs w:val="false"/>
-        </w:rPr>
-      </w:pPr>
-      <w:r>
-        <w:rPr>
-          <w:rFonts w:ascii="Andale Mono" w:hAnsi="Andale Mono"/>
-          <w:b w:val="false"/>
-          <w:bCs w:val="false"/>
-          <w:i w:val="false"/>
-          <w:iCs w:val="false"/>
+      </w:r>
+    </w:p>
+    <w:p>
+      <w:pPr>
+        <w:pStyle w:val="Normal"/>
+        <w:rPr>
+          <w:rFonts w:ascii="Georgia" w:hAnsi="Georgia"/>
+          <w:b/>
+          <w:bCs/>
           <w:sz w:val="12"/>
           <w:szCs w:val="12"/>
         </w:rPr>
-        <w:t xml:space="preserve">          </w:t>
-      </w:r>
-      <w:r>
-        <w:rPr>
-          <w:rFonts w:ascii="Andale Mono" w:hAnsi="Andale Mono"/>
-          <w:b w:val="false"/>
-          <w:bCs w:val="false"/>
-          <w:i w:val="false"/>
-          <w:iCs w:val="false"/>
+      </w:pPr>
+      <w:r>
+        <w:rPr>
+          <w:rFonts w:ascii="Georgia" w:hAnsi="Georgia"/>
+          <w:b/>
+          <w:bCs/>
           <w:sz w:val="12"/>
           <w:szCs w:val="12"/>
         </w:rPr>
-        <w:tab/>
-        <w:tab/>
-      </w:r>
-      <w:r>
-        <w:rPr>
-          <w:rFonts w:ascii="Georgia" w:hAnsi="Georgia"/>
-          <w:b/>
-          <w:bCs/>
-          <w:i/>
-          <w:iCs/>
-          <w:sz w:val="16"/>
-          <w:szCs w:val="16"/>
-        </w:rPr>
-        <w:t xml:space="preserve">env </w:t>
-      </w:r>
-      <w:r>
-        <w:rPr>
-          <w:rFonts w:ascii="Andale Mono" w:hAnsi="Andale Mono"/>
-          <w:b w:val="false"/>
-          <w:bCs w:val="false"/>
-          <w:i w:val="false"/>
-          <w:iCs w:val="false"/>
-          <w:sz w:val="14"/>
-          <w:szCs w:val="14"/>
-        </w:rPr>
-        <w:t xml:space="preserve">&amp;Config </w:t>
-      </w:r>
-      <w:r>
-        <w:rPr>
-          <w:rFonts w:ascii="Georgia" w:hAnsi="Georgia"/>
-          <w:b/>
-          <w:bCs/>
-          <w:i w:val="false"/>
-          <w:iCs w:val="false"/>
-          <w:sz w:val="14"/>
-          <w:szCs w:val="14"/>
-        </w:rPr>
-        <w:t>→</w:t>
-      </w:r>
-      <w:r>
-        <w:rPr>
-          <w:rFonts w:ascii="Andale Mono" w:hAnsi="Andale Mono"/>
-          <w:b w:val="false"/>
-          <w:bCs w:val="false"/>
-          <w:i w:val="false"/>
-          <w:iCs w:val="false"/>
-          <w:sz w:val="14"/>
-          <w:szCs w:val="14"/>
-        </w:rPr>
-        <w:t xml:space="preserve"> Env</w:t>
+      </w:r>
+    </w:p>
+    <w:p>
+      <w:pPr>
+        <w:pStyle w:val="Normal"/>
+        <w:rPr>
+          <w:rFonts w:ascii="Georgia" w:hAnsi="Georgia"/>
+          <w:b/>
+          <w:bCs/>
+          <w:sz w:val="12"/>
+          <w:szCs w:val="12"/>
+        </w:rPr>
+      </w:pPr>
+      <w:r>
+        <w:rPr>
+          <w:rFonts w:ascii="Georgia" w:hAnsi="Georgia"/>
+          <w:b/>
+          <w:bCs/>
+          <w:sz w:val="12"/>
+          <w:szCs w:val="12"/>
+        </w:rPr>
+      </w:r>
+    </w:p>
+    <w:p>
+      <w:pPr>
+        <w:pStyle w:val="Normal"/>
+        <w:rPr>
+          <w:rFonts w:ascii="Georgia" w:hAnsi="Georgia"/>
+          <w:b/>
+          <w:bCs/>
+          <w:sz w:val="12"/>
+          <w:szCs w:val="12"/>
+        </w:rPr>
+      </w:pPr>
+      <w:r>
+        <w:rPr>
+          <w:rFonts w:ascii="Georgia" w:hAnsi="Georgia"/>
+          <w:b/>
+          <w:bCs/>
+          <w:sz w:val="12"/>
+          <w:szCs w:val="12"/>
+        </w:rPr>
+      </w:r>
+    </w:p>
+    <w:p>
+      <w:pPr>
+        <w:pStyle w:val="Normal"/>
+        <w:rPr>
+          <w:rFonts w:ascii="Georgia" w:hAnsi="Georgia"/>
+          <w:b/>
+          <w:bCs/>
+          <w:sz w:val="12"/>
+          <w:szCs w:val="12"/>
+        </w:rPr>
+      </w:pPr>
+      <w:r>
+        <w:rPr>
+          <w:rFonts w:ascii="Georgia" w:hAnsi="Georgia"/>
+          <w:b/>
+          <w:bCs/>
+          <w:sz w:val="12"/>
+          <w:szCs w:val="12"/>
+        </w:rPr>
+      </w:r>
+    </w:p>
+    <w:p>
+      <w:pPr>
+        <w:pStyle w:val="Normal"/>
+        <w:rPr>
+          <w:rFonts w:ascii="Georgia" w:hAnsi="Georgia"/>
+          <w:b/>
+          <w:bCs/>
+          <w:sz w:val="12"/>
+          <w:szCs w:val="12"/>
+        </w:rPr>
+      </w:pPr>
+      <w:r>
+        <w:rPr>
+          <w:rFonts w:ascii="Georgia" w:hAnsi="Georgia"/>
+          <w:b/>
+          <w:bCs/>
+          <w:sz w:val="12"/>
+          <w:szCs w:val="12"/>
+        </w:rPr>
+      </w:r>
+    </w:p>
+    <w:p>
+      <w:pPr>
+        <w:pStyle w:val="Normal"/>
+        <w:rPr>
+          <w:rFonts w:ascii="Georgia" w:hAnsi="Georgia"/>
+          <w:b/>
+          <w:bCs/>
+          <w:sz w:val="12"/>
+          <w:szCs w:val="12"/>
+        </w:rPr>
+      </w:pPr>
+      <w:r>
+        <w:rPr>
+          <w:rFonts w:ascii="Georgia" w:hAnsi="Georgia"/>
+          <w:b/>
+          <w:bCs/>
+          <w:sz w:val="12"/>
+          <w:szCs w:val="12"/>
+        </w:rPr>
+      </w:r>
+    </w:p>
+    <w:p>
+      <w:pPr>
+        <w:pStyle w:val="Normal"/>
+        <w:rPr>
+          <w:rFonts w:ascii="Georgia" w:hAnsi="Georgia"/>
+          <w:b/>
+          <w:bCs/>
+          <w:sz w:val="12"/>
+          <w:szCs w:val="12"/>
+        </w:rPr>
+      </w:pPr>
+      <w:r>
+        <w:rPr>
+          <w:rFonts w:ascii="Georgia" w:hAnsi="Georgia"/>
+          <w:b/>
+          <w:bCs/>
+          <w:sz w:val="12"/>
+          <w:szCs w:val="12"/>
+        </w:rPr>
+      </w:r>
+    </w:p>
+    <w:p>
+      <w:pPr>
+        <w:pStyle w:val="Normal"/>
+        <w:rPr>
+          <w:rFonts w:ascii="Georgia" w:hAnsi="Georgia"/>
+          <w:b/>
+          <w:bCs/>
+          <w:sz w:val="12"/>
+          <w:szCs w:val="12"/>
+        </w:rPr>
+      </w:pPr>
+      <w:r>
+        <w:rPr>
+          <w:rFonts w:ascii="Georgia" w:hAnsi="Georgia"/>
+          <w:b/>
+          <w:bCs/>
+          <w:sz w:val="12"/>
+          <w:szCs w:val="12"/>
+        </w:rPr>
+      </w:r>
+    </w:p>
+    <w:p>
+      <w:pPr>
+        <w:pStyle w:val="Normal"/>
+        <w:rPr>
+          <w:rFonts w:ascii="Georgia" w:hAnsi="Georgia"/>
+          <w:b/>
+          <w:bCs/>
+          <w:sz w:val="12"/>
+          <w:szCs w:val="12"/>
+        </w:rPr>
+      </w:pPr>
+      <w:r>
+        <w:rPr>
+          <w:rFonts w:ascii="Georgia" w:hAnsi="Georgia"/>
+          <w:b/>
+          <w:bCs/>
+          <w:sz w:val="12"/>
+          <w:szCs w:val="12"/>
+        </w:rPr>
+      </w:r>
+    </w:p>
+    <w:p>
+      <w:pPr>
+        <w:pStyle w:val="Normal"/>
+        <w:rPr>
+          <w:rFonts w:ascii="Georgia" w:hAnsi="Georgia"/>
+          <w:b/>
+          <w:bCs/>
+          <w:sz w:val="12"/>
+          <w:szCs w:val="12"/>
+        </w:rPr>
+      </w:pPr>
+      <w:r>
+        <w:rPr>
+          <w:rFonts w:ascii="Georgia" w:hAnsi="Georgia"/>
+          <w:b/>
+          <w:bCs/>
+          <w:sz w:val="12"/>
+          <w:szCs w:val="12"/>
+        </w:rPr>
+      </w:r>
+    </w:p>
+    <w:p>
+      <w:pPr>
+        <w:pStyle w:val="Normal"/>
+        <w:rPr>
+          <w:rFonts w:ascii="Georgia" w:hAnsi="Georgia"/>
+          <w:b/>
+          <w:bCs/>
+          <w:sz w:val="12"/>
+          <w:szCs w:val="12"/>
+        </w:rPr>
+      </w:pPr>
+      <w:r>
+        <w:rPr>
+          <w:rFonts w:ascii="Georgia" w:hAnsi="Georgia"/>
+          <w:b/>
+          <w:bCs/>
+          <w:sz w:val="12"/>
+          <w:szCs w:val="12"/>
+        </w:rPr>
+      </w:r>
+    </w:p>
+    <w:p>
+      <w:pPr>
+        <w:pStyle w:val="Normal"/>
+        <w:rPr>
+          <w:rFonts w:ascii="Georgia" w:hAnsi="Georgia"/>
+          <w:b/>
+          <w:bCs/>
+          <w:sz w:val="12"/>
+          <w:szCs w:val="12"/>
+        </w:rPr>
+      </w:pPr>
+      <w:r>
+        <w:rPr>
+          <w:rFonts w:ascii="Georgia" w:hAnsi="Georgia"/>
+          <w:b/>
+          <w:bCs/>
+          <w:sz w:val="12"/>
+          <w:szCs w:val="12"/>
+        </w:rPr>
+      </w:r>
+    </w:p>
+    <w:p>
+      <w:pPr>
+        <w:pStyle w:val="Normal"/>
+        <w:rPr>
+          <w:rFonts w:ascii="Georgia" w:hAnsi="Georgia"/>
+          <w:b/>
+          <w:bCs/>
+          <w:sz w:val="12"/>
+          <w:szCs w:val="12"/>
+        </w:rPr>
+      </w:pPr>
+      <w:r>
+        <w:rPr>
+          <w:rFonts w:ascii="Georgia" w:hAnsi="Georgia"/>
+          <w:b/>
+          <w:bCs/>
+          <w:sz w:val="12"/>
+          <w:szCs w:val="12"/>
+        </w:rPr>
+      </w:r>
+    </w:p>
+    <w:p>
+      <w:pPr>
+        <w:pStyle w:val="Normal"/>
+        <w:rPr>
+          <w:rFonts w:ascii="Georgia" w:hAnsi="Georgia"/>
+          <w:b/>
+          <w:bCs/>
+          <w:sz w:val="12"/>
+          <w:szCs w:val="12"/>
+        </w:rPr>
+      </w:pPr>
+      <w:r>
+        <w:rPr>
+          <w:rFonts w:ascii="Georgia" w:hAnsi="Georgia"/>
+          <w:b/>
+          <w:bCs/>
+          <w:sz w:val="12"/>
+          <w:szCs w:val="12"/>
+        </w:rPr>
       </w:r>
     </w:p>
     <w:p>
@@ -18629,57 +18842,20 @@
         <w:ind w:hanging="0" w:left="709"/>
         <w:rPr>
           <w:rFonts w:ascii="Georgia" w:hAnsi="Georgia"/>
-          <w:sz w:val="14"/>
-          <w:szCs w:val="14"/>
-        </w:rPr>
-      </w:pPr>
-      <w:r>
-        <w:rPr>
-          <w:rFonts w:ascii="Georgia" w:hAnsi="Georgia"/>
-          <w:b/>
-          <w:bCs/>
-          <w:i/>
-          <w:iCs/>
-          <w:sz w:val="14"/>
-          <w:szCs w:val="14"/>
-        </w:rPr>
-        <w:t>eq T T’</w:t>
-      </w:r>
-      <w:r>
-        <w:rPr>
-          <w:rFonts w:ascii="Georgia" w:hAnsi="Georgia"/>
-          <w:b/>
-          <w:bCs/>
-          <w:i w:val="false"/>
-          <w:iCs w:val="false"/>
-          <w:sz w:val="14"/>
-          <w:szCs w:val="14"/>
-        </w:rPr>
-        <w:t xml:space="preserve"> </w:t>
-      </w:r>
-      <w:r>
-        <w:rPr>
-          <w:rFonts w:ascii="Georgia" w:hAnsi="Georgia"/>
-          <w:b w:val="false"/>
-          <w:bCs w:val="false"/>
-          <w:i w:val="false"/>
-          <w:iCs w:val="false"/>
-          <w:sz w:val="14"/>
-          <w:szCs w:val="14"/>
-        </w:rPr>
-        <w:t xml:space="preserve">→ </w:t>
-      </w:r>
-      <w:r>
-        <w:rPr>
-          <w:rFonts w:ascii="Andale Mono" w:hAnsi="Andale Mono"/>
-          <w:b w:val="false"/>
-          <w:bCs w:val="false"/>
-          <w:i w:val="false"/>
-          <w:iCs w:val="false"/>
-          <w:sz w:val="14"/>
-          <w:szCs w:val="14"/>
-        </w:rPr>
-        <w:t>bool</w:t>
+          <w:b/>
+          <w:bCs/>
+          <w:sz w:val="12"/>
+          <w:szCs w:val="12"/>
+        </w:rPr>
+      </w:pPr>
+      <w:r>
+        <w:rPr>
+          <w:rFonts w:ascii="Georgia" w:hAnsi="Georgia"/>
+          <w:b/>
+          <w:bCs/>
+          <w:sz w:val="12"/>
+          <w:szCs w:val="12"/>
+        </w:rPr>
       </w:r>
     </w:p>
     <w:p>
@@ -18695,50 +18871,9 @@
       <w:r>
         <w:rPr>
           <w:rFonts w:ascii="Georgia" w:hAnsi="Georgia"/>
-          <w:b/>
-          <w:bCs/>
-          <w:i/>
-          <w:iCs/>
-          <w:sz w:val="14"/>
-          <w:szCs w:val="14"/>
-        </w:rPr>
-        <w:t>err_out</w:t>
-      </w:r>
-      <w:r>
-        <w:rPr>
-          <w:rFonts w:ascii="Georgia" w:hAnsi="Georgia"/>
-          <w:b w:val="false"/>
-          <w:bCs w:val="false"/>
-          <w:i w:val="false"/>
-          <w:iCs w:val="false"/>
-          <w:sz w:val="14"/>
-          <w:szCs w:val="14"/>
-        </w:rPr>
-        <w:t xml:space="preserve"> → </w:t>
-      </w:r>
-      <w:r>
-        <w:rPr>
-          <w:rFonts w:ascii="Andale Mono" w:hAnsi="Andale Mono"/>
-          <w:b w:val="false"/>
-          <w:bCs w:val="false"/>
-          <w:i w:val="false"/>
-          <w:iCs w:val="false"/>
-          <w:sz w:val="14"/>
-          <w:szCs w:val="14"/>
-        </w:rPr>
-        <w:t>Tag</w:t>
-      </w:r>
-      <w:r>
-        <w:rPr>
-          <w:rFonts w:ascii="Georgia" w:hAnsi="Georgia"/>
-          <w:b w:val="false"/>
-          <w:bCs w:val="false"/>
-          <w:i w:val="false"/>
-          <w:iCs w:val="false"/>
-          <w:sz w:val="14"/>
-          <w:szCs w:val="14"/>
-        </w:rPr>
-        <w:t xml:space="preserve">  </w:t>
+          <w:sz w:val="14"/>
+          <w:szCs w:val="14"/>
+        </w:rPr>
       </w:r>
     </w:p>
     <w:p>
@@ -18754,98 +18889,9 @@
       <w:r>
         <w:rPr>
           <w:rFonts w:ascii="Georgia" w:hAnsi="Georgia"/>
-          <w:b/>
-          <w:bCs/>
-          <w:i/>
-          <w:iCs/>
-          <w:sz w:val="14"/>
-          <w:szCs w:val="14"/>
-        </w:rPr>
-        <w:t xml:space="preserve">eval_str </w:t>
-      </w:r>
-      <w:r>
-        <w:rPr>
-          <w:rFonts w:ascii="Andale Mono" w:hAnsi="Andale Mono"/>
-          <w:b w:val="false"/>
-          <w:bCs w:val="false"/>
-          <w:i w:val="false"/>
-          <w:iCs w:val="false"/>
-          <w:sz w:val="14"/>
-          <w:szCs w:val="14"/>
-        </w:rPr>
-        <w:t>&amp;Env</w:t>
-      </w:r>
-      <w:r>
-        <w:rPr>
-          <w:rFonts w:ascii="Georgia" w:hAnsi="Georgia"/>
-          <w:b w:val="false"/>
-          <w:bCs w:val="false"/>
-          <w:i w:val="false"/>
-          <w:iCs w:val="false"/>
-          <w:sz w:val="14"/>
-          <w:szCs w:val="14"/>
-        </w:rPr>
-        <w:t xml:space="preserve"> </w:t>
-      </w:r>
-      <w:r>
-        <w:rPr>
-          <w:rFonts w:ascii="Andale Mono" w:hAnsi="Andale Mono"/>
-          <w:b w:val="false"/>
-          <w:bCs w:val="false"/>
-          <w:i w:val="false"/>
-          <w:iCs w:val="false"/>
-          <w:sz w:val="14"/>
-          <w:szCs w:val="14"/>
-        </w:rPr>
-        <w:t>&amp;str</w:t>
-      </w:r>
-      <w:r>
-        <w:rPr>
-          <w:rFonts w:ascii="Georgia" w:hAnsi="Georgia"/>
-          <w:b w:val="false"/>
-          <w:bCs w:val="false"/>
-          <w:i w:val="false"/>
-          <w:iCs w:val="false"/>
-          <w:sz w:val="14"/>
-          <w:szCs w:val="14"/>
-        </w:rPr>
-        <w:t xml:space="preserve"> </w:t>
-      </w:r>
-      <w:r>
-        <w:rPr>
-          <w:rFonts w:ascii="Georgia" w:hAnsi="Georgia"/>
-          <w:b/>
-          <w:bCs/>
-          <w:i w:val="false"/>
-          <w:iCs w:val="false"/>
-          <w:sz w:val="14"/>
-          <w:szCs w:val="14"/>
-        </w:rPr>
-        <w:t>→</w:t>
-      </w:r>
-      <w:r>
-        <w:rPr>
-          <w:rFonts w:ascii="Georgia" w:hAnsi="Georgia"/>
-          <w:b w:val="false"/>
-          <w:bCs w:val="false"/>
-          <w:i w:val="false"/>
-          <w:iCs w:val="false"/>
-          <w:sz w:val="14"/>
-          <w:szCs w:val="14"/>
-        </w:rPr>
-        <w:t xml:space="preserve"> </w:t>
-      </w:r>
-      <w:r>
-        <w:rPr>
-          <w:rFonts w:ascii="Andale Mono" w:hAnsi="Andale Mono"/>
-          <w:b w:val="false"/>
-          <w:bCs w:val="false"/>
-          <w:i w:val="false"/>
-          <w:iCs w:val="false"/>
-          <w:sz w:val="14"/>
-          <w:szCs w:val="14"/>
-        </w:rPr>
-        <w:t>Result&lt;Tag&gt;</w:t>
+          <w:sz w:val="14"/>
+          <w:szCs w:val="14"/>
+        </w:rPr>
       </w:r>
     </w:p>
     <w:p>
@@ -18861,98 +18907,9 @@
       <w:r>
         <w:rPr>
           <w:rFonts w:ascii="Georgia" w:hAnsi="Georgia"/>
-          <w:b/>
-          <w:bCs/>
-          <w:i/>
-          <w:iCs/>
-          <w:sz w:val="14"/>
-          <w:szCs w:val="14"/>
-        </w:rPr>
-        <w:t xml:space="preserve">eval </w:t>
-      </w:r>
-      <w:r>
-        <w:rPr>
-          <w:rFonts w:ascii="Andale Mono" w:hAnsi="Andale Mono"/>
-          <w:b w:val="false"/>
-          <w:bCs w:val="false"/>
-          <w:i w:val="false"/>
-          <w:iCs w:val="false"/>
-          <w:sz w:val="14"/>
-          <w:szCs w:val="14"/>
-        </w:rPr>
-        <w:t>&amp;Env</w:t>
-      </w:r>
-      <w:r>
-        <w:rPr>
-          <w:rFonts w:ascii="Georgia" w:hAnsi="Georgia"/>
-          <w:b w:val="false"/>
-          <w:bCs w:val="false"/>
-          <w:i w:val="false"/>
-          <w:iCs w:val="false"/>
-          <w:sz w:val="14"/>
-          <w:szCs w:val="14"/>
-        </w:rPr>
-        <w:t xml:space="preserve"> </w:t>
-      </w:r>
-      <w:r>
-        <w:rPr>
-          <w:rFonts w:ascii="Georgia" w:hAnsi="Georgia"/>
-          <w:b/>
-          <w:bCs/>
-          <w:i/>
-          <w:iCs/>
-          <w:sz w:val="14"/>
-          <w:szCs w:val="14"/>
-        </w:rPr>
-        <w:t>T</w:t>
-      </w:r>
-      <w:r>
-        <w:rPr>
-          <w:rFonts w:ascii="Georgia" w:hAnsi="Georgia"/>
-          <w:b w:val="false"/>
-          <w:bCs w:val="false"/>
-          <w:i w:val="false"/>
-          <w:iCs w:val="false"/>
-          <w:sz w:val="14"/>
-          <w:szCs w:val="14"/>
-        </w:rPr>
-        <w:t xml:space="preserve"> </w:t>
-      </w:r>
-      <w:r>
-        <w:rPr>
-          <w:rFonts w:ascii="Georgia" w:hAnsi="Georgia"/>
-          <w:b/>
-          <w:bCs/>
-          <w:i w:val="false"/>
-          <w:iCs w:val="false"/>
-          <w:sz w:val="14"/>
-          <w:szCs w:val="14"/>
-        </w:rPr>
-        <w:t>→</w:t>
-      </w:r>
-      <w:r>
-        <w:rPr>
-          <w:rFonts w:ascii="Georgia" w:hAnsi="Georgia"/>
-          <w:b w:val="false"/>
-          <w:bCs w:val="false"/>
-          <w:i w:val="false"/>
-          <w:iCs w:val="false"/>
-          <w:sz w:val="14"/>
-          <w:szCs w:val="14"/>
-        </w:rPr>
-        <w:t xml:space="preserve"> </w:t>
-      </w:r>
-      <w:r>
-        <w:rPr>
-          <w:rFonts w:ascii="Andale Mono" w:hAnsi="Andale Mono"/>
-          <w:b w:val="false"/>
-          <w:bCs w:val="false"/>
-          <w:i w:val="false"/>
-          <w:iCs w:val="false"/>
-          <w:sz w:val="14"/>
-          <w:szCs w:val="14"/>
-        </w:rPr>
-        <w:t>Result&lt;Tag&gt;</w:t>
+          <w:sz w:val="14"/>
+          <w:szCs w:val="14"/>
+        </w:rPr>
       </w:r>
     </w:p>
     <w:p>
@@ -18968,98 +18925,9 @@
       <w:r>
         <w:rPr>
           <w:rFonts w:ascii="Georgia" w:hAnsi="Georgia"/>
-          <w:b/>
-          <w:bCs/>
-          <w:i/>
-          <w:iCs/>
-          <w:sz w:val="14"/>
-          <w:szCs w:val="14"/>
-        </w:rPr>
-        <w:t xml:space="preserve">exception_string </w:t>
-      </w:r>
-      <w:r>
-        <w:rPr>
-          <w:rFonts w:ascii="Andale Mono" w:hAnsi="Andale Mono"/>
-          <w:b w:val="false"/>
-          <w:bCs w:val="false"/>
-          <w:i w:val="false"/>
-          <w:iCs w:val="false"/>
-          <w:sz w:val="14"/>
-          <w:szCs w:val="14"/>
-        </w:rPr>
-        <w:t>&amp;Env</w:t>
-      </w:r>
-      <w:r>
-        <w:rPr>
-          <w:rFonts w:ascii="Georgia" w:hAnsi="Georgia"/>
-          <w:b w:val="false"/>
-          <w:bCs w:val="false"/>
-          <w:i w:val="false"/>
-          <w:iCs w:val="false"/>
-          <w:sz w:val="14"/>
-          <w:szCs w:val="14"/>
-        </w:rPr>
-        <w:t xml:space="preserve"> </w:t>
-      </w:r>
-      <w:r>
-        <w:rPr>
-          <w:rFonts w:ascii="Andale Mono" w:hAnsi="Andale Mono"/>
-          <w:b w:val="false"/>
-          <w:bCs w:val="false"/>
-          <w:i w:val="false"/>
-          <w:iCs w:val="false"/>
-          <w:sz w:val="14"/>
-          <w:szCs w:val="14"/>
-        </w:rPr>
-        <w:t>Exception</w:t>
-      </w:r>
-      <w:r>
-        <w:rPr>
-          <w:rFonts w:ascii="Georgia" w:hAnsi="Georgia"/>
-          <w:b w:val="false"/>
-          <w:bCs w:val="false"/>
-          <w:i w:val="false"/>
-          <w:iCs w:val="false"/>
-          <w:sz w:val="14"/>
-          <w:szCs w:val="14"/>
-        </w:rPr>
-        <w:t xml:space="preserve"> </w:t>
-      </w:r>
-      <w:r>
-        <w:rPr>
-          <w:rFonts w:ascii="Georgia" w:hAnsi="Georgia"/>
-          <w:b/>
-          <w:bCs/>
-          <w:i w:val="false"/>
-          <w:iCs w:val="false"/>
-          <w:sz w:val="14"/>
-          <w:szCs w:val="14"/>
-        </w:rPr>
-        <w:t>→</w:t>
-      </w:r>
-      <w:r>
-        <w:rPr>
-          <w:rFonts w:ascii="Georgia" w:hAnsi="Georgia"/>
-          <w:b w:val="false"/>
-          <w:bCs w:val="false"/>
-          <w:i w:val="false"/>
-          <w:iCs w:val="false"/>
-          <w:sz w:val="14"/>
-          <w:szCs w:val="14"/>
-        </w:rPr>
-        <w:t xml:space="preserve"> </w:t>
-      </w:r>
-      <w:r>
-        <w:rPr>
-          <w:rFonts w:ascii="Andale Mono" w:hAnsi="Andale Mono"/>
-          <w:b w:val="false"/>
-          <w:bCs w:val="false"/>
-          <w:i w:val="false"/>
-          <w:iCs w:val="false"/>
-          <w:sz w:val="14"/>
-          <w:szCs w:val="14"/>
-        </w:rPr>
-        <w:t>String</w:t>
+          <w:sz w:val="14"/>
+          <w:szCs w:val="14"/>
+        </w:rPr>
       </w:r>
     </w:p>
     <w:p>
@@ -19075,98 +18943,9 @@
       <w:r>
         <w:rPr>
           <w:rFonts w:ascii="Georgia" w:hAnsi="Georgia"/>
-          <w:b/>
-          <w:bCs/>
-          <w:i/>
-          <w:iCs/>
-          <w:sz w:val="14"/>
-          <w:szCs w:val="14"/>
-        </w:rPr>
-        <w:t>load</w:t>
-      </w:r>
-      <w:r>
-        <w:rPr>
-          <w:rFonts w:ascii="Andale Mono" w:hAnsi="Andale Mono"/>
-          <w:b/>
-          <w:bCs/>
-          <w:i/>
-          <w:iCs/>
-          <w:sz w:val="14"/>
-          <w:szCs w:val="14"/>
-        </w:rPr>
-        <w:t xml:space="preserve"> </w:t>
-      </w:r>
-      <w:r>
-        <w:rPr>
-          <w:rFonts w:ascii="Andale Mono" w:hAnsi="Andale Mono"/>
-          <w:b w:val="false"/>
-          <w:bCs w:val="false"/>
-          <w:i w:val="false"/>
-          <w:iCs w:val="false"/>
-          <w:sz w:val="14"/>
-          <w:szCs w:val="14"/>
-        </w:rPr>
-        <w:t>&amp;Env &amp;str</w:t>
-      </w:r>
-      <w:r>
-        <w:rPr>
-          <w:rFonts w:ascii="Georgia" w:hAnsi="Georgia"/>
-          <w:b w:val="false"/>
-          <w:bCs w:val="false"/>
-          <w:i w:val="false"/>
-          <w:iCs w:val="false"/>
-          <w:sz w:val="14"/>
-          <w:szCs w:val="14"/>
-        </w:rPr>
-        <w:t xml:space="preserve"> </w:t>
-      </w:r>
-      <w:r>
-        <w:rPr>
-          <w:rFonts w:ascii="Georgia" w:hAnsi="Georgia"/>
-          <w:b/>
-          <w:bCs/>
-          <w:i w:val="false"/>
-          <w:iCs w:val="false"/>
-          <w:sz w:val="14"/>
-          <w:szCs w:val="14"/>
-        </w:rPr>
-        <w:t>→</w:t>
-      </w:r>
-      <w:r>
-        <w:rPr>
-          <w:rFonts w:ascii="Georgia" w:hAnsi="Georgia"/>
-          <w:b w:val="false"/>
-          <w:bCs w:val="false"/>
-          <w:i w:val="false"/>
-          <w:iCs w:val="false"/>
-          <w:sz w:val="14"/>
-          <w:szCs w:val="14"/>
-        </w:rPr>
-        <w:t xml:space="preserve"> </w:t>
-      </w:r>
-      <w:r>
-        <w:rPr>
-          <w:rFonts w:ascii="Andale Mono" w:hAnsi="Andale Mono"/>
-          <w:b w:val="false"/>
-          <w:bCs w:val="false"/>
-          <w:i w:val="false"/>
-          <w:iCs w:val="false"/>
-          <w:sz w:val="14"/>
-          <w:szCs w:val="14"/>
-        </w:rPr>
-        <w:t>Result&lt;bool&gt;</w:t>
-      </w:r>
-      <w:r>
-        <w:rPr>
-          <w:rFonts w:ascii="Georgia" w:hAnsi="Georgia"/>
-          <w:b w:val="false"/>
-          <w:bCs w:val="false"/>
-          <w:i w:val="false"/>
-          <w:iCs w:val="false"/>
-          <w:sz w:val="14"/>
-          <w:szCs w:val="14"/>
-        </w:rPr>
-        <w:t xml:space="preserve"> </w:t>
+          <w:sz w:val="14"/>
+          <w:szCs w:val="14"/>
+        </w:rPr>
       </w:r>
     </w:p>
     <w:p>
@@ -19182,74 +18961,9 @@
       <w:r>
         <w:rPr>
           <w:rFonts w:ascii="Georgia" w:hAnsi="Georgia"/>
-          <w:b/>
-          <w:bCs/>
-          <w:i/>
-          <w:iCs/>
-          <w:sz w:val="14"/>
-          <w:szCs w:val="14"/>
-        </w:rPr>
-        <w:t xml:space="preserve">env </w:t>
-      </w:r>
-      <w:r>
-        <w:rPr>
-          <w:rFonts w:ascii="Andale Mono" w:hAnsi="Andale Mono"/>
-          <w:b w:val="false"/>
-          <w:bCs w:val="false"/>
-          <w:i w:val="false"/>
-          <w:iCs w:val="false"/>
-          <w:sz w:val="14"/>
-          <w:szCs w:val="14"/>
-        </w:rPr>
-        <w:t>&amp;Config</w:t>
-      </w:r>
-      <w:r>
-        <w:rPr>
-          <w:rFonts w:ascii="Georgia" w:hAnsi="Georgia"/>
-          <w:b w:val="false"/>
-          <w:bCs w:val="false"/>
-          <w:i w:val="false"/>
-          <w:iCs w:val="false"/>
-          <w:sz w:val="14"/>
-          <w:szCs w:val="14"/>
-        </w:rPr>
-        <w:t xml:space="preserve"> </w:t>
-      </w:r>
-      <w:r>
-        <w:rPr>
-          <w:rFonts w:ascii="Georgia" w:hAnsi="Georgia"/>
-          <w:b/>
-          <w:bCs/>
-          <w:i w:val="false"/>
-          <w:iCs w:val="false"/>
-          <w:sz w:val="14"/>
-          <w:szCs w:val="14"/>
-        </w:rPr>
-        <w:t>→</w:t>
-      </w:r>
-      <w:r>
-        <w:rPr>
-          <w:rFonts w:ascii="Georgia" w:hAnsi="Georgia"/>
-          <w:b w:val="false"/>
-          <w:bCs w:val="false"/>
-          <w:i w:val="false"/>
-          <w:iCs w:val="false"/>
-          <w:sz w:val="14"/>
-          <w:szCs w:val="14"/>
-        </w:rPr>
-        <w:t xml:space="preserve"> </w:t>
-      </w:r>
-      <w:r>
-        <w:rPr>
-          <w:rFonts w:ascii="Andale Mono" w:hAnsi="Andale Mono"/>
-          <w:b w:val="false"/>
-          <w:bCs w:val="false"/>
-          <w:i w:val="false"/>
-          <w:iCs w:val="false"/>
-          <w:sz w:val="14"/>
-          <w:szCs w:val="14"/>
-        </w:rPr>
-        <w:t>Env</w:t>
+          <w:sz w:val="14"/>
+          <w:szCs w:val="14"/>
+        </w:rPr>
       </w:r>
     </w:p>
     <w:p>
@@ -19265,1016 +18979,6 @@
       <w:r>
         <w:rPr>
           <w:rFonts w:ascii="Georgia" w:hAnsi="Georgia"/>
-          <w:b/>
-          <w:bCs/>
-          <w:i/>
-          <w:iCs/>
-          <w:sz w:val="14"/>
-          <w:szCs w:val="14"/>
-        </w:rPr>
-        <w:t>nil</w:t>
-      </w:r>
-      <w:r>
-        <w:rPr>
-          <w:rFonts w:ascii="Andale Mono" w:hAnsi="Andale Mono"/>
-          <w:sz w:val="14"/>
-          <w:szCs w:val="14"/>
-        </w:rPr>
-        <w:t xml:space="preserve"> </w:t>
-      </w:r>
-      <w:r>
-        <w:rPr>
-          <w:rFonts w:ascii="Georgia" w:hAnsi="Georgia"/>
-          <w:b/>
-          <w:bCs/>
-          <w:i w:val="false"/>
-          <w:iCs w:val="false"/>
-          <w:sz w:val="14"/>
-          <w:szCs w:val="14"/>
-        </w:rPr>
-        <w:t>→</w:t>
-      </w:r>
-      <w:r>
-        <w:rPr>
-          <w:rFonts w:ascii="Georgia" w:hAnsi="Georgia"/>
-          <w:b w:val="false"/>
-          <w:bCs w:val="false"/>
-          <w:i w:val="false"/>
-          <w:iCs w:val="false"/>
-          <w:sz w:val="14"/>
-          <w:szCs w:val="14"/>
-        </w:rPr>
-        <w:t xml:space="preserve"> </w:t>
-      </w:r>
-      <w:r>
-        <w:rPr>
-          <w:rFonts w:ascii="Andale Mono" w:hAnsi="Andale Mono"/>
-          <w:sz w:val="14"/>
-          <w:szCs w:val="14"/>
-        </w:rPr>
-        <w:t>Tag</w:t>
-      </w:r>
-    </w:p>
-    <w:p>
-      <w:pPr>
-        <w:pStyle w:val="Normal"/>
-        <w:ind w:hanging="0" w:left="709"/>
-        <w:rPr>
-          <w:rFonts w:ascii="Georgia" w:hAnsi="Georgia"/>
-          <w:sz w:val="14"/>
-          <w:szCs w:val="14"/>
-        </w:rPr>
-      </w:pPr>
-      <w:r>
-        <w:rPr>
-          <w:rFonts w:ascii="Georgia" w:hAnsi="Georgia"/>
-          <w:b/>
-          <w:bCs/>
-          <w:i/>
-          <w:iCs/>
-          <w:sz w:val="14"/>
-          <w:szCs w:val="14"/>
-        </w:rPr>
-        <w:t xml:space="preserve">read_str  </w:t>
-      </w:r>
-      <w:r>
-        <w:rPr>
-          <w:rFonts w:ascii="Andale Mono" w:hAnsi="Andale Mono"/>
-          <w:b w:val="false"/>
-          <w:bCs w:val="false"/>
-          <w:i w:val="false"/>
-          <w:iCs w:val="false"/>
-          <w:sz w:val="14"/>
-          <w:szCs w:val="14"/>
-        </w:rPr>
-        <w:t xml:space="preserve">&amp;Env &amp;str </w:t>
-      </w:r>
-      <w:r>
-        <w:rPr>
-          <w:rFonts w:ascii="Georgia" w:hAnsi="Georgia"/>
-          <w:b/>
-          <w:bCs/>
-          <w:i w:val="false"/>
-          <w:iCs w:val="false"/>
-          <w:sz w:val="14"/>
-          <w:szCs w:val="14"/>
-        </w:rPr>
-        <w:t>→</w:t>
-      </w:r>
-      <w:r>
-        <w:rPr>
-          <w:rFonts w:ascii="Georgia" w:hAnsi="Georgia"/>
-          <w:b w:val="false"/>
-          <w:bCs w:val="false"/>
-          <w:i w:val="false"/>
-          <w:iCs w:val="false"/>
-          <w:sz w:val="14"/>
-          <w:szCs w:val="14"/>
-        </w:rPr>
-        <w:t xml:space="preserve"> </w:t>
-      </w:r>
-      <w:r>
-        <w:rPr>
-          <w:rFonts w:ascii="Andale Mono" w:hAnsi="Andale Mono"/>
-          <w:b w:val="false"/>
-          <w:bCs w:val="false"/>
-          <w:i w:val="false"/>
-          <w:iCs w:val="false"/>
-          <w:sz w:val="14"/>
-          <w:szCs w:val="14"/>
-        </w:rPr>
-        <w:t>Result&lt;Tag&gt;</w:t>
-      </w:r>
-    </w:p>
-    <w:p>
-      <w:pPr>
-        <w:pStyle w:val="Normal"/>
-        <w:ind w:hanging="0" w:left="709"/>
-        <w:rPr>
-          <w:rFonts w:ascii="Georgia" w:hAnsi="Georgia"/>
-          <w:sz w:val="14"/>
-          <w:szCs w:val="14"/>
-        </w:rPr>
-      </w:pPr>
-      <w:r>
-        <w:rPr>
-          <w:rFonts w:ascii="Georgia" w:hAnsi="Georgia"/>
-          <w:b/>
-          <w:bCs/>
-          <w:i/>
-          <w:iCs/>
-          <w:sz w:val="14"/>
-          <w:szCs w:val="14"/>
-        </w:rPr>
-        <w:t>read</w:t>
-      </w:r>
-      <w:r>
-        <w:rPr>
-          <w:rFonts w:ascii="Andale Mono" w:hAnsi="Andale Mono"/>
-          <w:b/>
-          <w:bCs/>
-          <w:i/>
-          <w:iCs/>
-          <w:sz w:val="14"/>
-          <w:szCs w:val="14"/>
-        </w:rPr>
-        <w:t xml:space="preserve"> </w:t>
-      </w:r>
-      <w:r>
-        <w:rPr>
-          <w:rFonts w:ascii="Andale Mono" w:hAnsi="Andale Mono"/>
-          <w:b w:val="false"/>
-          <w:bCs w:val="false"/>
-          <w:i w:val="false"/>
-          <w:iCs w:val="false"/>
-          <w:sz w:val="14"/>
-          <w:szCs w:val="14"/>
-        </w:rPr>
-        <w:t>&amp;Env</w:t>
-      </w:r>
-      <w:r>
-        <w:rPr>
-          <w:rFonts w:ascii="Georgia" w:hAnsi="Georgia"/>
-          <w:b w:val="false"/>
-          <w:bCs w:val="false"/>
-          <w:i w:val="false"/>
-          <w:iCs w:val="false"/>
-          <w:sz w:val="14"/>
-          <w:szCs w:val="14"/>
-        </w:rPr>
-        <w:t xml:space="preserve"> </w:t>
-      </w:r>
-      <w:r>
-        <w:rPr>
-          <w:rFonts w:ascii="Georgia" w:hAnsi="Georgia"/>
-          <w:b/>
-          <w:bCs/>
-          <w:i/>
-          <w:iCs/>
-          <w:sz w:val="14"/>
-          <w:szCs w:val="14"/>
-        </w:rPr>
-        <w:t>stream</w:t>
-      </w:r>
-      <w:r>
-        <w:rPr>
-          <w:rFonts w:ascii="Georgia" w:hAnsi="Georgia"/>
-          <w:b w:val="false"/>
-          <w:bCs w:val="false"/>
-          <w:i w:val="false"/>
-          <w:iCs w:val="false"/>
-          <w:sz w:val="14"/>
-          <w:szCs w:val="14"/>
-        </w:rPr>
-        <w:t xml:space="preserve"> </w:t>
-      </w:r>
-      <w:r>
-        <w:rPr>
-          <w:rFonts w:ascii="Andale Mono" w:hAnsi="Andale Mono"/>
-          <w:b w:val="false"/>
-          <w:bCs w:val="false"/>
-          <w:i w:val="false"/>
-          <w:iCs w:val="false"/>
-          <w:sz w:val="14"/>
-          <w:szCs w:val="14"/>
-        </w:rPr>
-        <w:t xml:space="preserve">bool </w:t>
-      </w:r>
-      <w:r>
-        <w:rPr>
-          <w:rFonts w:ascii="Andale Mono" w:hAnsi="Andale Mono"/>
-          <w:b w:val="false"/>
-          <w:bCs w:val="false"/>
-          <w:i/>
-          <w:iCs/>
-          <w:sz w:val="14"/>
-          <w:szCs w:val="14"/>
-        </w:rPr>
-        <w:t>eof-value</w:t>
-      </w:r>
-      <w:r>
-        <w:rPr>
-          <w:rFonts w:ascii="Andale Mono" w:hAnsi="Andale Mono"/>
-          <w:b w:val="false"/>
-          <w:bCs w:val="false"/>
-          <w:i w:val="false"/>
-          <w:iCs w:val="false"/>
-          <w:sz w:val="14"/>
-          <w:szCs w:val="14"/>
-        </w:rPr>
-        <w:t xml:space="preserve"> </w:t>
-      </w:r>
-      <w:r>
-        <w:rPr>
-          <w:rFonts w:ascii="Georgia" w:hAnsi="Georgia"/>
-          <w:b/>
-          <w:bCs/>
-          <w:i w:val="false"/>
-          <w:iCs w:val="false"/>
-          <w:sz w:val="14"/>
-          <w:szCs w:val="14"/>
-        </w:rPr>
-        <w:t>→</w:t>
-      </w:r>
-      <w:r>
-        <w:rPr>
-          <w:rFonts w:ascii="Georgia" w:hAnsi="Georgia"/>
-          <w:b w:val="false"/>
-          <w:bCs w:val="false"/>
-          <w:i w:val="false"/>
-          <w:iCs w:val="false"/>
-          <w:sz w:val="14"/>
-          <w:szCs w:val="14"/>
-        </w:rPr>
-        <w:t xml:space="preserve"> </w:t>
-      </w:r>
-      <w:r>
-        <w:rPr>
-          <w:rFonts w:ascii="Andale Mono" w:hAnsi="Andale Mono"/>
-          <w:b w:val="false"/>
-          <w:bCs w:val="false"/>
-          <w:i w:val="false"/>
-          <w:iCs w:val="false"/>
-          <w:sz w:val="14"/>
-          <w:szCs w:val="14"/>
-        </w:rPr>
-        <w:t>Result&lt;Tag&gt;</w:t>
-      </w:r>
-    </w:p>
-    <w:p>
-      <w:pPr>
-        <w:pStyle w:val="Normal"/>
-        <w:ind w:hanging="0" w:left="709"/>
-        <w:rPr>
-          <w:rFonts w:ascii="Georgia" w:hAnsi="Georgia"/>
-          <w:sz w:val="14"/>
-          <w:szCs w:val="14"/>
-        </w:rPr>
-      </w:pPr>
-      <w:r>
-        <w:rPr>
-          <w:rFonts w:ascii="Andale Mono" w:hAnsi="Andale Mono"/>
-          <w:b w:val="false"/>
-          <w:bCs w:val="false"/>
-          <w:i w:val="false"/>
-          <w:iCs w:val="false"/>
-          <w:sz w:val="14"/>
-          <w:szCs w:val="14"/>
-        </w:rPr>
-        <w:t>// bool</w:t>
-      </w:r>
-      <w:r>
-        <w:rPr>
-          <w:rFonts w:ascii="Georgia" w:hAnsi="Georgia"/>
-          <w:b/>
-          <w:bCs/>
-          <w:i/>
-          <w:iCs/>
-          <w:sz w:val="14"/>
-          <w:szCs w:val="14"/>
-        </w:rPr>
-        <w:t xml:space="preserve"> –</w:t>
-      </w:r>
-      <w:r>
-        <w:rPr>
-          <w:rFonts w:ascii="Andale Mono" w:hAnsi="Andale Mono"/>
-          <w:b w:val="false"/>
-          <w:bCs w:val="false"/>
-          <w:i w:val="false"/>
-          <w:iCs w:val="false"/>
-          <w:sz w:val="14"/>
-          <w:szCs w:val="14"/>
-        </w:rPr>
-        <w:t xml:space="preserve"> raise exception on end of stream</w:t>
-      </w:r>
-    </w:p>
-    <w:p>
-      <w:pPr>
-        <w:pStyle w:val="Normal"/>
-        <w:ind w:hanging="0" w:left="709"/>
-        <w:rPr>
-          <w:rFonts w:ascii="Georgia" w:hAnsi="Georgia"/>
-          <w:sz w:val="14"/>
-          <w:szCs w:val="14"/>
-        </w:rPr>
-      </w:pPr>
-      <w:r>
-        <w:rPr>
-          <w:rFonts w:ascii="Georgia" w:hAnsi="Georgia"/>
-          <w:b/>
-          <w:bCs/>
-          <w:i/>
-          <w:iCs/>
-          <w:sz w:val="14"/>
-          <w:szCs w:val="14"/>
-        </w:rPr>
-        <w:t>std_in</w:t>
-      </w:r>
-      <w:r>
-        <w:rPr>
-          <w:rFonts w:ascii="Georgia" w:hAnsi="Georgia"/>
-          <w:b w:val="false"/>
-          <w:bCs w:val="false"/>
-          <w:i w:val="false"/>
-          <w:iCs w:val="false"/>
-          <w:sz w:val="14"/>
-          <w:szCs w:val="14"/>
-        </w:rPr>
-        <w:t xml:space="preserve"> </w:t>
-      </w:r>
-      <w:r>
-        <w:rPr>
-          <w:rFonts w:ascii="Georgia" w:hAnsi="Georgia"/>
-          <w:b/>
-          <w:bCs/>
-          <w:i w:val="false"/>
-          <w:iCs w:val="false"/>
-          <w:sz w:val="14"/>
-          <w:szCs w:val="14"/>
-        </w:rPr>
-        <w:t>→</w:t>
-      </w:r>
-      <w:r>
-        <w:rPr>
-          <w:rFonts w:ascii="Georgia" w:hAnsi="Georgia"/>
-          <w:b w:val="false"/>
-          <w:bCs w:val="false"/>
-          <w:i w:val="false"/>
-          <w:iCs w:val="false"/>
-          <w:sz w:val="14"/>
-          <w:szCs w:val="14"/>
-        </w:rPr>
-        <w:t xml:space="preserve"> </w:t>
-      </w:r>
-      <w:r>
-        <w:rPr>
-          <w:rFonts w:ascii="Andale Mono" w:hAnsi="Andale Mono"/>
-          <w:b w:val="false"/>
-          <w:bCs w:val="false"/>
-          <w:i w:val="false"/>
-          <w:iCs w:val="false"/>
-          <w:sz w:val="14"/>
-          <w:szCs w:val="14"/>
-        </w:rPr>
-        <w:t>Tag</w:t>
-      </w:r>
-    </w:p>
-    <w:p>
-      <w:pPr>
-        <w:pStyle w:val="Normal"/>
-        <w:ind w:hanging="0" w:left="709"/>
-        <w:rPr>
-          <w:rFonts w:ascii="Georgia" w:hAnsi="Georgia"/>
-          <w:sz w:val="14"/>
-          <w:szCs w:val="14"/>
-        </w:rPr>
-      </w:pPr>
-      <w:r>
-        <w:rPr>
-          <w:rFonts w:ascii="Georgia" w:hAnsi="Georgia"/>
-          <w:b/>
-          <w:bCs/>
-          <w:i/>
-          <w:iCs/>
-          <w:sz w:val="14"/>
-          <w:szCs w:val="14"/>
-        </w:rPr>
-        <w:t>std_out</w:t>
-      </w:r>
-      <w:r>
-        <w:rPr>
-          <w:rFonts w:ascii="Georgia" w:hAnsi="Georgia"/>
-          <w:b w:val="false"/>
-          <w:bCs w:val="false"/>
-          <w:i w:val="false"/>
-          <w:iCs w:val="false"/>
-          <w:sz w:val="14"/>
-          <w:szCs w:val="14"/>
-        </w:rPr>
-        <w:t xml:space="preserve"> </w:t>
-      </w:r>
-      <w:r>
-        <w:rPr>
-          <w:rFonts w:ascii="Georgia" w:hAnsi="Georgia"/>
-          <w:b/>
-          <w:bCs/>
-          <w:i w:val="false"/>
-          <w:iCs w:val="false"/>
-          <w:sz w:val="14"/>
-          <w:szCs w:val="14"/>
-        </w:rPr>
-        <w:t>→</w:t>
-      </w:r>
-      <w:r>
-        <w:rPr>
-          <w:rFonts w:ascii="Georgia" w:hAnsi="Georgia"/>
-          <w:b w:val="false"/>
-          <w:bCs w:val="false"/>
-          <w:i w:val="false"/>
-          <w:iCs w:val="false"/>
-          <w:sz w:val="14"/>
-          <w:szCs w:val="14"/>
-        </w:rPr>
-        <w:t xml:space="preserve"> </w:t>
-      </w:r>
-      <w:r>
-        <w:rPr>
-          <w:rFonts w:ascii="Andale Mono" w:hAnsi="Andale Mono"/>
-          <w:b w:val="false"/>
-          <w:bCs w:val="false"/>
-          <w:i w:val="false"/>
-          <w:iCs w:val="false"/>
-          <w:sz w:val="14"/>
-          <w:szCs w:val="14"/>
-        </w:rPr>
-        <w:t>Tag</w:t>
-      </w:r>
-    </w:p>
-    <w:p>
-      <w:pPr>
-        <w:pStyle w:val="Normal"/>
-        <w:ind w:hanging="0" w:left="709"/>
-        <w:rPr>
-          <w:rFonts w:ascii="Georgia" w:hAnsi="Georgia"/>
-          <w:sz w:val="14"/>
-          <w:szCs w:val="14"/>
-        </w:rPr>
-      </w:pPr>
-      <w:r>
-        <w:rPr>
-          <w:rFonts w:ascii="Georgia" w:hAnsi="Georgia"/>
-          <w:b/>
-          <w:bCs/>
-          <w:i/>
-          <w:iCs/>
-          <w:sz w:val="14"/>
-          <w:szCs w:val="14"/>
-        </w:rPr>
-        <w:t>version</w:t>
-      </w:r>
-      <w:r>
-        <w:rPr>
-          <w:rFonts w:ascii="Georgia" w:hAnsi="Georgia"/>
-          <w:b w:val="false"/>
-          <w:bCs w:val="false"/>
-          <w:i w:val="false"/>
-          <w:iCs w:val="false"/>
-          <w:sz w:val="14"/>
-          <w:szCs w:val="14"/>
-        </w:rPr>
-        <w:t xml:space="preserve"> </w:t>
-      </w:r>
-      <w:r>
-        <w:rPr>
-          <w:rFonts w:ascii="Georgia" w:hAnsi="Georgia"/>
-          <w:b/>
-          <w:bCs/>
-          <w:i w:val="false"/>
-          <w:iCs w:val="false"/>
-          <w:sz w:val="14"/>
-          <w:szCs w:val="14"/>
-        </w:rPr>
-        <w:t>→</w:t>
-      </w:r>
-      <w:r>
-        <w:rPr>
-          <w:rFonts w:ascii="Georgia" w:hAnsi="Georgia"/>
-          <w:b w:val="false"/>
-          <w:bCs w:val="false"/>
-          <w:i w:val="false"/>
-          <w:iCs w:val="false"/>
-          <w:sz w:val="14"/>
-          <w:szCs w:val="14"/>
-        </w:rPr>
-        <w:t xml:space="preserve"> </w:t>
-      </w:r>
-      <w:r>
-        <w:rPr>
-          <w:rFonts w:ascii="Andale Mono" w:hAnsi="Andale Mono"/>
-          <w:b w:val="false"/>
-          <w:bCs w:val="false"/>
-          <w:i w:val="false"/>
-          <w:iCs w:val="false"/>
-          <w:sz w:val="14"/>
-          <w:szCs w:val="14"/>
-        </w:rPr>
-        <w:t>&amp;str</w:t>
-      </w:r>
-    </w:p>
-    <w:p>
-      <w:pPr>
-        <w:pStyle w:val="Normal"/>
-        <w:ind w:hanging="0" w:left="709"/>
-        <w:rPr>
-          <w:rFonts w:ascii="Georgia" w:hAnsi="Georgia"/>
-          <w:sz w:val="14"/>
-          <w:szCs w:val="14"/>
-        </w:rPr>
-      </w:pPr>
-      <w:r>
-        <w:rPr>
-          <w:rFonts w:ascii="Georgia" w:hAnsi="Georgia"/>
-          <w:b/>
-          <w:bCs/>
-          <w:i/>
-          <w:iCs/>
-          <w:sz w:val="14"/>
-          <w:szCs w:val="14"/>
-        </w:rPr>
-        <w:t xml:space="preserve">write_str </w:t>
-      </w:r>
-      <w:r>
-        <w:rPr>
-          <w:rFonts w:ascii="Andale Mono" w:hAnsi="Andale Mono"/>
-          <w:b w:val="false"/>
-          <w:bCs w:val="false"/>
-          <w:i w:val="false"/>
-          <w:iCs w:val="false"/>
-          <w:sz w:val="14"/>
-          <w:szCs w:val="14"/>
-        </w:rPr>
-        <w:t>&amp;Env &amp;str</w:t>
-      </w:r>
-      <w:r>
-        <w:rPr>
-          <w:rFonts w:ascii="Georgia" w:hAnsi="Georgia"/>
-          <w:b w:val="false"/>
-          <w:bCs w:val="false"/>
-          <w:i w:val="false"/>
-          <w:iCs w:val="false"/>
-          <w:sz w:val="14"/>
-          <w:szCs w:val="14"/>
-        </w:rPr>
-        <w:t xml:space="preserve"> </w:t>
-      </w:r>
-      <w:r>
-        <w:rPr>
-          <w:rFonts w:ascii="Georgia" w:hAnsi="Georgia"/>
-          <w:b/>
-          <w:bCs/>
-          <w:i/>
-          <w:iCs/>
-          <w:sz w:val="14"/>
-          <w:szCs w:val="14"/>
-        </w:rPr>
-        <w:t>stream</w:t>
-      </w:r>
-      <w:r>
-        <w:rPr>
-          <w:rFonts w:ascii="Georgia" w:hAnsi="Georgia"/>
-          <w:b w:val="false"/>
-          <w:bCs w:val="false"/>
-          <w:i w:val="false"/>
-          <w:iCs w:val="false"/>
-          <w:sz w:val="14"/>
-          <w:szCs w:val="14"/>
-        </w:rPr>
-        <w:t xml:space="preserve"> </w:t>
-      </w:r>
-      <w:r>
-        <w:rPr>
-          <w:rFonts w:ascii="Georgia" w:hAnsi="Georgia"/>
-          <w:b/>
-          <w:bCs/>
-          <w:i w:val="false"/>
-          <w:iCs w:val="false"/>
-          <w:sz w:val="14"/>
-          <w:szCs w:val="14"/>
-        </w:rPr>
-        <w:t>→</w:t>
-      </w:r>
-      <w:r>
-        <w:rPr>
-          <w:rFonts w:ascii="Georgia" w:hAnsi="Georgia"/>
-          <w:b w:val="false"/>
-          <w:bCs w:val="false"/>
-          <w:i w:val="false"/>
-          <w:iCs w:val="false"/>
-          <w:sz w:val="14"/>
-          <w:szCs w:val="14"/>
-        </w:rPr>
-        <w:t xml:space="preserve"> </w:t>
-      </w:r>
-      <w:r>
-        <w:rPr>
-          <w:rFonts w:ascii="Andale Mono" w:hAnsi="Andale Mono"/>
-          <w:b w:val="false"/>
-          <w:bCs w:val="false"/>
-          <w:i w:val="false"/>
-          <w:iCs w:val="false"/>
-          <w:sz w:val="14"/>
-          <w:szCs w:val="14"/>
-        </w:rPr>
-        <w:t>Result&lt;()&gt;</w:t>
-      </w:r>
-    </w:p>
-    <w:p>
-      <w:pPr>
-        <w:pStyle w:val="Normal"/>
-        <w:ind w:hanging="0" w:left="709"/>
-        <w:rPr>
-          <w:rFonts w:ascii="Georgia" w:hAnsi="Georgia"/>
-          <w:sz w:val="14"/>
-          <w:szCs w:val="14"/>
-        </w:rPr>
-      </w:pPr>
-      <w:r>
-        <w:rPr>
-          <w:rFonts w:ascii="Georgia" w:hAnsi="Georgia"/>
-          <w:b/>
-          <w:bCs/>
-          <w:i/>
-          <w:iCs/>
-          <w:sz w:val="14"/>
-          <w:szCs w:val="14"/>
-        </w:rPr>
-        <w:t xml:space="preserve">write_to_string </w:t>
-      </w:r>
-      <w:r>
-        <w:rPr>
-          <w:rFonts w:ascii="Andale Mono" w:hAnsi="Andale Mono"/>
-          <w:b w:val="false"/>
-          <w:bCs w:val="false"/>
-          <w:i w:val="false"/>
-          <w:iCs w:val="false"/>
-          <w:sz w:val="14"/>
-          <w:szCs w:val="14"/>
-        </w:rPr>
-        <w:t>&amp;Env</w:t>
-      </w:r>
-      <w:r>
-        <w:rPr>
-          <w:rFonts w:ascii="Georgia" w:hAnsi="Georgia"/>
-          <w:b w:val="false"/>
-          <w:bCs w:val="false"/>
-          <w:i/>
-          <w:iCs/>
-          <w:sz w:val="14"/>
-          <w:szCs w:val="14"/>
-        </w:rPr>
-        <w:t xml:space="preserve"> T </w:t>
-      </w:r>
-      <w:r>
-        <w:rPr>
-          <w:rFonts w:ascii="Andale Mono" w:hAnsi="Andale Mono"/>
-          <w:b w:val="false"/>
-          <w:bCs w:val="false"/>
-          <w:i w:val="false"/>
-          <w:iCs w:val="false"/>
-          <w:sz w:val="14"/>
-          <w:szCs w:val="14"/>
-        </w:rPr>
-        <w:t xml:space="preserve">bool </w:t>
-      </w:r>
-      <w:r>
-        <w:rPr>
-          <w:rFonts w:ascii="Georgia" w:hAnsi="Georgia"/>
-          <w:b/>
-          <w:bCs/>
-          <w:i w:val="false"/>
-          <w:iCs w:val="false"/>
-          <w:sz w:val="14"/>
-          <w:szCs w:val="14"/>
-        </w:rPr>
-        <w:t>→</w:t>
-      </w:r>
-      <w:r>
-        <w:rPr>
-          <w:rFonts w:ascii="Georgia" w:hAnsi="Georgia"/>
-          <w:b w:val="false"/>
-          <w:bCs w:val="false"/>
-          <w:i w:val="false"/>
-          <w:iCs w:val="false"/>
-          <w:sz w:val="14"/>
-          <w:szCs w:val="14"/>
-        </w:rPr>
-        <w:t xml:space="preserve"> </w:t>
-      </w:r>
-      <w:r>
-        <w:rPr>
-          <w:rFonts w:ascii="Andale Mono" w:hAnsi="Andale Mono"/>
-          <w:b w:val="false"/>
-          <w:bCs w:val="false"/>
-          <w:i w:val="false"/>
-          <w:iCs w:val="false"/>
-          <w:sz w:val="14"/>
-          <w:szCs w:val="14"/>
-        </w:rPr>
-        <w:t>String</w:t>
-      </w:r>
-    </w:p>
-    <w:p>
-      <w:pPr>
-        <w:pStyle w:val="Normal"/>
-        <w:ind w:hanging="0" w:left="709"/>
-        <w:rPr>
-          <w:rFonts w:ascii="Georgia" w:hAnsi="Georgia"/>
-          <w:sz w:val="14"/>
-          <w:szCs w:val="14"/>
-        </w:rPr>
-      </w:pPr>
-      <w:r>
-        <w:rPr>
-          <w:rFonts w:ascii="Andale Mono" w:hAnsi="Andale Mono"/>
-          <w:b w:val="false"/>
-          <w:bCs w:val="false"/>
-          <w:i w:val="false"/>
-          <w:iCs w:val="false"/>
-          <w:sz w:val="14"/>
-          <w:szCs w:val="14"/>
-        </w:rPr>
-        <w:t>// bool – print escaped</w:t>
-      </w:r>
-    </w:p>
-    <w:p>
-      <w:pPr>
-        <w:pStyle w:val="Normal"/>
-        <w:ind w:hanging="0" w:left="709"/>
-        <w:rPr>
-          <w:rFonts w:ascii="Georgia" w:hAnsi="Georgia"/>
-          <w:sz w:val="14"/>
-          <w:szCs w:val="14"/>
-        </w:rPr>
-      </w:pPr>
-      <w:r>
-        <w:rPr>
-          <w:rFonts w:ascii="Georgia" w:hAnsi="Georgia"/>
-          <w:b/>
-          <w:bCs/>
-          <w:i/>
-          <w:iCs/>
-          <w:sz w:val="14"/>
-          <w:szCs w:val="14"/>
-        </w:rPr>
-        <w:t xml:space="preserve">write </w:t>
-      </w:r>
-      <w:r>
-        <w:rPr>
-          <w:rFonts w:ascii="Andale Mono" w:hAnsi="Andale Mono"/>
-          <w:b w:val="false"/>
-          <w:bCs w:val="false"/>
-          <w:i w:val="false"/>
-          <w:iCs w:val="false"/>
-          <w:sz w:val="14"/>
-          <w:szCs w:val="14"/>
-        </w:rPr>
-        <w:t xml:space="preserve">&amp;Env </w:t>
-      </w:r>
-      <w:r>
-        <w:rPr>
-          <w:rFonts w:ascii="Georgia" w:hAnsi="Georgia"/>
-          <w:b w:val="false"/>
-          <w:bCs w:val="false"/>
-          <w:i/>
-          <w:iCs/>
-          <w:sz w:val="14"/>
-          <w:szCs w:val="14"/>
-        </w:rPr>
-        <w:t xml:space="preserve">T </w:t>
-      </w:r>
-      <w:r>
-        <w:rPr>
-          <w:rFonts w:ascii="Georgia" w:hAnsi="Georgia"/>
-          <w:b w:val="false"/>
-          <w:bCs w:val="false"/>
-          <w:i w:val="false"/>
-          <w:iCs w:val="false"/>
-          <w:sz w:val="14"/>
-          <w:szCs w:val="14"/>
-        </w:rPr>
-        <w:t xml:space="preserve"> </w:t>
-      </w:r>
-      <w:r>
-        <w:rPr>
-          <w:rFonts w:ascii="Andale Mono" w:hAnsi="Andale Mono"/>
-          <w:b w:val="false"/>
-          <w:bCs w:val="false"/>
-          <w:i w:val="false"/>
-          <w:iCs w:val="false"/>
-          <w:sz w:val="14"/>
-          <w:szCs w:val="14"/>
-        </w:rPr>
-        <w:t>bool</w:t>
-      </w:r>
-      <w:r>
-        <w:rPr>
-          <w:rFonts w:ascii="Georgia" w:hAnsi="Georgia"/>
-          <w:b w:val="false"/>
-          <w:bCs w:val="false"/>
-          <w:i w:val="false"/>
-          <w:iCs w:val="false"/>
-          <w:sz w:val="14"/>
-          <w:szCs w:val="14"/>
-        </w:rPr>
-        <w:t xml:space="preserve"> </w:t>
-      </w:r>
-      <w:r>
-        <w:rPr>
-          <w:rFonts w:ascii="Georgia" w:hAnsi="Georgia"/>
-          <w:b/>
-          <w:bCs/>
-          <w:i/>
-          <w:iCs/>
-          <w:sz w:val="14"/>
-          <w:szCs w:val="14"/>
-        </w:rPr>
-        <w:t>stream</w:t>
-      </w:r>
-      <w:r>
-        <w:rPr>
-          <w:rFonts w:ascii="Georgia" w:hAnsi="Georgia"/>
-          <w:b w:val="false"/>
-          <w:bCs w:val="false"/>
-          <w:i w:val="false"/>
-          <w:iCs w:val="false"/>
-          <w:sz w:val="14"/>
-          <w:szCs w:val="14"/>
-        </w:rPr>
-        <w:t xml:space="preserve"> </w:t>
-      </w:r>
-      <w:r>
-        <w:rPr>
-          <w:rFonts w:ascii="Georgia" w:hAnsi="Georgia"/>
-          <w:b/>
-          <w:bCs/>
-          <w:i w:val="false"/>
-          <w:iCs w:val="false"/>
-          <w:sz w:val="14"/>
-          <w:szCs w:val="14"/>
-        </w:rPr>
-        <w:t>→</w:t>
-      </w:r>
-      <w:r>
-        <w:rPr>
-          <w:rFonts w:ascii="Georgia" w:hAnsi="Georgia"/>
-          <w:b w:val="false"/>
-          <w:bCs w:val="false"/>
-          <w:i w:val="false"/>
-          <w:iCs w:val="false"/>
-          <w:sz w:val="14"/>
-          <w:szCs w:val="14"/>
-        </w:rPr>
-        <w:t xml:space="preserve"> </w:t>
-      </w:r>
-      <w:r>
-        <w:rPr>
-          <w:rFonts w:ascii="Andale Mono" w:hAnsi="Andale Mono"/>
-          <w:b w:val="false"/>
-          <w:bCs w:val="false"/>
-          <w:i w:val="false"/>
-          <w:iCs w:val="false"/>
-          <w:sz w:val="14"/>
-          <w:szCs w:val="14"/>
-        </w:rPr>
-        <w:t>Result&lt;()&gt;</w:t>
-      </w:r>
-    </w:p>
-    <w:p>
-      <w:pPr>
-        <w:pStyle w:val="Normal"/>
-        <w:ind w:hanging="0" w:left="709"/>
-        <w:rPr>
-          <w:rFonts w:ascii="Georgia" w:hAnsi="Georgia"/>
-          <w:sz w:val="14"/>
-          <w:szCs w:val="14"/>
-        </w:rPr>
-      </w:pPr>
-      <w:r>
-        <w:rPr>
-          <w:rFonts w:ascii="Andale Mono" w:hAnsi="Andale Mono"/>
-          <w:b w:val="false"/>
-          <w:bCs w:val="false"/>
-          <w:i w:val="false"/>
-          <w:iCs w:val="false"/>
-          <w:sz w:val="14"/>
-          <w:szCs w:val="14"/>
-        </w:rPr>
-        <w:t>// bool – print escape</w:t>
-      </w:r>
-    </w:p>
-    <w:p>
-      <w:pPr>
-        <w:pStyle w:val="Normal"/>
-        <w:ind w:hanging="0" w:left="709"/>
-        <w:rPr>
-          <w:rFonts w:ascii="Georgia" w:hAnsi="Georgia"/>
-          <w:sz w:val="14"/>
-          <w:szCs w:val="14"/>
-        </w:rPr>
-      </w:pPr>
-      <w:r>
-        <w:rPr>
-          <w:rFonts w:ascii="Georgia" w:hAnsi="Georgia"/>
-          <w:b w:val="false"/>
-          <w:bCs w:val="false"/>
-          <w:i w:val="false"/>
-          <w:iCs w:val="false"/>
-          <w:sz w:val="14"/>
-          <w:szCs w:val="14"/>
-        </w:rPr>
-      </w:r>
-    </w:p>
-    <w:p>
-      <w:pPr>
-        <w:pStyle w:val="Normal"/>
-        <w:ind w:hanging="0" w:left="709"/>
-        <w:rPr>
-          <w:rFonts w:ascii="Georgia" w:hAnsi="Georgia"/>
-          <w:sz w:val="14"/>
-          <w:szCs w:val="14"/>
-        </w:rPr>
-      </w:pPr>
-      <w:r>
-        <w:rPr>
-          <w:rFonts w:ascii="Georgia" w:hAnsi="Georgia"/>
-          <w:b w:val="false"/>
-          <w:bCs w:val="false"/>
-          <w:i w:val="false"/>
-          <w:iCs w:val="false"/>
-          <w:sz w:val="14"/>
-          <w:szCs w:val="14"/>
-        </w:rPr>
-      </w:r>
-    </w:p>
-    <w:p>
-      <w:pPr>
-        <w:pStyle w:val="Normal"/>
-        <w:ind w:hanging="0" w:left="709"/>
-        <w:rPr>
-          <w:rFonts w:ascii="Georgia" w:hAnsi="Georgia"/>
-          <w:sz w:val="14"/>
-          <w:szCs w:val="14"/>
-        </w:rPr>
-      </w:pPr>
-      <w:r>
-        <w:rPr>
-          <w:rFonts w:ascii="Georgia" w:hAnsi="Georgia"/>
-          <w:b w:val="false"/>
-          <w:bCs w:val="false"/>
-          <w:i w:val="false"/>
-          <w:iCs w:val="false"/>
-          <w:sz w:val="14"/>
-          <w:szCs w:val="14"/>
-        </w:rPr>
-      </w:r>
-    </w:p>
-    <w:p>
-      <w:pPr>
-        <w:pStyle w:val="Normal"/>
-        <w:ind w:hanging="0" w:left="709"/>
-        <w:rPr>
-          <w:rFonts w:ascii="Georgia" w:hAnsi="Georgia"/>
-          <w:sz w:val="14"/>
-          <w:szCs w:val="14"/>
-        </w:rPr>
-      </w:pPr>
-      <w:r>
-        <w:rPr>
-          <w:rFonts w:ascii="Georgia" w:hAnsi="Georgia"/>
-          <w:b w:val="false"/>
-          <w:bCs w:val="false"/>
-          <w:i w:val="false"/>
-          <w:iCs w:val="false"/>
           <w:sz w:val="14"/>
           <w:szCs w:val="14"/>
         </w:rPr>
@@ -20359,7 +19063,10 @@
     <w:p>
       <w:pPr>
         <w:pStyle w:val="Normal"/>
+        <w:bidi w:val="0"/>
+        <w:spacing w:lineRule="auto" w:line="240"/>
         <w:ind w:hanging="0" w:left="0"/>
+        <w:jc w:val="left"/>
         <w:rPr>
           <w:rFonts w:ascii="Andale Mono MT Std" w:hAnsi="Andale Mono MT Std"/>
           <w:b w:val="false"/>
@@ -20381,13 +19088,11 @@
     <w:p>
       <w:pPr>
         <w:pStyle w:val="Normal"/>
-        <w:spacing w:before="57" w:after="57"/>
+        <w:bidi w:val="0"/>
+        <w:spacing w:lineRule="auto" w:line="240" w:before="57" w:after="57"/>
         <w:ind w:hanging="0" w:left="0"/>
-        <w:rPr>
-          <w:rFonts w:ascii="Andale Mono MT Std" w:hAnsi="Andale Mono MT Std"/>
-          <w:b w:val="false"/>
-          <w:bCs w:val="false"/>
-        </w:rPr>
+        <w:jc w:val="left"/>
+        <w:rPr/>
       </w:pPr>
       <w:r>
         <w:rPr>
@@ -20429,12 +19134,11 @@
     <w:p>
       <w:pPr>
         <w:pStyle w:val="Normal"/>
-        <w:spacing w:before="57" w:after="57"/>
+        <w:bidi w:val="0"/>
+        <w:spacing w:lineRule="auto" w:line="240" w:before="57" w:after="57"/>
         <w:ind w:hanging="0" w:left="0"/>
-        <w:rPr>
-          <w:b/>
-          <w:bCs/>
-        </w:rPr>
+        <w:jc w:val="left"/>
+        <w:rPr/>
       </w:pPr>
       <w:r>
         <w:rPr>
@@ -20476,12 +19180,11 @@
     <w:p>
       <w:pPr>
         <w:pStyle w:val="Normal"/>
-        <w:spacing w:before="57" w:after="57"/>
+        <w:bidi w:val="0"/>
+        <w:spacing w:lineRule="auto" w:line="240" w:before="57" w:after="57"/>
         <w:ind w:hanging="0" w:left="0"/>
-        <w:rPr>
-          <w:b/>
-          <w:bCs/>
-        </w:rPr>
+        <w:jc w:val="left"/>
+        <w:rPr/>
       </w:pPr>
       <w:r>
         <w:rPr>
@@ -20538,12 +19241,11 @@
     <w:p>
       <w:pPr>
         <w:pStyle w:val="Normal"/>
-        <w:spacing w:before="57" w:after="57"/>
+        <w:bidi w:val="0"/>
+        <w:spacing w:lineRule="auto" w:line="240" w:before="57" w:after="57"/>
         <w:ind w:hanging="0" w:left="0"/>
-        <w:rPr>
-          <w:b/>
-          <w:bCs/>
-        </w:rPr>
+        <w:jc w:val="left"/>
+        <w:rPr/>
       </w:pPr>
       <w:r>
         <w:rPr>
@@ -20616,12 +19318,11 @@
     <w:p>
       <w:pPr>
         <w:pStyle w:val="Normal"/>
-        <w:spacing w:before="57" w:after="57"/>
+        <w:bidi w:val="0"/>
+        <w:spacing w:lineRule="auto" w:line="240" w:before="57" w:after="57"/>
         <w:ind w:hanging="0" w:left="0"/>
-        <w:rPr>
-          <w:b/>
-          <w:bCs/>
-        </w:rPr>
+        <w:jc w:val="left"/>
+        <w:rPr/>
       </w:pPr>
       <w:r>
         <w:rPr>
@@ -20699,12 +19400,11 @@
     <w:p>
       <w:pPr>
         <w:pStyle w:val="Normal"/>
-        <w:spacing w:before="57" w:after="57"/>
+        <w:bidi w:val="0"/>
+        <w:spacing w:lineRule="auto" w:line="240" w:before="57" w:after="57"/>
         <w:ind w:hanging="0" w:left="0"/>
-        <w:rPr>
-          <w:b/>
-          <w:bCs/>
-        </w:rPr>
+        <w:jc w:val="left"/>
+        <w:rPr/>
       </w:pPr>
       <w:r>
         <w:rPr>
@@ -20777,12 +19477,11 @@
     <w:p>
       <w:pPr>
         <w:pStyle w:val="Normal"/>
-        <w:spacing w:before="57" w:after="57"/>
+        <w:bidi w:val="0"/>
+        <w:spacing w:lineRule="auto" w:line="240" w:before="57" w:after="57"/>
         <w:ind w:hanging="0" w:left="0"/>
-        <w:rPr>
-          <w:b/>
-          <w:bCs/>
-        </w:rPr>
+        <w:jc w:val="left"/>
+        <w:rPr/>
       </w:pPr>
       <w:r>
         <w:rPr>
@@ -20855,12 +19554,11 @@
     <w:p>
       <w:pPr>
         <w:pStyle w:val="Normal"/>
-        <w:spacing w:before="57" w:after="57"/>
+        <w:bidi w:val="0"/>
+        <w:spacing w:lineRule="auto" w:line="240" w:before="57" w:after="57"/>
         <w:ind w:hanging="0" w:left="0"/>
-        <w:rPr>
-          <w:b/>
-          <w:bCs/>
-        </w:rPr>
+        <w:jc w:val="left"/>
+        <w:rPr/>
       </w:pPr>
       <w:r>
         <w:rPr>
@@ -20918,12 +19616,11 @@
     <w:p>
       <w:pPr>
         <w:pStyle w:val="Normal"/>
-        <w:spacing w:before="57" w:after="57"/>
+        <w:bidi w:val="0"/>
+        <w:spacing w:lineRule="auto" w:line="240" w:before="57" w:after="57"/>
         <w:ind w:hanging="0" w:left="0"/>
-        <w:rPr>
-          <w:b/>
-          <w:bCs/>
-        </w:rPr>
+        <w:jc w:val="left"/>
+        <w:rPr/>
       </w:pPr>
       <w:r>
         <w:rPr>
@@ -20996,12 +19693,11 @@
     <w:p>
       <w:pPr>
         <w:pStyle w:val="Normal"/>
-        <w:spacing w:before="57" w:after="57"/>
+        <w:bidi w:val="0"/>
+        <w:spacing w:lineRule="auto" w:line="240" w:before="57" w:after="57"/>
         <w:ind w:hanging="0" w:left="0"/>
-        <w:rPr>
-          <w:b/>
-          <w:bCs/>
-        </w:rPr>
+        <w:jc w:val="left"/>
+        <w:rPr/>
       </w:pPr>
       <w:r>
         <w:rPr>
@@ -21059,12 +19755,11 @@
     <w:p>
       <w:pPr>
         <w:pStyle w:val="Normal"/>
-        <w:spacing w:before="57" w:after="57"/>
+        <w:bidi w:val="0"/>
+        <w:spacing w:lineRule="auto" w:line="240" w:before="57" w:after="57"/>
         <w:ind w:hanging="0" w:left="0"/>
-        <w:rPr>
-          <w:b/>
-          <w:bCs/>
-        </w:rPr>
+        <w:jc w:val="left"/>
+        <w:rPr/>
       </w:pPr>
       <w:r>
         <w:rPr>
@@ -21136,12 +19831,11 @@
     <w:p>
       <w:pPr>
         <w:pStyle w:val="Normal"/>
-        <w:spacing w:before="57" w:after="57"/>
+        <w:bidi w:val="0"/>
+        <w:spacing w:lineRule="auto" w:line="240" w:before="57" w:after="57"/>
         <w:ind w:hanging="0" w:left="0"/>
-        <w:rPr>
-          <w:b/>
-          <w:bCs/>
-        </w:rPr>
+        <w:jc w:val="left"/>
+        <w:rPr/>
       </w:pPr>
       <w:r>
         <w:rPr>
@@ -21198,12 +19892,11 @@
     <w:p>
       <w:pPr>
         <w:pStyle w:val="Normal"/>
-        <w:spacing w:before="57" w:after="57"/>
+        <w:bidi w:val="0"/>
+        <w:spacing w:lineRule="auto" w:line="240" w:before="57" w:after="57"/>
         <w:ind w:hanging="0" w:left="0"/>
-        <w:rPr>
-          <w:b/>
-          <w:bCs/>
-        </w:rPr>
+        <w:jc w:val="left"/>
+        <w:rPr/>
       </w:pPr>
       <w:r>
         <w:rPr>
@@ -21292,12 +19985,11 @@
     <w:p>
       <w:pPr>
         <w:pStyle w:val="Normal"/>
-        <w:spacing w:before="57" w:after="57"/>
+        <w:bidi w:val="0"/>
+        <w:spacing w:lineRule="auto" w:line="240" w:before="57" w:after="57"/>
         <w:ind w:hanging="0" w:left="0"/>
-        <w:rPr>
-          <w:b/>
-          <w:bCs/>
-        </w:rPr>
+        <w:jc w:val="left"/>
+        <w:rPr/>
       </w:pPr>
       <w:r>
         <w:rPr>
@@ -21386,12 +20078,11 @@
     <w:p>
       <w:pPr>
         <w:pStyle w:val="Normal"/>
-        <w:spacing w:before="57" w:after="57"/>
+        <w:bidi w:val="0"/>
+        <w:spacing w:lineRule="auto" w:line="240" w:before="57" w:after="57"/>
         <w:ind w:hanging="0" w:left="0"/>
-        <w:rPr>
-          <w:b/>
-          <w:bCs/>
-        </w:rPr>
+        <w:jc w:val="left"/>
+        <w:rPr/>
       </w:pPr>
       <w:r>
         <w:rPr>
@@ -21416,12 +20107,11 @@
     <w:p>
       <w:pPr>
         <w:pStyle w:val="Normal"/>
-        <w:spacing w:before="57" w:after="57"/>
+        <w:bidi w:val="0"/>
+        <w:spacing w:lineRule="auto" w:line="240" w:before="57" w:after="57"/>
         <w:ind w:hanging="0" w:left="0"/>
-        <w:rPr>
-          <w:b/>
-          <w:bCs/>
-        </w:rPr>
+        <w:jc w:val="left"/>
+        <w:rPr/>
       </w:pPr>
       <w:r>
         <w:rPr>
@@ -21494,12 +20184,11 @@
     <w:p>
       <w:pPr>
         <w:pStyle w:val="Normal"/>
-        <w:spacing w:before="57" w:after="57"/>
+        <w:bidi w:val="0"/>
+        <w:spacing w:lineRule="auto" w:line="240" w:before="57" w:after="57"/>
         <w:ind w:hanging="0" w:left="0"/>
-        <w:rPr>
-          <w:b/>
-          <w:bCs/>
-        </w:rPr>
+        <w:jc w:val="left"/>
+        <w:rPr/>
       </w:pPr>
       <w:r>
         <w:rPr>
@@ -21541,12 +20230,11 @@
     <w:p>
       <w:pPr>
         <w:pStyle w:val="Normal"/>
-        <w:spacing w:before="57" w:after="57"/>
+        <w:bidi w:val="0"/>
+        <w:spacing w:lineRule="auto" w:line="240" w:before="57" w:after="57"/>
         <w:ind w:hanging="0" w:left="0"/>
-        <w:rPr>
-          <w:b/>
-          <w:bCs/>
-        </w:rPr>
+        <w:jc w:val="left"/>
+        <w:rPr/>
       </w:pPr>
       <w:r>
         <w:rPr>
@@ -21604,12 +20292,11 @@
     <w:p>
       <w:pPr>
         <w:pStyle w:val="Normal"/>
-        <w:spacing w:before="57" w:after="57"/>
+        <w:bidi w:val="0"/>
+        <w:spacing w:lineRule="auto" w:line="240" w:before="57" w:after="57"/>
         <w:ind w:hanging="0" w:left="0"/>
-        <w:rPr>
-          <w:b/>
-          <w:bCs/>
-        </w:rPr>
+        <w:jc w:val="left"/>
+        <w:rPr/>
       </w:pPr>
       <w:r>
         <w:rPr>
@@ -21651,12 +20338,11 @@
     <w:p>
       <w:pPr>
         <w:pStyle w:val="Normal"/>
-        <w:spacing w:before="57" w:after="57"/>
+        <w:bidi w:val="0"/>
+        <w:spacing w:lineRule="auto" w:line="240" w:before="57" w:after="57"/>
         <w:ind w:hanging="0" w:left="0"/>
-        <w:rPr>
-          <w:b/>
-          <w:bCs/>
-        </w:rPr>
+        <w:jc w:val="left"/>
+        <w:rPr/>
       </w:pPr>
       <w:r>
         <w:rPr>
@@ -21713,12 +20399,11 @@
     <w:p>
       <w:pPr>
         <w:pStyle w:val="Normal"/>
-        <w:spacing w:before="57" w:after="57"/>
+        <w:bidi w:val="0"/>
+        <w:spacing w:lineRule="auto" w:line="240" w:before="57" w:after="57"/>
         <w:ind w:hanging="0" w:left="0"/>
-        <w:rPr>
-          <w:b/>
-          <w:bCs/>
-        </w:rPr>
+        <w:jc w:val="left"/>
+        <w:rPr/>
       </w:pPr>
       <w:r>
         <w:rPr>
@@ -21774,12 +20459,11 @@
     <w:p>
       <w:pPr>
         <w:pStyle w:val="Normal"/>
-        <w:spacing w:before="57" w:after="57"/>
+        <w:bidi w:val="0"/>
+        <w:spacing w:lineRule="auto" w:line="240" w:before="57" w:after="57"/>
         <w:ind w:hanging="0" w:left="0"/>
-        <w:rPr>
-          <w:b/>
-          <w:bCs/>
-        </w:rPr>
+        <w:jc w:val="left"/>
+        <w:rPr/>
       </w:pPr>
       <w:r>
         <w:rPr>
@@ -21835,12 +20519,11 @@
     <w:p>
       <w:pPr>
         <w:pStyle w:val="Normal"/>
-        <w:spacing w:before="57" w:after="57"/>
+        <w:bidi w:val="0"/>
+        <w:spacing w:lineRule="auto" w:line="240" w:before="57" w:after="57"/>
         <w:ind w:hanging="0" w:left="0"/>
-        <w:rPr>
-          <w:b/>
-          <w:bCs/>
-        </w:rPr>
+        <w:jc w:val="left"/>
+        <w:rPr/>
       </w:pPr>
       <w:r>
         <w:rPr>
@@ -21944,12 +20627,11 @@
     <w:p>
       <w:pPr>
         <w:pStyle w:val="Normal"/>
-        <w:spacing w:before="57" w:after="57"/>
+        <w:bidi w:val="0"/>
+        <w:spacing w:lineRule="auto" w:line="240" w:before="57" w:after="57"/>
         <w:ind w:hanging="0" w:left="0"/>
-        <w:rPr>
-          <w:b/>
-          <w:bCs/>
-        </w:rPr>
+        <w:jc w:val="left"/>
+        <w:rPr/>
       </w:pPr>
       <w:r>
         <w:rPr>
@@ -21991,12 +20673,11 @@
     <w:p>
       <w:pPr>
         <w:pStyle w:val="Normal"/>
-        <w:spacing w:before="57" w:after="57"/>
+        <w:bidi w:val="0"/>
+        <w:spacing w:lineRule="auto" w:line="240" w:before="57" w:after="57"/>
         <w:ind w:hanging="0" w:left="0"/>
-        <w:rPr>
-          <w:b/>
-          <w:bCs/>
-        </w:rPr>
+        <w:jc w:val="left"/>
+        <w:rPr/>
       </w:pPr>
       <w:r>
         <w:rPr>
@@ -22038,8 +20719,10 @@
     <w:p>
       <w:pPr>
         <w:pStyle w:val="Normal"/>
-        <w:spacing w:before="57" w:after="57"/>
+        <w:bidi w:val="0"/>
+        <w:spacing w:lineRule="auto" w:line="240" w:before="57" w:after="57"/>
         <w:ind w:hanging="0" w:left="0"/>
+        <w:jc w:val="left"/>
         <w:rPr>
           <w:rFonts w:ascii="Andale Mono MT Std" w:hAnsi="Andale Mono MT Std"/>
           <w:b/>
@@ -22073,12 +20756,11 @@
     <w:p>
       <w:pPr>
         <w:pStyle w:val="Normal"/>
-        <w:spacing w:before="57" w:after="57"/>
+        <w:bidi w:val="0"/>
+        <w:spacing w:lineRule="auto" w:line="240" w:before="57" w:after="57"/>
         <w:ind w:hanging="0" w:left="0"/>
-        <w:rPr>
-          <w:b/>
-          <w:bCs/>
-        </w:rPr>
+        <w:jc w:val="left"/>
+        <w:rPr/>
       </w:pPr>
       <w:r>
         <w:rPr>
@@ -22134,12 +20816,11 @@
     <w:p>
       <w:pPr>
         <w:pStyle w:val="Normal"/>
-        <w:spacing w:before="57" w:after="57"/>
+        <w:bidi w:val="0"/>
+        <w:spacing w:lineRule="auto" w:line="240" w:before="57" w:after="57"/>
         <w:ind w:hanging="0" w:left="0"/>
-        <w:rPr>
-          <w:b/>
-          <w:bCs/>
-        </w:rPr>
+        <w:jc w:val="left"/>
+        <w:rPr/>
       </w:pPr>
       <w:r>
         <w:rPr>
@@ -22177,12 +20858,11 @@
     <w:p>
       <w:pPr>
         <w:pStyle w:val="Normal"/>
-        <w:spacing w:before="57" w:after="57"/>
+        <w:bidi w:val="0"/>
+        <w:spacing w:lineRule="auto" w:line="240" w:before="57" w:after="57"/>
         <w:ind w:hanging="0" w:left="0"/>
-        <w:rPr>
-          <w:b/>
-          <w:bCs/>
-        </w:rPr>
+        <w:jc w:val="left"/>
+        <w:rPr/>
       </w:pPr>
       <w:r>
         <w:rPr>
@@ -22220,12 +20900,11 @@
     <w:p>
       <w:pPr>
         <w:pStyle w:val="Normal"/>
-        <w:spacing w:before="57" w:after="57"/>
+        <w:bidi w:val="0"/>
+        <w:spacing w:lineRule="auto" w:line="240" w:before="57" w:after="57"/>
         <w:ind w:hanging="0" w:left="0"/>
-        <w:rPr>
-          <w:b/>
-          <w:bCs/>
-        </w:rPr>
+        <w:jc w:val="left"/>
+        <w:rPr/>
       </w:pPr>
       <w:r>
         <w:rPr>
@@ -22257,8 +20936,18 @@
           <w:sz w:val="14"/>
           <w:szCs w:val="14"/>
         </w:rPr>
-        <w:t>A..Za..z</w:t>
-      </w:r>
+        <w:t>A..Za..z0..9</w:t>
+      </w:r>
+    </w:p>
+    <w:p>
+      <w:pPr>
+        <w:pStyle w:val="Normal"/>
+        <w:bidi w:val="0"/>
+        <w:spacing w:lineRule="auto" w:line="240" w:before="57" w:after="57"/>
+        <w:ind w:hanging="0" w:left="0"/>
+        <w:jc w:val="left"/>
+        <w:rPr/>
+      </w:pPr>
       <w:r>
         <w:rPr>
           <w:rFonts w:ascii="Andale Mono MT Std" w:hAnsi="Andale Mono MT Std"/>
@@ -22273,14 +20962,19 @@
           <w:sz w:val="14"/>
           <w:szCs w:val="14"/>
         </w:rPr>
-        <w:t>0..9</w:t>
-      </w:r>
-    </w:p>
-    <w:p>
-      <w:pPr>
-        <w:pStyle w:val="Normal"/>
-        <w:spacing w:before="57" w:after="57"/>
+        <w:tab/>
+      </w:r>
+    </w:p>
+    <w:p>
+      <w:pPr>
+        <w:pStyle w:val="Normal"/>
+        <w:bidi w:val="0"/>
+        <w:spacing w:lineRule="auto" w:line="240" w:before="57" w:after="57"/>
         <w:ind w:hanging="0" w:left="0"/>
+        <w:jc w:val="left"/>
+        <w:rPr/>
+      </w:pPr>
+      <w:r>
         <w:rPr>
           <w:rFonts w:ascii="Andale Mono MT Std" w:hAnsi="Andale Mono MT Std"/>
           <w:b/>
@@ -22294,7 +20988,8 @@
           <w:sz w:val="14"/>
           <w:szCs w:val="14"/>
         </w:rPr>
-      </w:pPr>
+        <w:t xml:space="preserve"> </w:t>
+      </w:r>
       <w:r>
         <w:rPr>
           <w:rFonts w:ascii="Andale Mono MT Std" w:hAnsi="Andale Mono MT Std"/>
@@ -22309,18 +21004,21 @@
           <w:sz w:val="14"/>
           <w:szCs w:val="14"/>
         </w:rPr>
-        <w:tab/>
-      </w:r>
-    </w:p>
-    <w:p>
-      <w:pPr>
-        <w:pStyle w:val="Normal"/>
-        <w:spacing w:before="57" w:after="57"/>
+        <w:t>0x09 #\tab</w:t>
+        <w:tab/>
+        <w:tab/>
+        <w:t>character designators</w:t>
+        <w:tab/>
+      </w:r>
+    </w:p>
+    <w:p>
+      <w:pPr>
+        <w:pStyle w:val="Normal"/>
+        <w:bidi w:val="0"/>
+        <w:spacing w:lineRule="auto" w:line="240" w:before="57" w:after="57"/>
         <w:ind w:hanging="0" w:left="0"/>
-        <w:rPr>
-          <w:b/>
-          <w:bCs/>
-        </w:rPr>
+        <w:jc w:val="left"/>
+        <w:rPr/>
       </w:pPr>
       <w:r>
         <w:rPr>
@@ -22352,22 +21050,17 @@
           <w:sz w:val="14"/>
           <w:szCs w:val="14"/>
         </w:rPr>
-        <w:t>0x09 #\tab</w:t>
-        <w:tab/>
-        <w:tab/>
-        <w:t>character designators</w:t>
-        <w:tab/>
-      </w:r>
-    </w:p>
-    <w:p>
-      <w:pPr>
-        <w:pStyle w:val="Normal"/>
-        <w:spacing w:before="57" w:after="57"/>
+        <w:t xml:space="preserve">0x0a #\linefeed </w:t>
+      </w:r>
+    </w:p>
+    <w:p>
+      <w:pPr>
+        <w:pStyle w:val="Normal"/>
+        <w:bidi w:val="0"/>
+        <w:spacing w:lineRule="auto" w:line="240" w:before="57" w:after="57"/>
         <w:ind w:hanging="0" w:left="0"/>
-        <w:rPr>
-          <w:b/>
-          <w:bCs/>
-        </w:rPr>
+        <w:jc w:val="left"/>
+        <w:rPr/>
       </w:pPr>
       <w:r>
         <w:rPr>
@@ -22399,18 +21092,17 @@
           <w:sz w:val="14"/>
           <w:szCs w:val="14"/>
         </w:rPr>
-        <w:t xml:space="preserve">0x0a #\linefeed </w:t>
-      </w:r>
-    </w:p>
-    <w:p>
-      <w:pPr>
-        <w:pStyle w:val="Normal"/>
-        <w:spacing w:before="57" w:after="57"/>
+        <w:t xml:space="preserve">0x0c #\page                </w:t>
+      </w:r>
+    </w:p>
+    <w:p>
+      <w:pPr>
+        <w:pStyle w:val="Normal"/>
+        <w:bidi w:val="0"/>
+        <w:spacing w:lineRule="auto" w:line="240" w:before="57" w:after="57"/>
         <w:ind w:hanging="0" w:left="0"/>
-        <w:rPr>
-          <w:b/>
-          <w:bCs/>
-        </w:rPr>
+        <w:jc w:val="left"/>
+        <w:rPr/>
       </w:pPr>
       <w:r>
         <w:rPr>
@@ -22442,61 +21134,17 @@
           <w:sz w:val="14"/>
           <w:szCs w:val="14"/>
         </w:rPr>
-        <w:t xml:space="preserve">0x0c #\page                </w:t>
-      </w:r>
-    </w:p>
-    <w:p>
-      <w:pPr>
-        <w:pStyle w:val="Normal"/>
-        <w:spacing w:before="57" w:after="57"/>
+        <w:t xml:space="preserve">0x0d #\return            </w:t>
+      </w:r>
+    </w:p>
+    <w:p>
+      <w:pPr>
+        <w:pStyle w:val="Normal"/>
+        <w:bidi w:val="0"/>
+        <w:spacing w:lineRule="auto" w:line="240" w:before="57" w:after="57"/>
         <w:ind w:hanging="0" w:left="0"/>
-        <w:rPr>
-          <w:b/>
-          <w:bCs/>
-        </w:rPr>
-      </w:pPr>
-      <w:r>
-        <w:rPr>
-          <w:rFonts w:ascii="Andale Mono MT Std" w:hAnsi="Andale Mono MT Std"/>
-          <w:b/>
-          <w:bCs/>
-          <w:i w:val="false"/>
-          <w:iCs w:val="false"/>
-          <w:caps w:val="false"/>
-          <w:smallCaps w:val="false"/>
-          <w:color w:val="auto"/>
-          <w:spacing w:val="0"/>
-          <w:sz w:val="14"/>
-          <w:szCs w:val="14"/>
-        </w:rPr>
-        <w:t xml:space="preserve"> </w:t>
-      </w:r>
-      <w:r>
-        <w:rPr>
-          <w:rFonts w:ascii="Andale Mono MT Std" w:hAnsi="Andale Mono MT Std"/>
-          <w:b/>
-          <w:bCs/>
-          <w:i w:val="false"/>
-          <w:iCs w:val="false"/>
-          <w:caps w:val="false"/>
-          <w:smallCaps w:val="false"/>
-          <w:color w:val="auto"/>
-          <w:spacing w:val="0"/>
-          <w:sz w:val="14"/>
-          <w:szCs w:val="14"/>
-        </w:rPr>
-        <w:t xml:space="preserve">0x0d #\return            </w:t>
-      </w:r>
-    </w:p>
-    <w:p>
-      <w:pPr>
-        <w:pStyle w:val="Normal"/>
-        <w:spacing w:before="57" w:after="57"/>
-        <w:ind w:hanging="0" w:left="0"/>
-        <w:rPr>
-          <w:b/>
-          <w:bCs/>
-        </w:rPr>
+        <w:jc w:val="left"/>
+        <w:rPr/>
       </w:pPr>
       <w:r>
         <w:rPr>

</xml_diff>

<commit_message>
#1122 - project: utilities rename
</commit_message>
<xml_diff>
--- a/doc/refcards/mu-ref.docx
+++ b/doc/refcards/mu-ref.docx
@@ -3552,6 +3552,7 @@
           <w:sz w:val="16"/>
           <w:szCs w:val="16"/>
         </w:rPr>
+        <w:t xml:space="preserve">    </w:t>
       </w:r>
     </w:p>
     <w:p>
@@ -8635,6 +8636,8 @@
           <w:rFonts w:ascii="Georgia" w:hAnsi="Georgia"/>
           <w:b/>
           <w:bCs/>
+          <w:i/>
+          <w:iCs/>
           <w:sz w:val="16"/>
           <w:szCs w:val="16"/>
           <w:u w:val="none"/>
@@ -8784,6 +8787,21 @@
           <w:u w:val="none"/>
         </w:rPr>
         <w:t>list</w:t>
+      </w:r>
+    </w:p>
+    <w:p>
+      <w:pPr>
+        <w:pStyle w:val="Normal"/>
+        <w:rPr>
+          <w:sz w:val="16"/>
+          <w:szCs w:val="16"/>
+        </w:rPr>
+      </w:pPr>
+      <w:r>
+        <w:rPr>
+          <w:sz w:val="16"/>
+          <w:szCs w:val="16"/>
+        </w:rPr>
       </w:r>
     </w:p>
     <w:p>
@@ -13141,18 +13159,6 @@
           <w:sz w:val="16"/>
           <w:szCs w:val="16"/>
         </w:rPr>
-        <w:t xml:space="preserve">   </w:t>
-      </w:r>
-      <w:r>
-        <w:rPr>
-          <w:rFonts w:ascii="Georgia" w:hAnsi="Georgia"/>
-          <w:b/>
-          <w:bCs/>
-          <w:i/>
-          <w:iCs/>
-          <w:sz w:val="16"/>
-          <w:szCs w:val="16"/>
-        </w:rPr>
         <w:t>write</w:t>
       </w:r>
       <w:r>
@@ -13244,6 +13250,21 @@
           <w:szCs w:val="16"/>
         </w:rPr>
         <w:t>write with escape</w:t>
+      </w:r>
+    </w:p>
+    <w:p>
+      <w:pPr>
+        <w:pStyle w:val="Normal"/>
+        <w:rPr>
+          <w:sz w:val="16"/>
+          <w:szCs w:val="16"/>
+        </w:rPr>
+      </w:pPr>
+      <w:r>
+        <w:rPr>
+          <w:sz w:val="16"/>
+          <w:szCs w:val="16"/>
+        </w:rPr>
       </w:r>
     </w:p>
     <w:p>
@@ -16855,6 +16876,72 @@
     <w:p>
       <w:pPr>
         <w:pStyle w:val="Normal"/>
+        <w:rPr>
+          <w:rFonts w:ascii="Georgia" w:hAnsi="Georgia"/>
+          <w:b w:val="false"/>
+          <w:bCs w:val="false"/>
+          <w:sz w:val="14"/>
+          <w:szCs w:val="14"/>
+        </w:rPr>
+      </w:pPr>
+      <w:r>
+        <w:rPr>
+          <w:rFonts w:ascii="Georgia" w:hAnsi="Georgia"/>
+          <w:b w:val="false"/>
+          <w:bCs w:val="false"/>
+          <w:sz w:val="14"/>
+          <w:szCs w:val="14"/>
+        </w:rPr>
+      </w:r>
+    </w:p>
+    <w:p>
+      <w:pPr>
+        <w:pStyle w:val="Normal"/>
+        <w:ind w:hanging="0" w:left="2836"/>
+        <w:rPr>
+          <w:rFonts w:ascii="Georgia" w:hAnsi="Georgia"/>
+          <w:b w:val="false"/>
+          <w:bCs w:val="false"/>
+          <w:sz w:val="14"/>
+          <w:szCs w:val="14"/>
+        </w:rPr>
+      </w:pPr>
+      <w:r>
+        <w:rPr>
+          <w:rFonts w:ascii="Georgia" w:hAnsi="Georgia"/>
+          <w:b w:val="false"/>
+          <w:bCs w:val="false"/>
+          <w:sz w:val="14"/>
+          <w:szCs w:val="14"/>
+        </w:rPr>
+      </w:r>
+    </w:p>
+    <w:p>
+      <w:pPr>
+        <w:pStyle w:val="Normal"/>
+        <w:ind w:hanging="0" w:left="2836"/>
+        <w:rPr>
+          <w:rFonts w:ascii="Georgia" w:hAnsi="Georgia"/>
+          <w:b w:val="false"/>
+          <w:bCs w:val="false"/>
+          <w:sz w:val="14"/>
+          <w:szCs w:val="14"/>
+        </w:rPr>
+      </w:pPr>
+      <w:r>
+        <w:rPr>
+          <w:rFonts w:ascii="Georgia" w:hAnsi="Georgia"/>
+          <w:b w:val="false"/>
+          <w:bCs w:val="false"/>
+          <w:sz w:val="14"/>
+          <w:szCs w:val="14"/>
+        </w:rPr>
+      </w:r>
+    </w:p>
+    <w:p>
+      <w:pPr>
+        <w:pStyle w:val="Normal"/>
+        <w:ind w:hanging="0" w:left="2836"/>
         <w:rPr>
           <w:rFonts w:ascii="Georgia" w:hAnsi="Georgia"/>
           <w:b w:val="false"/>
@@ -18969,24 +19056,6 @@
     <w:p>
       <w:pPr>
         <w:pStyle w:val="Normal"/>
-        <w:ind w:hanging="0" w:left="709"/>
-        <w:rPr>
-          <w:rFonts w:ascii="Georgia" w:hAnsi="Georgia"/>
-          <w:sz w:val="14"/>
-          <w:szCs w:val="14"/>
-        </w:rPr>
-      </w:pPr>
-      <w:r>
-        <w:rPr>
-          <w:rFonts w:ascii="Georgia" w:hAnsi="Georgia"/>
-          <w:sz w:val="14"/>
-          <w:szCs w:val="14"/>
-        </w:rPr>
-      </w:r>
-    </w:p>
-    <w:p>
-      <w:pPr>
-        <w:pStyle w:val="Normal"/>
         <w:rPr>
           <w:rFonts w:ascii="Georgia" w:hAnsi="Georgia"/>
           <w:sz w:val="20"/>
@@ -19655,6 +19724,7 @@
         <w:t xml:space="preserve">()           </w:t>
         <w:tab/>
         <w:tab/>
+        <w:tab/>
         <w:t xml:space="preserve">empty </w:t>
       </w:r>
       <w:r>
@@ -20793,6 +20863,7 @@
           <w:szCs w:val="14"/>
         </w:rPr>
         <w:t>!$%&amp;*+-.</w:t>
+        <w:tab/>
         <w:tab/>
         <w:tab/>
       </w:r>

</xml_diff>

<commit_message>
#1118 - doc: better documentation of API
</commit_message>
<xml_diff>
--- a/doc/refcards/mu-ref.docx
+++ b/doc/refcards/mu-ref.docx
@@ -62,7 +62,7 @@
           <w:tab w:val="left" w:pos="4110" w:leader="none"/>
         </w:tabs>
         <w:suppressAutoHyphens w:val="true"/>
-        <w:overflowPunct w:val="true"/>
+        <w:overflowPunct w:val="false"/>
         <w:bidi w:val="0"/>
         <w:spacing w:before="0" w:after="0"/>
         <w:ind w:hanging="0" w:left="0" w:right="0"/>
@@ -2094,7 +2094,7 @@
         <w:pStyle w:val="Normal"/>
         <w:widowControl/>
         <w:suppressAutoHyphens w:val="true"/>
-        <w:overflowPunct w:val="true"/>
+        <w:overflowPunct w:val="false"/>
         <w:bidi w:val="0"/>
         <w:spacing w:before="0" w:after="0"/>
         <w:ind w:hanging="0" w:left="0" w:right="0"/>
@@ -5584,7 +5584,7 @@
         <w:pStyle w:val="Normal"/>
         <w:widowControl/>
         <w:suppressAutoHyphens w:val="true"/>
-        <w:overflowPunct w:val="true"/>
+        <w:overflowPunct w:val="false"/>
         <w:bidi w:val="0"/>
         <w:spacing w:before="0" w:after="0"/>
         <w:ind w:hanging="0" w:left="0" w:right="0"/>
@@ -17592,7 +17592,7 @@
           <w:sz w:val="12"/>
           <w:szCs w:val="12"/>
         </w:rPr>
-        <w:t xml:space="preserve">  </w:t>
+        <w:t xml:space="preserve">     </w:t>
       </w:r>
       <w:r>
         <w:rPr>
@@ -17722,15 +17722,847 @@
           <w:sz w:val="12"/>
           <w:szCs w:val="12"/>
         </w:rPr>
+        <w:t xml:space="preserve">     </w:t>
+      </w:r>
+      <w:r>
+        <w:rPr>
+          <w:rFonts w:ascii="Georgia" w:hAnsi="Georgia"/>
+          <w:b/>
+          <w:bCs/>
+          <w:i w:val="false"/>
+          <w:iCs w:val="false"/>
+          <w:sz w:val="12"/>
+          <w:szCs w:val="12"/>
+        </w:rPr>
+        <w:t>}</w:t>
+      </w:r>
+    </w:p>
+    <w:p>
+      <w:pPr>
+        <w:pStyle w:val="Normal"/>
+        <w:rPr>
+          <w:rFonts w:ascii="Georgia" w:hAnsi="Georgia"/>
+          <w:b w:val="false"/>
+          <w:bCs w:val="false"/>
+          <w:i/>
+          <w:iCs/>
+          <w:sz w:val="12"/>
+          <w:szCs w:val="12"/>
+        </w:rPr>
+      </w:pPr>
+      <w:r>
+        <w:rPr>
+          <w:rFonts w:ascii="Georgia" w:hAnsi="Georgia"/>
+          <w:b w:val="false"/>
+          <w:bCs w:val="false"/>
+          <w:i/>
+          <w:iCs/>
+          <w:sz w:val="12"/>
+          <w:szCs w:val="12"/>
+        </w:rPr>
+      </w:r>
+    </w:p>
+    <w:p>
+      <w:pPr>
+        <w:pStyle w:val="Normal"/>
+        <w:ind w:hanging="0" w:left="709"/>
+        <w:rPr>
+          <w:rFonts w:ascii="Georgia" w:hAnsi="Georgia"/>
+          <w:b w:val="false"/>
+          <w:bCs w:val="false"/>
+          <w:i/>
+          <w:iCs/>
+          <w:sz w:val="12"/>
+          <w:szCs w:val="12"/>
+        </w:rPr>
+      </w:pPr>
+      <w:r>
+        <w:rPr>
+          <w:rFonts w:ascii="Andale Mono MT Std" w:hAnsi="Andale Mono MT Std"/>
+          <w:b w:val="false"/>
+          <w:bCs w:val="false"/>
+          <w:i w:val="false"/>
+          <w:iCs w:val="false"/>
+          <w:sz w:val="12"/>
+          <w:szCs w:val="12"/>
+        </w:rPr>
         <w:t xml:space="preserve">  </w:t>
       </w:r>
       <w:r>
         <w:rPr>
-          <w:rFonts w:ascii="Georgia" w:hAnsi="Georgia"/>
-          <w:b/>
-          <w:bCs/>
-          <w:i w:val="false"/>
-          <w:iCs w:val="false"/>
+          <w:rFonts w:ascii="Andale Mono MT Std" w:hAnsi="Andale Mono MT Std"/>
+          <w:b w:val="false"/>
+          <w:bCs w:val="false"/>
+          <w:i w:val="false"/>
+          <w:iCs w:val="false"/>
+          <w:sz w:val="12"/>
+          <w:szCs w:val="12"/>
+        </w:rPr>
+        <w:t>use mu::{ Mu, Env, Config };</w:t>
+      </w:r>
+    </w:p>
+    <w:p>
+      <w:pPr>
+        <w:pStyle w:val="Normal"/>
+        <w:ind w:hanging="0" w:left="709"/>
+        <w:rPr>
+          <w:rFonts w:ascii="Georgia" w:hAnsi="Georgia"/>
+          <w:b w:val="false"/>
+          <w:bCs w:val="false"/>
+          <w:i/>
+          <w:iCs/>
+          <w:sz w:val="12"/>
+          <w:szCs w:val="12"/>
+        </w:rPr>
+      </w:pPr>
+      <w:r>
+        <w:rPr>
+          <w:rFonts w:ascii="Andale Mono MT Std" w:hAnsi="Andale Mono MT Std"/>
+          <w:b w:val="false"/>
+          <w:bCs w:val="false"/>
+          <w:i w:val="false"/>
+          <w:iCs w:val="false"/>
+          <w:sz w:val="12"/>
+          <w:szCs w:val="12"/>
+        </w:rPr>
+        <w:t xml:space="preserve">  </w:t>
+      </w:r>
+      <w:r>
+        <w:rPr>
+          <w:rFonts w:ascii="Andale Mono MT Std" w:hAnsi="Andale Mono MT Std"/>
+          <w:b w:val="false"/>
+          <w:bCs w:val="false"/>
+          <w:i w:val="false"/>
+          <w:iCs w:val="false"/>
+          <w:sz w:val="12"/>
+          <w:szCs w:val="12"/>
+        </w:rPr>
+        <w:t>use mu::{ Result, Tag, Exception, Condition };</w:t>
+      </w:r>
+    </w:p>
+    <w:p>
+      <w:pPr>
+        <w:pStyle w:val="Normal"/>
+        <w:rPr>
+          <w:rFonts w:ascii="Andale Mono MT Std" w:hAnsi="Andale Mono MT Std"/>
+          <w:b w:val="false"/>
+          <w:bCs w:val="false"/>
+          <w:sz w:val="12"/>
+          <w:szCs w:val="12"/>
+        </w:rPr>
+      </w:pPr>
+      <w:r>
+        <w:rPr>
+          <w:rFonts w:ascii="Andale Mono MT Std" w:hAnsi="Andale Mono MT Std"/>
+          <w:b w:val="false"/>
+          <w:bCs w:val="false"/>
+          <w:sz w:val="12"/>
+          <w:szCs w:val="12"/>
+        </w:rPr>
+      </w:r>
+    </w:p>
+    <w:p>
+      <w:pPr>
+        <w:pStyle w:val="Normal"/>
+        <w:ind w:hanging="0" w:left="709"/>
+        <w:rPr>
+          <w:rFonts w:ascii="Andale Mono MT Std" w:hAnsi="Andale Mono MT Std"/>
+        </w:rPr>
+      </w:pPr>
+      <w:r>
+        <w:rPr>
+          <w:rFonts w:ascii="Andale Mono MT Std" w:hAnsi="Andale Mono MT Std"/>
+          <w:b w:val="false"/>
+          <w:bCs w:val="false"/>
+          <w:i w:val="false"/>
+          <w:iCs w:val="false"/>
+          <w:sz w:val="12"/>
+          <w:szCs w:val="12"/>
+        </w:rPr>
+        <w:t xml:space="preserve">  </w:t>
+      </w:r>
+      <w:r>
+        <w:rPr>
+          <w:rFonts w:ascii="Andale Mono MT Std" w:hAnsi="Andale Mono MT Std"/>
+          <w:b w:val="false"/>
+          <w:bCs w:val="false"/>
+          <w:i w:val="false"/>
+          <w:iCs w:val="false"/>
+          <w:sz w:val="12"/>
+          <w:szCs w:val="12"/>
+        </w:rPr>
+        <w:t>impl Mu {</w:t>
+      </w:r>
+    </w:p>
+    <w:p>
+      <w:pPr>
+        <w:pStyle w:val="Normal"/>
+        <w:bidi w:val="0"/>
+        <w:ind w:hanging="0" w:left="709"/>
+        <w:rPr>
+          <w:rFonts w:ascii="Andale Mono MT Std" w:hAnsi="Andale Mono MT Std"/>
+        </w:rPr>
+      </w:pPr>
+      <w:r>
+        <w:rPr>
+          <w:rFonts w:ascii="Andale Mono MT Std" w:hAnsi="Andale Mono MT Std"/>
+          <w:b w:val="false"/>
+          <w:bCs w:val="false"/>
+          <w:i w:val="false"/>
+          <w:iCs w:val="false"/>
+          <w:sz w:val="12"/>
+          <w:szCs w:val="12"/>
+        </w:rPr>
+        <w:t xml:space="preserve">     </w:t>
+      </w:r>
+      <w:r>
+        <w:rPr>
+          <w:rFonts w:ascii="Andale Mono MT Std" w:hAnsi="Andale Mono MT Std"/>
+          <w:b w:val="false"/>
+          <w:bCs w:val="false"/>
+          <w:i w:val="false"/>
+          <w:iCs w:val="false"/>
+          <w:sz w:val="12"/>
+          <w:szCs w:val="12"/>
+        </w:rPr>
+        <w:t>fn compile(_: &amp;Env, _: Tag) → Result&lt;Tag&gt;</w:t>
+      </w:r>
+    </w:p>
+    <w:p>
+      <w:pPr>
+        <w:pStyle w:val="Normal"/>
+        <w:bidi w:val="0"/>
+        <w:ind w:hanging="0" w:left="709"/>
+        <w:rPr>
+          <w:rFonts w:ascii="Andale Mono MT Std" w:hAnsi="Andale Mono MT Std"/>
+        </w:rPr>
+      </w:pPr>
+      <w:r>
+        <w:rPr>
+          <w:rFonts w:ascii="Andale Mono MT Std" w:hAnsi="Andale Mono MT Std"/>
+          <w:b w:val="false"/>
+          <w:bCs w:val="false"/>
+          <w:i w:val="false"/>
+          <w:iCs w:val="false"/>
+          <w:sz w:val="12"/>
+          <w:szCs w:val="12"/>
+        </w:rPr>
+        <w:t xml:space="preserve">     </w:t>
+      </w:r>
+      <w:r>
+        <w:rPr>
+          <w:rFonts w:ascii="Andale Mono MT Std" w:hAnsi="Andale Mono MT Std"/>
+          <w:b w:val="false"/>
+          <w:bCs w:val="false"/>
+          <w:i w:val="false"/>
+          <w:iCs w:val="false"/>
+          <w:sz w:val="12"/>
+          <w:szCs w:val="12"/>
+        </w:rPr>
+        <w:t>fn config(_: Option&lt;String&gt;) → Config</w:t>
+      </w:r>
+    </w:p>
+    <w:p>
+      <w:pPr>
+        <w:pStyle w:val="Normal"/>
+        <w:bidi w:val="0"/>
+        <w:ind w:hanging="0" w:left="709"/>
+        <w:rPr>
+          <w:rFonts w:ascii="Andale Mono MT Std" w:hAnsi="Andale Mono MT Std"/>
+        </w:rPr>
+      </w:pPr>
+      <w:r>
+        <w:rPr>
+          <w:rFonts w:ascii="Andale Mono MT Std" w:hAnsi="Andale Mono MT Std"/>
+          <w:b w:val="false"/>
+          <w:bCs w:val="false"/>
+          <w:i w:val="false"/>
+          <w:iCs w:val="false"/>
+          <w:sz w:val="12"/>
+          <w:szCs w:val="12"/>
+        </w:rPr>
+        <w:t xml:space="preserve">     </w:t>
+      </w:r>
+      <w:r>
+        <w:rPr>
+          <w:rFonts w:ascii="Andale Mono MT Std" w:hAnsi="Andale Mono MT Std"/>
+          <w:b w:val="false"/>
+          <w:bCs w:val="false"/>
+          <w:i w:val="false"/>
+          <w:iCs w:val="false"/>
+          <w:sz w:val="12"/>
+          <w:szCs w:val="12"/>
+        </w:rPr>
+        <w:t>fn env(_: &amp;Config) → Env</w:t>
+      </w:r>
+    </w:p>
+    <w:p>
+      <w:pPr>
+        <w:pStyle w:val="Normal"/>
+        <w:bidi w:val="0"/>
+        <w:ind w:hanging="0" w:left="709"/>
+        <w:rPr>
+          <w:rFonts w:ascii="Andale Mono MT Std" w:hAnsi="Andale Mono MT Std"/>
+        </w:rPr>
+      </w:pPr>
+      <w:r>
+        <w:rPr>
+          <w:rFonts w:ascii="Andale Mono MT Std" w:hAnsi="Andale Mono MT Std"/>
+          <w:b w:val="false"/>
+          <w:bCs w:val="false"/>
+          <w:i w:val="false"/>
+          <w:iCs w:val="false"/>
+          <w:sz w:val="12"/>
+          <w:szCs w:val="12"/>
+        </w:rPr>
+        <w:t xml:space="preserve">     </w:t>
+      </w:r>
+      <w:r>
+        <w:rPr>
+          <w:rFonts w:ascii="Andale Mono MT Std" w:hAnsi="Andale Mono MT Std"/>
+          <w:b w:val="false"/>
+          <w:bCs w:val="false"/>
+          <w:i w:val="false"/>
+          <w:iCs w:val="false"/>
+          <w:sz w:val="12"/>
+          <w:szCs w:val="12"/>
+        </w:rPr>
+        <w:t>fn eq(_: Tag, _: Tag) → bool;</w:t>
+      </w:r>
+    </w:p>
+    <w:p>
+      <w:pPr>
+        <w:pStyle w:val="Normal"/>
+        <w:bidi w:val="0"/>
+        <w:ind w:hanging="0" w:left="709"/>
+        <w:rPr>
+          <w:rFonts w:ascii="Andale Mono MT Std" w:hAnsi="Andale Mono MT Std"/>
+        </w:rPr>
+      </w:pPr>
+      <w:r>
+        <w:rPr>
+          <w:rFonts w:ascii="Andale Mono MT Std" w:hAnsi="Andale Mono MT Std"/>
+          <w:b w:val="false"/>
+          <w:bCs w:val="false"/>
+          <w:i w:val="false"/>
+          <w:iCs w:val="false"/>
+          <w:sz w:val="12"/>
+          <w:szCs w:val="12"/>
+        </w:rPr>
+        <w:t xml:space="preserve">     </w:t>
+      </w:r>
+      <w:r>
+        <w:rPr>
+          <w:rFonts w:ascii="Andale Mono MT Std" w:hAnsi="Andale Mono MT Std"/>
+          <w:b w:val="false"/>
+          <w:bCs w:val="false"/>
+          <w:i w:val="false"/>
+          <w:iCs w:val="false"/>
+          <w:sz w:val="12"/>
+          <w:szCs w:val="12"/>
+        </w:rPr>
+        <w:t xml:space="preserve">fn err_out() → Tag  </w:t>
+      </w:r>
+    </w:p>
+    <w:p>
+      <w:pPr>
+        <w:pStyle w:val="Normal"/>
+        <w:bidi w:val="0"/>
+        <w:ind w:hanging="0" w:left="709"/>
+        <w:rPr>
+          <w:rFonts w:ascii="Andale Mono MT Std" w:hAnsi="Andale Mono MT Std"/>
+        </w:rPr>
+      </w:pPr>
+      <w:r>
+        <w:rPr>
+          <w:rFonts w:ascii="Andale Mono MT Std" w:hAnsi="Andale Mono MT Std"/>
+          <w:b w:val="false"/>
+          <w:bCs w:val="false"/>
+          <w:i w:val="false"/>
+          <w:iCs w:val="false"/>
+          <w:sz w:val="12"/>
+          <w:szCs w:val="12"/>
+        </w:rPr>
+        <w:t xml:space="preserve">     </w:t>
+      </w:r>
+      <w:r>
+        <w:rPr>
+          <w:rFonts w:ascii="Andale Mono MT Std" w:hAnsi="Andale Mono MT Std"/>
+          <w:b w:val="false"/>
+          <w:bCs w:val="false"/>
+          <w:i w:val="false"/>
+          <w:iCs w:val="false"/>
+          <w:sz w:val="12"/>
+          <w:szCs w:val="12"/>
+        </w:rPr>
+        <w:t>fn eval_str(_: &amp;Env, _: &amp;str) → Result&lt;Tag&gt;</w:t>
+      </w:r>
+    </w:p>
+    <w:p>
+      <w:pPr>
+        <w:pStyle w:val="Normal"/>
+        <w:bidi w:val="0"/>
+        <w:ind w:hanging="0" w:left="709"/>
+        <w:rPr>
+          <w:rFonts w:ascii="Andale Mono MT Std" w:hAnsi="Andale Mono MT Std"/>
+        </w:rPr>
+      </w:pPr>
+      <w:r>
+        <w:rPr>
+          <w:rFonts w:ascii="Andale Mono MT Std" w:hAnsi="Andale Mono MT Std"/>
+          <w:b w:val="false"/>
+          <w:bCs w:val="false"/>
+          <w:i w:val="false"/>
+          <w:iCs w:val="false"/>
+          <w:sz w:val="12"/>
+          <w:szCs w:val="12"/>
+        </w:rPr>
+        <w:t xml:space="preserve">     </w:t>
+      </w:r>
+      <w:r>
+        <w:rPr>
+          <w:rFonts w:ascii="Andale Mono MT Std" w:hAnsi="Andale Mono MT Std"/>
+          <w:b w:val="false"/>
+          <w:bCs w:val="false"/>
+          <w:i w:val="false"/>
+          <w:iCs w:val="false"/>
+          <w:sz w:val="12"/>
+          <w:szCs w:val="12"/>
+        </w:rPr>
+        <w:t>fn eval(_: &amp;Env, _: Tag) → Result&lt;Tag&gt;</w:t>
+      </w:r>
+    </w:p>
+    <w:p>
+      <w:pPr>
+        <w:pStyle w:val="Normal"/>
+        <w:bidi w:val="0"/>
+        <w:ind w:hanging="0" w:left="709"/>
+        <w:rPr>
+          <w:rFonts w:ascii="Andale Mono MT Std" w:hAnsi="Andale Mono MT Std"/>
+        </w:rPr>
+      </w:pPr>
+      <w:r>
+        <w:rPr>
+          <w:rFonts w:ascii="Andale Mono MT Std" w:hAnsi="Andale Mono MT Std"/>
+          <w:b w:val="false"/>
+          <w:bCs w:val="false"/>
+          <w:i w:val="false"/>
+          <w:iCs w:val="false"/>
+          <w:sz w:val="12"/>
+          <w:szCs w:val="12"/>
+        </w:rPr>
+        <w:t xml:space="preserve">     </w:t>
+      </w:r>
+      <w:r>
+        <w:rPr>
+          <w:rFonts w:ascii="Andale Mono MT Std" w:hAnsi="Andale Mono MT Std"/>
+          <w:b w:val="false"/>
+          <w:bCs w:val="false"/>
+          <w:i w:val="false"/>
+          <w:iCs w:val="false"/>
+          <w:sz w:val="12"/>
+          <w:szCs w:val="12"/>
+        </w:rPr>
+        <w:t xml:space="preserve">fn exception_string(_: &amp;Env, _: Exception) → String  </w:t>
+      </w:r>
+    </w:p>
+    <w:p>
+      <w:pPr>
+        <w:pStyle w:val="Normal"/>
+        <w:bidi w:val="0"/>
+        <w:ind w:hanging="0" w:left="709"/>
+        <w:rPr>
+          <w:rFonts w:ascii="Andale Mono MT Std" w:hAnsi="Andale Mono MT Std"/>
+        </w:rPr>
+      </w:pPr>
+      <w:r>
+        <w:rPr>
+          <w:rFonts w:ascii="Andale Mono MT Std" w:hAnsi="Andale Mono MT Std"/>
+          <w:b w:val="false"/>
+          <w:bCs w:val="false"/>
+          <w:i w:val="false"/>
+          <w:iCs w:val="false"/>
+          <w:sz w:val="12"/>
+          <w:szCs w:val="12"/>
+        </w:rPr>
+        <w:t xml:space="preserve">     </w:t>
+      </w:r>
+      <w:r>
+        <w:rPr>
+          <w:rFonts w:ascii="Andale Mono MT Std" w:hAnsi="Andale Mono MT Std"/>
+          <w:b w:val="false"/>
+          <w:bCs w:val="false"/>
+          <w:i w:val="false"/>
+          <w:iCs w:val="false"/>
+          <w:sz w:val="12"/>
+          <w:szCs w:val="12"/>
+        </w:rPr>
+        <w:t>fn load(_: &amp;Env, _: &amp;str) → Result&lt;bool&gt;</w:t>
+      </w:r>
+    </w:p>
+    <w:p>
+      <w:pPr>
+        <w:pStyle w:val="Normal"/>
+        <w:bidi w:val="0"/>
+        <w:ind w:hanging="0" w:left="709"/>
+        <w:rPr>
+          <w:rFonts w:ascii="Andale Mono MT Std" w:hAnsi="Andale Mono MT Std"/>
+        </w:rPr>
+      </w:pPr>
+      <w:r>
+        <w:rPr>
+          <w:rFonts w:ascii="Andale Mono MT Std" w:hAnsi="Andale Mono MT Std"/>
+          <w:b w:val="false"/>
+          <w:bCs w:val="false"/>
+          <w:i w:val="false"/>
+          <w:iCs w:val="false"/>
+          <w:sz w:val="12"/>
+          <w:szCs w:val="12"/>
+        </w:rPr>
+        <w:t xml:space="preserve">     </w:t>
+      </w:r>
+      <w:r>
+        <w:rPr>
+          <w:rFonts w:ascii="Andale Mono MT Std" w:hAnsi="Andale Mono MT Std"/>
+          <w:b w:val="false"/>
+          <w:bCs w:val="false"/>
+          <w:i w:val="false"/>
+          <w:iCs w:val="false"/>
+          <w:sz w:val="12"/>
+          <w:szCs w:val="12"/>
+        </w:rPr>
+        <w:t>fn env(_: &amp;Config) → Env</w:t>
+      </w:r>
+    </w:p>
+    <w:p>
+      <w:pPr>
+        <w:pStyle w:val="Normal"/>
+        <w:bidi w:val="0"/>
+        <w:ind w:hanging="0" w:left="709"/>
+        <w:rPr>
+          <w:rFonts w:ascii="Andale Mono MT Std" w:hAnsi="Andale Mono MT Std"/>
+        </w:rPr>
+      </w:pPr>
+      <w:r>
+        <w:rPr>
+          <w:rFonts w:ascii="Andale Mono MT Std" w:hAnsi="Andale Mono MT Std"/>
+          <w:b w:val="false"/>
+          <w:bCs w:val="false"/>
+          <w:i w:val="false"/>
+          <w:iCs w:val="false"/>
+          <w:sz w:val="12"/>
+          <w:szCs w:val="12"/>
+        </w:rPr>
+        <w:t xml:space="preserve">     </w:t>
+      </w:r>
+      <w:r>
+        <w:rPr>
+          <w:rFonts w:ascii="Andale Mono MT Std" w:hAnsi="Andale Mono MT Std"/>
+          <w:b w:val="false"/>
+          <w:bCs w:val="false"/>
+          <w:i w:val="false"/>
+          <w:iCs w:val="false"/>
+          <w:sz w:val="12"/>
+          <w:szCs w:val="12"/>
+        </w:rPr>
+        <w:t>fn nil() → Tag</w:t>
+      </w:r>
+    </w:p>
+    <w:p>
+      <w:pPr>
+        <w:pStyle w:val="Normal"/>
+        <w:bidi w:val="0"/>
+        <w:ind w:hanging="0" w:left="709"/>
+        <w:rPr>
+          <w:rFonts w:ascii="Andale Mono MT Std" w:hAnsi="Andale Mono MT Std"/>
+        </w:rPr>
+      </w:pPr>
+      <w:r>
+        <w:rPr>
+          <w:rFonts w:ascii="Andale Mono MT Std" w:hAnsi="Andale Mono MT Std"/>
+          <w:b w:val="false"/>
+          <w:bCs w:val="false"/>
+          <w:i w:val="false"/>
+          <w:iCs w:val="false"/>
+          <w:sz w:val="12"/>
+          <w:szCs w:val="12"/>
+        </w:rPr>
+        <w:t xml:space="preserve">     </w:t>
+      </w:r>
+      <w:r>
+        <w:rPr>
+          <w:rFonts w:ascii="Andale Mono MT Std" w:hAnsi="Andale Mono MT Std"/>
+          <w:b w:val="false"/>
+          <w:bCs w:val="false"/>
+          <w:i w:val="false"/>
+          <w:iCs w:val="false"/>
+          <w:sz w:val="12"/>
+          <w:szCs w:val="12"/>
+        </w:rPr>
+        <w:t>fn read_str(_: &amp;Env, _: &amp;str) → Result&lt;Tag&gt;</w:t>
+      </w:r>
+    </w:p>
+    <w:p>
+      <w:pPr>
+        <w:pStyle w:val="Normal"/>
+        <w:bidi w:val="0"/>
+        <w:ind w:hanging="0" w:left="709"/>
+        <w:rPr>
+          <w:rFonts w:ascii="Andale Mono MT Std" w:hAnsi="Andale Mono MT Std"/>
+        </w:rPr>
+      </w:pPr>
+      <w:r>
+        <w:rPr>
+          <w:rFonts w:ascii="Andale Mono MT Std" w:hAnsi="Andale Mono MT Std"/>
+          <w:b w:val="false"/>
+          <w:bCs w:val="false"/>
+          <w:i w:val="false"/>
+          <w:iCs w:val="false"/>
+          <w:sz w:val="12"/>
+          <w:szCs w:val="12"/>
+        </w:rPr>
+        <w:t xml:space="preserve">     </w:t>
+      </w:r>
+      <w:r>
+        <w:rPr>
+          <w:rFonts w:ascii="Andale Mono MT Std" w:hAnsi="Andale Mono MT Std"/>
+          <w:b w:val="false"/>
+          <w:bCs w:val="false"/>
+          <w:i w:val="false"/>
+          <w:iCs w:val="false"/>
+          <w:sz w:val="12"/>
+          <w:szCs w:val="12"/>
+        </w:rPr>
+        <w:t>fn read(_: &amp;Env, _: Tag, _: bool, _: Tag) → Result&lt;Tag&gt;</w:t>
+      </w:r>
+    </w:p>
+    <w:p>
+      <w:pPr>
+        <w:pStyle w:val="Normal"/>
+        <w:bidi w:val="0"/>
+        <w:ind w:hanging="0" w:left="709"/>
+        <w:rPr>
+          <w:rFonts w:ascii="Andale Mono MT Std" w:hAnsi="Andale Mono MT Std"/>
+        </w:rPr>
+      </w:pPr>
+      <w:r>
+        <w:rPr>
+          <w:rFonts w:ascii="Andale Mono MT Std" w:hAnsi="Andale Mono MT Std"/>
+          <w:b w:val="false"/>
+          <w:bCs w:val="false"/>
+          <w:i w:val="false"/>
+          <w:iCs w:val="false"/>
+          <w:sz w:val="12"/>
+          <w:szCs w:val="12"/>
+        </w:rPr>
+        <w:t xml:space="preserve">     </w:t>
+      </w:r>
+      <w:r>
+        <w:rPr>
+          <w:rFonts w:ascii="Andale Mono MT Std" w:hAnsi="Andale Mono MT Std"/>
+          <w:b w:val="false"/>
+          <w:bCs w:val="false"/>
+          <w:i w:val="false"/>
+          <w:iCs w:val="false"/>
+          <w:sz w:val="12"/>
+          <w:szCs w:val="12"/>
+        </w:rPr>
+        <w:t>fn std_in() → Tag</w:t>
+      </w:r>
+    </w:p>
+    <w:p>
+      <w:pPr>
+        <w:pStyle w:val="Normal"/>
+        <w:bidi w:val="0"/>
+        <w:ind w:hanging="0" w:left="709"/>
+        <w:rPr>
+          <w:rFonts w:ascii="Andale Mono MT Std" w:hAnsi="Andale Mono MT Std"/>
+        </w:rPr>
+      </w:pPr>
+      <w:r>
+        <w:rPr>
+          <w:rFonts w:ascii="Andale Mono MT Std" w:hAnsi="Andale Mono MT Std"/>
+          <w:b w:val="false"/>
+          <w:bCs w:val="false"/>
+          <w:i w:val="false"/>
+          <w:iCs w:val="false"/>
+          <w:sz w:val="12"/>
+          <w:szCs w:val="12"/>
+        </w:rPr>
+        <w:t xml:space="preserve">     </w:t>
+      </w:r>
+      <w:r>
+        <w:rPr>
+          <w:rFonts w:ascii="Andale Mono MT Std" w:hAnsi="Andale Mono MT Std"/>
+          <w:b w:val="false"/>
+          <w:bCs w:val="false"/>
+          <w:i w:val="false"/>
+          <w:iCs w:val="false"/>
+          <w:sz w:val="12"/>
+          <w:szCs w:val="12"/>
+        </w:rPr>
+        <w:t>fn std_out() → Tag</w:t>
+      </w:r>
+    </w:p>
+    <w:p>
+      <w:pPr>
+        <w:pStyle w:val="Normal"/>
+        <w:bidi w:val="0"/>
+        <w:ind w:hanging="0" w:left="709"/>
+        <w:rPr>
+          <w:rFonts w:ascii="Andale Mono MT Std" w:hAnsi="Andale Mono MT Std"/>
+        </w:rPr>
+      </w:pPr>
+      <w:r>
+        <w:rPr>
+          <w:rFonts w:ascii="Andale Mono MT Std" w:hAnsi="Andale Mono MT Std"/>
+          <w:b w:val="false"/>
+          <w:bCs w:val="false"/>
+          <w:i w:val="false"/>
+          <w:iCs w:val="false"/>
+          <w:sz w:val="12"/>
+          <w:szCs w:val="12"/>
+        </w:rPr>
+        <w:t xml:space="preserve">     </w:t>
+      </w:r>
+      <w:r>
+        <w:rPr>
+          <w:rFonts w:ascii="Andale Mono MT Std" w:hAnsi="Andale Mono MT Std"/>
+          <w:b w:val="false"/>
+          <w:bCs w:val="false"/>
+          <w:i w:val="false"/>
+          <w:iCs w:val="false"/>
+          <w:sz w:val="12"/>
+          <w:szCs w:val="12"/>
+        </w:rPr>
+        <w:t>fn version() → &amp;str</w:t>
+      </w:r>
+    </w:p>
+    <w:p>
+      <w:pPr>
+        <w:pStyle w:val="Normal"/>
+        <w:bidi w:val="0"/>
+        <w:ind w:hanging="0" w:left="709"/>
+        <w:rPr>
+          <w:rFonts w:ascii="Andale Mono MT Std" w:hAnsi="Andale Mono MT Std"/>
+        </w:rPr>
+      </w:pPr>
+      <w:r>
+        <w:rPr>
+          <w:rFonts w:ascii="Andale Mono MT Std" w:hAnsi="Andale Mono MT Std"/>
+          <w:b w:val="false"/>
+          <w:bCs w:val="false"/>
+          <w:i w:val="false"/>
+          <w:iCs w:val="false"/>
+          <w:sz w:val="12"/>
+          <w:szCs w:val="12"/>
+        </w:rPr>
+        <w:t xml:space="preserve">     </w:t>
+      </w:r>
+      <w:r>
+        <w:rPr>
+          <w:rFonts w:ascii="Andale Mono MT Std" w:hAnsi="Andale Mono MT Std"/>
+          <w:b w:val="false"/>
+          <w:bCs w:val="false"/>
+          <w:i w:val="false"/>
+          <w:iCs w:val="false"/>
+          <w:sz w:val="12"/>
+          <w:szCs w:val="12"/>
+        </w:rPr>
+        <w:t>fn write_str(_: &amp;Env, _: &amp;str, _: Tag) → Result&lt;()&gt;</w:t>
+      </w:r>
+    </w:p>
+    <w:p>
+      <w:pPr>
+        <w:pStyle w:val="Normal"/>
+        <w:bidi w:val="0"/>
+        <w:ind w:hanging="0" w:left="709"/>
+        <w:rPr>
+          <w:rFonts w:ascii="Andale Mono MT Std" w:hAnsi="Andale Mono MT Std"/>
+        </w:rPr>
+      </w:pPr>
+      <w:r>
+        <w:rPr>
+          <w:rFonts w:ascii="Andale Mono MT Std" w:hAnsi="Andale Mono MT Std"/>
+          <w:b w:val="false"/>
+          <w:bCs w:val="false"/>
+          <w:i w:val="false"/>
+          <w:iCs w:val="false"/>
+          <w:sz w:val="12"/>
+          <w:szCs w:val="12"/>
+        </w:rPr>
+        <w:t xml:space="preserve">     </w:t>
+      </w:r>
+      <w:r>
+        <w:rPr>
+          <w:rFonts w:ascii="Andale Mono MT Std" w:hAnsi="Andale Mono MT Std"/>
+          <w:b w:val="false"/>
+          <w:bCs w:val="false"/>
+          <w:i w:val="false"/>
+          <w:iCs w:val="false"/>
+          <w:sz w:val="12"/>
+          <w:szCs w:val="12"/>
+        </w:rPr>
+        <w:t>fn write_to_string(_: &amp;Env, _: Tag, _: bool) → String</w:t>
+      </w:r>
+    </w:p>
+    <w:p>
+      <w:pPr>
+        <w:pStyle w:val="Normal"/>
+        <w:bidi w:val="0"/>
+        <w:ind w:hanging="0" w:left="709"/>
+        <w:rPr>
+          <w:rFonts w:ascii="Andale Mono MT Std" w:hAnsi="Andale Mono MT Std"/>
+        </w:rPr>
+      </w:pPr>
+      <w:r>
+        <w:rPr>
+          <w:rFonts w:ascii="Andale Mono MT Std" w:hAnsi="Andale Mono MT Std"/>
+          <w:b w:val="false"/>
+          <w:bCs w:val="false"/>
+          <w:i w:val="false"/>
+          <w:iCs w:val="false"/>
+          <w:sz w:val="12"/>
+          <w:szCs w:val="12"/>
+        </w:rPr>
+        <w:t xml:space="preserve">     </w:t>
+      </w:r>
+      <w:r>
+        <w:rPr>
+          <w:rFonts w:ascii="Andale Mono MT Std" w:hAnsi="Andale Mono MT Std"/>
+          <w:b w:val="false"/>
+          <w:bCs w:val="false"/>
+          <w:i w:val="false"/>
+          <w:iCs w:val="false"/>
+          <w:sz w:val="12"/>
+          <w:szCs w:val="12"/>
+        </w:rPr>
+        <w:t>fn write(_: &amp;Env, _: Tag, _: bool, _: Tag) → Result&lt;()&gt;</w:t>
+      </w:r>
+    </w:p>
+    <w:p>
+      <w:pPr>
+        <w:pStyle w:val="Normal"/>
+        <w:ind w:hanging="0" w:left="709"/>
+        <w:rPr>
+          <w:rFonts w:ascii="Andale Mono MT Std" w:hAnsi="Andale Mono MT Std"/>
+        </w:rPr>
+      </w:pPr>
+      <w:r>
+        <w:rPr>
+          <w:rFonts w:ascii="Andale Mono MT Std" w:hAnsi="Andale Mono MT Std"/>
+          <w:b/>
+          <w:bCs/>
+          <w:sz w:val="16"/>
+          <w:szCs w:val="16"/>
+        </w:rPr>
+        <w:t xml:space="preserve">  </w:t>
+      </w:r>
+      <w:r>
+        <w:rPr>
+          <w:rFonts w:ascii="Andale Mono MT Std" w:hAnsi="Andale Mono MT Std"/>
+          <w:b w:val="false"/>
+          <w:bCs w:val="false"/>
           <w:sz w:val="12"/>
           <w:szCs w:val="12"/>
         </w:rPr>
@@ -17742,153 +18574,103 @@
         <w:pStyle w:val="Normal"/>
         <w:rPr>
           <w:rFonts w:ascii="Georgia" w:hAnsi="Georgia"/>
-          <w:b w:val="false"/>
-          <w:bCs w:val="false"/>
-          <w:i/>
-          <w:iCs/>
-          <w:sz w:val="12"/>
-          <w:szCs w:val="12"/>
-        </w:rPr>
-      </w:pPr>
-      <w:r>
-        <w:rPr>
-          <w:rFonts w:ascii="Georgia" w:hAnsi="Georgia"/>
-          <w:b w:val="false"/>
-          <w:bCs w:val="false"/>
-          <w:i/>
-          <w:iCs/>
-          <w:sz w:val="12"/>
-          <w:szCs w:val="12"/>
-        </w:rPr>
-      </w:r>
-    </w:p>
-    <w:p>
-      <w:pPr>
-        <w:pStyle w:val="Normal"/>
-        <w:rPr>
-          <w:rFonts w:ascii="Georgia" w:hAnsi="Georgia"/>
-          <w:b w:val="false"/>
-          <w:bCs w:val="false"/>
-          <w:i/>
-          <w:iCs/>
-          <w:sz w:val="12"/>
-          <w:szCs w:val="12"/>
-        </w:rPr>
-      </w:pPr>
-      <w:r>
-        <w:rPr>
-          <w:rFonts w:ascii="Andale Mono MT Std" w:hAnsi="Andale Mono MT Std"/>
-          <w:b w:val="false"/>
-          <w:bCs w:val="false"/>
-          <w:i w:val="false"/>
-          <w:iCs w:val="false"/>
-          <w:sz w:val="12"/>
-          <w:szCs w:val="12"/>
-        </w:rPr>
-        <w:t xml:space="preserve">  </w:t>
-      </w:r>
-      <w:r>
-        <w:rPr>
-          <w:rFonts w:ascii="Andale Mono MT Std" w:hAnsi="Andale Mono MT Std"/>
-          <w:b w:val="false"/>
-          <w:bCs w:val="false"/>
-          <w:i w:val="false"/>
-          <w:iCs w:val="false"/>
-          <w:sz w:val="12"/>
-          <w:szCs w:val="12"/>
-        </w:rPr>
-        <w:t>use mu::{ Mu, Env, Config };</w:t>
-      </w:r>
-    </w:p>
-    <w:p>
-      <w:pPr>
-        <w:pStyle w:val="Normal"/>
-        <w:rPr>
-          <w:rFonts w:ascii="Georgia" w:hAnsi="Georgia"/>
-          <w:b w:val="false"/>
-          <w:bCs w:val="false"/>
-          <w:i/>
-          <w:iCs/>
-          <w:sz w:val="12"/>
-          <w:szCs w:val="12"/>
-        </w:rPr>
-      </w:pPr>
-      <w:r>
-        <w:rPr>
-          <w:rFonts w:ascii="Andale Mono MT Std" w:hAnsi="Andale Mono MT Std"/>
-          <w:b w:val="false"/>
-          <w:bCs w:val="false"/>
-          <w:i w:val="false"/>
-          <w:iCs w:val="false"/>
-          <w:sz w:val="12"/>
-          <w:szCs w:val="12"/>
-        </w:rPr>
-        <w:t xml:space="preserve">  </w:t>
-      </w:r>
-      <w:r>
-        <w:rPr>
-          <w:rFonts w:ascii="Andale Mono MT Std" w:hAnsi="Andale Mono MT Std"/>
-          <w:b w:val="false"/>
-          <w:bCs w:val="false"/>
-          <w:i w:val="false"/>
-          <w:iCs w:val="false"/>
-          <w:sz w:val="12"/>
-          <w:szCs w:val="12"/>
-        </w:rPr>
-        <w:t>use mu::{ Result, Tag, Exception, Condition };</w:t>
-      </w:r>
-    </w:p>
-    <w:p>
-      <w:pPr>
-        <w:pStyle w:val="Normal"/>
-        <w:rPr>
-          <w:rFonts w:ascii="Andale Mono MT Std" w:hAnsi="Andale Mono MT Std"/>
-          <w:b w:val="false"/>
-          <w:bCs w:val="false"/>
-          <w:sz w:val="12"/>
-          <w:szCs w:val="12"/>
-        </w:rPr>
-      </w:pPr>
-      <w:r>
-        <w:rPr>
-          <w:rFonts w:ascii="Andale Mono MT Std" w:hAnsi="Andale Mono MT Std"/>
-          <w:b w:val="false"/>
-          <w:bCs w:val="false"/>
-          <w:sz w:val="12"/>
-          <w:szCs w:val="12"/>
-        </w:rPr>
-      </w:r>
-    </w:p>
-    <w:p>
-      <w:pPr>
-        <w:pStyle w:val="Normal"/>
-        <w:rPr>
-          <w:rFonts w:ascii="Andale Mono MT Std" w:hAnsi="Andale Mono MT Std"/>
-        </w:rPr>
-      </w:pPr>
-      <w:r>
-        <w:rPr>
-          <w:rFonts w:ascii="Andale Mono MT Std" w:hAnsi="Andale Mono MT Std"/>
-          <w:b w:val="false"/>
-          <w:bCs w:val="false"/>
-          <w:i w:val="false"/>
-          <w:iCs w:val="false"/>
-          <w:sz w:val="12"/>
-          <w:szCs w:val="12"/>
-        </w:rPr>
-        <w:t xml:space="preserve">  </w:t>
-      </w:r>
-      <w:r>
-        <w:rPr>
-          <w:rFonts w:ascii="Andale Mono MT Std" w:hAnsi="Andale Mono MT Std"/>
-          <w:b w:val="false"/>
-          <w:bCs w:val="false"/>
-          <w:i w:val="false"/>
-          <w:iCs w:val="false"/>
-          <w:sz w:val="12"/>
-          <w:szCs w:val="12"/>
-        </w:rPr>
-        <w:t>impl Mu {</w:t>
+          <w:b/>
+          <w:bCs/>
+          <w:sz w:val="12"/>
+          <w:szCs w:val="12"/>
+        </w:rPr>
+      </w:pPr>
+      <w:r>
+        <w:rPr>
+          <w:rFonts w:ascii="Georgia" w:hAnsi="Georgia"/>
+          <w:b/>
+          <w:bCs/>
+          <w:sz w:val="12"/>
+          <w:szCs w:val="12"/>
+        </w:rPr>
+      </w:r>
+    </w:p>
+    <w:p>
+      <w:pPr>
+        <w:pStyle w:val="Normal"/>
+        <w:ind w:hanging="0" w:left="0"/>
+        <w:rPr>
+          <w:rFonts w:ascii="Georgia" w:hAnsi="Georgia"/>
+          <w:b/>
+          <w:bCs/>
+          <w:sz w:val="16"/>
+          <w:szCs w:val="16"/>
+        </w:rPr>
+      </w:pPr>
+      <w:r>
+        <w:rPr>
+          <w:rFonts w:ascii="Georgia" w:hAnsi="Georgia"/>
+          <w:b/>
+          <w:bCs/>
+          <w:sz w:val="16"/>
+          <w:szCs w:val="16"/>
+        </w:rPr>
+        <w:t xml:space="preserve">    </w:t>
+      </w:r>
+      <w:r>
+        <w:rPr>
+          <w:rFonts w:ascii="Andale Mono MT Std" w:hAnsi="Andale Mono MT Std"/>
+          <w:b/>
+          <w:bCs/>
+          <w:i w:val="false"/>
+          <w:iCs w:val="false"/>
+          <w:sz w:val="12"/>
+          <w:szCs w:val="12"/>
+        </w:rPr>
+        <w:t>compile(</w:t>
+      </w:r>
+      <w:r>
+        <w:rPr>
+          <w:rFonts w:ascii="Andale Mono MT Std" w:hAnsi="Andale Mono MT Std"/>
+          <w:b/>
+          <w:bCs/>
+          <w:i w:val="false"/>
+          <w:iCs w:val="false"/>
+          <w:sz w:val="12"/>
+          <w:szCs w:val="12"/>
+        </w:rPr>
+        <w:t>env</w:t>
+      </w:r>
+      <w:r>
+        <w:rPr>
+          <w:rFonts w:ascii="Andale Mono MT Std" w:hAnsi="Andale Mono MT Std"/>
+          <w:b/>
+          <w:bCs/>
+          <w:i w:val="false"/>
+          <w:iCs w:val="false"/>
+          <w:sz w:val="12"/>
+          <w:szCs w:val="12"/>
+        </w:rPr>
+        <w:t xml:space="preserve">: &amp;Env, </w:t>
+      </w:r>
+      <w:r>
+        <w:rPr>
+          <w:rFonts w:ascii="Andale Mono MT Std" w:hAnsi="Andale Mono MT Std"/>
+          <w:b/>
+          <w:bCs/>
+          <w:i w:val="false"/>
+          <w:iCs w:val="false"/>
+          <w:sz w:val="12"/>
+          <w:szCs w:val="12"/>
+        </w:rPr>
+        <w:t>form</w:t>
+      </w:r>
+      <w:r>
+        <w:rPr>
+          <w:rFonts w:ascii="Andale Mono MT Std" w:hAnsi="Andale Mono MT Std"/>
+          <w:b/>
+          <w:bCs/>
+          <w:i w:val="false"/>
+          <w:iCs w:val="false"/>
+          <w:sz w:val="12"/>
+          <w:szCs w:val="12"/>
+        </w:rPr>
+        <w:t>: Tag) → Result&lt;Tag&gt;</w:t>
       </w:r>
     </w:p>
     <w:p>
@@ -17897,14 +18679,15 @@
         <w:bidi w:val="0"/>
         <w:ind w:hanging="0" w:left="0"/>
         <w:rPr>
-          <w:rFonts w:ascii="Andale Mono MT Std" w:hAnsi="Andale Mono MT Std"/>
-        </w:rPr>
-      </w:pPr>
-      <w:r>
-        <w:rPr>
-          <w:rFonts w:ascii="Andale Mono MT Std" w:hAnsi="Andale Mono MT Std"/>
-          <w:b w:val="false"/>
-          <w:bCs w:val="false"/>
+          <w:b/>
+          <w:bCs/>
+        </w:rPr>
+      </w:pPr>
+      <w:r>
+        <w:rPr>
+          <w:rFonts w:ascii="Andale Mono MT Std" w:hAnsi="Andale Mono MT Std"/>
+          <w:b/>
+          <w:bCs/>
           <w:i w:val="false"/>
           <w:iCs w:val="false"/>
           <w:sz w:val="12"/>
@@ -17915,14 +18698,38 @@
       <w:r>
         <w:rPr>
           <w:rFonts w:ascii="Andale Mono MT Std" w:hAnsi="Andale Mono MT Std"/>
-          <w:b w:val="false"/>
-          <w:bCs w:val="false"/>
-          <w:i w:val="false"/>
-          <w:iCs w:val="false"/>
-          <w:sz w:val="12"/>
-          <w:szCs w:val="12"/>
-        </w:rPr>
-        <w:t>fn compile(_: &amp;Env, _: Tag) → Result&lt;Tag&gt;</w:t>
+          <w:b/>
+          <w:bCs/>
+          <w:i w:val="false"/>
+          <w:iCs w:val="false"/>
+          <w:sz w:val="12"/>
+          <w:szCs w:val="12"/>
+        </w:rPr>
+        <w:t>config(</w:t>
+      </w:r>
+      <w:r>
+        <w:rPr>
+          <w:rFonts w:ascii="Andale Mono MT Std" w:hAnsi="Andale Mono MT Std"/>
+          <w:b/>
+          <w:bCs/>
+          <w:i w:val="false"/>
+          <w:iCs w:val="false"/>
+          <w:sz w:val="12"/>
+          <w:szCs w:val="12"/>
+        </w:rPr>
+        <w:t>opt</w:t>
+      </w:r>
+      <w:r>
+        <w:rPr>
+          <w:rFonts w:ascii="Andale Mono MT Std" w:hAnsi="Andale Mono MT Std"/>
+          <w:b/>
+          <w:bCs/>
+          <w:i w:val="false"/>
+          <w:iCs w:val="false"/>
+          <w:sz w:val="12"/>
+          <w:szCs w:val="12"/>
+        </w:rPr>
+        <w:t>: Option&lt;String&gt;) → Config</w:t>
       </w:r>
     </w:p>
     <w:p>
@@ -17931,14 +18738,15 @@
         <w:bidi w:val="0"/>
         <w:ind w:hanging="0" w:left="0"/>
         <w:rPr>
-          <w:rFonts w:ascii="Andale Mono MT Std" w:hAnsi="Andale Mono MT Std"/>
-        </w:rPr>
-      </w:pPr>
-      <w:r>
-        <w:rPr>
-          <w:rFonts w:ascii="Andale Mono MT Std" w:hAnsi="Andale Mono MT Std"/>
-          <w:b w:val="false"/>
-          <w:bCs w:val="false"/>
+          <w:b/>
+          <w:bCs/>
+        </w:rPr>
+      </w:pPr>
+      <w:r>
+        <w:rPr>
+          <w:rFonts w:ascii="Andale Mono MT Std" w:hAnsi="Andale Mono MT Std"/>
+          <w:b/>
+          <w:bCs/>
           <w:i w:val="false"/>
           <w:iCs w:val="false"/>
           <w:sz w:val="12"/>
@@ -17949,14 +18757,38 @@
       <w:r>
         <w:rPr>
           <w:rFonts w:ascii="Andale Mono MT Std" w:hAnsi="Andale Mono MT Std"/>
-          <w:b w:val="false"/>
-          <w:bCs w:val="false"/>
-          <w:i w:val="false"/>
-          <w:iCs w:val="false"/>
-          <w:sz w:val="12"/>
-          <w:szCs w:val="12"/>
-        </w:rPr>
-        <w:t>fn config(_: Option&lt;String&gt;) → Config</w:t>
+          <w:b/>
+          <w:bCs/>
+          <w:i w:val="false"/>
+          <w:iCs w:val="false"/>
+          <w:sz w:val="12"/>
+          <w:szCs w:val="12"/>
+        </w:rPr>
+        <w:t>env(</w:t>
+      </w:r>
+      <w:r>
+        <w:rPr>
+          <w:rFonts w:ascii="Andale Mono MT Std" w:hAnsi="Andale Mono MT Std"/>
+          <w:b/>
+          <w:bCs/>
+          <w:i w:val="false"/>
+          <w:iCs w:val="false"/>
+          <w:sz w:val="12"/>
+          <w:szCs w:val="12"/>
+        </w:rPr>
+        <w:t>config</w:t>
+      </w:r>
+      <w:r>
+        <w:rPr>
+          <w:rFonts w:ascii="Andale Mono MT Std" w:hAnsi="Andale Mono MT Std"/>
+          <w:b/>
+          <w:bCs/>
+          <w:i w:val="false"/>
+          <w:iCs w:val="false"/>
+          <w:sz w:val="12"/>
+          <w:szCs w:val="12"/>
+        </w:rPr>
+        <w:t>: &amp;Config) → Env</w:t>
       </w:r>
     </w:p>
     <w:p>
@@ -17965,14 +18797,15 @@
         <w:bidi w:val="0"/>
         <w:ind w:hanging="0" w:left="0"/>
         <w:rPr>
-          <w:rFonts w:ascii="Andale Mono MT Std" w:hAnsi="Andale Mono MT Std"/>
-        </w:rPr>
-      </w:pPr>
-      <w:r>
-        <w:rPr>
-          <w:rFonts w:ascii="Andale Mono MT Std" w:hAnsi="Andale Mono MT Std"/>
-          <w:b w:val="false"/>
-          <w:bCs w:val="false"/>
+          <w:b/>
+          <w:bCs/>
+        </w:rPr>
+      </w:pPr>
+      <w:r>
+        <w:rPr>
+          <w:rFonts w:ascii="Andale Mono MT Std" w:hAnsi="Andale Mono MT Std"/>
+          <w:b/>
+          <w:bCs/>
           <w:i w:val="false"/>
           <w:iCs w:val="false"/>
           <w:sz w:val="12"/>
@@ -17983,14 +18816,62 @@
       <w:r>
         <w:rPr>
           <w:rFonts w:ascii="Andale Mono MT Std" w:hAnsi="Andale Mono MT Std"/>
-          <w:b w:val="false"/>
-          <w:bCs w:val="false"/>
-          <w:i w:val="false"/>
-          <w:iCs w:val="false"/>
-          <w:sz w:val="12"/>
-          <w:szCs w:val="12"/>
-        </w:rPr>
-        <w:t>fn env(_: &amp;Config) → Env</w:t>
+          <w:b/>
+          <w:bCs/>
+          <w:i w:val="false"/>
+          <w:iCs w:val="false"/>
+          <w:sz w:val="12"/>
+          <w:szCs w:val="12"/>
+        </w:rPr>
+        <w:t>eq(</w:t>
+      </w:r>
+      <w:r>
+        <w:rPr>
+          <w:rFonts w:ascii="Andale Mono MT Std" w:hAnsi="Andale Mono MT Std"/>
+          <w:b/>
+          <w:bCs/>
+          <w:i w:val="false"/>
+          <w:iCs w:val="false"/>
+          <w:sz w:val="12"/>
+          <w:szCs w:val="12"/>
+        </w:rPr>
+        <w:t>form</w:t>
+      </w:r>
+      <w:r>
+        <w:rPr>
+          <w:rFonts w:ascii="Andale Mono MT Std" w:hAnsi="Andale Mono MT Std"/>
+          <w:b/>
+          <w:bCs/>
+          <w:i w:val="false"/>
+          <w:iCs w:val="false"/>
+          <w:sz w:val="12"/>
+          <w:szCs w:val="12"/>
+        </w:rPr>
+        <w:t xml:space="preserve">: Tag, </w:t>
+      </w:r>
+      <w:r>
+        <w:rPr>
+          <w:rFonts w:ascii="Andale Mono MT Std" w:hAnsi="Andale Mono MT Std"/>
+          <w:b/>
+          <w:bCs/>
+          <w:i w:val="false"/>
+          <w:iCs w:val="false"/>
+          <w:sz w:val="12"/>
+          <w:szCs w:val="12"/>
+        </w:rPr>
+        <w:t>form1:</w:t>
+      </w:r>
+      <w:r>
+        <w:rPr>
+          <w:rFonts w:ascii="Andale Mono MT Std" w:hAnsi="Andale Mono MT Std"/>
+          <w:b/>
+          <w:bCs/>
+          <w:i w:val="false"/>
+          <w:iCs w:val="false"/>
+          <w:sz w:val="12"/>
+          <w:szCs w:val="12"/>
+        </w:rPr>
+        <w:t xml:space="preserve"> Tag) → bool;</w:t>
       </w:r>
     </w:p>
     <w:p>
@@ -17999,14 +18880,15 @@
         <w:bidi w:val="0"/>
         <w:ind w:hanging="0" w:left="0"/>
         <w:rPr>
-          <w:rFonts w:ascii="Andale Mono MT Std" w:hAnsi="Andale Mono MT Std"/>
-        </w:rPr>
-      </w:pPr>
-      <w:r>
-        <w:rPr>
-          <w:rFonts w:ascii="Andale Mono MT Std" w:hAnsi="Andale Mono MT Std"/>
-          <w:b w:val="false"/>
-          <w:bCs w:val="false"/>
+          <w:b/>
+          <w:bCs/>
+        </w:rPr>
+      </w:pPr>
+      <w:r>
+        <w:rPr>
+          <w:rFonts w:ascii="Andale Mono MT Std" w:hAnsi="Andale Mono MT Std"/>
+          <w:b/>
+          <w:bCs/>
           <w:i w:val="false"/>
           <w:iCs w:val="false"/>
           <w:sz w:val="12"/>
@@ -18017,14 +18899,14 @@
       <w:r>
         <w:rPr>
           <w:rFonts w:ascii="Andale Mono MT Std" w:hAnsi="Andale Mono MT Std"/>
-          <w:b w:val="false"/>
-          <w:bCs w:val="false"/>
-          <w:i w:val="false"/>
-          <w:iCs w:val="false"/>
-          <w:sz w:val="12"/>
-          <w:szCs w:val="12"/>
-        </w:rPr>
-        <w:t>fn eq(_: Tag, _: Tag) → bool;</w:t>
+          <w:b/>
+          <w:bCs/>
+          <w:i w:val="false"/>
+          <w:iCs w:val="false"/>
+          <w:sz w:val="12"/>
+          <w:szCs w:val="12"/>
+        </w:rPr>
+        <w:t xml:space="preserve">err_out() → Tag  </w:t>
       </w:r>
     </w:p>
     <w:p>
@@ -18033,14 +18915,15 @@
         <w:bidi w:val="0"/>
         <w:ind w:hanging="0" w:left="0"/>
         <w:rPr>
-          <w:rFonts w:ascii="Andale Mono MT Std" w:hAnsi="Andale Mono MT Std"/>
-        </w:rPr>
-      </w:pPr>
-      <w:r>
-        <w:rPr>
-          <w:rFonts w:ascii="Andale Mono MT Std" w:hAnsi="Andale Mono MT Std"/>
-          <w:b w:val="false"/>
-          <w:bCs w:val="false"/>
+          <w:b/>
+          <w:bCs/>
+        </w:rPr>
+      </w:pPr>
+      <w:r>
+        <w:rPr>
+          <w:rFonts w:ascii="Andale Mono MT Std" w:hAnsi="Andale Mono MT Std"/>
+          <w:b/>
+          <w:bCs/>
           <w:i w:val="false"/>
           <w:iCs w:val="false"/>
           <w:sz w:val="12"/>
@@ -18051,14 +18934,62 @@
       <w:r>
         <w:rPr>
           <w:rFonts w:ascii="Andale Mono MT Std" w:hAnsi="Andale Mono MT Std"/>
-          <w:b w:val="false"/>
-          <w:bCs w:val="false"/>
-          <w:i w:val="false"/>
-          <w:iCs w:val="false"/>
-          <w:sz w:val="12"/>
-          <w:szCs w:val="12"/>
-        </w:rPr>
-        <w:t xml:space="preserve">fn err_out() → Tag  </w:t>
+          <w:b/>
+          <w:bCs/>
+          <w:i w:val="false"/>
+          <w:iCs w:val="false"/>
+          <w:sz w:val="12"/>
+          <w:szCs w:val="12"/>
+        </w:rPr>
+        <w:t>eval_str(</w:t>
+      </w:r>
+      <w:r>
+        <w:rPr>
+          <w:rFonts w:ascii="Andale Mono MT Std" w:hAnsi="Andale Mono MT Std"/>
+          <w:b/>
+          <w:bCs/>
+          <w:i w:val="false"/>
+          <w:iCs w:val="false"/>
+          <w:sz w:val="12"/>
+          <w:szCs w:val="12"/>
+        </w:rPr>
+        <w:t>env</w:t>
+      </w:r>
+      <w:r>
+        <w:rPr>
+          <w:rFonts w:ascii="Andale Mono MT Std" w:hAnsi="Andale Mono MT Std"/>
+          <w:b/>
+          <w:bCs/>
+          <w:i w:val="false"/>
+          <w:iCs w:val="false"/>
+          <w:sz w:val="12"/>
+          <w:szCs w:val="12"/>
+        </w:rPr>
+        <w:t xml:space="preserve">: &amp;Env, </w:t>
+      </w:r>
+      <w:r>
+        <w:rPr>
+          <w:rFonts w:ascii="Andale Mono MT Std" w:hAnsi="Andale Mono MT Std"/>
+          <w:b/>
+          <w:bCs/>
+          <w:i w:val="false"/>
+          <w:iCs w:val="false"/>
+          <w:sz w:val="12"/>
+          <w:szCs w:val="12"/>
+        </w:rPr>
+        <w:t>form</w:t>
+      </w:r>
+      <w:r>
+        <w:rPr>
+          <w:rFonts w:ascii="Andale Mono MT Std" w:hAnsi="Andale Mono MT Std"/>
+          <w:b/>
+          <w:bCs/>
+          <w:i w:val="false"/>
+          <w:iCs w:val="false"/>
+          <w:sz w:val="12"/>
+          <w:szCs w:val="12"/>
+        </w:rPr>
+        <w:t>: &amp;str) → Result&lt;Tag&gt;</w:t>
       </w:r>
     </w:p>
     <w:p>
@@ -18067,14 +18998,15 @@
         <w:bidi w:val="0"/>
         <w:ind w:hanging="0" w:left="0"/>
         <w:rPr>
-          <w:rFonts w:ascii="Andale Mono MT Std" w:hAnsi="Andale Mono MT Std"/>
-        </w:rPr>
-      </w:pPr>
-      <w:r>
-        <w:rPr>
-          <w:rFonts w:ascii="Andale Mono MT Std" w:hAnsi="Andale Mono MT Std"/>
-          <w:b w:val="false"/>
-          <w:bCs w:val="false"/>
+          <w:b/>
+          <w:bCs/>
+        </w:rPr>
+      </w:pPr>
+      <w:r>
+        <w:rPr>
+          <w:rFonts w:ascii="Andale Mono MT Std" w:hAnsi="Andale Mono MT Std"/>
+          <w:b/>
+          <w:bCs/>
           <w:i w:val="false"/>
           <w:iCs w:val="false"/>
           <w:sz w:val="12"/>
@@ -18085,14 +19017,62 @@
       <w:r>
         <w:rPr>
           <w:rFonts w:ascii="Andale Mono MT Std" w:hAnsi="Andale Mono MT Std"/>
-          <w:b w:val="false"/>
-          <w:bCs w:val="false"/>
-          <w:i w:val="false"/>
-          <w:iCs w:val="false"/>
-          <w:sz w:val="12"/>
-          <w:szCs w:val="12"/>
-        </w:rPr>
-        <w:t>fn eval_str(_: &amp;Env, _: &amp;str) → Result&lt;Tag&gt;</w:t>
+          <w:b/>
+          <w:bCs/>
+          <w:i w:val="false"/>
+          <w:iCs w:val="false"/>
+          <w:sz w:val="12"/>
+          <w:szCs w:val="12"/>
+        </w:rPr>
+        <w:t>eval(</w:t>
+      </w:r>
+      <w:r>
+        <w:rPr>
+          <w:rFonts w:ascii="Andale Mono MT Std" w:hAnsi="Andale Mono MT Std"/>
+          <w:b/>
+          <w:bCs/>
+          <w:i w:val="false"/>
+          <w:iCs w:val="false"/>
+          <w:sz w:val="12"/>
+          <w:szCs w:val="12"/>
+        </w:rPr>
+        <w:t>env</w:t>
+      </w:r>
+      <w:r>
+        <w:rPr>
+          <w:rFonts w:ascii="Andale Mono MT Std" w:hAnsi="Andale Mono MT Std"/>
+          <w:b/>
+          <w:bCs/>
+          <w:i w:val="false"/>
+          <w:iCs w:val="false"/>
+          <w:sz w:val="12"/>
+          <w:szCs w:val="12"/>
+        </w:rPr>
+        <w:t xml:space="preserve">: &amp;Env, </w:t>
+      </w:r>
+      <w:r>
+        <w:rPr>
+          <w:rFonts w:ascii="Andale Mono MT Std" w:hAnsi="Andale Mono MT Std"/>
+          <w:b/>
+          <w:bCs/>
+          <w:i w:val="false"/>
+          <w:iCs w:val="false"/>
+          <w:sz w:val="12"/>
+          <w:szCs w:val="12"/>
+        </w:rPr>
+        <w:t>form</w:t>
+      </w:r>
+      <w:r>
+        <w:rPr>
+          <w:rFonts w:ascii="Andale Mono MT Std" w:hAnsi="Andale Mono MT Std"/>
+          <w:b/>
+          <w:bCs/>
+          <w:i w:val="false"/>
+          <w:iCs w:val="false"/>
+          <w:sz w:val="12"/>
+          <w:szCs w:val="12"/>
+        </w:rPr>
+        <w:t>: Tag) → Result&lt;Tag&gt;</w:t>
       </w:r>
     </w:p>
     <w:p>
@@ -18101,14 +19081,15 @@
         <w:bidi w:val="0"/>
         <w:ind w:hanging="0" w:left="0"/>
         <w:rPr>
-          <w:rFonts w:ascii="Andale Mono MT Std" w:hAnsi="Andale Mono MT Std"/>
-        </w:rPr>
-      </w:pPr>
-      <w:r>
-        <w:rPr>
-          <w:rFonts w:ascii="Andale Mono MT Std" w:hAnsi="Andale Mono MT Std"/>
-          <w:b w:val="false"/>
-          <w:bCs w:val="false"/>
+          <w:b/>
+          <w:bCs/>
+        </w:rPr>
+      </w:pPr>
+      <w:r>
+        <w:rPr>
+          <w:rFonts w:ascii="Andale Mono MT Std" w:hAnsi="Andale Mono MT Std"/>
+          <w:b/>
+          <w:bCs/>
           <w:i w:val="false"/>
           <w:iCs w:val="false"/>
           <w:sz w:val="12"/>
@@ -18119,14 +19100,62 @@
       <w:r>
         <w:rPr>
           <w:rFonts w:ascii="Andale Mono MT Std" w:hAnsi="Andale Mono MT Std"/>
-          <w:b w:val="false"/>
-          <w:bCs w:val="false"/>
-          <w:i w:val="false"/>
-          <w:iCs w:val="false"/>
-          <w:sz w:val="12"/>
-          <w:szCs w:val="12"/>
-        </w:rPr>
-        <w:t>fn eval(_: &amp;Env, _: Tag) → Result&lt;Tag&gt;</w:t>
+          <w:b/>
+          <w:bCs/>
+          <w:i w:val="false"/>
+          <w:iCs w:val="false"/>
+          <w:sz w:val="12"/>
+          <w:szCs w:val="12"/>
+        </w:rPr>
+        <w:t>exception_string(</w:t>
+      </w:r>
+      <w:r>
+        <w:rPr>
+          <w:rFonts w:ascii="Andale Mono MT Std" w:hAnsi="Andale Mono MT Std"/>
+          <w:b/>
+          <w:bCs/>
+          <w:i w:val="false"/>
+          <w:iCs w:val="false"/>
+          <w:sz w:val="12"/>
+          <w:szCs w:val="12"/>
+        </w:rPr>
+        <w:t>env</w:t>
+      </w:r>
+      <w:r>
+        <w:rPr>
+          <w:rFonts w:ascii="Andale Mono MT Std" w:hAnsi="Andale Mono MT Std"/>
+          <w:b/>
+          <w:bCs/>
+          <w:i w:val="false"/>
+          <w:iCs w:val="false"/>
+          <w:sz w:val="12"/>
+          <w:szCs w:val="12"/>
+        </w:rPr>
+        <w:t xml:space="preserve">: &amp;Env, </w:t>
+      </w:r>
+      <w:r>
+        <w:rPr>
+          <w:rFonts w:ascii="Andale Mono MT Std" w:hAnsi="Andale Mono MT Std"/>
+          <w:b/>
+          <w:bCs/>
+          <w:i w:val="false"/>
+          <w:iCs w:val="false"/>
+          <w:sz w:val="12"/>
+          <w:szCs w:val="12"/>
+        </w:rPr>
+        <w:t>ex</w:t>
+      </w:r>
+      <w:r>
+        <w:rPr>
+          <w:rFonts w:ascii="Andale Mono MT Std" w:hAnsi="Andale Mono MT Std"/>
+          <w:b/>
+          <w:bCs/>
+          <w:i w:val="false"/>
+          <w:iCs w:val="false"/>
+          <w:sz w:val="12"/>
+          <w:szCs w:val="12"/>
+        </w:rPr>
+        <w:t xml:space="preserve">: Exception) → String  </w:t>
       </w:r>
     </w:p>
     <w:p>
@@ -18135,14 +19164,15 @@
         <w:bidi w:val="0"/>
         <w:ind w:hanging="0" w:left="0"/>
         <w:rPr>
-          <w:rFonts w:ascii="Andale Mono MT Std" w:hAnsi="Andale Mono MT Std"/>
-        </w:rPr>
-      </w:pPr>
-      <w:r>
-        <w:rPr>
-          <w:rFonts w:ascii="Andale Mono MT Std" w:hAnsi="Andale Mono MT Std"/>
-          <w:b w:val="false"/>
-          <w:bCs w:val="false"/>
+          <w:b/>
+          <w:bCs/>
+        </w:rPr>
+      </w:pPr>
+      <w:r>
+        <w:rPr>
+          <w:rFonts w:ascii="Andale Mono MT Std" w:hAnsi="Andale Mono MT Std"/>
+          <w:b/>
+          <w:bCs/>
           <w:i w:val="false"/>
           <w:iCs w:val="false"/>
           <w:sz w:val="12"/>
@@ -18153,14 +19183,62 @@
       <w:r>
         <w:rPr>
           <w:rFonts w:ascii="Andale Mono MT Std" w:hAnsi="Andale Mono MT Std"/>
-          <w:b w:val="false"/>
-          <w:bCs w:val="false"/>
-          <w:i w:val="false"/>
-          <w:iCs w:val="false"/>
-          <w:sz w:val="12"/>
-          <w:szCs w:val="12"/>
-        </w:rPr>
-        <w:t xml:space="preserve">fn exception_string(_: &amp;Env, _: Exception) → String  </w:t>
+          <w:b/>
+          <w:bCs/>
+          <w:i w:val="false"/>
+          <w:iCs w:val="false"/>
+          <w:sz w:val="12"/>
+          <w:szCs w:val="12"/>
+        </w:rPr>
+        <w:t>load(</w:t>
+      </w:r>
+      <w:r>
+        <w:rPr>
+          <w:rFonts w:ascii="Andale Mono MT Std" w:hAnsi="Andale Mono MT Std"/>
+          <w:b/>
+          <w:bCs/>
+          <w:i w:val="false"/>
+          <w:iCs w:val="false"/>
+          <w:sz w:val="12"/>
+          <w:szCs w:val="12"/>
+        </w:rPr>
+        <w:t>env</w:t>
+      </w:r>
+      <w:r>
+        <w:rPr>
+          <w:rFonts w:ascii="Andale Mono MT Std" w:hAnsi="Andale Mono MT Std"/>
+          <w:b/>
+          <w:bCs/>
+          <w:i w:val="false"/>
+          <w:iCs w:val="false"/>
+          <w:sz w:val="12"/>
+          <w:szCs w:val="12"/>
+        </w:rPr>
+        <w:t xml:space="preserve">: &amp;Env, </w:t>
+      </w:r>
+      <w:r>
+        <w:rPr>
+          <w:rFonts w:ascii="Andale Mono MT Std" w:hAnsi="Andale Mono MT Std"/>
+          <w:b/>
+          <w:bCs/>
+          <w:i w:val="false"/>
+          <w:iCs w:val="false"/>
+          <w:sz w:val="12"/>
+          <w:szCs w:val="12"/>
+        </w:rPr>
+        <w:t>path</w:t>
+      </w:r>
+      <w:r>
+        <w:rPr>
+          <w:rFonts w:ascii="Andale Mono MT Std" w:hAnsi="Andale Mono MT Std"/>
+          <w:b/>
+          <w:bCs/>
+          <w:i w:val="false"/>
+          <w:iCs w:val="false"/>
+          <w:sz w:val="12"/>
+          <w:szCs w:val="12"/>
+        </w:rPr>
+        <w:t>: &amp;str) → Result&lt;bool&gt;</w:t>
       </w:r>
     </w:p>
     <w:p>
@@ -18169,14 +19247,15 @@
         <w:bidi w:val="0"/>
         <w:ind w:hanging="0" w:left="0"/>
         <w:rPr>
-          <w:rFonts w:ascii="Andale Mono MT Std" w:hAnsi="Andale Mono MT Std"/>
-        </w:rPr>
-      </w:pPr>
-      <w:r>
-        <w:rPr>
-          <w:rFonts w:ascii="Andale Mono MT Std" w:hAnsi="Andale Mono MT Std"/>
-          <w:b w:val="false"/>
-          <w:bCs w:val="false"/>
+          <w:b/>
+          <w:bCs/>
+        </w:rPr>
+      </w:pPr>
+      <w:r>
+        <w:rPr>
+          <w:rFonts w:ascii="Andale Mono MT Std" w:hAnsi="Andale Mono MT Std"/>
+          <w:b/>
+          <w:bCs/>
           <w:i w:val="false"/>
           <w:iCs w:val="false"/>
           <w:sz w:val="12"/>
@@ -18187,14 +19266,38 @@
       <w:r>
         <w:rPr>
           <w:rFonts w:ascii="Andale Mono MT Std" w:hAnsi="Andale Mono MT Std"/>
-          <w:b w:val="false"/>
-          <w:bCs w:val="false"/>
-          <w:i w:val="false"/>
-          <w:iCs w:val="false"/>
-          <w:sz w:val="12"/>
-          <w:szCs w:val="12"/>
-        </w:rPr>
-        <w:t>fn load(_: &amp;Env, _: &amp;str) → Result&lt;bool&gt;</w:t>
+          <w:b/>
+          <w:bCs/>
+          <w:i w:val="false"/>
+          <w:iCs w:val="false"/>
+          <w:sz w:val="12"/>
+          <w:szCs w:val="12"/>
+        </w:rPr>
+        <w:t>env(</w:t>
+      </w:r>
+      <w:r>
+        <w:rPr>
+          <w:rFonts w:ascii="Andale Mono MT Std" w:hAnsi="Andale Mono MT Std"/>
+          <w:b/>
+          <w:bCs/>
+          <w:i w:val="false"/>
+          <w:iCs w:val="false"/>
+          <w:sz w:val="12"/>
+          <w:szCs w:val="12"/>
+        </w:rPr>
+        <w:t>config</w:t>
+      </w:r>
+      <w:r>
+        <w:rPr>
+          <w:rFonts w:ascii="Andale Mono MT Std" w:hAnsi="Andale Mono MT Std"/>
+          <w:b/>
+          <w:bCs/>
+          <w:i w:val="false"/>
+          <w:iCs w:val="false"/>
+          <w:sz w:val="12"/>
+          <w:szCs w:val="12"/>
+        </w:rPr>
+        <w:t>: &amp;Config) → Env</w:t>
       </w:r>
     </w:p>
     <w:p>
@@ -18203,14 +19306,15 @@
         <w:bidi w:val="0"/>
         <w:ind w:hanging="0" w:left="0"/>
         <w:rPr>
-          <w:rFonts w:ascii="Andale Mono MT Std" w:hAnsi="Andale Mono MT Std"/>
-        </w:rPr>
-      </w:pPr>
-      <w:r>
-        <w:rPr>
-          <w:rFonts w:ascii="Andale Mono MT Std" w:hAnsi="Andale Mono MT Std"/>
-          <w:b w:val="false"/>
-          <w:bCs w:val="false"/>
+          <w:b/>
+          <w:bCs/>
+        </w:rPr>
+      </w:pPr>
+      <w:r>
+        <w:rPr>
+          <w:rFonts w:ascii="Andale Mono MT Std" w:hAnsi="Andale Mono MT Std"/>
+          <w:b/>
+          <w:bCs/>
           <w:i w:val="false"/>
           <w:iCs w:val="false"/>
           <w:sz w:val="12"/>
@@ -18221,14 +19325,14 @@
       <w:r>
         <w:rPr>
           <w:rFonts w:ascii="Andale Mono MT Std" w:hAnsi="Andale Mono MT Std"/>
-          <w:b w:val="false"/>
-          <w:bCs w:val="false"/>
-          <w:i w:val="false"/>
-          <w:iCs w:val="false"/>
-          <w:sz w:val="12"/>
-          <w:szCs w:val="12"/>
-        </w:rPr>
-        <w:t>fn env(_: &amp;Config) → Env</w:t>
+          <w:b/>
+          <w:bCs/>
+          <w:i w:val="false"/>
+          <w:iCs w:val="false"/>
+          <w:sz w:val="12"/>
+          <w:szCs w:val="12"/>
+        </w:rPr>
+        <w:t>nil() → Tag</w:t>
       </w:r>
     </w:p>
     <w:p>
@@ -18237,14 +19341,15 @@
         <w:bidi w:val="0"/>
         <w:ind w:hanging="0" w:left="0"/>
         <w:rPr>
-          <w:rFonts w:ascii="Andale Mono MT Std" w:hAnsi="Andale Mono MT Std"/>
-        </w:rPr>
-      </w:pPr>
-      <w:r>
-        <w:rPr>
-          <w:rFonts w:ascii="Andale Mono MT Std" w:hAnsi="Andale Mono MT Std"/>
-          <w:b w:val="false"/>
-          <w:bCs w:val="false"/>
+          <w:b/>
+          <w:bCs/>
+        </w:rPr>
+      </w:pPr>
+      <w:r>
+        <w:rPr>
+          <w:rFonts w:ascii="Andale Mono MT Std" w:hAnsi="Andale Mono MT Std"/>
+          <w:b/>
+          <w:bCs/>
           <w:i w:val="false"/>
           <w:iCs w:val="false"/>
           <w:sz w:val="12"/>
@@ -18255,14 +19360,62 @@
       <w:r>
         <w:rPr>
           <w:rFonts w:ascii="Andale Mono MT Std" w:hAnsi="Andale Mono MT Std"/>
-          <w:b w:val="false"/>
-          <w:bCs w:val="false"/>
-          <w:i w:val="false"/>
-          <w:iCs w:val="false"/>
-          <w:sz w:val="12"/>
-          <w:szCs w:val="12"/>
-        </w:rPr>
-        <w:t>fn nil() → Tag</w:t>
+          <w:b/>
+          <w:bCs/>
+          <w:i w:val="false"/>
+          <w:iCs w:val="false"/>
+          <w:sz w:val="12"/>
+          <w:szCs w:val="12"/>
+        </w:rPr>
+        <w:t>read_str(</w:t>
+      </w:r>
+      <w:r>
+        <w:rPr>
+          <w:rFonts w:ascii="Andale Mono MT Std" w:hAnsi="Andale Mono MT Std"/>
+          <w:b/>
+          <w:bCs/>
+          <w:i w:val="false"/>
+          <w:iCs w:val="false"/>
+          <w:sz w:val="12"/>
+          <w:szCs w:val="12"/>
+        </w:rPr>
+        <w:t>env</w:t>
+      </w:r>
+      <w:r>
+        <w:rPr>
+          <w:rFonts w:ascii="Andale Mono MT Std" w:hAnsi="Andale Mono MT Std"/>
+          <w:b/>
+          <w:bCs/>
+          <w:i w:val="false"/>
+          <w:iCs w:val="false"/>
+          <w:sz w:val="12"/>
+          <w:szCs w:val="12"/>
+        </w:rPr>
+        <w:t xml:space="preserve">: &amp;Env, </w:t>
+      </w:r>
+      <w:r>
+        <w:rPr>
+          <w:rFonts w:ascii="Andale Mono MT Std" w:hAnsi="Andale Mono MT Std"/>
+          <w:b/>
+          <w:bCs/>
+          <w:i w:val="false"/>
+          <w:iCs w:val="false"/>
+          <w:sz w:val="12"/>
+          <w:szCs w:val="12"/>
+        </w:rPr>
+        <w:t>form</w:t>
+      </w:r>
+      <w:r>
+        <w:rPr>
+          <w:rFonts w:ascii="Andale Mono MT Std" w:hAnsi="Andale Mono MT Std"/>
+          <w:b/>
+          <w:bCs/>
+          <w:i w:val="false"/>
+          <w:iCs w:val="false"/>
+          <w:sz w:val="12"/>
+          <w:szCs w:val="12"/>
+        </w:rPr>
+        <w:t>: &amp;str) → Result&lt;Tag&gt;</w:t>
       </w:r>
     </w:p>
     <w:p>
@@ -18271,14 +19424,15 @@
         <w:bidi w:val="0"/>
         <w:ind w:hanging="0" w:left="0"/>
         <w:rPr>
-          <w:rFonts w:ascii="Andale Mono MT Std" w:hAnsi="Andale Mono MT Std"/>
-        </w:rPr>
-      </w:pPr>
-      <w:r>
-        <w:rPr>
-          <w:rFonts w:ascii="Andale Mono MT Std" w:hAnsi="Andale Mono MT Std"/>
-          <w:b w:val="false"/>
-          <w:bCs w:val="false"/>
+          <w:b/>
+          <w:bCs/>
+        </w:rPr>
+      </w:pPr>
+      <w:r>
+        <w:rPr>
+          <w:rFonts w:ascii="Andale Mono MT Std" w:hAnsi="Andale Mono MT Std"/>
+          <w:b/>
+          <w:bCs/>
           <w:i w:val="false"/>
           <w:iCs w:val="false"/>
           <w:sz w:val="12"/>
@@ -18289,14 +19443,110 @@
       <w:r>
         <w:rPr>
           <w:rFonts w:ascii="Andale Mono MT Std" w:hAnsi="Andale Mono MT Std"/>
-          <w:b w:val="false"/>
-          <w:bCs w:val="false"/>
-          <w:i w:val="false"/>
-          <w:iCs w:val="false"/>
-          <w:sz w:val="12"/>
-          <w:szCs w:val="12"/>
-        </w:rPr>
-        <w:t>fn read_str(_: &amp;Env, _: &amp;str) → Result&lt;Tag&gt;</w:t>
+          <w:b/>
+          <w:bCs/>
+          <w:i w:val="false"/>
+          <w:iCs w:val="false"/>
+          <w:sz w:val="12"/>
+          <w:szCs w:val="12"/>
+        </w:rPr>
+        <w:t>read(</w:t>
+      </w:r>
+      <w:r>
+        <w:rPr>
+          <w:rFonts w:ascii="Andale Mono MT Std" w:hAnsi="Andale Mono MT Std"/>
+          <w:b/>
+          <w:bCs/>
+          <w:i w:val="false"/>
+          <w:iCs w:val="false"/>
+          <w:sz w:val="12"/>
+          <w:szCs w:val="12"/>
+        </w:rPr>
+        <w:t>env</w:t>
+      </w:r>
+      <w:r>
+        <w:rPr>
+          <w:rFonts w:ascii="Andale Mono MT Std" w:hAnsi="Andale Mono MT Std"/>
+          <w:b/>
+          <w:bCs/>
+          <w:i w:val="false"/>
+          <w:iCs w:val="false"/>
+          <w:sz w:val="12"/>
+          <w:szCs w:val="12"/>
+        </w:rPr>
+        <w:t xml:space="preserve">: &amp;Env, </w:t>
+      </w:r>
+      <w:r>
+        <w:rPr>
+          <w:rFonts w:ascii="Andale Mono MT Std" w:hAnsi="Andale Mono MT Std"/>
+          <w:b/>
+          <w:bCs/>
+          <w:i w:val="false"/>
+          <w:iCs w:val="false"/>
+          <w:sz w:val="12"/>
+          <w:szCs w:val="12"/>
+        </w:rPr>
+        <w:t>stream</w:t>
+      </w:r>
+      <w:r>
+        <w:rPr>
+          <w:rFonts w:ascii="Andale Mono MT Std" w:hAnsi="Andale Mono MT Std"/>
+          <w:b/>
+          <w:bCs/>
+          <w:i w:val="false"/>
+          <w:iCs w:val="false"/>
+          <w:sz w:val="12"/>
+          <w:szCs w:val="12"/>
+        </w:rPr>
+        <w:t xml:space="preserve">: Tag, </w:t>
+      </w:r>
+      <w:r>
+        <w:rPr>
+          <w:rFonts w:ascii="Andale Mono MT Std" w:hAnsi="Andale Mono MT Std"/>
+          <w:b/>
+          <w:bCs/>
+          <w:i w:val="false"/>
+          <w:iCs w:val="false"/>
+          <w:sz w:val="12"/>
+          <w:szCs w:val="12"/>
+        </w:rPr>
+        <w:t>eof_err</w:t>
+      </w:r>
+      <w:r>
+        <w:rPr>
+          <w:rFonts w:ascii="Andale Mono MT Std" w:hAnsi="Andale Mono MT Std"/>
+          <w:b/>
+          <w:bCs/>
+          <w:i w:val="false"/>
+          <w:iCs w:val="false"/>
+          <w:sz w:val="12"/>
+          <w:szCs w:val="12"/>
+        </w:rPr>
+        <w:t xml:space="preserve">: bool, </w:t>
+      </w:r>
+      <w:r>
+        <w:rPr>
+          <w:rFonts w:ascii="Andale Mono MT Std" w:hAnsi="Andale Mono MT Std"/>
+          <w:b/>
+          <w:bCs/>
+          <w:i w:val="false"/>
+          <w:iCs w:val="false"/>
+          <w:sz w:val="12"/>
+          <w:szCs w:val="12"/>
+        </w:rPr>
+        <w:t>eof</w:t>
+      </w:r>
+      <w:r>
+        <w:rPr>
+          <w:rFonts w:ascii="Andale Mono MT Std" w:hAnsi="Andale Mono MT Std"/>
+          <w:b/>
+          <w:bCs/>
+          <w:i w:val="false"/>
+          <w:iCs w:val="false"/>
+          <w:sz w:val="12"/>
+          <w:szCs w:val="12"/>
+        </w:rPr>
+        <w:t>: Tag) → Result&lt;Tag&gt;</w:t>
       </w:r>
     </w:p>
     <w:p>
@@ -18305,14 +19555,15 @@
         <w:bidi w:val="0"/>
         <w:ind w:hanging="0" w:left="0"/>
         <w:rPr>
-          <w:rFonts w:ascii="Andale Mono MT Std" w:hAnsi="Andale Mono MT Std"/>
-        </w:rPr>
-      </w:pPr>
-      <w:r>
-        <w:rPr>
-          <w:rFonts w:ascii="Andale Mono MT Std" w:hAnsi="Andale Mono MT Std"/>
-          <w:b w:val="false"/>
-          <w:bCs w:val="false"/>
+          <w:b/>
+          <w:bCs/>
+        </w:rPr>
+      </w:pPr>
+      <w:r>
+        <w:rPr>
+          <w:rFonts w:ascii="Andale Mono MT Std" w:hAnsi="Andale Mono MT Std"/>
+          <w:b/>
+          <w:bCs/>
           <w:i w:val="false"/>
           <w:iCs w:val="false"/>
           <w:sz w:val="12"/>
@@ -18323,14 +19574,14 @@
       <w:r>
         <w:rPr>
           <w:rFonts w:ascii="Andale Mono MT Std" w:hAnsi="Andale Mono MT Std"/>
-          <w:b w:val="false"/>
-          <w:bCs w:val="false"/>
-          <w:i w:val="false"/>
-          <w:iCs w:val="false"/>
-          <w:sz w:val="12"/>
-          <w:szCs w:val="12"/>
-        </w:rPr>
-        <w:t>fn read(_: &amp;Env, _: Tag, _: bool, _: Tag) → Result&lt;Tag&gt;</w:t>
+          <w:b/>
+          <w:bCs/>
+          <w:i w:val="false"/>
+          <w:iCs w:val="false"/>
+          <w:sz w:val="12"/>
+          <w:szCs w:val="12"/>
+        </w:rPr>
+        <w:t>std_in() → Tag</w:t>
       </w:r>
     </w:p>
     <w:p>
@@ -18339,14 +19590,15 @@
         <w:bidi w:val="0"/>
         <w:ind w:hanging="0" w:left="0"/>
         <w:rPr>
-          <w:rFonts w:ascii="Andale Mono MT Std" w:hAnsi="Andale Mono MT Std"/>
-        </w:rPr>
-      </w:pPr>
-      <w:r>
-        <w:rPr>
-          <w:rFonts w:ascii="Andale Mono MT Std" w:hAnsi="Andale Mono MT Std"/>
-          <w:b w:val="false"/>
-          <w:bCs w:val="false"/>
+          <w:b/>
+          <w:bCs/>
+        </w:rPr>
+      </w:pPr>
+      <w:r>
+        <w:rPr>
+          <w:rFonts w:ascii="Andale Mono MT Std" w:hAnsi="Andale Mono MT Std"/>
+          <w:b/>
+          <w:bCs/>
           <w:i w:val="false"/>
           <w:iCs w:val="false"/>
           <w:sz w:val="12"/>
@@ -18357,14 +19609,14 @@
       <w:r>
         <w:rPr>
           <w:rFonts w:ascii="Andale Mono MT Std" w:hAnsi="Andale Mono MT Std"/>
-          <w:b w:val="false"/>
-          <w:bCs w:val="false"/>
-          <w:i w:val="false"/>
-          <w:iCs w:val="false"/>
-          <w:sz w:val="12"/>
-          <w:szCs w:val="12"/>
-        </w:rPr>
-        <w:t>fn std_in() → Tag</w:t>
+          <w:b/>
+          <w:bCs/>
+          <w:i w:val="false"/>
+          <w:iCs w:val="false"/>
+          <w:sz w:val="12"/>
+          <w:szCs w:val="12"/>
+        </w:rPr>
+        <w:t>std_out() → Tag</w:t>
       </w:r>
     </w:p>
     <w:p>
@@ -18373,14 +19625,15 @@
         <w:bidi w:val="0"/>
         <w:ind w:hanging="0" w:left="0"/>
         <w:rPr>
-          <w:rFonts w:ascii="Andale Mono MT Std" w:hAnsi="Andale Mono MT Std"/>
-        </w:rPr>
-      </w:pPr>
-      <w:r>
-        <w:rPr>
-          <w:rFonts w:ascii="Andale Mono MT Std" w:hAnsi="Andale Mono MT Std"/>
-          <w:b w:val="false"/>
-          <w:bCs w:val="false"/>
+          <w:b/>
+          <w:bCs/>
+        </w:rPr>
+      </w:pPr>
+      <w:r>
+        <w:rPr>
+          <w:rFonts w:ascii="Andale Mono MT Std" w:hAnsi="Andale Mono MT Std"/>
+          <w:b/>
+          <w:bCs/>
           <w:i w:val="false"/>
           <w:iCs w:val="false"/>
           <w:sz w:val="12"/>
@@ -18391,14 +19644,14 @@
       <w:r>
         <w:rPr>
           <w:rFonts w:ascii="Andale Mono MT Std" w:hAnsi="Andale Mono MT Std"/>
-          <w:b w:val="false"/>
-          <w:bCs w:val="false"/>
-          <w:i w:val="false"/>
-          <w:iCs w:val="false"/>
-          <w:sz w:val="12"/>
-          <w:szCs w:val="12"/>
-        </w:rPr>
-        <w:t>fn std_out() → Tag</w:t>
+          <w:b/>
+          <w:bCs/>
+          <w:i w:val="false"/>
+          <w:iCs w:val="false"/>
+          <w:sz w:val="12"/>
+          <w:szCs w:val="12"/>
+        </w:rPr>
+        <w:t>version() → &amp;str</w:t>
       </w:r>
     </w:p>
     <w:p>
@@ -18407,14 +19660,15 @@
         <w:bidi w:val="0"/>
         <w:ind w:hanging="0" w:left="0"/>
         <w:rPr>
-          <w:rFonts w:ascii="Andale Mono MT Std" w:hAnsi="Andale Mono MT Std"/>
-        </w:rPr>
-      </w:pPr>
-      <w:r>
-        <w:rPr>
-          <w:rFonts w:ascii="Andale Mono MT Std" w:hAnsi="Andale Mono MT Std"/>
-          <w:b w:val="false"/>
-          <w:bCs w:val="false"/>
+          <w:b/>
+          <w:bCs/>
+        </w:rPr>
+      </w:pPr>
+      <w:r>
+        <w:rPr>
+          <w:rFonts w:ascii="Andale Mono MT Std" w:hAnsi="Andale Mono MT Std"/>
+          <w:b/>
+          <w:bCs/>
           <w:i w:val="false"/>
           <w:iCs w:val="false"/>
           <w:sz w:val="12"/>
@@ -18425,14 +19679,86 @@
       <w:r>
         <w:rPr>
           <w:rFonts w:ascii="Andale Mono MT Std" w:hAnsi="Andale Mono MT Std"/>
-          <w:b w:val="false"/>
-          <w:bCs w:val="false"/>
-          <w:i w:val="false"/>
-          <w:iCs w:val="false"/>
-          <w:sz w:val="12"/>
-          <w:szCs w:val="12"/>
-        </w:rPr>
-        <w:t>fn version() → &amp;str</w:t>
+          <w:b/>
+          <w:bCs/>
+          <w:i w:val="false"/>
+          <w:iCs w:val="false"/>
+          <w:sz w:val="12"/>
+          <w:szCs w:val="12"/>
+        </w:rPr>
+        <w:t>write_str(</w:t>
+      </w:r>
+      <w:r>
+        <w:rPr>
+          <w:rFonts w:ascii="Andale Mono MT Std" w:hAnsi="Andale Mono MT Std"/>
+          <w:b/>
+          <w:bCs/>
+          <w:i w:val="false"/>
+          <w:iCs w:val="false"/>
+          <w:sz w:val="12"/>
+          <w:szCs w:val="12"/>
+        </w:rPr>
+        <w:t>env</w:t>
+      </w:r>
+      <w:r>
+        <w:rPr>
+          <w:rFonts w:ascii="Andale Mono MT Std" w:hAnsi="Andale Mono MT Std"/>
+          <w:b/>
+          <w:bCs/>
+          <w:i w:val="false"/>
+          <w:iCs w:val="false"/>
+          <w:sz w:val="12"/>
+          <w:szCs w:val="12"/>
+        </w:rPr>
+        <w:t xml:space="preserve">: &amp;Env, </w:t>
+      </w:r>
+      <w:r>
+        <w:rPr>
+          <w:rFonts w:ascii="Andale Mono MT Std" w:hAnsi="Andale Mono MT Std"/>
+          <w:b/>
+          <w:bCs/>
+          <w:i w:val="false"/>
+          <w:iCs w:val="false"/>
+          <w:sz w:val="12"/>
+          <w:szCs w:val="12"/>
+        </w:rPr>
+        <w:t>form</w:t>
+      </w:r>
+      <w:r>
+        <w:rPr>
+          <w:rFonts w:ascii="Andale Mono MT Std" w:hAnsi="Andale Mono MT Std"/>
+          <w:b/>
+          <w:bCs/>
+          <w:i w:val="false"/>
+          <w:iCs w:val="false"/>
+          <w:sz w:val="12"/>
+          <w:szCs w:val="12"/>
+        </w:rPr>
+        <w:t xml:space="preserve">: &amp;str, </w:t>
+      </w:r>
+      <w:r>
+        <w:rPr>
+          <w:rFonts w:ascii="Andale Mono MT Std" w:hAnsi="Andale Mono MT Std"/>
+          <w:b/>
+          <w:bCs/>
+          <w:i w:val="false"/>
+          <w:iCs w:val="false"/>
+          <w:sz w:val="12"/>
+          <w:szCs w:val="12"/>
+        </w:rPr>
+        <w:t>stream</w:t>
+      </w:r>
+      <w:r>
+        <w:rPr>
+          <w:rFonts w:ascii="Andale Mono MT Std" w:hAnsi="Andale Mono MT Std"/>
+          <w:b/>
+          <w:bCs/>
+          <w:i w:val="false"/>
+          <w:iCs w:val="false"/>
+          <w:sz w:val="12"/>
+          <w:szCs w:val="12"/>
+        </w:rPr>
+        <w:t>: Tag) → Result&lt;()&gt;</w:t>
       </w:r>
     </w:p>
     <w:p>
@@ -18441,14 +19767,15 @@
         <w:bidi w:val="0"/>
         <w:ind w:hanging="0" w:left="0"/>
         <w:rPr>
-          <w:rFonts w:ascii="Andale Mono MT Std" w:hAnsi="Andale Mono MT Std"/>
-        </w:rPr>
-      </w:pPr>
-      <w:r>
-        <w:rPr>
-          <w:rFonts w:ascii="Andale Mono MT Std" w:hAnsi="Andale Mono MT Std"/>
-          <w:b w:val="false"/>
-          <w:bCs w:val="false"/>
+          <w:b/>
+          <w:bCs/>
+        </w:rPr>
+      </w:pPr>
+      <w:r>
+        <w:rPr>
+          <w:rFonts w:ascii="Andale Mono MT Std" w:hAnsi="Andale Mono MT Std"/>
+          <w:b/>
+          <w:bCs/>
           <w:i w:val="false"/>
           <w:iCs w:val="false"/>
           <w:sz w:val="12"/>
@@ -18459,30 +19786,105 @@
       <w:r>
         <w:rPr>
           <w:rFonts w:ascii="Andale Mono MT Std" w:hAnsi="Andale Mono MT Std"/>
-          <w:b w:val="false"/>
-          <w:bCs w:val="false"/>
-          <w:i w:val="false"/>
-          <w:iCs w:val="false"/>
-          <w:sz w:val="12"/>
-          <w:szCs w:val="12"/>
-        </w:rPr>
-        <w:t>fn write_str(_: &amp;Env, _: &amp;str, _: Tag) → Result&lt;()&gt;</w:t>
-      </w:r>
-    </w:p>
-    <w:p>
-      <w:pPr>
-        <w:pStyle w:val="Normal"/>
-        <w:bidi w:val="0"/>
+          <w:b/>
+          <w:bCs/>
+          <w:i w:val="false"/>
+          <w:iCs w:val="false"/>
+          <w:sz w:val="12"/>
+          <w:szCs w:val="12"/>
+        </w:rPr>
+        <w:t>write_to_string(</w:t>
+      </w:r>
+      <w:r>
+        <w:rPr>
+          <w:rFonts w:ascii="Andale Mono MT Std" w:hAnsi="Andale Mono MT Std"/>
+          <w:b/>
+          <w:bCs/>
+          <w:i w:val="false"/>
+          <w:iCs w:val="false"/>
+          <w:sz w:val="12"/>
+          <w:szCs w:val="12"/>
+        </w:rPr>
+        <w:t>env</w:t>
+      </w:r>
+      <w:r>
+        <w:rPr>
+          <w:rFonts w:ascii="Andale Mono MT Std" w:hAnsi="Andale Mono MT Std"/>
+          <w:b/>
+          <w:bCs/>
+          <w:i w:val="false"/>
+          <w:iCs w:val="false"/>
+          <w:sz w:val="12"/>
+          <w:szCs w:val="12"/>
+        </w:rPr>
+        <w:t xml:space="preserve">: &amp;Env, </w:t>
+      </w:r>
+      <w:r>
+        <w:rPr>
+          <w:rFonts w:ascii="Andale Mono MT Std" w:hAnsi="Andale Mono MT Std"/>
+          <w:b/>
+          <w:bCs/>
+          <w:i w:val="false"/>
+          <w:iCs w:val="false"/>
+          <w:sz w:val="12"/>
+          <w:szCs w:val="12"/>
+        </w:rPr>
+        <w:t>form</w:t>
+      </w:r>
+      <w:r>
+        <w:rPr>
+          <w:rFonts w:ascii="Andale Mono MT Std" w:hAnsi="Andale Mono MT Std"/>
+          <w:b/>
+          <w:bCs/>
+          <w:i w:val="false"/>
+          <w:iCs w:val="false"/>
+          <w:sz w:val="12"/>
+          <w:szCs w:val="12"/>
+        </w:rPr>
+        <w:t xml:space="preserve">: Tag, </w:t>
+      </w:r>
+      <w:r>
+        <w:rPr>
+          <w:rFonts w:ascii="Andale Mono MT Std" w:hAnsi="Andale Mono MT Std"/>
+          <w:b/>
+          <w:bCs/>
+          <w:i w:val="false"/>
+          <w:iCs w:val="false"/>
+          <w:sz w:val="12"/>
+          <w:szCs w:val="12"/>
+        </w:rPr>
+        <w:t>escapes</w:t>
+      </w:r>
+      <w:r>
+        <w:rPr>
+          <w:rFonts w:ascii="Andale Mono MT Std" w:hAnsi="Andale Mono MT Std"/>
+          <w:b/>
+          <w:bCs/>
+          <w:i w:val="false"/>
+          <w:iCs w:val="false"/>
+          <w:sz w:val="12"/>
+          <w:szCs w:val="12"/>
+        </w:rPr>
+        <w:t>: bool) → String</w:t>
+      </w:r>
+    </w:p>
+    <w:p>
+      <w:pPr>
+        <w:pStyle w:val="Normal"/>
         <w:ind w:hanging="0" w:left="0"/>
         <w:rPr>
-          <w:rFonts w:ascii="Andale Mono MT Std" w:hAnsi="Andale Mono MT Std"/>
-        </w:rPr>
-      </w:pPr>
-      <w:r>
-        <w:rPr>
-          <w:rFonts w:ascii="Andale Mono MT Std" w:hAnsi="Andale Mono MT Std"/>
-          <w:b w:val="false"/>
-          <w:bCs w:val="false"/>
+          <w:rFonts w:ascii="Georgia" w:hAnsi="Georgia"/>
+          <w:b/>
+          <w:bCs/>
+          <w:sz w:val="12"/>
+          <w:szCs w:val="12"/>
+        </w:rPr>
+      </w:pPr>
+      <w:r>
+        <w:rPr>
+          <w:rFonts w:ascii="Andale Mono MT Std" w:hAnsi="Andale Mono MT Std"/>
+          <w:b/>
+          <w:bCs/>
           <w:i w:val="false"/>
           <w:iCs w:val="false"/>
           <w:sz w:val="12"/>
@@ -18493,561 +19895,129 @@
       <w:r>
         <w:rPr>
           <w:rFonts w:ascii="Andale Mono MT Std" w:hAnsi="Andale Mono MT Std"/>
-          <w:b w:val="false"/>
-          <w:bCs w:val="false"/>
-          <w:i w:val="false"/>
-          <w:iCs w:val="false"/>
-          <w:sz w:val="12"/>
-          <w:szCs w:val="12"/>
-        </w:rPr>
-        <w:t>fn write_to_string(_: &amp;Env, _: Tag, _: bool) → String</w:t>
-      </w:r>
-    </w:p>
-    <w:p>
-      <w:pPr>
-        <w:pStyle w:val="Normal"/>
-        <w:bidi w:val="0"/>
+          <w:b/>
+          <w:bCs/>
+          <w:i w:val="false"/>
+          <w:iCs w:val="false"/>
+          <w:sz w:val="12"/>
+          <w:szCs w:val="12"/>
+        </w:rPr>
+        <w:t>write(</w:t>
+      </w:r>
+      <w:r>
+        <w:rPr>
+          <w:rFonts w:ascii="Andale Mono MT Std" w:hAnsi="Andale Mono MT Std"/>
+          <w:b/>
+          <w:bCs/>
+          <w:i w:val="false"/>
+          <w:iCs w:val="false"/>
+          <w:sz w:val="12"/>
+          <w:szCs w:val="12"/>
+        </w:rPr>
+        <w:t>env</w:t>
+      </w:r>
+      <w:r>
+        <w:rPr>
+          <w:rFonts w:ascii="Andale Mono MT Std" w:hAnsi="Andale Mono MT Std"/>
+          <w:b/>
+          <w:bCs/>
+          <w:i w:val="false"/>
+          <w:iCs w:val="false"/>
+          <w:sz w:val="12"/>
+          <w:szCs w:val="12"/>
+        </w:rPr>
+        <w:t xml:space="preserve">: &amp;Env, </w:t>
+      </w:r>
+      <w:r>
+        <w:rPr>
+          <w:rFonts w:ascii="Andale Mono MT Std" w:hAnsi="Andale Mono MT Std"/>
+          <w:b/>
+          <w:bCs/>
+          <w:i w:val="false"/>
+          <w:iCs w:val="false"/>
+          <w:sz w:val="12"/>
+          <w:szCs w:val="12"/>
+        </w:rPr>
+        <w:t>form</w:t>
+      </w:r>
+      <w:r>
+        <w:rPr>
+          <w:rFonts w:ascii="Andale Mono MT Std" w:hAnsi="Andale Mono MT Std"/>
+          <w:b/>
+          <w:bCs/>
+          <w:i w:val="false"/>
+          <w:iCs w:val="false"/>
+          <w:sz w:val="12"/>
+          <w:szCs w:val="12"/>
+        </w:rPr>
+        <w:t xml:space="preserve">: Tag, </w:t>
+      </w:r>
+      <w:r>
+        <w:rPr>
+          <w:rFonts w:ascii="Andale Mono MT Std" w:hAnsi="Andale Mono MT Std"/>
+          <w:b/>
+          <w:bCs/>
+          <w:i w:val="false"/>
+          <w:iCs w:val="false"/>
+          <w:sz w:val="12"/>
+          <w:szCs w:val="12"/>
+        </w:rPr>
+        <w:t>escapes</w:t>
+      </w:r>
+      <w:r>
+        <w:rPr>
+          <w:rFonts w:ascii="Andale Mono MT Std" w:hAnsi="Andale Mono MT Std"/>
+          <w:b/>
+          <w:bCs/>
+          <w:i w:val="false"/>
+          <w:iCs w:val="false"/>
+          <w:sz w:val="12"/>
+          <w:szCs w:val="12"/>
+        </w:rPr>
+        <w:t xml:space="preserve">: bool, </w:t>
+      </w:r>
+      <w:r>
+        <w:rPr>
+          <w:rFonts w:ascii="Andale Mono MT Std" w:hAnsi="Andale Mono MT Std"/>
+          <w:b/>
+          <w:bCs/>
+          <w:i w:val="false"/>
+          <w:iCs w:val="false"/>
+          <w:sz w:val="12"/>
+          <w:szCs w:val="12"/>
+        </w:rPr>
+        <w:t>stream</w:t>
+      </w:r>
+      <w:r>
+        <w:rPr>
+          <w:rFonts w:ascii="Andale Mono MT Std" w:hAnsi="Andale Mono MT Std"/>
+          <w:b/>
+          <w:bCs/>
+          <w:i w:val="false"/>
+          <w:iCs w:val="false"/>
+          <w:sz w:val="12"/>
+          <w:szCs w:val="12"/>
+        </w:rPr>
+        <w:t>: Tag) → Result&lt;()&gt;</w:t>
+      </w:r>
+    </w:p>
+    <w:p>
+      <w:pPr>
+        <w:pStyle w:val="Normal"/>
         <w:ind w:hanging="0" w:left="0"/>
         <w:rPr>
-          <w:rFonts w:ascii="Andale Mono MT Std" w:hAnsi="Andale Mono MT Std"/>
-        </w:rPr>
-      </w:pPr>
-      <w:r>
-        <w:rPr>
-          <w:rFonts w:ascii="Andale Mono MT Std" w:hAnsi="Andale Mono MT Std"/>
-          <w:b w:val="false"/>
-          <w:bCs w:val="false"/>
-          <w:i w:val="false"/>
-          <w:iCs w:val="false"/>
-          <w:sz w:val="12"/>
-          <w:szCs w:val="12"/>
-        </w:rPr>
-        <w:t xml:space="preserve">     </w:t>
-      </w:r>
-      <w:r>
-        <w:rPr>
-          <w:rFonts w:ascii="Andale Mono MT Std" w:hAnsi="Andale Mono MT Std"/>
-          <w:b w:val="false"/>
-          <w:bCs w:val="false"/>
-          <w:i w:val="false"/>
-          <w:iCs w:val="false"/>
-          <w:sz w:val="12"/>
-          <w:szCs w:val="12"/>
-        </w:rPr>
-        <w:t>fn write(_: &amp;Env, _: Tag, _: bool, _: Tag) → Result&lt;()&gt;</w:t>
-      </w:r>
-    </w:p>
-    <w:p>
-      <w:pPr>
-        <w:pStyle w:val="Normal"/>
-        <w:rPr>
-          <w:rFonts w:ascii="Andale Mono MT Std" w:hAnsi="Andale Mono MT Std"/>
-        </w:rPr>
-      </w:pPr>
-      <w:r>
-        <w:rPr>
-          <w:rFonts w:ascii="Andale Mono MT Std" w:hAnsi="Andale Mono MT Std"/>
-          <w:b/>
-          <w:bCs/>
-          <w:sz w:val="16"/>
-          <w:szCs w:val="16"/>
-        </w:rPr>
-        <w:t xml:space="preserve">  </w:t>
-      </w:r>
-      <w:r>
-        <w:rPr>
-          <w:rFonts w:ascii="Andale Mono MT Std" w:hAnsi="Andale Mono MT Std"/>
-          <w:b w:val="false"/>
-          <w:bCs w:val="false"/>
-          <w:sz w:val="12"/>
-          <w:szCs w:val="12"/>
-        </w:rPr>
-        <w:t>}</w:t>
-      </w:r>
-    </w:p>
-    <w:p>
-      <w:pPr>
-        <w:pStyle w:val="Normal"/>
-        <w:rPr>
-          <w:rFonts w:ascii="Georgia" w:hAnsi="Georgia"/>
-          <w:b/>
-          <w:bCs/>
-          <w:sz w:val="12"/>
-          <w:szCs w:val="12"/>
-        </w:rPr>
-      </w:pPr>
-      <w:r>
-        <w:rPr>
-          <w:rFonts w:ascii="Georgia" w:hAnsi="Georgia"/>
-          <w:b/>
-          <w:bCs/>
-          <w:sz w:val="12"/>
-          <w:szCs w:val="12"/>
-        </w:rPr>
-      </w:r>
-    </w:p>
-    <w:p>
-      <w:pPr>
-        <w:pStyle w:val="Normal"/>
-        <w:rPr>
-          <w:rFonts w:ascii="Georgia" w:hAnsi="Georgia"/>
-          <w:b/>
-          <w:bCs/>
-          <w:sz w:val="12"/>
-          <w:szCs w:val="12"/>
-        </w:rPr>
-      </w:pPr>
-      <w:r>
-        <w:rPr>
-          <w:rFonts w:ascii="Georgia" w:hAnsi="Georgia"/>
-          <w:b/>
-          <w:bCs/>
-          <w:sz w:val="16"/>
-          <w:szCs w:val="16"/>
-        </w:rPr>
-        <w:t xml:space="preserve">    </w:t>
-      </w:r>
-    </w:p>
-    <w:p>
-      <w:pPr>
-        <w:pStyle w:val="Normal"/>
-        <w:rPr>
-          <w:rFonts w:ascii="Georgia" w:hAnsi="Georgia"/>
-          <w:b/>
-          <w:bCs/>
-          <w:sz w:val="12"/>
-          <w:szCs w:val="12"/>
-        </w:rPr>
-      </w:pPr>
-      <w:r>
-        <w:rPr>
-          <w:rFonts w:ascii="Georgia" w:hAnsi="Georgia"/>
-          <w:b/>
-          <w:bCs/>
-          <w:sz w:val="12"/>
-          <w:szCs w:val="12"/>
-        </w:rPr>
-      </w:r>
-    </w:p>
-    <w:p>
-      <w:pPr>
-        <w:pStyle w:val="Normal"/>
-        <w:rPr>
-          <w:rFonts w:ascii="Georgia" w:hAnsi="Georgia"/>
-          <w:b/>
-          <w:bCs/>
-          <w:sz w:val="12"/>
-          <w:szCs w:val="12"/>
-        </w:rPr>
-      </w:pPr>
-      <w:r>
-        <w:rPr>
-          <w:rFonts w:ascii="Georgia" w:hAnsi="Georgia"/>
-          <w:b/>
-          <w:bCs/>
-          <w:sz w:val="12"/>
-          <w:szCs w:val="12"/>
-        </w:rPr>
-      </w:r>
-    </w:p>
-    <w:p>
-      <w:pPr>
-        <w:pStyle w:val="Normal"/>
-        <w:rPr>
-          <w:rFonts w:ascii="Georgia" w:hAnsi="Georgia"/>
-          <w:b/>
-          <w:bCs/>
-          <w:sz w:val="12"/>
-          <w:szCs w:val="12"/>
-        </w:rPr>
-      </w:pPr>
-      <w:r>
-        <w:rPr>
-          <w:rFonts w:ascii="Georgia" w:hAnsi="Georgia"/>
-          <w:b/>
-          <w:bCs/>
-          <w:sz w:val="12"/>
-          <w:szCs w:val="12"/>
-        </w:rPr>
-      </w:r>
-    </w:p>
-    <w:p>
-      <w:pPr>
-        <w:pStyle w:val="Normal"/>
-        <w:rPr>
-          <w:rFonts w:ascii="Georgia" w:hAnsi="Georgia"/>
-          <w:b/>
-          <w:bCs/>
-          <w:sz w:val="12"/>
-          <w:szCs w:val="12"/>
-        </w:rPr>
-      </w:pPr>
-      <w:r>
-        <w:rPr>
-          <w:rFonts w:ascii="Georgia" w:hAnsi="Georgia"/>
-          <w:b/>
-          <w:bCs/>
-          <w:sz w:val="12"/>
-          <w:szCs w:val="12"/>
-        </w:rPr>
-      </w:r>
-    </w:p>
-    <w:p>
-      <w:pPr>
-        <w:pStyle w:val="Normal"/>
-        <w:rPr>
-          <w:rFonts w:ascii="Georgia" w:hAnsi="Georgia"/>
-          <w:b/>
-          <w:bCs/>
-          <w:sz w:val="12"/>
-          <w:szCs w:val="12"/>
-        </w:rPr>
-      </w:pPr>
-      <w:r>
-        <w:rPr>
-          <w:rFonts w:ascii="Georgia" w:hAnsi="Georgia"/>
-          <w:b/>
-          <w:bCs/>
-          <w:sz w:val="12"/>
-          <w:szCs w:val="12"/>
-        </w:rPr>
-      </w:r>
-    </w:p>
-    <w:p>
-      <w:pPr>
-        <w:pStyle w:val="Normal"/>
-        <w:rPr>
-          <w:rFonts w:ascii="Georgia" w:hAnsi="Georgia"/>
-          <w:b/>
-          <w:bCs/>
-          <w:sz w:val="12"/>
-          <w:szCs w:val="12"/>
-        </w:rPr>
-      </w:pPr>
-      <w:r>
-        <w:rPr>
-          <w:rFonts w:ascii="Georgia" w:hAnsi="Georgia"/>
-          <w:b/>
-          <w:bCs/>
-          <w:sz w:val="12"/>
-          <w:szCs w:val="12"/>
-        </w:rPr>
-      </w:r>
-    </w:p>
-    <w:p>
-      <w:pPr>
-        <w:pStyle w:val="Normal"/>
-        <w:rPr>
-          <w:rFonts w:ascii="Georgia" w:hAnsi="Georgia"/>
-          <w:b/>
-          <w:bCs/>
-          <w:sz w:val="12"/>
-          <w:szCs w:val="12"/>
-        </w:rPr>
-      </w:pPr>
-      <w:r>
-        <w:rPr>
-          <w:rFonts w:ascii="Georgia" w:hAnsi="Georgia"/>
-          <w:b/>
-          <w:bCs/>
-          <w:sz w:val="12"/>
-          <w:szCs w:val="12"/>
-        </w:rPr>
-      </w:r>
-    </w:p>
-    <w:p>
-      <w:pPr>
-        <w:pStyle w:val="Normal"/>
-        <w:rPr>
-          <w:rFonts w:ascii="Georgia" w:hAnsi="Georgia"/>
-          <w:b/>
-          <w:bCs/>
-          <w:sz w:val="12"/>
-          <w:szCs w:val="12"/>
-        </w:rPr>
-      </w:pPr>
-      <w:r>
-        <w:rPr>
-          <w:rFonts w:ascii="Georgia" w:hAnsi="Georgia"/>
-          <w:b/>
-          <w:bCs/>
-          <w:sz w:val="12"/>
-          <w:szCs w:val="12"/>
-        </w:rPr>
-      </w:r>
-    </w:p>
-    <w:p>
-      <w:pPr>
-        <w:pStyle w:val="Normal"/>
-        <w:rPr>
-          <w:rFonts w:ascii="Georgia" w:hAnsi="Georgia"/>
-          <w:b/>
-          <w:bCs/>
-          <w:sz w:val="12"/>
-          <w:szCs w:val="12"/>
-        </w:rPr>
-      </w:pPr>
-      <w:r>
-        <w:rPr>
-          <w:rFonts w:ascii="Georgia" w:hAnsi="Georgia"/>
-          <w:b/>
-          <w:bCs/>
-          <w:sz w:val="12"/>
-          <w:szCs w:val="12"/>
-        </w:rPr>
-      </w:r>
-    </w:p>
-    <w:p>
-      <w:pPr>
-        <w:pStyle w:val="Normal"/>
-        <w:rPr>
-          <w:rFonts w:ascii="Georgia" w:hAnsi="Georgia"/>
-          <w:b/>
-          <w:bCs/>
-          <w:sz w:val="12"/>
-          <w:szCs w:val="12"/>
-        </w:rPr>
-      </w:pPr>
-      <w:r>
-        <w:rPr>
-          <w:rFonts w:ascii="Georgia" w:hAnsi="Georgia"/>
-          <w:b/>
-          <w:bCs/>
-          <w:sz w:val="12"/>
-          <w:szCs w:val="12"/>
-        </w:rPr>
-      </w:r>
-    </w:p>
-    <w:p>
-      <w:pPr>
-        <w:pStyle w:val="Normal"/>
-        <w:rPr>
-          <w:rFonts w:ascii="Georgia" w:hAnsi="Georgia"/>
-          <w:b/>
-          <w:bCs/>
-          <w:sz w:val="12"/>
-          <w:szCs w:val="12"/>
-        </w:rPr>
-      </w:pPr>
-      <w:r>
-        <w:rPr>
-          <w:rFonts w:ascii="Georgia" w:hAnsi="Georgia"/>
-          <w:b/>
-          <w:bCs/>
-          <w:sz w:val="12"/>
-          <w:szCs w:val="12"/>
-        </w:rPr>
-      </w:r>
-    </w:p>
-    <w:p>
-      <w:pPr>
-        <w:pStyle w:val="Normal"/>
-        <w:rPr>
-          <w:rFonts w:ascii="Georgia" w:hAnsi="Georgia"/>
-          <w:b/>
-          <w:bCs/>
-          <w:sz w:val="12"/>
-          <w:szCs w:val="12"/>
-        </w:rPr>
-      </w:pPr>
-      <w:r>
-        <w:rPr>
-          <w:rFonts w:ascii="Georgia" w:hAnsi="Georgia"/>
-          <w:b/>
-          <w:bCs/>
-          <w:sz w:val="12"/>
-          <w:szCs w:val="12"/>
-        </w:rPr>
-      </w:r>
-    </w:p>
-    <w:p>
-      <w:pPr>
-        <w:pStyle w:val="Normal"/>
-        <w:rPr>
-          <w:rFonts w:ascii="Georgia" w:hAnsi="Georgia"/>
-          <w:b/>
-          <w:bCs/>
-          <w:sz w:val="12"/>
-          <w:szCs w:val="12"/>
-        </w:rPr>
-      </w:pPr>
-      <w:r>
-        <w:rPr>
-          <w:rFonts w:ascii="Georgia" w:hAnsi="Georgia"/>
-          <w:b/>
-          <w:bCs/>
-          <w:sz w:val="12"/>
-          <w:szCs w:val="12"/>
-        </w:rPr>
-      </w:r>
-    </w:p>
-    <w:p>
-      <w:pPr>
-        <w:pStyle w:val="Normal"/>
-        <w:rPr>
-          <w:rFonts w:ascii="Georgia" w:hAnsi="Georgia"/>
-          <w:b/>
-          <w:bCs/>
-          <w:sz w:val="12"/>
-          <w:szCs w:val="12"/>
-        </w:rPr>
-      </w:pPr>
-      <w:r>
-        <w:rPr>
-          <w:rFonts w:ascii="Georgia" w:hAnsi="Georgia"/>
-          <w:b/>
-          <w:bCs/>
-          <w:sz w:val="12"/>
-          <w:szCs w:val="12"/>
-        </w:rPr>
-      </w:r>
-    </w:p>
-    <w:p>
-      <w:pPr>
-        <w:pStyle w:val="Normal"/>
-        <w:rPr>
-          <w:rFonts w:ascii="Georgia" w:hAnsi="Georgia"/>
-          <w:b/>
-          <w:bCs/>
-          <w:sz w:val="12"/>
-          <w:szCs w:val="12"/>
-        </w:rPr>
-      </w:pPr>
-      <w:r>
-        <w:rPr>
-          <w:rFonts w:ascii="Georgia" w:hAnsi="Georgia"/>
-          <w:b/>
-          <w:bCs/>
-          <w:sz w:val="12"/>
-          <w:szCs w:val="12"/>
-        </w:rPr>
-      </w:r>
-    </w:p>
-    <w:p>
-      <w:pPr>
-        <w:pStyle w:val="Normal"/>
-        <w:ind w:hanging="0" w:left="709"/>
-        <w:rPr>
-          <w:rFonts w:ascii="Georgia" w:hAnsi="Georgia"/>
-          <w:b/>
-          <w:bCs/>
-          <w:sz w:val="12"/>
-          <w:szCs w:val="12"/>
-        </w:rPr>
-      </w:pPr>
-      <w:r>
-        <w:rPr>
-          <w:rFonts w:ascii="Georgia" w:hAnsi="Georgia"/>
-          <w:b/>
-          <w:bCs/>
-          <w:sz w:val="12"/>
-          <w:szCs w:val="12"/>
-        </w:rPr>
-      </w:r>
-    </w:p>
-    <w:p>
-      <w:pPr>
-        <w:pStyle w:val="Normal"/>
-        <w:ind w:hanging="0" w:left="709"/>
-        <w:rPr>
-          <w:rFonts w:ascii="Georgia" w:hAnsi="Georgia"/>
-          <w:sz w:val="14"/>
-          <w:szCs w:val="14"/>
-        </w:rPr>
-      </w:pPr>
-      <w:r>
-        <w:rPr>
-          <w:rFonts w:ascii="Georgia" w:hAnsi="Georgia"/>
-          <w:sz w:val="14"/>
-          <w:szCs w:val="14"/>
-        </w:rPr>
-      </w:r>
-    </w:p>
-    <w:p>
-      <w:pPr>
-        <w:pStyle w:val="Normal"/>
-        <w:ind w:hanging="0" w:left="709"/>
-        <w:rPr>
-          <w:rFonts w:ascii="Georgia" w:hAnsi="Georgia"/>
-          <w:sz w:val="14"/>
-          <w:szCs w:val="14"/>
-        </w:rPr>
-      </w:pPr>
-      <w:r>
-        <w:rPr>
-          <w:rFonts w:ascii="Georgia" w:hAnsi="Georgia"/>
-          <w:sz w:val="14"/>
-          <w:szCs w:val="14"/>
-        </w:rPr>
-      </w:r>
-    </w:p>
-    <w:p>
-      <w:pPr>
-        <w:pStyle w:val="Normal"/>
-        <w:ind w:hanging="0" w:left="709"/>
-        <w:rPr>
-          <w:rFonts w:ascii="Georgia" w:hAnsi="Georgia"/>
-          <w:sz w:val="14"/>
-          <w:szCs w:val="14"/>
-        </w:rPr>
-      </w:pPr>
-      <w:r>
-        <w:rPr>
-          <w:rFonts w:ascii="Georgia" w:hAnsi="Georgia"/>
-          <w:sz w:val="14"/>
-          <w:szCs w:val="14"/>
-        </w:rPr>
-      </w:r>
-    </w:p>
-    <w:p>
-      <w:pPr>
-        <w:pStyle w:val="Normal"/>
-        <w:ind w:hanging="0" w:left="709"/>
-        <w:rPr>
-          <w:rFonts w:ascii="Georgia" w:hAnsi="Georgia"/>
-          <w:sz w:val="14"/>
-          <w:szCs w:val="14"/>
-        </w:rPr>
-      </w:pPr>
-      <w:r>
-        <w:rPr>
-          <w:rFonts w:ascii="Georgia" w:hAnsi="Georgia"/>
-          <w:sz w:val="14"/>
-          <w:szCs w:val="14"/>
-        </w:rPr>
-      </w:r>
-    </w:p>
-    <w:p>
-      <w:pPr>
-        <w:pStyle w:val="Normal"/>
-        <w:ind w:hanging="0" w:left="709"/>
-        <w:rPr>
-          <w:rFonts w:ascii="Georgia" w:hAnsi="Georgia"/>
-          <w:sz w:val="14"/>
-          <w:szCs w:val="14"/>
-        </w:rPr>
-      </w:pPr>
-      <w:r>
-        <w:rPr>
-          <w:rFonts w:ascii="Georgia" w:hAnsi="Georgia"/>
-          <w:sz w:val="14"/>
-          <w:szCs w:val="14"/>
-        </w:rPr>
-      </w:r>
-    </w:p>
-    <w:p>
-      <w:pPr>
-        <w:pStyle w:val="Normal"/>
-        <w:ind w:hanging="0" w:left="709"/>
-        <w:rPr>
-          <w:rFonts w:ascii="Georgia" w:hAnsi="Georgia"/>
-          <w:sz w:val="14"/>
-          <w:szCs w:val="14"/>
-        </w:rPr>
-      </w:pPr>
-      <w:r>
-        <w:rPr>
-          <w:rFonts w:ascii="Georgia" w:hAnsi="Georgia"/>
+          <w:rFonts w:ascii="Georgia" w:hAnsi="Georgia"/>
+          <w:b/>
+          <w:bCs/>
+          <w:sz w:val="14"/>
+          <w:szCs w:val="14"/>
+        </w:rPr>
+      </w:pPr>
+      <w:r>
+        <w:rPr>
+          <w:rFonts w:ascii="Georgia" w:hAnsi="Georgia"/>
+          <w:b/>
+          <w:bCs/>
           <w:sz w:val="14"/>
           <w:szCs w:val="14"/>
         </w:rPr>
@@ -21544,7 +22514,7 @@
     <w:pPr>
       <w:widowControl/>
       <w:suppressAutoHyphens w:val="true"/>
-      <w:overflowPunct w:val="true"/>
+      <w:overflowPunct w:val="false"/>
       <w:bidi w:val="0"/>
       <w:spacing w:before="0" w:after="0"/>
       <w:jc w:val="left"/>
@@ -21710,8 +22680,8 @@
     </w:pPr>
     <w:rPr/>
   </w:style>
-  <w:style w:type="paragraph" w:styleId="FrameContents">
-    <w:name w:val="Frame Contents"/>
+  <w:style w:type="paragraph" w:styleId="FrameContentsuser">
+    <w:name w:val="Frame Contents (user)"/>
     <w:basedOn w:val="Normal"/>
     <w:qFormat/>
     <w:pPr/>

</xml_diff>